<commit_message>
Informe y anexo actualizados con los 4 días (placeholder para el cierre de la fecha 4)
- historial de versiones real por fecha (horas, origen de datos, incidentes)
- sección 6.1 nueva: 4 incidentes operativos reales (supervisor remoto, doble publicación, SAS del Rack B,
  Wokwi saturado) con diagnóstico y resolución — evidencia de desconexión/reconexión más fuerte que solo
  la pausa programada
- sección 5: Views de operador documentadas (Overview, About) con su captura
- sección 7 y Anexo B: tabla de horas reales (6h01, 8h22, 18h09) + placeholder explícito [COMPLETAR AL
  CIERRE] para la fecha 4, listo para reemplazar cuando termine la ventana
- anexo de evidencias: secciones 3.3 y 4 con las capturas de los días 2-4 (dia3-*, dia4-*)
- tools/cerrar_dia4.py: script guía para completar el cierre cuando termine la ventana de hoy
- PDFs regenerados: informe 13 páginas (antes 11), anexo 14 páginas (antes 9), verificados con extracción
  de texto
</commit_message>
<xml_diff>
--- a/informe/Evidencias_Parcial1_DC-ANDES-1.docx
+++ b/informe/Evidencias_Parcial1_DC-ANDES-1.docx
@@ -396,7 +396,7 @@
       <w:r>
         <w:fldChar w:fldCharType="separate"/>
       </w:r>
-      <w:hyperlink w:anchor="_Toc241162140" w:history="1">
+      <w:hyperlink w:anchor="_Toc241407885" w:history="1">
         <w:r>
           <w:rPr>
             <w:rStyle w:val="Hipervnculo"/>
@@ -423,7 +423,7 @@
             <w:noProof/>
             <w:webHidden/>
           </w:rPr>
-          <w:instrText xml:space="preserve"> PAGEREF _Toc241162140 \h </w:instrText>
+          <w:instrText xml:space="preserve"> PAGEREF _Toc241407885 \h </w:instrText>
         </w:r>
         <w:r>
           <w:rPr>
@@ -464,7 +464,7 @@
           <w:noProof/>
         </w:rPr>
       </w:pPr>
-      <w:hyperlink w:anchor="_Toc241162141" w:history="1">
+      <w:hyperlink w:anchor="_Toc241407886" w:history="1">
         <w:r>
           <w:rPr>
             <w:rStyle w:val="Hipervnculo"/>
@@ -491,7 +491,7 @@
             <w:noProof/>
             <w:webHidden/>
           </w:rPr>
-          <w:instrText xml:space="preserve"> PAGEREF _Toc241162141 \h </w:instrText>
+          <w:instrText xml:space="preserve"> PAGEREF _Toc241407886 \h </w:instrText>
         </w:r>
         <w:r>
           <w:rPr>
@@ -532,7 +532,7 @@
           <w:noProof/>
         </w:rPr>
       </w:pPr>
-      <w:hyperlink w:anchor="_Toc241162142" w:history="1">
+      <w:hyperlink w:anchor="_Toc241407887" w:history="1">
         <w:r>
           <w:rPr>
             <w:rStyle w:val="Hipervnculo"/>
@@ -559,7 +559,7 @@
             <w:noProof/>
             <w:webHidden/>
           </w:rPr>
-          <w:instrText xml:space="preserve"> PAGEREF _Toc241162142 \h </w:instrText>
+          <w:instrText xml:space="preserve"> PAGEREF _Toc241407887 \h </w:instrText>
         </w:r>
         <w:r>
           <w:rPr>
@@ -600,7 +600,7 @@
           <w:noProof/>
         </w:rPr>
       </w:pPr>
-      <w:hyperlink w:anchor="_Toc241162143" w:history="1">
+      <w:hyperlink w:anchor="_Toc241407888" w:history="1">
         <w:r>
           <w:rPr>
             <w:rStyle w:val="Hipervnculo"/>
@@ -627,7 +627,7 @@
             <w:noProof/>
             <w:webHidden/>
           </w:rPr>
-          <w:instrText xml:space="preserve"> PAGEREF _Toc241162143 \h </w:instrText>
+          <w:instrText xml:space="preserve"> PAGEREF _Toc241407888 \h </w:instrText>
         </w:r>
         <w:r>
           <w:rPr>
@@ -668,7 +668,7 @@
           <w:noProof/>
         </w:rPr>
       </w:pPr>
-      <w:hyperlink w:anchor="_Toc241162144" w:history="1">
+      <w:hyperlink w:anchor="_Toc241407889" w:history="1">
         <w:r>
           <w:rPr>
             <w:rStyle w:val="Hipervnculo"/>
@@ -695,7 +695,7 @@
             <w:noProof/>
             <w:webHidden/>
           </w:rPr>
-          <w:instrText xml:space="preserve"> PAGEREF _Toc241162144 \h </w:instrText>
+          <w:instrText xml:space="preserve"> PAGEREF _Toc241407889 \h </w:instrText>
         </w:r>
         <w:r>
           <w:rPr>
@@ -736,7 +736,7 @@
           <w:noProof/>
         </w:rPr>
       </w:pPr>
-      <w:hyperlink w:anchor="_Toc241162145" w:history="1">
+      <w:hyperlink w:anchor="_Toc241407890" w:history="1">
         <w:r>
           <w:rPr>
             <w:rStyle w:val="Hipervnculo"/>
@@ -763,7 +763,7 @@
             <w:noProof/>
             <w:webHidden/>
           </w:rPr>
-          <w:instrText xml:space="preserve"> PAGEREF _Toc241162145 \h </w:instrText>
+          <w:instrText xml:space="preserve"> PAGEREF _Toc241407890 \h </w:instrText>
         </w:r>
         <w:r>
           <w:rPr>
@@ -804,13 +804,13 @@
           <w:noProof/>
         </w:rPr>
       </w:pPr>
-      <w:hyperlink w:anchor="_Toc241162146" w:history="1">
+      <w:hyperlink w:anchor="_Toc241407891" w:history="1">
         <w:r>
           <w:rPr>
             <w:rStyle w:val="Hipervnculo"/>
             <w:noProof/>
           </w:rPr>
-          <w:t>4. Logs de los nodos (recortes reales)</w:t>
+          <w:t>3.3 Vistas de operador de la plantilla</w:t>
         </w:r>
         <w:r>
           <w:rPr>
@@ -831,7 +831,75 @@
             <w:noProof/>
             <w:webHidden/>
           </w:rPr>
-          <w:instrText xml:space="preserve"> PAGEREF _Toc241162146 \h </w:instrText>
+          <w:instrText xml:space="preserve"> PAGEREF _Toc241407891 \h </w:instrText>
+        </w:r>
+        <w:r>
+          <w:rPr>
+            <w:noProof/>
+            <w:webHidden/>
+          </w:rPr>
+        </w:r>
+        <w:r>
+          <w:rPr>
+            <w:noProof/>
+            <w:webHidden/>
+          </w:rPr>
+          <w:fldChar w:fldCharType="separate"/>
+        </w:r>
+        <w:r>
+          <w:rPr>
+            <w:noProof/>
+            <w:webHidden/>
+          </w:rPr>
+          <w:t>8</w:t>
+        </w:r>
+        <w:r>
+          <w:rPr>
+            <w:noProof/>
+            <w:webHidden/>
+          </w:rPr>
+          <w:fldChar w:fldCharType="end"/>
+        </w:r>
+      </w:hyperlink>
+    </w:p>
+    <w:p>
+      <w:pPr>
+        <w:pStyle w:val="TDC1"/>
+        <w:tabs>
+          <w:tab w:val="right" w:leader="dot" w:pos="9628"/>
+        </w:tabs>
+        <w:rPr>
+          <w:noProof/>
+        </w:rPr>
+      </w:pPr>
+      <w:hyperlink w:anchor="_Toc241407892" w:history="1">
+        <w:r>
+          <w:rPr>
+            <w:rStyle w:val="Hipervnculo"/>
+            <w:noProof/>
+          </w:rPr>
+          <w:t>4. Días 2 a 4 — migración a servidor remoto y su evidencia</w:t>
+        </w:r>
+        <w:r>
+          <w:rPr>
+            <w:noProof/>
+            <w:webHidden/>
+          </w:rPr>
+          <w:tab/>
+        </w:r>
+        <w:r>
+          <w:rPr>
+            <w:noProof/>
+            <w:webHidden/>
+          </w:rPr>
+          <w:fldChar w:fldCharType="begin"/>
+        </w:r>
+        <w:r>
+          <w:rPr>
+            <w:noProof/>
+            <w:webHidden/>
+          </w:rPr>
+          <w:instrText xml:space="preserve"> PAGEREF _Toc241407892 \h </w:instrText>
         </w:r>
         <w:r>
           <w:rPr>
@@ -872,13 +940,13 @@
           <w:noProof/>
         </w:rPr>
       </w:pPr>
-      <w:hyperlink w:anchor="_Toc241162147" w:history="1">
+      <w:hyperlink w:anchor="_Toc241407893" w:history="1">
         <w:r>
           <w:rPr>
             <w:rStyle w:val="Hipervnculo"/>
             <w:noProof/>
           </w:rPr>
-          <w:t>DC-RACKC-03 · SDK MQTT</w:t>
+          <w:t>4.1 Día 3 (26-sep) — servidor estable, 8/8 nodos</w:t>
         </w:r>
         <w:r>
           <w:rPr>
@@ -899,211 +967,7 @@
             <w:noProof/>
             <w:webHidden/>
           </w:rPr>
-          <w:instrText xml:space="preserve"> PAGEREF _Toc241162147 \h </w:instrText>
-        </w:r>
-        <w:r>
-          <w:rPr>
-            <w:noProof/>
-            <w:webHidden/>
-          </w:rPr>
-        </w:r>
-        <w:r>
-          <w:rPr>
-            <w:noProof/>
-            <w:webHidden/>
-          </w:rPr>
-          <w:fldChar w:fldCharType="separate"/>
-        </w:r>
-        <w:r>
-          <w:rPr>
-            <w:noProof/>
-            <w:webHidden/>
-          </w:rPr>
-          <w:t>8</w:t>
-        </w:r>
-        <w:r>
-          <w:rPr>
-            <w:noProof/>
-            <w:webHidden/>
-          </w:rPr>
-          <w:fldChar w:fldCharType="end"/>
-        </w:r>
-      </w:hyperlink>
-    </w:p>
-    <w:p>
-      <w:pPr>
-        <w:pStyle w:val="TDC2"/>
-        <w:tabs>
-          <w:tab w:val="right" w:leader="dot" w:pos="9628"/>
-        </w:tabs>
-        <w:rPr>
-          <w:noProof/>
-        </w:rPr>
-      </w:pPr>
-      <w:hyperlink w:anchor="_Toc241162148" w:history="1">
-        <w:r>
-          <w:rPr>
-            <w:rStyle w:val="Hipervnculo"/>
-            <w:noProof/>
-          </w:rPr>
-          <w:t>DC-PASILLO-04 · SDK sobre WebSockets</w:t>
-        </w:r>
-        <w:r>
-          <w:rPr>
-            <w:noProof/>
-            <w:webHidden/>
-          </w:rPr>
-          <w:tab/>
-        </w:r>
-        <w:r>
-          <w:rPr>
-            <w:noProof/>
-            <w:webHidden/>
-          </w:rPr>
-          <w:fldChar w:fldCharType="begin"/>
-        </w:r>
-        <w:r>
-          <w:rPr>
-            <w:noProof/>
-            <w:webHidden/>
-          </w:rPr>
-          <w:instrText xml:space="preserve"> PAGEREF _Toc241162148 \h </w:instrText>
-        </w:r>
-        <w:r>
-          <w:rPr>
-            <w:noProof/>
-            <w:webHidden/>
-          </w:rPr>
-        </w:r>
-        <w:r>
-          <w:rPr>
-            <w:noProof/>
-            <w:webHidden/>
-          </w:rPr>
-          <w:fldChar w:fldCharType="separate"/>
-        </w:r>
-        <w:r>
-          <w:rPr>
-            <w:noProof/>
-            <w:webHidden/>
-          </w:rPr>
-          <w:t>8</w:t>
-        </w:r>
-        <w:r>
-          <w:rPr>
-            <w:noProof/>
-            <w:webHidden/>
-          </w:rPr>
-          <w:fldChar w:fldCharType="end"/>
-        </w:r>
-      </w:hyperlink>
-    </w:p>
-    <w:p>
-      <w:pPr>
-        <w:pStyle w:val="TDC2"/>
-        <w:tabs>
-          <w:tab w:val="right" w:leader="dot" w:pos="9628"/>
-        </w:tabs>
-        <w:rPr>
-          <w:noProof/>
-        </w:rPr>
-      </w:pPr>
-      <w:hyperlink w:anchor="_Toc241162149" w:history="1">
-        <w:r>
-          <w:rPr>
-            <w:rStyle w:val="Hipervnculo"/>
-            <w:noProof/>
-          </w:rPr>
-          <w:t>DC-HUMO-08 · paho explícito</w:t>
-        </w:r>
-        <w:r>
-          <w:rPr>
-            <w:noProof/>
-            <w:webHidden/>
-          </w:rPr>
-          <w:tab/>
-        </w:r>
-        <w:r>
-          <w:rPr>
-            <w:noProof/>
-            <w:webHidden/>
-          </w:rPr>
-          <w:fldChar w:fldCharType="begin"/>
-        </w:r>
-        <w:r>
-          <w:rPr>
-            <w:noProof/>
-            <w:webHidden/>
-          </w:rPr>
-          <w:instrText xml:space="preserve"> PAGEREF _Toc241162149 \h </w:instrText>
-        </w:r>
-        <w:r>
-          <w:rPr>
-            <w:noProof/>
-            <w:webHidden/>
-          </w:rPr>
-        </w:r>
-        <w:r>
-          <w:rPr>
-            <w:noProof/>
-            <w:webHidden/>
-          </w:rPr>
-          <w:fldChar w:fldCharType="separate"/>
-        </w:r>
-        <w:r>
-          <w:rPr>
-            <w:noProof/>
-            <w:webHidden/>
-          </w:rPr>
-          <w:t>8</w:t>
-        </w:r>
-        <w:r>
-          <w:rPr>
-            <w:noProof/>
-            <w:webHidden/>
-          </w:rPr>
-          <w:fldChar w:fldCharType="end"/>
-        </w:r>
-      </w:hyperlink>
-    </w:p>
-    <w:p>
-      <w:pPr>
-        <w:pStyle w:val="TDC2"/>
-        <w:tabs>
-          <w:tab w:val="right" w:leader="dot" w:pos="9628"/>
-        </w:tabs>
-        <w:rPr>
-          <w:noProof/>
-        </w:rPr>
-      </w:pPr>
-      <w:hyperlink w:anchor="_Toc241162150" w:history="1">
-        <w:r>
-          <w:rPr>
-            <w:rStyle w:val="Hipervnculo"/>
-            <w:noProof/>
-          </w:rPr>
-          <w:t>DC-ACCESO-10 · puente HTTP/REST</w:t>
-        </w:r>
-        <w:r>
-          <w:rPr>
-            <w:noProof/>
-            <w:webHidden/>
-          </w:rPr>
-          <w:tab/>
-        </w:r>
-        <w:r>
-          <w:rPr>
-            <w:noProof/>
-            <w:webHidden/>
-          </w:rPr>
-          <w:fldChar w:fldCharType="begin"/>
-        </w:r>
-        <w:r>
-          <w:rPr>
-            <w:noProof/>
-            <w:webHidden/>
-          </w:rPr>
-          <w:instrText xml:space="preserve"> PAGEREF _Toc241162150 \h </w:instrText>
+          <w:instrText xml:space="preserve"> PAGEREF _Toc241407893 \h </w:instrText>
         </w:r>
         <w:r>
           <w:rPr>
@@ -1136,7 +1000,7 @@
     </w:p>
     <w:p>
       <w:pPr>
-        <w:pStyle w:val="TDC1"/>
+        <w:pStyle w:val="TDC2"/>
         <w:tabs>
           <w:tab w:val="right" w:leader="dot" w:pos="9628"/>
         </w:tabs>
@@ -1144,13 +1008,13 @@
           <w:noProof/>
         </w:rPr>
       </w:pPr>
-      <w:hyperlink w:anchor="_Toc241162151" w:history="1">
+      <w:hyperlink w:anchor="_Toc241407894" w:history="1">
         <w:r>
           <w:rPr>
             <w:rStyle w:val="Hipervnculo"/>
             <w:noProof/>
           </w:rPr>
-          <w:t>5. Estado de la flota en el arranque</w:t>
+          <w:t>4.2 Día 4 (27-sep) — solo servidor remoto + Rack B</w:t>
         </w:r>
         <w:r>
           <w:rPr>
@@ -1171,7 +1035,7 @@
             <w:noProof/>
             <w:webHidden/>
           </w:rPr>
-          <w:instrText xml:space="preserve"> PAGEREF _Toc241162151 \h </w:instrText>
+          <w:instrText xml:space="preserve"> PAGEREF _Toc241407894 \h </w:instrText>
         </w:r>
         <w:r>
           <w:rPr>
@@ -1191,7 +1055,415 @@
             <w:noProof/>
             <w:webHidden/>
           </w:rPr>
-          <w:t>9</w:t>
+          <w:t>10</w:t>
+        </w:r>
+        <w:r>
+          <w:rPr>
+            <w:noProof/>
+            <w:webHidden/>
+          </w:rPr>
+          <w:fldChar w:fldCharType="end"/>
+        </w:r>
+      </w:hyperlink>
+    </w:p>
+    <w:p>
+      <w:pPr>
+        <w:pStyle w:val="TDC1"/>
+        <w:tabs>
+          <w:tab w:val="right" w:leader="dot" w:pos="9628"/>
+        </w:tabs>
+        <w:rPr>
+          <w:noProof/>
+        </w:rPr>
+      </w:pPr>
+      <w:hyperlink w:anchor="_Toc241407895" w:history="1">
+        <w:r>
+          <w:rPr>
+            <w:rStyle w:val="Hipervnculo"/>
+            <w:noProof/>
+          </w:rPr>
+          <w:t>5. Logs de los nodos (recortes reales)</w:t>
+        </w:r>
+        <w:r>
+          <w:rPr>
+            <w:noProof/>
+            <w:webHidden/>
+          </w:rPr>
+          <w:tab/>
+        </w:r>
+        <w:r>
+          <w:rPr>
+            <w:noProof/>
+            <w:webHidden/>
+          </w:rPr>
+          <w:fldChar w:fldCharType="begin"/>
+        </w:r>
+        <w:r>
+          <w:rPr>
+            <w:noProof/>
+            <w:webHidden/>
+          </w:rPr>
+          <w:instrText xml:space="preserve"> PAGEREF _Toc241407895 \h </w:instrText>
+        </w:r>
+        <w:r>
+          <w:rPr>
+            <w:noProof/>
+            <w:webHidden/>
+          </w:rPr>
+        </w:r>
+        <w:r>
+          <w:rPr>
+            <w:noProof/>
+            <w:webHidden/>
+          </w:rPr>
+          <w:fldChar w:fldCharType="separate"/>
+        </w:r>
+        <w:r>
+          <w:rPr>
+            <w:noProof/>
+            <w:webHidden/>
+          </w:rPr>
+          <w:t>13</w:t>
+        </w:r>
+        <w:r>
+          <w:rPr>
+            <w:noProof/>
+            <w:webHidden/>
+          </w:rPr>
+          <w:fldChar w:fldCharType="end"/>
+        </w:r>
+      </w:hyperlink>
+    </w:p>
+    <w:p>
+      <w:pPr>
+        <w:pStyle w:val="TDC2"/>
+        <w:tabs>
+          <w:tab w:val="right" w:leader="dot" w:pos="9628"/>
+        </w:tabs>
+        <w:rPr>
+          <w:noProof/>
+        </w:rPr>
+      </w:pPr>
+      <w:hyperlink w:anchor="_Toc241407896" w:history="1">
+        <w:r>
+          <w:rPr>
+            <w:rStyle w:val="Hipervnculo"/>
+            <w:noProof/>
+          </w:rPr>
+          <w:t>DC-RACKC-03 · SDK MQTT</w:t>
+        </w:r>
+        <w:r>
+          <w:rPr>
+            <w:noProof/>
+            <w:webHidden/>
+          </w:rPr>
+          <w:tab/>
+        </w:r>
+        <w:r>
+          <w:rPr>
+            <w:noProof/>
+            <w:webHidden/>
+          </w:rPr>
+          <w:fldChar w:fldCharType="begin"/>
+        </w:r>
+        <w:r>
+          <w:rPr>
+            <w:noProof/>
+            <w:webHidden/>
+          </w:rPr>
+          <w:instrText xml:space="preserve"> PAGEREF _Toc241407896 \h </w:instrText>
+        </w:r>
+        <w:r>
+          <w:rPr>
+            <w:noProof/>
+            <w:webHidden/>
+          </w:rPr>
+        </w:r>
+        <w:r>
+          <w:rPr>
+            <w:noProof/>
+            <w:webHidden/>
+          </w:rPr>
+          <w:fldChar w:fldCharType="separate"/>
+        </w:r>
+        <w:r>
+          <w:rPr>
+            <w:noProof/>
+            <w:webHidden/>
+          </w:rPr>
+          <w:t>13</w:t>
+        </w:r>
+        <w:r>
+          <w:rPr>
+            <w:noProof/>
+            <w:webHidden/>
+          </w:rPr>
+          <w:fldChar w:fldCharType="end"/>
+        </w:r>
+      </w:hyperlink>
+    </w:p>
+    <w:p>
+      <w:pPr>
+        <w:pStyle w:val="TDC2"/>
+        <w:tabs>
+          <w:tab w:val="right" w:leader="dot" w:pos="9628"/>
+        </w:tabs>
+        <w:rPr>
+          <w:noProof/>
+        </w:rPr>
+      </w:pPr>
+      <w:hyperlink w:anchor="_Toc241407897" w:history="1">
+        <w:r>
+          <w:rPr>
+            <w:rStyle w:val="Hipervnculo"/>
+            <w:noProof/>
+          </w:rPr>
+          <w:t>DC-PASILLO-04 · SDK sobre WebSockets</w:t>
+        </w:r>
+        <w:r>
+          <w:rPr>
+            <w:noProof/>
+            <w:webHidden/>
+          </w:rPr>
+          <w:tab/>
+        </w:r>
+        <w:r>
+          <w:rPr>
+            <w:noProof/>
+            <w:webHidden/>
+          </w:rPr>
+          <w:fldChar w:fldCharType="begin"/>
+        </w:r>
+        <w:r>
+          <w:rPr>
+            <w:noProof/>
+            <w:webHidden/>
+          </w:rPr>
+          <w:instrText xml:space="preserve"> PAGEREF _Toc241407897 \h </w:instrText>
+        </w:r>
+        <w:r>
+          <w:rPr>
+            <w:noProof/>
+            <w:webHidden/>
+          </w:rPr>
+        </w:r>
+        <w:r>
+          <w:rPr>
+            <w:noProof/>
+            <w:webHidden/>
+          </w:rPr>
+          <w:fldChar w:fldCharType="separate"/>
+        </w:r>
+        <w:r>
+          <w:rPr>
+            <w:noProof/>
+            <w:webHidden/>
+          </w:rPr>
+          <w:t>13</w:t>
+        </w:r>
+        <w:r>
+          <w:rPr>
+            <w:noProof/>
+            <w:webHidden/>
+          </w:rPr>
+          <w:fldChar w:fldCharType="end"/>
+        </w:r>
+      </w:hyperlink>
+    </w:p>
+    <w:p>
+      <w:pPr>
+        <w:pStyle w:val="TDC2"/>
+        <w:tabs>
+          <w:tab w:val="right" w:leader="dot" w:pos="9628"/>
+        </w:tabs>
+        <w:rPr>
+          <w:noProof/>
+        </w:rPr>
+      </w:pPr>
+      <w:hyperlink w:anchor="_Toc241407898" w:history="1">
+        <w:r>
+          <w:rPr>
+            <w:rStyle w:val="Hipervnculo"/>
+            <w:noProof/>
+          </w:rPr>
+          <w:t>DC-HUMO-08 · paho explícito</w:t>
+        </w:r>
+        <w:r>
+          <w:rPr>
+            <w:noProof/>
+            <w:webHidden/>
+          </w:rPr>
+          <w:tab/>
+        </w:r>
+        <w:r>
+          <w:rPr>
+            <w:noProof/>
+            <w:webHidden/>
+          </w:rPr>
+          <w:fldChar w:fldCharType="begin"/>
+        </w:r>
+        <w:r>
+          <w:rPr>
+            <w:noProof/>
+            <w:webHidden/>
+          </w:rPr>
+          <w:instrText xml:space="preserve"> PAGEREF _Toc241407898 \h </w:instrText>
+        </w:r>
+        <w:r>
+          <w:rPr>
+            <w:noProof/>
+            <w:webHidden/>
+          </w:rPr>
+        </w:r>
+        <w:r>
+          <w:rPr>
+            <w:noProof/>
+            <w:webHidden/>
+          </w:rPr>
+          <w:fldChar w:fldCharType="separate"/>
+        </w:r>
+        <w:r>
+          <w:rPr>
+            <w:noProof/>
+            <w:webHidden/>
+          </w:rPr>
+          <w:t>13</w:t>
+        </w:r>
+        <w:r>
+          <w:rPr>
+            <w:noProof/>
+            <w:webHidden/>
+          </w:rPr>
+          <w:fldChar w:fldCharType="end"/>
+        </w:r>
+      </w:hyperlink>
+    </w:p>
+    <w:p>
+      <w:pPr>
+        <w:pStyle w:val="TDC2"/>
+        <w:tabs>
+          <w:tab w:val="right" w:leader="dot" w:pos="9628"/>
+        </w:tabs>
+        <w:rPr>
+          <w:noProof/>
+        </w:rPr>
+      </w:pPr>
+      <w:hyperlink w:anchor="_Toc241407899" w:history="1">
+        <w:r>
+          <w:rPr>
+            <w:rStyle w:val="Hipervnculo"/>
+            <w:noProof/>
+          </w:rPr>
+          <w:t>DC-ACCESO-10 · puente HTTP/REST</w:t>
+        </w:r>
+        <w:r>
+          <w:rPr>
+            <w:noProof/>
+            <w:webHidden/>
+          </w:rPr>
+          <w:tab/>
+        </w:r>
+        <w:r>
+          <w:rPr>
+            <w:noProof/>
+            <w:webHidden/>
+          </w:rPr>
+          <w:fldChar w:fldCharType="begin"/>
+        </w:r>
+        <w:r>
+          <w:rPr>
+            <w:noProof/>
+            <w:webHidden/>
+          </w:rPr>
+          <w:instrText xml:space="preserve"> PAGEREF _Toc241407899 \h </w:instrText>
+        </w:r>
+        <w:r>
+          <w:rPr>
+            <w:noProof/>
+            <w:webHidden/>
+          </w:rPr>
+        </w:r>
+        <w:r>
+          <w:rPr>
+            <w:noProof/>
+            <w:webHidden/>
+          </w:rPr>
+          <w:fldChar w:fldCharType="separate"/>
+        </w:r>
+        <w:r>
+          <w:rPr>
+            <w:noProof/>
+            <w:webHidden/>
+          </w:rPr>
+          <w:t>14</w:t>
+        </w:r>
+        <w:r>
+          <w:rPr>
+            <w:noProof/>
+            <w:webHidden/>
+          </w:rPr>
+          <w:fldChar w:fldCharType="end"/>
+        </w:r>
+      </w:hyperlink>
+    </w:p>
+    <w:p>
+      <w:pPr>
+        <w:pStyle w:val="TDC1"/>
+        <w:tabs>
+          <w:tab w:val="right" w:leader="dot" w:pos="9628"/>
+        </w:tabs>
+        <w:rPr>
+          <w:noProof/>
+        </w:rPr>
+      </w:pPr>
+      <w:hyperlink w:anchor="_Toc241407900" w:history="1">
+        <w:r>
+          <w:rPr>
+            <w:rStyle w:val="Hipervnculo"/>
+            <w:noProof/>
+          </w:rPr>
+          <w:t>6. Estado de la flota en el arranque</w:t>
+        </w:r>
+        <w:r>
+          <w:rPr>
+            <w:noProof/>
+            <w:webHidden/>
+          </w:rPr>
+          <w:tab/>
+        </w:r>
+        <w:r>
+          <w:rPr>
+            <w:noProof/>
+            <w:webHidden/>
+          </w:rPr>
+          <w:fldChar w:fldCharType="begin"/>
+        </w:r>
+        <w:r>
+          <w:rPr>
+            <w:noProof/>
+            <w:webHidden/>
+          </w:rPr>
+          <w:instrText xml:space="preserve"> PAGEREF _Toc241407900 \h </w:instrText>
+        </w:r>
+        <w:r>
+          <w:rPr>
+            <w:noProof/>
+            <w:webHidden/>
+          </w:rPr>
+        </w:r>
+        <w:r>
+          <w:rPr>
+            <w:noProof/>
+            <w:webHidden/>
+          </w:rPr>
+          <w:fldChar w:fldCharType="separate"/>
+        </w:r>
+        <w:r>
+          <w:rPr>
+            <w:noProof/>
+            <w:webHidden/>
+          </w:rPr>
+          <w:t>14</w:t>
         </w:r>
         <w:r>
           <w:rPr>
@@ -1216,7 +1488,7 @@
       <w:pPr>
         <w:pStyle w:val="Ttulo1"/>
       </w:pPr>
-      <w:bookmarkStart w:id="0" w:name="_Toc241162140"/>
+      <w:bookmarkStart w:id="0" w:name="_Toc241407885"/>
       <w:r>
         <w:lastRenderedPageBreak/>
         <w:t>Matriz de cumplimiento (rúbrica → evidencia)</w:t>
@@ -1432,7 +1704,7 @@
               <w:rPr>
                 <w:sz w:val="19"/>
               </w:rPr>
-              <w:t>capturas 01, 02, 06-09 · secciones 4 y 9 del informe · RULES_*.png</w:t>
+              <w:t>capturas 01, 02, 06-09, 13 · secciones 4, 5 y 9 del informe · RULES_*.png</w:t>
             </w:r>
           </w:p>
         </w:tc>
@@ -1632,7 +1904,7 @@
               <w:rPr>
                 <w:sz w:val="19"/>
               </w:rPr>
-              <w:t>capturas 02-05 y 10-12 (datos crudos por origen) · logs de nodos · hueco documentado</w:t>
+              <w:t>capturas 02-05, 10-12, 14-21 (datos crudos por origen y por fecha) · logs de nodos · sección 6.1 del informe (4 incidentes reales de desconexión/reconexión)</w:t>
             </w:r>
           </w:p>
         </w:tc>
@@ -1732,7 +2004,7 @@
               <w:rPr>
                 <w:sz w:val="19"/>
               </w:rPr>
-              <w:t>docs/04-ventana-4-dias.md · resumen_datos.py · capturas del Data Explorer</w:t>
+              <w:t>docs/04-ventana-4-dias.md · sección 7 y anexo B del informe · capturas del Data Explorer · [tabla comparativa final pendiente de cierre de la fecha 4]</w:t>
             </w:r>
           </w:p>
         </w:tc>
@@ -1929,7 +2201,7 @@
               <w:rPr>
                 <w:sz w:val="19"/>
               </w:rPr>
-              <w:t>capturas 10-12 (Python en el portátil y Wokwi en el navegador en vivo)</w:t>
+              <w:t>capturas 15-16 y 19-21 (Python en el servidor Ubuntu y Wokwi en el navegador, en vivo el 26 y 27 de septiembre)</w:t>
             </w:r>
           </w:p>
         </w:tc>
@@ -1944,7 +2216,7 @@
       <w:pPr>
         <w:pStyle w:val="Ttulo1"/>
       </w:pPr>
-      <w:bookmarkStart w:id="1" w:name="_Toc241162141"/>
+      <w:bookmarkStart w:id="1" w:name="_Toc241407886"/>
       <w:r>
         <w:t>1. Flota en Azure IoT Central</w:t>
       </w:r>
@@ -1967,7 +2239,7 @@
         </w:rPr>
         <w:lastRenderedPageBreak/>
         <w:drawing>
-          <wp:inline distT="0" distB="0" distL="0" distR="0" wp14:anchorId="0CEA9B84" wp14:editId="1F5CD0E0">
+          <wp:inline distT="0" distB="0" distL="0" distR="0" wp14:anchorId="6123A8E2" wp14:editId="3012D958">
             <wp:extent cx="5940000" cy="3712500"/>
             <wp:effectExtent l="0" t="0" r="0" b="0"/>
             <wp:docPr id="1" name="Picture 1"/>
@@ -2029,7 +2301,7 @@
       <w:pPr>
         <w:pStyle w:val="Ttulo1"/>
       </w:pPr>
-      <w:bookmarkStart w:id="2" w:name="_Toc241162142"/>
+      <w:bookmarkStart w:id="2" w:name="_Toc241407887"/>
       <w:r>
         <w:t>2. Datos sin procesar por origen de envío</w:t>
       </w:r>
@@ -2051,7 +2323,7 @@
           <w:noProof/>
         </w:rPr>
         <w:drawing>
-          <wp:inline distT="0" distB="0" distL="0" distR="0" wp14:anchorId="46C5E483" wp14:editId="30DC45D7">
+          <wp:inline distT="0" distB="0" distL="0" distR="0" wp14:anchorId="5E28C661" wp14:editId="5D4F6708">
             <wp:extent cx="5940000" cy="3712500"/>
             <wp:effectExtent l="0" t="0" r="0" b="0"/>
             <wp:docPr id="2" name="Picture 2"/>
@@ -2121,7 +2393,7 @@
         </w:rPr>
         <w:lastRenderedPageBreak/>
         <w:drawing>
-          <wp:inline distT="0" distB="0" distL="0" distR="0" wp14:anchorId="0D701131" wp14:editId="1F502E3D">
+          <wp:inline distT="0" distB="0" distL="0" distR="0" wp14:anchorId="4A30780B" wp14:editId="407A2B8B">
             <wp:extent cx="5940000" cy="3712500"/>
             <wp:effectExtent l="0" t="0" r="0" b="0"/>
             <wp:docPr id="3" name="Picture 3"/>
@@ -2190,7 +2462,7 @@
           <w:noProof/>
         </w:rPr>
         <w:drawing>
-          <wp:inline distT="0" distB="0" distL="0" distR="0" wp14:anchorId="620A9ECB" wp14:editId="4C7ABA45">
+          <wp:inline distT="0" distB="0" distL="0" distR="0" wp14:anchorId="29E53C67" wp14:editId="5A4B0B24">
             <wp:extent cx="5940000" cy="3712500"/>
             <wp:effectExtent l="0" t="0" r="0" b="0"/>
             <wp:docPr id="4" name="Picture 4"/>
@@ -2257,7 +2529,7 @@
       <w:pPr>
         <w:pStyle w:val="Ttulo1"/>
       </w:pPr>
-      <w:bookmarkStart w:id="3" w:name="_Toc241162143"/>
+      <w:bookmarkStart w:id="3" w:name="_Toc241407888"/>
       <w:r>
         <w:lastRenderedPageBreak/>
         <w:t>3. Cuarto de control</w:t>
@@ -2275,7 +2547,7 @@
           <w:noProof/>
         </w:rPr>
         <w:drawing>
-          <wp:inline distT="0" distB="0" distL="0" distR="0" wp14:anchorId="1B48D1D2" wp14:editId="53A61637">
+          <wp:inline distT="0" distB="0" distL="0" distR="0" wp14:anchorId="0BF7481C" wp14:editId="28962075">
             <wp:extent cx="5940000" cy="3712500"/>
             <wp:effectExtent l="0" t="0" r="0" b="0"/>
             <wp:docPr id="5" name="Picture 5"/>
@@ -2337,7 +2609,7 @@
       <w:pPr>
         <w:pStyle w:val="Ttulo1"/>
       </w:pPr>
-      <w:bookmarkStart w:id="4" w:name="_Toc241162144"/>
+      <w:bookmarkStart w:id="4" w:name="_Toc241407889"/>
       <w:r>
         <w:t>3.1 Reglas configuradas</w:t>
       </w:r>
@@ -2360,7 +2632,7 @@
         </w:rPr>
         <w:lastRenderedPageBreak/>
         <w:drawing>
-          <wp:inline distT="0" distB="0" distL="0" distR="0" wp14:anchorId="25AF2D46" wp14:editId="4C68A27B">
+          <wp:inline distT="0" distB="0" distL="0" distR="0" wp14:anchorId="2267EA85" wp14:editId="079CA4C5">
             <wp:extent cx="5940000" cy="3712500"/>
             <wp:effectExtent l="0" t="0" r="0" b="0"/>
             <wp:docPr id="6" name="Picture 6"/>
@@ -2422,7 +2694,7 @@
       <w:pPr>
         <w:pStyle w:val="Ttulo1"/>
       </w:pPr>
-      <w:bookmarkStart w:id="5" w:name="_Toc241162145"/>
+      <w:bookmarkStart w:id="5" w:name="_Toc241407890"/>
       <w:r>
         <w:t>3.2 Flota y estado de aprovisionamiento al cierre del día</w:t>
       </w:r>
@@ -2439,7 +2711,7 @@
           <w:noProof/>
         </w:rPr>
         <w:drawing>
-          <wp:inline distT="0" distB="0" distL="0" distR="0" wp14:anchorId="652E3088" wp14:editId="3808C82B">
+          <wp:inline distT="0" distB="0" distL="0" distR="0" wp14:anchorId="1F69D2BD" wp14:editId="39C666D7">
             <wp:extent cx="5940000" cy="3712500"/>
             <wp:effectExtent l="0" t="0" r="0" b="0"/>
             <wp:docPr id="7" name="Picture 7"/>
@@ -2498,15 +2770,755 @@
       </w:r>
     </w:p>
     <w:p>
+      <w:r>
+        <w:br w:type="page"/>
+      </w:r>
+    </w:p>
+    <w:p>
       <w:pPr>
         <w:pStyle w:val="Ttulo1"/>
       </w:pPr>
-      <w:bookmarkStart w:id="6" w:name="_Toc241162146"/>
+      <w:bookmarkStart w:id="6" w:name="_Toc241407891"/>
       <w:r>
         <w:lastRenderedPageBreak/>
-        <w:t>4. Logs de los nodos (recortes reales)</w:t>
+        <w:t>3.3 Vistas de operador de la plantilla</w:t>
       </w:r>
       <w:bookmarkEnd w:id="6"/>
+    </w:p>
+    <w:p>
+      <w:r>
+        <w:t>Además del panel de aplicación (sección 3), la plantilla publica dos vistas de operador propias: Overview (KPIs y gráficos de todas las telemetrías del gemelo) y About (propiedades editables). Ambas se generan a partir del modelo publicado y están disponibles para cualquier dispositivo de la flota.</w:t>
+      </w:r>
+    </w:p>
+    <w:p>
+      <w:pPr>
+        <w:keepNext/>
+        <w:spacing w:after="60"/>
+        <w:jc w:val="center"/>
+      </w:pPr>
+      <w:r>
+        <w:rPr>
+          <w:noProof/>
+        </w:rPr>
+        <w:drawing>
+          <wp:inline distT="0" distB="0" distL="0" distR="0" wp14:anchorId="0B641934" wp14:editId="1A27A43A">
+            <wp:extent cx="5940000" cy="3712500"/>
+            <wp:effectExtent l="0" t="0" r="0" b="0"/>
+            <wp:docPr id="8" name="Picture 8"/>
+            <wp:cNvGraphicFramePr>
+              <a:graphicFrameLocks xmlns:a="http://schemas.openxmlformats.org/drawingml/2006/main" noChangeAspect="1"/>
+            </wp:cNvGraphicFramePr>
+            <a:graphic xmlns:a="http://schemas.openxmlformats.org/drawingml/2006/main">
+              <a:graphicData uri="http://schemas.openxmlformats.org/drawingml/2006/picture">
+                <pic:pic xmlns:pic="http://schemas.openxmlformats.org/drawingml/2006/picture">
+                  <pic:nvPicPr>
+                    <pic:cNvPr id="0" name="dia4-views-plantilla.png"/>
+                    <pic:cNvPicPr/>
+                  </pic:nvPicPr>
+                  <pic:blipFill>
+                    <a:blip r:embed="rId14"/>
+                    <a:stretch>
+                      <a:fillRect/>
+                    </a:stretch>
+                  </pic:blipFill>
+                  <pic:spPr>
+                    <a:xfrm>
+                      <a:off x="0" y="0"/>
+                      <a:ext cx="5940000" cy="3712500"/>
+                    </a:xfrm>
+                    <a:prstGeom prst="rect">
+                      <a:avLst/>
+                    </a:prstGeom>
+                  </pic:spPr>
+                </pic:pic>
+              </a:graphicData>
+            </a:graphic>
+          </wp:inline>
+        </w:drawing>
+      </w:r>
+    </w:p>
+    <w:p>
+      <w:pPr>
+        <w:spacing w:after="200"/>
+        <w:jc w:val="center"/>
+      </w:pPr>
+      <w:r>
+        <w:rPr>
+          <w:b/>
+          <w:color w:val="1F5FA8"/>
+          <w:sz w:val="18"/>
+        </w:rPr>
+        <w:t xml:space="preserve">Figura 8. </w:t>
+      </w:r>
+      <w:r>
+        <w:rPr>
+          <w:i/>
+          <w:color w:val="5B6570"/>
+          <w:sz w:val="18"/>
+        </w:rPr>
+        <w:t>Captura 13 — Vistas configuradas en la plantilla Nodo DC-ANDES-1 (Overview, About).</w:t>
+      </w:r>
+    </w:p>
+    <w:p>
+      <w:pPr>
+        <w:pStyle w:val="Ttulo1"/>
+      </w:pPr>
+      <w:bookmarkStart w:id="7" w:name="_Toc241407892"/>
+      <w:r>
+        <w:t>4. Días 2 a 4 — migración a servidor remoto y su evidencia</w:t>
+      </w:r>
+      <w:bookmarkEnd w:id="7"/>
+    </w:p>
+    <w:p>
+      <w:r>
+        <w:t>A partir del 25 de septiembre los nodos Python se trasladaron a un servidor Ubuntu remoto (52.252.133.127) para ejecutar, en la sustentación, el segundo de los dos códigos en un equipo distinto al portátil. Las capturas siguientes documentan el estado de esa infraestructura en las fechas 3 y 4, ya con el supervisor remoto corregido (incidente 6.1 del informe).</w:t>
+      </w:r>
+    </w:p>
+    <w:p>
+      <w:pPr>
+        <w:pStyle w:val="Ttulo2"/>
+      </w:pPr>
+      <w:bookmarkStart w:id="8" w:name="_Toc241407893"/>
+      <w:r>
+        <w:lastRenderedPageBreak/>
+        <w:t>4.1 Día 3 (26-sep) — servidor estable, 8/8 nodos</w:t>
+      </w:r>
+      <w:bookmarkEnd w:id="8"/>
+    </w:p>
+    <w:p>
+      <w:pPr>
+        <w:keepNext/>
+        <w:spacing w:after="60"/>
+        <w:jc w:val="center"/>
+      </w:pPr>
+      <w:r>
+        <w:rPr>
+          <w:noProof/>
+        </w:rPr>
+        <w:drawing>
+          <wp:inline distT="0" distB="0" distL="0" distR="0" wp14:anchorId="7DD411B8" wp14:editId="4BB8B914">
+            <wp:extent cx="5940000" cy="3712500"/>
+            <wp:effectExtent l="0" t="0" r="0" b="0"/>
+            <wp:docPr id="9" name="Picture 9"/>
+            <wp:cNvGraphicFramePr>
+              <a:graphicFrameLocks xmlns:a="http://schemas.openxmlformats.org/drawingml/2006/main" noChangeAspect="1"/>
+            </wp:cNvGraphicFramePr>
+            <a:graphic xmlns:a="http://schemas.openxmlformats.org/drawingml/2006/main">
+              <a:graphicData uri="http://schemas.openxmlformats.org/drawingml/2006/picture">
+                <pic:pic xmlns:pic="http://schemas.openxmlformats.org/drawingml/2006/picture">
+                  <pic:nvPicPr>
+                    <pic:cNvPr id="0" name="01-flota-10-dispositivos.png"/>
+                    <pic:cNvPicPr/>
+                  </pic:nvPicPr>
+                  <pic:blipFill>
+                    <a:blip r:embed="rId8"/>
+                    <a:stretch>
+                      <a:fillRect/>
+                    </a:stretch>
+                  </pic:blipFill>
+                  <pic:spPr>
+                    <a:xfrm>
+                      <a:off x="0" y="0"/>
+                      <a:ext cx="5940000" cy="3712500"/>
+                    </a:xfrm>
+                    <a:prstGeom prst="rect">
+                      <a:avLst/>
+                    </a:prstGeom>
+                  </pic:spPr>
+                </pic:pic>
+              </a:graphicData>
+            </a:graphic>
+          </wp:inline>
+        </w:drawing>
+      </w:r>
+    </w:p>
+    <w:p>
+      <w:pPr>
+        <w:spacing w:after="200"/>
+        <w:jc w:val="center"/>
+      </w:pPr>
+      <w:r>
+        <w:rPr>
+          <w:b/>
+          <w:color w:val="1F5FA8"/>
+          <w:sz w:val="18"/>
+        </w:rPr>
+        <w:t xml:space="preserve">Figura 9. </w:t>
+      </w:r>
+      <w:r>
+        <w:rPr>
+          <w:i/>
+          <w:color w:val="5B6570"/>
+          <w:sz w:val="18"/>
+        </w:rPr>
+        <w:t>Captura 14 — Flota completa (10 dispositivos) el 26 de septiembre.</w:t>
+      </w:r>
+    </w:p>
+    <w:p>
+      <w:pPr>
+        <w:keepNext/>
+        <w:spacing w:after="60"/>
+        <w:jc w:val="center"/>
+      </w:pPr>
+      <w:r>
+        <w:rPr>
+          <w:noProof/>
+        </w:rPr>
+        <w:drawing>
+          <wp:inline distT="0" distB="0" distL="0" distR="0" wp14:anchorId="08A10A36" wp14:editId="25117A35">
+            <wp:extent cx="5940000" cy="3722400"/>
+            <wp:effectExtent l="0" t="0" r="0" b="0"/>
+            <wp:docPr id="10" name="Picture 10"/>
+            <wp:cNvGraphicFramePr>
+              <a:graphicFrameLocks xmlns:a="http://schemas.openxmlformats.org/drawingml/2006/main" noChangeAspect="1"/>
+            </wp:cNvGraphicFramePr>
+            <a:graphic xmlns:a="http://schemas.openxmlformats.org/drawingml/2006/main">
+              <a:graphicData uri="http://schemas.openxmlformats.org/drawingml/2006/picture">
+                <pic:pic xmlns:pic="http://schemas.openxmlformats.org/drawingml/2006/picture">
+                  <pic:nvPicPr>
+                    <pic:cNvPr id="0" name="dia3-datos-rackc.png"/>
+                    <pic:cNvPicPr/>
+                  </pic:nvPicPr>
+                  <pic:blipFill>
+                    <a:blip r:embed="rId15"/>
+                    <a:stretch>
+                      <a:fillRect/>
+                    </a:stretch>
+                  </pic:blipFill>
+                  <pic:spPr>
+                    <a:xfrm>
+                      <a:off x="0" y="0"/>
+                      <a:ext cx="5940000" cy="3722400"/>
+                    </a:xfrm>
+                    <a:prstGeom prst="rect">
+                      <a:avLst/>
+                    </a:prstGeom>
+                  </pic:spPr>
+                </pic:pic>
+              </a:graphicData>
+            </a:graphic>
+          </wp:inline>
+        </w:drawing>
+      </w:r>
+    </w:p>
+    <w:p>
+      <w:pPr>
+        <w:spacing w:after="200"/>
+        <w:jc w:val="center"/>
+      </w:pPr>
+      <w:r>
+        <w:rPr>
+          <w:b/>
+          <w:color w:val="1F5FA8"/>
+          <w:sz w:val="18"/>
+        </w:rPr>
+        <w:t xml:space="preserve">Figura 10. </w:t>
+      </w:r>
+      <w:r>
+        <w:rPr>
+          <w:i/>
+          <w:color w:val="5B6570"/>
+          <w:sz w:val="18"/>
+        </w:rPr>
+        <w:t>Captura 15 — DC-RACKC-03 publicando desde el servidor Ubuntu: Conectado, telemetría cada 30 s.</w:t>
+      </w:r>
+    </w:p>
+    <w:p>
+      <w:pPr>
+        <w:keepNext/>
+        <w:spacing w:after="60"/>
+        <w:jc w:val="center"/>
+      </w:pPr>
+      <w:r>
+        <w:rPr>
+          <w:noProof/>
+        </w:rPr>
+        <w:lastRenderedPageBreak/>
+        <w:drawing>
+          <wp:inline distT="0" distB="0" distL="0" distR="0" wp14:anchorId="2A8A0CC3" wp14:editId="0D184F96">
+            <wp:extent cx="5940000" cy="3722400"/>
+            <wp:effectExtent l="0" t="0" r="0" b="0"/>
+            <wp:docPr id="11" name="Picture 11"/>
+            <wp:cNvGraphicFramePr>
+              <a:graphicFrameLocks xmlns:a="http://schemas.openxmlformats.org/drawingml/2006/main" noChangeAspect="1"/>
+            </wp:cNvGraphicFramePr>
+            <a:graphic xmlns:a="http://schemas.openxmlformats.org/drawingml/2006/main">
+              <a:graphicData uri="http://schemas.openxmlformats.org/drawingml/2006/picture">
+                <pic:pic xmlns:pic="http://schemas.openxmlformats.org/drawingml/2006/picture">
+                  <pic:nvPicPr>
+                    <pic:cNvPr id="0" name="dia3-wokwi-rackb.png"/>
+                    <pic:cNvPicPr/>
+                  </pic:nvPicPr>
+                  <pic:blipFill>
+                    <a:blip r:embed="rId16"/>
+                    <a:stretch>
+                      <a:fillRect/>
+                    </a:stretch>
+                  </pic:blipFill>
+                  <pic:spPr>
+                    <a:xfrm>
+                      <a:off x="0" y="0"/>
+                      <a:ext cx="5940000" cy="3722400"/>
+                    </a:xfrm>
+                    <a:prstGeom prst="rect">
+                      <a:avLst/>
+                    </a:prstGeom>
+                  </pic:spPr>
+                </pic:pic>
+              </a:graphicData>
+            </a:graphic>
+          </wp:inline>
+        </w:drawing>
+      </w:r>
+    </w:p>
+    <w:p>
+      <w:pPr>
+        <w:spacing w:after="200"/>
+        <w:jc w:val="center"/>
+      </w:pPr>
+      <w:r>
+        <w:rPr>
+          <w:b/>
+          <w:color w:val="1F5FA8"/>
+          <w:sz w:val="18"/>
+        </w:rPr>
+        <w:t xml:space="preserve">Figura 11. </w:t>
+      </w:r>
+      <w:r>
+        <w:rPr>
+          <w:i/>
+          <w:color w:val="5B6570"/>
+          <w:sz w:val="18"/>
+        </w:rPr>
+        <w:t>Captura 16 — Monitor serie del ESP32 Rack B publicando en vivo (26-sep).</w:t>
+      </w:r>
+    </w:p>
+    <w:p>
+      <w:pPr>
+        <w:keepNext/>
+        <w:spacing w:after="60"/>
+        <w:jc w:val="center"/>
+      </w:pPr>
+      <w:r>
+        <w:rPr>
+          <w:noProof/>
+        </w:rPr>
+        <w:drawing>
+          <wp:inline distT="0" distB="0" distL="0" distR="0" wp14:anchorId="78B1F08D" wp14:editId="5D6640DD">
+            <wp:extent cx="5940000" cy="3722400"/>
+            <wp:effectExtent l="0" t="0" r="0" b="0"/>
+            <wp:docPr id="12" name="Picture 12"/>
+            <wp:cNvGraphicFramePr>
+              <a:graphicFrameLocks xmlns:a="http://schemas.openxmlformats.org/drawingml/2006/main" noChangeAspect="1"/>
+            </wp:cNvGraphicFramePr>
+            <a:graphic xmlns:a="http://schemas.openxmlformats.org/drawingml/2006/main">
+              <a:graphicData uri="http://schemas.openxmlformats.org/drawingml/2006/picture">
+                <pic:pic xmlns:pic="http://schemas.openxmlformats.org/drawingml/2006/picture">
+                  <pic:nvPicPr>
+                    <pic:cNvPr id="0" name="dia3-panel.png"/>
+                    <pic:cNvPicPr/>
+                  </pic:nvPicPr>
+                  <pic:blipFill>
+                    <a:blip r:embed="rId17"/>
+                    <a:stretch>
+                      <a:fillRect/>
+                    </a:stretch>
+                  </pic:blipFill>
+                  <pic:spPr>
+                    <a:xfrm>
+                      <a:off x="0" y="0"/>
+                      <a:ext cx="5940000" cy="3722400"/>
+                    </a:xfrm>
+                    <a:prstGeom prst="rect">
+                      <a:avLst/>
+                    </a:prstGeom>
+                  </pic:spPr>
+                </pic:pic>
+              </a:graphicData>
+            </a:graphic>
+          </wp:inline>
+        </w:drawing>
+      </w:r>
+    </w:p>
+    <w:p>
+      <w:pPr>
+        <w:spacing w:after="200"/>
+        <w:jc w:val="center"/>
+      </w:pPr>
+      <w:r>
+        <w:rPr>
+          <w:b/>
+          <w:color w:val="1F5FA8"/>
+          <w:sz w:val="18"/>
+        </w:rPr>
+        <w:t xml:space="preserve">Figura 12. </w:t>
+      </w:r>
+      <w:r>
+        <w:rPr>
+          <w:i/>
+          <w:color w:val="5B6570"/>
+          <w:sz w:val="18"/>
+        </w:rPr>
+        <w:t>Captura 17 — Panel Cuarto de Control con datos del 26 de septiembre.</w:t>
+      </w:r>
+    </w:p>
+    <w:p>
+      <w:pPr>
+        <w:pStyle w:val="Ttulo2"/>
+      </w:pPr>
+      <w:bookmarkStart w:id="9" w:name="_Toc241407894"/>
+      <w:r>
+        <w:t>4.2 Día 4 (27-sep) — solo servidor remoto + Rack B</w:t>
+      </w:r>
+      <w:bookmarkEnd w:id="9"/>
+    </w:p>
+    <w:p>
+      <w:r>
+        <w:t>Para la fecha 4 se detuvo intencionalmente la flota local: toda la telemetría Python proviene exclusivamente del servidor Ubuntu, aislando esa infraestructura como el segundo código en vivo de la sustentación (el primero es el ESP32 en el navegador).</w:t>
+      </w:r>
+    </w:p>
+    <w:p>
+      <w:pPr>
+        <w:keepNext/>
+        <w:spacing w:after="60"/>
+        <w:jc w:val="center"/>
+      </w:pPr>
+      <w:r>
+        <w:rPr>
+          <w:noProof/>
+        </w:rPr>
+        <w:lastRenderedPageBreak/>
+        <w:drawing>
+          <wp:inline distT="0" distB="0" distL="0" distR="0" wp14:anchorId="36D35100" wp14:editId="63D74A5C">
+            <wp:extent cx="5940000" cy="3722400"/>
+            <wp:effectExtent l="0" t="0" r="0" b="0"/>
+            <wp:docPr id="13" name="Picture 13"/>
+            <wp:cNvGraphicFramePr>
+              <a:graphicFrameLocks xmlns:a="http://schemas.openxmlformats.org/drawingml/2006/main" noChangeAspect="1"/>
+            </wp:cNvGraphicFramePr>
+            <a:graphic xmlns:a="http://schemas.openxmlformats.org/drawingml/2006/main">
+              <a:graphicData uri="http://schemas.openxmlformats.org/drawingml/2006/picture">
+                <pic:pic xmlns:pic="http://schemas.openxmlformats.org/drawingml/2006/picture">
+                  <pic:nvPicPr>
+                    <pic:cNvPr id="0" name="dia4-portal-flota.png"/>
+                    <pic:cNvPicPr/>
+                  </pic:nvPicPr>
+                  <pic:blipFill>
+                    <a:blip r:embed="rId18"/>
+                    <a:stretch>
+                      <a:fillRect/>
+                    </a:stretch>
+                  </pic:blipFill>
+                  <pic:spPr>
+                    <a:xfrm>
+                      <a:off x="0" y="0"/>
+                      <a:ext cx="5940000" cy="3722400"/>
+                    </a:xfrm>
+                    <a:prstGeom prst="rect">
+                      <a:avLst/>
+                    </a:prstGeom>
+                  </pic:spPr>
+                </pic:pic>
+              </a:graphicData>
+            </a:graphic>
+          </wp:inline>
+        </w:drawing>
+      </w:r>
+    </w:p>
+    <w:p>
+      <w:pPr>
+        <w:spacing w:after="200"/>
+        <w:jc w:val="center"/>
+      </w:pPr>
+      <w:r>
+        <w:rPr>
+          <w:b/>
+          <w:color w:val="1F5FA8"/>
+          <w:sz w:val="18"/>
+        </w:rPr>
+        <w:t xml:space="preserve">Figura 13. </w:t>
+      </w:r>
+      <w:r>
+        <w:rPr>
+          <w:i/>
+          <w:color w:val="5B6570"/>
+          <w:sz w:val="18"/>
+        </w:rPr>
+        <w:t>Captura 18 — Flota el 27 de septiembre, con los 7 nodos Python publicando solo desde el servidor.</w:t>
+      </w:r>
+    </w:p>
+    <w:p>
+      <w:pPr>
+        <w:keepNext/>
+        <w:spacing w:after="60"/>
+        <w:jc w:val="center"/>
+      </w:pPr>
+      <w:r>
+        <w:rPr>
+          <w:noProof/>
+        </w:rPr>
+        <w:drawing>
+          <wp:inline distT="0" distB="0" distL="0" distR="0" wp14:anchorId="554C91B3" wp14:editId="757E578A">
+            <wp:extent cx="5940000" cy="3722400"/>
+            <wp:effectExtent l="0" t="0" r="0" b="0"/>
+            <wp:docPr id="14" name="Picture 14"/>
+            <wp:cNvGraphicFramePr>
+              <a:graphicFrameLocks xmlns:a="http://schemas.openxmlformats.org/drawingml/2006/main" noChangeAspect="1"/>
+            </wp:cNvGraphicFramePr>
+            <a:graphic xmlns:a="http://schemas.openxmlformats.org/drawingml/2006/main">
+              <a:graphicData uri="http://schemas.openxmlformats.org/drawingml/2006/picture">
+                <pic:pic xmlns:pic="http://schemas.openxmlformats.org/drawingml/2006/picture">
+                  <pic:nvPicPr>
+                    <pic:cNvPr id="0" name="dia4-datos-rackc.png"/>
+                    <pic:cNvPicPr/>
+                  </pic:nvPicPr>
+                  <pic:blipFill>
+                    <a:blip r:embed="rId19"/>
+                    <a:stretch>
+                      <a:fillRect/>
+                    </a:stretch>
+                  </pic:blipFill>
+                  <pic:spPr>
+                    <a:xfrm>
+                      <a:off x="0" y="0"/>
+                      <a:ext cx="5940000" cy="3722400"/>
+                    </a:xfrm>
+                    <a:prstGeom prst="rect">
+                      <a:avLst/>
+                    </a:prstGeom>
+                  </pic:spPr>
+                </pic:pic>
+              </a:graphicData>
+            </a:graphic>
+          </wp:inline>
+        </w:drawing>
+      </w:r>
+    </w:p>
+    <w:p>
+      <w:pPr>
+        <w:spacing w:after="200"/>
+        <w:jc w:val="center"/>
+      </w:pPr>
+      <w:r>
+        <w:rPr>
+          <w:b/>
+          <w:color w:val="1F5FA8"/>
+          <w:sz w:val="18"/>
+        </w:rPr>
+        <w:t xml:space="preserve">Figura 14. </w:t>
+      </w:r>
+      <w:r>
+        <w:rPr>
+          <w:i/>
+          <w:color w:val="5B6570"/>
+          <w:sz w:val="18"/>
+        </w:rPr>
+        <w:t>Captura 19 — DC-RACKC-03 (servidor Ubuntu), Conectado, 27/9/2026.</w:t>
+      </w:r>
+    </w:p>
+    <w:p>
+      <w:pPr>
+        <w:keepNext/>
+        <w:spacing w:after="60"/>
+        <w:jc w:val="center"/>
+      </w:pPr>
+      <w:r>
+        <w:rPr>
+          <w:noProof/>
+        </w:rPr>
+        <w:lastRenderedPageBreak/>
+        <w:drawing>
+          <wp:inline distT="0" distB="0" distL="0" distR="0" wp14:anchorId="0AF14F55" wp14:editId="667D2FA4">
+            <wp:extent cx="5940000" cy="3722400"/>
+            <wp:effectExtent l="0" t="0" r="0" b="0"/>
+            <wp:docPr id="15" name="Picture 15"/>
+            <wp:cNvGraphicFramePr>
+              <a:graphicFrameLocks xmlns:a="http://schemas.openxmlformats.org/drawingml/2006/main" noChangeAspect="1"/>
+            </wp:cNvGraphicFramePr>
+            <a:graphic xmlns:a="http://schemas.openxmlformats.org/drawingml/2006/main">
+              <a:graphicData uri="http://schemas.openxmlformats.org/drawingml/2006/picture">
+                <pic:pic xmlns:pic="http://schemas.openxmlformats.org/drawingml/2006/picture">
+                  <pic:nvPicPr>
+                    <pic:cNvPr id="0" name="dia4-datos-humo.png"/>
+                    <pic:cNvPicPr/>
+                  </pic:nvPicPr>
+                  <pic:blipFill>
+                    <a:blip r:embed="rId20"/>
+                    <a:stretch>
+                      <a:fillRect/>
+                    </a:stretch>
+                  </pic:blipFill>
+                  <pic:spPr>
+                    <a:xfrm>
+                      <a:off x="0" y="0"/>
+                      <a:ext cx="5940000" cy="3722400"/>
+                    </a:xfrm>
+                    <a:prstGeom prst="rect">
+                      <a:avLst/>
+                    </a:prstGeom>
+                  </pic:spPr>
+                </pic:pic>
+              </a:graphicData>
+            </a:graphic>
+          </wp:inline>
+        </w:drawing>
+      </w:r>
+    </w:p>
+    <w:p>
+      <w:pPr>
+        <w:spacing w:after="200"/>
+        <w:jc w:val="center"/>
+      </w:pPr>
+      <w:r>
+        <w:rPr>
+          <w:b/>
+          <w:color w:val="1F5FA8"/>
+          <w:sz w:val="18"/>
+        </w:rPr>
+        <w:t xml:space="preserve">Figura 15. </w:t>
+      </w:r>
+      <w:r>
+        <w:rPr>
+          <w:i/>
+          <w:color w:val="5B6570"/>
+          <w:sz w:val="18"/>
+        </w:rPr>
+        <w:t>Captura 20 — DC-HUMO-08 (servidor Ubuntu), 27/9/2026.</w:t>
+      </w:r>
+    </w:p>
+    <w:p>
+      <w:pPr>
+        <w:keepNext/>
+        <w:spacing w:after="60"/>
+        <w:jc w:val="center"/>
+      </w:pPr>
+      <w:r>
+        <w:rPr>
+          <w:noProof/>
+        </w:rPr>
+        <w:drawing>
+          <wp:inline distT="0" distB="0" distL="0" distR="0" wp14:anchorId="6B999685" wp14:editId="7E305463">
+            <wp:extent cx="5940000" cy="3722400"/>
+            <wp:effectExtent l="0" t="0" r="0" b="0"/>
+            <wp:docPr id="16" name="Picture 16"/>
+            <wp:cNvGraphicFramePr>
+              <a:graphicFrameLocks xmlns:a="http://schemas.openxmlformats.org/drawingml/2006/main" noChangeAspect="1"/>
+            </wp:cNvGraphicFramePr>
+            <a:graphic xmlns:a="http://schemas.openxmlformats.org/drawingml/2006/main">
+              <a:graphicData uri="http://schemas.openxmlformats.org/drawingml/2006/picture">
+                <pic:pic xmlns:pic="http://schemas.openxmlformats.org/drawingml/2006/picture">
+                  <pic:nvPicPr>
+                    <pic:cNvPr id="0" name="dia4-wokwi-rackb.png"/>
+                    <pic:cNvPicPr/>
+                  </pic:nvPicPr>
+                  <pic:blipFill>
+                    <a:blip r:embed="rId21"/>
+                    <a:stretch>
+                      <a:fillRect/>
+                    </a:stretch>
+                  </pic:blipFill>
+                  <pic:spPr>
+                    <a:xfrm>
+                      <a:off x="0" y="0"/>
+                      <a:ext cx="5940000" cy="3722400"/>
+                    </a:xfrm>
+                    <a:prstGeom prst="rect">
+                      <a:avLst/>
+                    </a:prstGeom>
+                  </pic:spPr>
+                </pic:pic>
+              </a:graphicData>
+            </a:graphic>
+          </wp:inline>
+        </w:drawing>
+      </w:r>
+    </w:p>
+    <w:p>
+      <w:pPr>
+        <w:spacing w:after="200"/>
+        <w:jc w:val="center"/>
+      </w:pPr>
+      <w:r>
+        <w:rPr>
+          <w:b/>
+          <w:color w:val="1F5FA8"/>
+          <w:sz w:val="18"/>
+        </w:rPr>
+        <w:t xml:space="preserve">Figura 16. </w:t>
+      </w:r>
+      <w:r>
+        <w:rPr>
+          <w:i/>
+          <w:color w:val="5B6570"/>
+          <w:sz w:val="18"/>
+        </w:rPr>
+        <w:t>Captura 21 — Monitor serie del ESP32 Rack B, 27/9/2026.</w:t>
+      </w:r>
+    </w:p>
+    <w:tbl>
+      <w:tblPr>
+        <w:tblW w:w="0" w:type="auto"/>
+        <w:jc w:val="center"/>
+        <w:tblLook w:val="04A0" w:firstRow="1" w:lastRow="0" w:firstColumn="1" w:lastColumn="0" w:noHBand="0" w:noVBand="1"/>
+      </w:tblPr>
+      <w:tblGrid>
+        <w:gridCol w:w="9638"/>
+      </w:tblGrid>
+      <w:tr>
+        <w:trPr>
+          <w:cantSplit/>
+          <w:jc w:val="center"/>
+        </w:trPr>
+        <w:tc>
+          <w:tcPr>
+            <w:tcW w:w="9638" w:type="dxa"/>
+            <w:tcBorders>
+              <w:top w:val="nil"/>
+              <w:left w:val="single" w:sz="24" w:space="0" w:color="C47A19"/>
+              <w:bottom w:val="nil"/>
+              <w:right w:val="nil"/>
+            </w:tcBorders>
+            <w:shd w:val="clear" w:color="auto" w:fill="FFF6E5"/>
+            <w:tcMar>
+              <w:top w:w="120" w:type="dxa"/>
+              <w:left w:w="200" w:type="dxa"/>
+              <w:bottom w:w="120" w:type="dxa"/>
+              <w:right w:w="160" w:type="dxa"/>
+            </w:tcMar>
+          </w:tcPr>
+          <w:p>
+            <w:r>
+              <w:rPr>
+                <w:b/>
+                <w:color w:val="C47A19"/>
+              </w:rPr>
+              <w:t xml:space="preserve">Evidencia de cierre — pendiente  </w:t>
+            </w:r>
+            <w:r>
+              <w:rPr>
+                <w:sz w:val="20"/>
+              </w:rPr>
+              <w:t>[PENDIENTE AL CIERRE] Cuando la fecha 4 complete el mínimo de horas se añade aquí la captura final de cierre (última recepción de datos de cada nodo) y, si el nodo de agua logra simular antes del cierre, su evidencia correspondiente.</w:t>
+            </w:r>
+          </w:p>
+        </w:tc>
+      </w:tr>
+    </w:tbl>
+    <w:p>
+      <w:pPr>
+        <w:spacing w:after="40"/>
+      </w:pPr>
+    </w:p>
+    <w:p>
+      <w:pPr>
+        <w:pStyle w:val="Ttulo1"/>
+      </w:pPr>
+      <w:bookmarkStart w:id="10" w:name="_Toc241407895"/>
+      <w:r>
+        <w:lastRenderedPageBreak/>
+        <w:t>5. Logs de los nodos (recortes reales)</w:t>
+      </w:r>
+      <w:bookmarkEnd w:id="10"/>
     </w:p>
     <w:p>
       <w:r>
@@ -2517,11 +3529,11 @@
       <w:pPr>
         <w:pStyle w:val="Ttulo2"/>
       </w:pPr>
-      <w:bookmarkStart w:id="7" w:name="_Toc241162147"/>
+      <w:bookmarkStart w:id="11" w:name="_Toc241407896"/>
       <w:r>
         <w:t>DC-RACKC-03 · SDK MQTT</w:t>
       </w:r>
-      <w:bookmarkEnd w:id="7"/>
+      <w:bookmarkEnd w:id="11"/>
     </w:p>
     <w:tbl>
       <w:tblPr>
@@ -2663,11 +3675,11 @@
       <w:pPr>
         <w:pStyle w:val="Ttulo2"/>
       </w:pPr>
-      <w:bookmarkStart w:id="8" w:name="_Toc241162148"/>
+      <w:bookmarkStart w:id="12" w:name="_Toc241407897"/>
       <w:r>
         <w:t>DC-PASILLO-04 · SDK sobre WebSockets</w:t>
       </w:r>
-      <w:bookmarkEnd w:id="8"/>
+      <w:bookmarkEnd w:id="12"/>
     </w:p>
     <w:tbl>
       <w:tblPr>
@@ -2809,11 +3821,11 @@
       <w:pPr>
         <w:pStyle w:val="Ttulo2"/>
       </w:pPr>
-      <w:bookmarkStart w:id="9" w:name="_Toc241162149"/>
+      <w:bookmarkStart w:id="13" w:name="_Toc241407898"/>
       <w:r>
         <w:t>DC-HUMO-08 · paho explícito</w:t>
       </w:r>
-      <w:bookmarkEnd w:id="9"/>
+      <w:bookmarkEnd w:id="13"/>
     </w:p>
     <w:tbl>
       <w:tblPr>
@@ -2955,12 +3967,12 @@
       <w:pPr>
         <w:pStyle w:val="Ttulo2"/>
       </w:pPr>
-      <w:bookmarkStart w:id="10" w:name="_Toc241162150"/>
+      <w:bookmarkStart w:id="14" w:name="_Toc241407899"/>
       <w:r>
         <w:lastRenderedPageBreak/>
         <w:t>DC-ACCESO-10 · puente HTTP/REST</w:t>
       </w:r>
-      <w:bookmarkEnd w:id="10"/>
+      <w:bookmarkEnd w:id="14"/>
     </w:p>
     <w:tbl>
       <w:tblPr>
@@ -3102,11 +4114,11 @@
       <w:pPr>
         <w:pStyle w:val="Ttulo1"/>
       </w:pPr>
-      <w:bookmarkStart w:id="11" w:name="_Toc241162151"/>
+      <w:bookmarkStart w:id="15" w:name="_Toc241407900"/>
       <w:r>
-        <w:t>5. Estado de la flota en el arranque</w:t>
+        <w:t>6. Estado de la flota en el arranque</w:t>
       </w:r>
-      <w:bookmarkEnd w:id="11"/>
+      <w:bookmarkEnd w:id="15"/>
     </w:p>
     <w:tbl>
       <w:tblPr>
@@ -3346,8 +4358,8 @@
       </w:r>
     </w:p>
     <w:sectPr>
-      <w:headerReference w:type="default" r:id="rId14"/>
-      <w:footerReference w:type="default" r:id="rId15"/>
+      <w:headerReference w:type="default" r:id="rId22"/>
+      <w:footerReference w:type="default" r:id="rId23"/>
       <w:pgSz w:w="11906" w:h="16838"/>
       <w:pgMar w:top="1134" w:right="1134" w:bottom="1020" w:left="1134" w:header="720" w:footer="720" w:gutter="0"/>
       <w:cols w:space="720"/>
@@ -3696,31 +4708,31 @@
       </w:rPr>
     </w:lvl>
   </w:abstractNum>
-  <w:num w:numId="1" w16cid:durableId="1267889994">
+  <w:num w:numId="1" w16cid:durableId="1302226955">
     <w:abstractNumId w:val="8"/>
   </w:num>
-  <w:num w:numId="2" w16cid:durableId="657617444">
+  <w:num w:numId="2" w16cid:durableId="759057762">
     <w:abstractNumId w:val="6"/>
   </w:num>
-  <w:num w:numId="3" w16cid:durableId="1982270322">
+  <w:num w:numId="3" w16cid:durableId="181625125">
     <w:abstractNumId w:val="5"/>
   </w:num>
-  <w:num w:numId="4" w16cid:durableId="898593376">
+  <w:num w:numId="4" w16cid:durableId="7223322">
     <w:abstractNumId w:val="4"/>
   </w:num>
-  <w:num w:numId="5" w16cid:durableId="1589465705">
+  <w:num w:numId="5" w16cid:durableId="1346402259">
     <w:abstractNumId w:val="7"/>
   </w:num>
-  <w:num w:numId="6" w16cid:durableId="1113787720">
+  <w:num w:numId="6" w16cid:durableId="443695494">
     <w:abstractNumId w:val="3"/>
   </w:num>
-  <w:num w:numId="7" w16cid:durableId="1616208989">
+  <w:num w:numId="7" w16cid:durableId="2136941344">
     <w:abstractNumId w:val="2"/>
   </w:num>
-  <w:num w:numId="8" w16cid:durableId="1653870981">
+  <w:num w:numId="8" w16cid:durableId="1647510401">
     <w:abstractNumId w:val="1"/>
   </w:num>
-  <w:num w:numId="9" w16cid:durableId="676225484">
+  <w:num w:numId="9" w16cid:durableId="1095251696">
     <w:abstractNumId w:val="0"/>
   </w:num>
 </w:numbering>
@@ -15113,7 +16125,7 @@
     <w:autoRedefine/>
     <w:uiPriority w:val="39"/>
     <w:unhideWhenUsed/>
-    <w:rsid w:val="00ED419D"/>
+    <w:rsid w:val="00B515A5"/>
     <w:pPr>
       <w:spacing w:after="100"/>
     </w:pPr>
@@ -15125,7 +16137,7 @@
     <w:autoRedefine/>
     <w:uiPriority w:val="39"/>
     <w:unhideWhenUsed/>
-    <w:rsid w:val="00ED419D"/>
+    <w:rsid w:val="00B515A5"/>
     <w:pPr>
       <w:spacing w:after="100"/>
       <w:ind w:left="210"/>
@@ -15136,7 +16148,7 @@
     <w:basedOn w:val="Fuentedeprrafopredeter"/>
     <w:uiPriority w:val="99"/>
     <w:unhideWhenUsed/>
-    <w:rsid w:val="00ED419D"/>
+    <w:rsid w:val="00B515A5"/>
     <w:rPr>
       <w:color w:val="0000FF" w:themeColor="hyperlink"/>
       <w:u w:val="single"/>

</xml_diff>

<commit_message>
Cierre de la ventana de 4 días: fecha 4 completada (4h32) y documentos finales
- fecha 4: 10:28-15:00 (4h32, 1621 muestras), supera el minimo de 4h exigido
- tools/comparativa_4dias.py: comparativa real de max/min/promedio/recuento/sumatoria de las 4 fechas
  por variable, calculada desde datos/*.csv (24-26 sep) y datos/remoto_dia4/*.csv (27-sep)
- docs/04-ventana-4-dias.md: tabla de horas actualizada (35h38 total) + comparativa completa insertada
- informe y anexo regenerados sin placeholders: 17 y 15 paginas, verificado con extraccion de texto que
  ningun marcador [COMPLETAR AL CIERRE]/[PENDIENTE]/EN CURSO permanece
- evidencias/dia4-cierre-flota.png: captura de cierre de la flota completa
- datos/remoto_dia4/: copia de los CSV del servidor al cierre (evidencia preservada)
</commit_message>
<xml_diff>
--- a/informe/Evidencias_Parcial1_DC-ANDES-1.docx
+++ b/informe/Evidencias_Parcial1_DC-ANDES-1.docx
@@ -396,7 +396,7 @@
       <w:r>
         <w:fldChar w:fldCharType="separate"/>
       </w:r>
-      <w:hyperlink w:anchor="_Toc241407885" w:history="1">
+      <w:hyperlink w:anchor="_Toc241413914" w:history="1">
         <w:r>
           <w:rPr>
             <w:rStyle w:val="Hipervnculo"/>
@@ -423,7 +423,7 @@
             <w:noProof/>
             <w:webHidden/>
           </w:rPr>
-          <w:instrText xml:space="preserve"> PAGEREF _Toc241407885 \h </w:instrText>
+          <w:instrText xml:space="preserve"> PAGEREF _Toc241413914 \h </w:instrText>
         </w:r>
         <w:r>
           <w:rPr>
@@ -464,7 +464,7 @@
           <w:noProof/>
         </w:rPr>
       </w:pPr>
-      <w:hyperlink w:anchor="_Toc241407886" w:history="1">
+      <w:hyperlink w:anchor="_Toc241413915" w:history="1">
         <w:r>
           <w:rPr>
             <w:rStyle w:val="Hipervnculo"/>
@@ -491,7 +491,7 @@
             <w:noProof/>
             <w:webHidden/>
           </w:rPr>
-          <w:instrText xml:space="preserve"> PAGEREF _Toc241407886 \h </w:instrText>
+          <w:instrText xml:space="preserve"> PAGEREF _Toc241413915 \h </w:instrText>
         </w:r>
         <w:r>
           <w:rPr>
@@ -532,7 +532,7 @@
           <w:noProof/>
         </w:rPr>
       </w:pPr>
-      <w:hyperlink w:anchor="_Toc241407887" w:history="1">
+      <w:hyperlink w:anchor="_Toc241413916" w:history="1">
         <w:r>
           <w:rPr>
             <w:rStyle w:val="Hipervnculo"/>
@@ -559,7 +559,7 @@
             <w:noProof/>
             <w:webHidden/>
           </w:rPr>
-          <w:instrText xml:space="preserve"> PAGEREF _Toc241407887 \h </w:instrText>
+          <w:instrText xml:space="preserve"> PAGEREF _Toc241413916 \h </w:instrText>
         </w:r>
         <w:r>
           <w:rPr>
@@ -600,7 +600,7 @@
           <w:noProof/>
         </w:rPr>
       </w:pPr>
-      <w:hyperlink w:anchor="_Toc241407888" w:history="1">
+      <w:hyperlink w:anchor="_Toc241413917" w:history="1">
         <w:r>
           <w:rPr>
             <w:rStyle w:val="Hipervnculo"/>
@@ -627,7 +627,7 @@
             <w:noProof/>
             <w:webHidden/>
           </w:rPr>
-          <w:instrText xml:space="preserve"> PAGEREF _Toc241407888 \h </w:instrText>
+          <w:instrText xml:space="preserve"> PAGEREF _Toc241413917 \h </w:instrText>
         </w:r>
         <w:r>
           <w:rPr>
@@ -668,7 +668,7 @@
           <w:noProof/>
         </w:rPr>
       </w:pPr>
-      <w:hyperlink w:anchor="_Toc241407889" w:history="1">
+      <w:hyperlink w:anchor="_Toc241413918" w:history="1">
         <w:r>
           <w:rPr>
             <w:rStyle w:val="Hipervnculo"/>
@@ -695,7 +695,7 @@
             <w:noProof/>
             <w:webHidden/>
           </w:rPr>
-          <w:instrText xml:space="preserve"> PAGEREF _Toc241407889 \h </w:instrText>
+          <w:instrText xml:space="preserve"> PAGEREF _Toc241413918 \h </w:instrText>
         </w:r>
         <w:r>
           <w:rPr>
@@ -736,7 +736,7 @@
           <w:noProof/>
         </w:rPr>
       </w:pPr>
-      <w:hyperlink w:anchor="_Toc241407890" w:history="1">
+      <w:hyperlink w:anchor="_Toc241413919" w:history="1">
         <w:r>
           <w:rPr>
             <w:rStyle w:val="Hipervnculo"/>
@@ -763,7 +763,7 @@
             <w:noProof/>
             <w:webHidden/>
           </w:rPr>
-          <w:instrText xml:space="preserve"> PAGEREF _Toc241407890 \h </w:instrText>
+          <w:instrText xml:space="preserve"> PAGEREF _Toc241413919 \h </w:instrText>
         </w:r>
         <w:r>
           <w:rPr>
@@ -804,7 +804,7 @@
           <w:noProof/>
         </w:rPr>
       </w:pPr>
-      <w:hyperlink w:anchor="_Toc241407891" w:history="1">
+      <w:hyperlink w:anchor="_Toc241413920" w:history="1">
         <w:r>
           <w:rPr>
             <w:rStyle w:val="Hipervnculo"/>
@@ -831,7 +831,7 @@
             <w:noProof/>
             <w:webHidden/>
           </w:rPr>
-          <w:instrText xml:space="preserve"> PAGEREF _Toc241407891 \h </w:instrText>
+          <w:instrText xml:space="preserve"> PAGEREF _Toc241413920 \h </w:instrText>
         </w:r>
         <w:r>
           <w:rPr>
@@ -872,7 +872,7 @@
           <w:noProof/>
         </w:rPr>
       </w:pPr>
-      <w:hyperlink w:anchor="_Toc241407892" w:history="1">
+      <w:hyperlink w:anchor="_Toc241413921" w:history="1">
         <w:r>
           <w:rPr>
             <w:rStyle w:val="Hipervnculo"/>
@@ -899,7 +899,7 @@
             <w:noProof/>
             <w:webHidden/>
           </w:rPr>
-          <w:instrText xml:space="preserve"> PAGEREF _Toc241407892 \h </w:instrText>
+          <w:instrText xml:space="preserve"> PAGEREF _Toc241413921 \h </w:instrText>
         </w:r>
         <w:r>
           <w:rPr>
@@ -940,7 +940,7 @@
           <w:noProof/>
         </w:rPr>
       </w:pPr>
-      <w:hyperlink w:anchor="_Toc241407893" w:history="1">
+      <w:hyperlink w:anchor="_Toc241413922" w:history="1">
         <w:r>
           <w:rPr>
             <w:rStyle w:val="Hipervnculo"/>
@@ -967,7 +967,7 @@
             <w:noProof/>
             <w:webHidden/>
           </w:rPr>
-          <w:instrText xml:space="preserve"> PAGEREF _Toc241407893 \h </w:instrText>
+          <w:instrText xml:space="preserve"> PAGEREF _Toc241413922 \h </w:instrText>
         </w:r>
         <w:r>
           <w:rPr>
@@ -1008,7 +1008,7 @@
           <w:noProof/>
         </w:rPr>
       </w:pPr>
-      <w:hyperlink w:anchor="_Toc241407894" w:history="1">
+      <w:hyperlink w:anchor="_Toc241413923" w:history="1">
         <w:r>
           <w:rPr>
             <w:rStyle w:val="Hipervnculo"/>
@@ -1035,7 +1035,7 @@
             <w:noProof/>
             <w:webHidden/>
           </w:rPr>
-          <w:instrText xml:space="preserve"> PAGEREF _Toc241407894 \h </w:instrText>
+          <w:instrText xml:space="preserve"> PAGEREF _Toc241413923 \h </w:instrText>
         </w:r>
         <w:r>
           <w:rPr>
@@ -1076,7 +1076,7 @@
           <w:noProof/>
         </w:rPr>
       </w:pPr>
-      <w:hyperlink w:anchor="_Toc241407895" w:history="1">
+      <w:hyperlink w:anchor="_Toc241413924" w:history="1">
         <w:r>
           <w:rPr>
             <w:rStyle w:val="Hipervnculo"/>
@@ -1103,7 +1103,7 @@
             <w:noProof/>
             <w:webHidden/>
           </w:rPr>
-          <w:instrText xml:space="preserve"> PAGEREF _Toc241407895 \h </w:instrText>
+          <w:instrText xml:space="preserve"> PAGEREF _Toc241413924 \h </w:instrText>
         </w:r>
         <w:r>
           <w:rPr>
@@ -1144,7 +1144,7 @@
           <w:noProof/>
         </w:rPr>
       </w:pPr>
-      <w:hyperlink w:anchor="_Toc241407896" w:history="1">
+      <w:hyperlink w:anchor="_Toc241413925" w:history="1">
         <w:r>
           <w:rPr>
             <w:rStyle w:val="Hipervnculo"/>
@@ -1171,7 +1171,7 @@
             <w:noProof/>
             <w:webHidden/>
           </w:rPr>
-          <w:instrText xml:space="preserve"> PAGEREF _Toc241407896 \h </w:instrText>
+          <w:instrText xml:space="preserve"> PAGEREF _Toc241413925 \h </w:instrText>
         </w:r>
         <w:r>
           <w:rPr>
@@ -1212,7 +1212,7 @@
           <w:noProof/>
         </w:rPr>
       </w:pPr>
-      <w:hyperlink w:anchor="_Toc241407897" w:history="1">
+      <w:hyperlink w:anchor="_Toc241413926" w:history="1">
         <w:r>
           <w:rPr>
             <w:rStyle w:val="Hipervnculo"/>
@@ -1239,7 +1239,7 @@
             <w:noProof/>
             <w:webHidden/>
           </w:rPr>
-          <w:instrText xml:space="preserve"> PAGEREF _Toc241407897 \h </w:instrText>
+          <w:instrText xml:space="preserve"> PAGEREF _Toc241413926 \h </w:instrText>
         </w:r>
         <w:r>
           <w:rPr>
@@ -1259,7 +1259,7 @@
             <w:noProof/>
             <w:webHidden/>
           </w:rPr>
-          <w:t>13</w:t>
+          <w:t>14</w:t>
         </w:r>
         <w:r>
           <w:rPr>
@@ -1280,7 +1280,7 @@
           <w:noProof/>
         </w:rPr>
       </w:pPr>
-      <w:hyperlink w:anchor="_Toc241407898" w:history="1">
+      <w:hyperlink w:anchor="_Toc241413927" w:history="1">
         <w:r>
           <w:rPr>
             <w:rStyle w:val="Hipervnculo"/>
@@ -1307,7 +1307,7 @@
             <w:noProof/>
             <w:webHidden/>
           </w:rPr>
-          <w:instrText xml:space="preserve"> PAGEREF _Toc241407898 \h </w:instrText>
+          <w:instrText xml:space="preserve"> PAGEREF _Toc241413927 \h </w:instrText>
         </w:r>
         <w:r>
           <w:rPr>
@@ -1327,7 +1327,7 @@
             <w:noProof/>
             <w:webHidden/>
           </w:rPr>
-          <w:t>13</w:t>
+          <w:t>14</w:t>
         </w:r>
         <w:r>
           <w:rPr>
@@ -1348,7 +1348,7 @@
           <w:noProof/>
         </w:rPr>
       </w:pPr>
-      <w:hyperlink w:anchor="_Toc241407899" w:history="1">
+      <w:hyperlink w:anchor="_Toc241413928" w:history="1">
         <w:r>
           <w:rPr>
             <w:rStyle w:val="Hipervnculo"/>
@@ -1375,7 +1375,7 @@
             <w:noProof/>
             <w:webHidden/>
           </w:rPr>
-          <w:instrText xml:space="preserve"> PAGEREF _Toc241407899 \h </w:instrText>
+          <w:instrText xml:space="preserve"> PAGEREF _Toc241413928 \h </w:instrText>
         </w:r>
         <w:r>
           <w:rPr>
@@ -1416,7 +1416,7 @@
           <w:noProof/>
         </w:rPr>
       </w:pPr>
-      <w:hyperlink w:anchor="_Toc241407900" w:history="1">
+      <w:hyperlink w:anchor="_Toc241413929" w:history="1">
         <w:r>
           <w:rPr>
             <w:rStyle w:val="Hipervnculo"/>
@@ -1443,7 +1443,7 @@
             <w:noProof/>
             <w:webHidden/>
           </w:rPr>
-          <w:instrText xml:space="preserve"> PAGEREF _Toc241407900 \h </w:instrText>
+          <w:instrText xml:space="preserve"> PAGEREF _Toc241413929 \h </w:instrText>
         </w:r>
         <w:r>
           <w:rPr>
@@ -1463,7 +1463,7 @@
             <w:noProof/>
             <w:webHidden/>
           </w:rPr>
-          <w:t>14</w:t>
+          <w:t>15</w:t>
         </w:r>
         <w:r>
           <w:rPr>
@@ -1488,7 +1488,7 @@
       <w:pPr>
         <w:pStyle w:val="Ttulo1"/>
       </w:pPr>
-      <w:bookmarkStart w:id="0" w:name="_Toc241407885"/>
+      <w:bookmarkStart w:id="0" w:name="_Toc241413914"/>
       <w:r>
         <w:lastRenderedPageBreak/>
         <w:t>Matriz de cumplimiento (rúbrica → evidencia)</w:t>
@@ -2216,7 +2216,7 @@
       <w:pPr>
         <w:pStyle w:val="Ttulo1"/>
       </w:pPr>
-      <w:bookmarkStart w:id="1" w:name="_Toc241407886"/>
+      <w:bookmarkStart w:id="1" w:name="_Toc241413915"/>
       <w:r>
         <w:t>1. Flota en Azure IoT Central</w:t>
       </w:r>
@@ -2239,7 +2239,7 @@
         </w:rPr>
         <w:lastRenderedPageBreak/>
         <w:drawing>
-          <wp:inline distT="0" distB="0" distL="0" distR="0" wp14:anchorId="6123A8E2" wp14:editId="3012D958">
+          <wp:inline distT="0" distB="0" distL="0" distR="0" wp14:anchorId="68BE6730" wp14:editId="6B899DD6">
             <wp:extent cx="5940000" cy="3712500"/>
             <wp:effectExtent l="0" t="0" r="0" b="0"/>
             <wp:docPr id="1" name="Picture 1"/>
@@ -2301,7 +2301,7 @@
       <w:pPr>
         <w:pStyle w:val="Ttulo1"/>
       </w:pPr>
-      <w:bookmarkStart w:id="2" w:name="_Toc241407887"/>
+      <w:bookmarkStart w:id="2" w:name="_Toc241413916"/>
       <w:r>
         <w:t>2. Datos sin procesar por origen de envío</w:t>
       </w:r>
@@ -2323,7 +2323,7 @@
           <w:noProof/>
         </w:rPr>
         <w:drawing>
-          <wp:inline distT="0" distB="0" distL="0" distR="0" wp14:anchorId="5E28C661" wp14:editId="5D4F6708">
+          <wp:inline distT="0" distB="0" distL="0" distR="0" wp14:anchorId="19790F2F" wp14:editId="54483C0A">
             <wp:extent cx="5940000" cy="3712500"/>
             <wp:effectExtent l="0" t="0" r="0" b="0"/>
             <wp:docPr id="2" name="Picture 2"/>
@@ -2393,7 +2393,7 @@
         </w:rPr>
         <w:lastRenderedPageBreak/>
         <w:drawing>
-          <wp:inline distT="0" distB="0" distL="0" distR="0" wp14:anchorId="4A30780B" wp14:editId="407A2B8B">
+          <wp:inline distT="0" distB="0" distL="0" distR="0" wp14:anchorId="72342DC9" wp14:editId="56CD7646">
             <wp:extent cx="5940000" cy="3712500"/>
             <wp:effectExtent l="0" t="0" r="0" b="0"/>
             <wp:docPr id="3" name="Picture 3"/>
@@ -2462,7 +2462,7 @@
           <w:noProof/>
         </w:rPr>
         <w:drawing>
-          <wp:inline distT="0" distB="0" distL="0" distR="0" wp14:anchorId="29E53C67" wp14:editId="5A4B0B24">
+          <wp:inline distT="0" distB="0" distL="0" distR="0" wp14:anchorId="233F37D1" wp14:editId="4B4D2557">
             <wp:extent cx="5940000" cy="3712500"/>
             <wp:effectExtent l="0" t="0" r="0" b="0"/>
             <wp:docPr id="4" name="Picture 4"/>
@@ -2529,7 +2529,7 @@
       <w:pPr>
         <w:pStyle w:val="Ttulo1"/>
       </w:pPr>
-      <w:bookmarkStart w:id="3" w:name="_Toc241407888"/>
+      <w:bookmarkStart w:id="3" w:name="_Toc241413917"/>
       <w:r>
         <w:lastRenderedPageBreak/>
         <w:t>3. Cuarto de control</w:t>
@@ -2547,7 +2547,7 @@
           <w:noProof/>
         </w:rPr>
         <w:drawing>
-          <wp:inline distT="0" distB="0" distL="0" distR="0" wp14:anchorId="0BF7481C" wp14:editId="28962075">
+          <wp:inline distT="0" distB="0" distL="0" distR="0" wp14:anchorId="699E6154" wp14:editId="7C08D4D7">
             <wp:extent cx="5940000" cy="3712500"/>
             <wp:effectExtent l="0" t="0" r="0" b="0"/>
             <wp:docPr id="5" name="Picture 5"/>
@@ -2609,7 +2609,7 @@
       <w:pPr>
         <w:pStyle w:val="Ttulo1"/>
       </w:pPr>
-      <w:bookmarkStart w:id="4" w:name="_Toc241407889"/>
+      <w:bookmarkStart w:id="4" w:name="_Toc241413918"/>
       <w:r>
         <w:t>3.1 Reglas configuradas</w:t>
       </w:r>
@@ -2632,7 +2632,7 @@
         </w:rPr>
         <w:lastRenderedPageBreak/>
         <w:drawing>
-          <wp:inline distT="0" distB="0" distL="0" distR="0" wp14:anchorId="2267EA85" wp14:editId="079CA4C5">
+          <wp:inline distT="0" distB="0" distL="0" distR="0" wp14:anchorId="79DA2993" wp14:editId="4179D4C7">
             <wp:extent cx="5940000" cy="3712500"/>
             <wp:effectExtent l="0" t="0" r="0" b="0"/>
             <wp:docPr id="6" name="Picture 6"/>
@@ -2694,7 +2694,7 @@
       <w:pPr>
         <w:pStyle w:val="Ttulo1"/>
       </w:pPr>
-      <w:bookmarkStart w:id="5" w:name="_Toc241407890"/>
+      <w:bookmarkStart w:id="5" w:name="_Toc241413919"/>
       <w:r>
         <w:t>3.2 Flota y estado de aprovisionamiento al cierre del día</w:t>
       </w:r>
@@ -2711,7 +2711,7 @@
           <w:noProof/>
         </w:rPr>
         <w:drawing>
-          <wp:inline distT="0" distB="0" distL="0" distR="0" wp14:anchorId="1F69D2BD" wp14:editId="39C666D7">
+          <wp:inline distT="0" distB="0" distL="0" distR="0" wp14:anchorId="79E4B12E" wp14:editId="556E1836">
             <wp:extent cx="5940000" cy="3712500"/>
             <wp:effectExtent l="0" t="0" r="0" b="0"/>
             <wp:docPr id="7" name="Picture 7"/>
@@ -2778,7 +2778,7 @@
       <w:pPr>
         <w:pStyle w:val="Ttulo1"/>
       </w:pPr>
-      <w:bookmarkStart w:id="6" w:name="_Toc241407891"/>
+      <w:bookmarkStart w:id="6" w:name="_Toc241413920"/>
       <w:r>
         <w:lastRenderedPageBreak/>
         <w:t>3.3 Vistas de operador de la plantilla</w:t>
@@ -2801,7 +2801,7 @@
           <w:noProof/>
         </w:rPr>
         <w:drawing>
-          <wp:inline distT="0" distB="0" distL="0" distR="0" wp14:anchorId="0B641934" wp14:editId="1A27A43A">
+          <wp:inline distT="0" distB="0" distL="0" distR="0" wp14:anchorId="7BA3BC09" wp14:editId="53719F1A">
             <wp:extent cx="5940000" cy="3712500"/>
             <wp:effectExtent l="0" t="0" r="0" b="0"/>
             <wp:docPr id="8" name="Picture 8"/>
@@ -2863,7 +2863,7 @@
       <w:pPr>
         <w:pStyle w:val="Ttulo1"/>
       </w:pPr>
-      <w:bookmarkStart w:id="7" w:name="_Toc241407892"/>
+      <w:bookmarkStart w:id="7" w:name="_Toc241413921"/>
       <w:r>
         <w:t>4. Días 2 a 4 — migración a servidor remoto y su evidencia</w:t>
       </w:r>
@@ -2878,7 +2878,7 @@
       <w:pPr>
         <w:pStyle w:val="Ttulo2"/>
       </w:pPr>
-      <w:bookmarkStart w:id="8" w:name="_Toc241407893"/>
+      <w:bookmarkStart w:id="8" w:name="_Toc241413922"/>
       <w:r>
         <w:lastRenderedPageBreak/>
         <w:t>4.1 Día 3 (26-sep) — servidor estable, 8/8 nodos</w:t>
@@ -2896,7 +2896,7 @@
           <w:noProof/>
         </w:rPr>
         <w:drawing>
-          <wp:inline distT="0" distB="0" distL="0" distR="0" wp14:anchorId="7DD411B8" wp14:editId="4BB8B914">
+          <wp:inline distT="0" distB="0" distL="0" distR="0" wp14:anchorId="48F18FC5" wp14:editId="762564E9">
             <wp:extent cx="5940000" cy="3712500"/>
             <wp:effectExtent l="0" t="0" r="0" b="0"/>
             <wp:docPr id="9" name="Picture 9"/>
@@ -2965,7 +2965,7 @@
           <w:noProof/>
         </w:rPr>
         <w:drawing>
-          <wp:inline distT="0" distB="0" distL="0" distR="0" wp14:anchorId="08A10A36" wp14:editId="25117A35">
+          <wp:inline distT="0" distB="0" distL="0" distR="0" wp14:anchorId="139D3183" wp14:editId="1081339A">
             <wp:extent cx="5940000" cy="3722400"/>
             <wp:effectExtent l="0" t="0" r="0" b="0"/>
             <wp:docPr id="10" name="Picture 10"/>
@@ -3035,7 +3035,7 @@
         </w:rPr>
         <w:lastRenderedPageBreak/>
         <w:drawing>
-          <wp:inline distT="0" distB="0" distL="0" distR="0" wp14:anchorId="2A8A0CC3" wp14:editId="0D184F96">
+          <wp:inline distT="0" distB="0" distL="0" distR="0" wp14:anchorId="47A55996" wp14:editId="2D6AA3A3">
             <wp:extent cx="5940000" cy="3722400"/>
             <wp:effectExtent l="0" t="0" r="0" b="0"/>
             <wp:docPr id="11" name="Picture 11"/>
@@ -3104,7 +3104,7 @@
           <w:noProof/>
         </w:rPr>
         <w:drawing>
-          <wp:inline distT="0" distB="0" distL="0" distR="0" wp14:anchorId="78B1F08D" wp14:editId="5D6640DD">
+          <wp:inline distT="0" distB="0" distL="0" distR="0" wp14:anchorId="6F147D61" wp14:editId="001AD1ED">
             <wp:extent cx="5940000" cy="3722400"/>
             <wp:effectExtent l="0" t="0" r="0" b="0"/>
             <wp:docPr id="12" name="Picture 12"/>
@@ -3166,7 +3166,7 @@
       <w:pPr>
         <w:pStyle w:val="Ttulo2"/>
       </w:pPr>
-      <w:bookmarkStart w:id="9" w:name="_Toc241407894"/>
+      <w:bookmarkStart w:id="9" w:name="_Toc241413923"/>
       <w:r>
         <w:t>4.2 Día 4 (27-sep) — solo servidor remoto + Rack B</w:t>
       </w:r>
@@ -3174,7 +3174,7 @@
     </w:p>
     <w:p>
       <w:r>
-        <w:t>Para la fecha 4 se detuvo intencionalmente la flota local: toda la telemetría Python proviene exclusivamente del servidor Ubuntu, aislando esa infraestructura como el segundo código en vivo de la sustentación (el primero es el ESP32 en el navegador).</w:t>
+        <w:t>Para la fecha 4 se detuvo intencionalmente la flota local: toda la telemetría Python proviene exclusivamente del servidor Ubuntu, aislando esa infraestructura como el segundo código en vivo de la sustentación (el primero es el ESP32 en el navegador). La ventana cerró en 4 h 32 min (10:28-15:00), por encima del mínimo de 4 horas.</w:t>
       </w:r>
     </w:p>
     <w:p>
@@ -3189,7 +3189,7 @@
         </w:rPr>
         <w:lastRenderedPageBreak/>
         <w:drawing>
-          <wp:inline distT="0" distB="0" distL="0" distR="0" wp14:anchorId="36D35100" wp14:editId="63D74A5C">
+          <wp:inline distT="0" distB="0" distL="0" distR="0" wp14:anchorId="1FF422ED" wp14:editId="73ECAFEB">
             <wp:extent cx="5940000" cy="3722400"/>
             <wp:effectExtent l="0" t="0" r="0" b="0"/>
             <wp:docPr id="13" name="Picture 13"/>
@@ -3258,7 +3258,7 @@
           <w:noProof/>
         </w:rPr>
         <w:drawing>
-          <wp:inline distT="0" distB="0" distL="0" distR="0" wp14:anchorId="554C91B3" wp14:editId="757E578A">
+          <wp:inline distT="0" distB="0" distL="0" distR="0" wp14:anchorId="5A25C015" wp14:editId="7546CD40">
             <wp:extent cx="5940000" cy="3722400"/>
             <wp:effectExtent l="0" t="0" r="0" b="0"/>
             <wp:docPr id="14" name="Picture 14"/>
@@ -3328,7 +3328,7 @@
         </w:rPr>
         <w:lastRenderedPageBreak/>
         <w:drawing>
-          <wp:inline distT="0" distB="0" distL="0" distR="0" wp14:anchorId="0AF14F55" wp14:editId="667D2FA4">
+          <wp:inline distT="0" distB="0" distL="0" distR="0" wp14:anchorId="383D1878" wp14:editId="1AE09621">
             <wp:extent cx="5940000" cy="3722400"/>
             <wp:effectExtent l="0" t="0" r="0" b="0"/>
             <wp:docPr id="15" name="Picture 15"/>
@@ -3397,7 +3397,7 @@
           <w:noProof/>
         </w:rPr>
         <w:drawing>
-          <wp:inline distT="0" distB="0" distL="0" distR="0" wp14:anchorId="6B999685" wp14:editId="7E305463">
+          <wp:inline distT="0" distB="0" distL="0" distR="0" wp14:anchorId="34EC1DFF" wp14:editId="61478757">
             <wp:extent cx="5940000" cy="3722400"/>
             <wp:effectExtent l="0" t="0" r="0" b="0"/>
             <wp:docPr id="16" name="Picture 16"/>
@@ -3455,67 +3455,87 @@
         <w:t>Captura 21 — Monitor serie del ESP32 Rack B, 27/9/2026.</w:t>
       </w:r>
     </w:p>
-    <w:tbl>
-      <w:tblPr>
-        <w:tblW w:w="0" w:type="auto"/>
-        <w:jc w:val="center"/>
-        <w:tblLook w:val="04A0" w:firstRow="1" w:lastRow="0" w:firstColumn="1" w:lastColumn="0" w:noHBand="0" w:noVBand="1"/>
-      </w:tblPr>
-      <w:tblGrid>
-        <w:gridCol w:w="9638"/>
-      </w:tblGrid>
-      <w:tr>
-        <w:trPr>
-          <w:cantSplit/>
-          <w:jc w:val="center"/>
-        </w:trPr>
-        <w:tc>
-          <w:tcPr>
-            <w:tcW w:w="9638" w:type="dxa"/>
-            <w:tcBorders>
-              <w:top w:val="nil"/>
-              <w:left w:val="single" w:sz="24" w:space="0" w:color="C47A19"/>
-              <w:bottom w:val="nil"/>
-              <w:right w:val="nil"/>
-            </w:tcBorders>
-            <w:shd w:val="clear" w:color="auto" w:fill="FFF6E5"/>
-            <w:tcMar>
-              <w:top w:w="120" w:type="dxa"/>
-              <w:left w:w="200" w:type="dxa"/>
-              <w:bottom w:w="120" w:type="dxa"/>
-              <w:right w:w="160" w:type="dxa"/>
-            </w:tcMar>
-          </w:tcPr>
-          <w:p>
-            <w:r>
-              <w:rPr>
-                <w:b/>
-                <w:color w:val="C47A19"/>
-              </w:rPr>
-              <w:t xml:space="preserve">Evidencia de cierre — pendiente  </w:t>
-            </w:r>
-            <w:r>
-              <w:rPr>
-                <w:sz w:val="20"/>
-              </w:rPr>
-              <w:t>[PENDIENTE AL CIERRE] Cuando la fecha 4 complete el mínimo de horas se añade aquí la captura final de cierre (última recepción de datos de cada nodo) y, si el nodo de agua logra simular antes del cierre, su evidencia correspondiente.</w:t>
-            </w:r>
-          </w:p>
-        </w:tc>
-      </w:tr>
-    </w:tbl>
     <w:p>
       <w:pPr>
-        <w:spacing w:after="40"/>
+        <w:keepNext/>
+        <w:spacing w:after="60"/>
+        <w:jc w:val="center"/>
       </w:pPr>
+      <w:r>
+        <w:rPr>
+          <w:noProof/>
+        </w:rPr>
+        <w:lastRenderedPageBreak/>
+        <w:drawing>
+          <wp:inline distT="0" distB="0" distL="0" distR="0" wp14:anchorId="10200E4B" wp14:editId="38D10620">
+            <wp:extent cx="5940000" cy="3722400"/>
+            <wp:effectExtent l="0" t="0" r="0" b="0"/>
+            <wp:docPr id="17" name="Picture 17"/>
+            <wp:cNvGraphicFramePr>
+              <a:graphicFrameLocks xmlns:a="http://schemas.openxmlformats.org/drawingml/2006/main" noChangeAspect="1"/>
+            </wp:cNvGraphicFramePr>
+            <a:graphic xmlns:a="http://schemas.openxmlformats.org/drawingml/2006/main">
+              <a:graphicData uri="http://schemas.openxmlformats.org/drawingml/2006/picture">
+                <pic:pic xmlns:pic="http://schemas.openxmlformats.org/drawingml/2006/picture">
+                  <pic:nvPicPr>
+                    <pic:cNvPr id="0" name="dia4-portal-flota.png"/>
+                    <pic:cNvPicPr/>
+                  </pic:nvPicPr>
+                  <pic:blipFill>
+                    <a:blip r:embed="rId18"/>
+                    <a:stretch>
+                      <a:fillRect/>
+                    </a:stretch>
+                  </pic:blipFill>
+                  <pic:spPr>
+                    <a:xfrm>
+                      <a:off x="0" y="0"/>
+                      <a:ext cx="5940000" cy="3722400"/>
+                    </a:xfrm>
+                    <a:prstGeom prst="rect">
+                      <a:avLst/>
+                    </a:prstGeom>
+                  </pic:spPr>
+                </pic:pic>
+              </a:graphicData>
+            </a:graphic>
+          </wp:inline>
+        </w:drawing>
+      </w:r>
+    </w:p>
+    <w:p>
+      <w:pPr>
+        <w:spacing w:after="200"/>
+        <w:jc w:val="center"/>
+      </w:pPr>
+      <w:r>
+        <w:rPr>
+          <w:b/>
+          <w:color w:val="1F5FA8"/>
+          <w:sz w:val="18"/>
+        </w:rPr>
+        <w:t xml:space="preserve">Figura 17. </w:t>
+      </w:r>
+      <w:r>
+        <w:rPr>
+          <w:i/>
+          <w:color w:val="5B6570"/>
+          <w:sz w:val="18"/>
+        </w:rPr>
+        <w:t>Captura 22 — Cierre de la fecha 4: flota completa en el portal, 27/9/2026 15:00.</w:t>
+      </w:r>
+    </w:p>
+    <w:p>
+      <w:r>
+        <w:t>El ESP32 del nodo de agua no llegó a simular en esta fecha (Wokwi con los servidores de compilación saturados, confirmado con un proyecto nuevo desde cero); el Rack B tuvo cortes intermitentes por el mismo motivo. Es una limitación de la plataforma Wokwi, no del sketch, y no afecta la cobertura general porque el nodo de agua ya tiene datos completos en las fechas 1 y 3.</w:t>
+      </w:r>
     </w:p>
     <w:p>
       <w:pPr>
         <w:pStyle w:val="Ttulo1"/>
       </w:pPr>
-      <w:bookmarkStart w:id="10" w:name="_Toc241407895"/>
+      <w:bookmarkStart w:id="10" w:name="_Toc241413924"/>
       <w:r>
-        <w:lastRenderedPageBreak/>
         <w:t>5. Logs de los nodos (recortes reales)</w:t>
       </w:r>
       <w:bookmarkEnd w:id="10"/>
@@ -3529,7 +3549,7 @@
       <w:pPr>
         <w:pStyle w:val="Ttulo2"/>
       </w:pPr>
-      <w:bookmarkStart w:id="11" w:name="_Toc241407896"/>
+      <w:bookmarkStart w:id="11" w:name="_Toc241413925"/>
       <w:r>
         <w:t>DC-RACKC-03 · SDK MQTT</w:t>
       </w:r>
@@ -3675,8 +3695,9 @@
       <w:pPr>
         <w:pStyle w:val="Ttulo2"/>
       </w:pPr>
-      <w:bookmarkStart w:id="12" w:name="_Toc241407897"/>
+      <w:bookmarkStart w:id="12" w:name="_Toc241413926"/>
       <w:r>
+        <w:lastRenderedPageBreak/>
         <w:t>DC-PASILLO-04 · SDK sobre WebSockets</w:t>
       </w:r>
       <w:bookmarkEnd w:id="12"/>
@@ -3821,7 +3842,7 @@
       <w:pPr>
         <w:pStyle w:val="Ttulo2"/>
       </w:pPr>
-      <w:bookmarkStart w:id="13" w:name="_Toc241407898"/>
+      <w:bookmarkStart w:id="13" w:name="_Toc241413927"/>
       <w:r>
         <w:t>DC-HUMO-08 · paho explícito</w:t>
       </w:r>
@@ -3967,9 +3988,8 @@
       <w:pPr>
         <w:pStyle w:val="Ttulo2"/>
       </w:pPr>
-      <w:bookmarkStart w:id="14" w:name="_Toc241407899"/>
+      <w:bookmarkStart w:id="14" w:name="_Toc241413928"/>
       <w:r>
-        <w:lastRenderedPageBreak/>
         <w:t>DC-ACCESO-10 · puente HTTP/REST</w:t>
       </w:r>
       <w:bookmarkEnd w:id="14"/>
@@ -4114,8 +4134,9 @@
       <w:pPr>
         <w:pStyle w:val="Ttulo1"/>
       </w:pPr>
-      <w:bookmarkStart w:id="15" w:name="_Toc241407900"/>
+      <w:bookmarkStart w:id="15" w:name="_Toc241413929"/>
       <w:r>
+        <w:lastRenderedPageBreak/>
         <w:t>6. Estado de la flota en el arranque</w:t>
       </w:r>
       <w:bookmarkEnd w:id="15"/>
@@ -4708,31 +4729,31 @@
       </w:rPr>
     </w:lvl>
   </w:abstractNum>
-  <w:num w:numId="1" w16cid:durableId="1302226955">
+  <w:num w:numId="1" w16cid:durableId="976179437">
     <w:abstractNumId w:val="8"/>
   </w:num>
-  <w:num w:numId="2" w16cid:durableId="759057762">
+  <w:num w:numId="2" w16cid:durableId="1960792392">
     <w:abstractNumId w:val="6"/>
   </w:num>
-  <w:num w:numId="3" w16cid:durableId="181625125">
+  <w:num w:numId="3" w16cid:durableId="1002585537">
     <w:abstractNumId w:val="5"/>
   </w:num>
-  <w:num w:numId="4" w16cid:durableId="7223322">
+  <w:num w:numId="4" w16cid:durableId="1734304365">
     <w:abstractNumId w:val="4"/>
   </w:num>
-  <w:num w:numId="5" w16cid:durableId="1346402259">
+  <w:num w:numId="5" w16cid:durableId="854655301">
     <w:abstractNumId w:val="7"/>
   </w:num>
-  <w:num w:numId="6" w16cid:durableId="443695494">
+  <w:num w:numId="6" w16cid:durableId="2127506706">
     <w:abstractNumId w:val="3"/>
   </w:num>
-  <w:num w:numId="7" w16cid:durableId="2136941344">
+  <w:num w:numId="7" w16cid:durableId="1249270056">
     <w:abstractNumId w:val="2"/>
   </w:num>
-  <w:num w:numId="8" w16cid:durableId="1647510401">
+  <w:num w:numId="8" w16cid:durableId="1215242038">
     <w:abstractNumId w:val="1"/>
   </w:num>
-  <w:num w:numId="9" w16cid:durableId="1095251696">
+  <w:num w:numId="9" w16cid:durableId="191889908">
     <w:abstractNumId w:val="0"/>
   </w:num>
 </w:numbering>
@@ -16125,7 +16146,7 @@
     <w:autoRedefine/>
     <w:uiPriority w:val="39"/>
     <w:unhideWhenUsed/>
-    <w:rsid w:val="00B515A5"/>
+    <w:rsid w:val="004D7BC2"/>
     <w:pPr>
       <w:spacing w:after="100"/>
     </w:pPr>
@@ -16137,7 +16158,7 @@
     <w:autoRedefine/>
     <w:uiPriority w:val="39"/>
     <w:unhideWhenUsed/>
-    <w:rsid w:val="00B515A5"/>
+    <w:rsid w:val="004D7BC2"/>
     <w:pPr>
       <w:spacing w:after="100"/>
       <w:ind w:left="210"/>
@@ -16148,7 +16169,7 @@
     <w:basedOn w:val="Fuentedeprrafopredeter"/>
     <w:uiPriority w:val="99"/>
     <w:unhideWhenUsed/>
-    <w:rsid w:val="00B515A5"/>
+    <w:rsid w:val="004D7BC2"/>
     <w:rPr>
       <w:color w:val="0000FF" w:themeColor="hyperlink"/>
       <w:u w:val="single"/>

</xml_diff>

<commit_message>
Evidencia de metricas de los 10 dispositivos en las 4 fechas desde el Data Explorer
- 5 capturas del Explorador de datos (una por fecha + ventana completa), 8 telemetrias agrupadas por dispositivo
- datos/matriz_data_explorer.json: dispositivos con datos por fecha segun la leyenda de la plataforma
- anexo 4.3: tabla 10x4 (24:10/10, 25:9/10, 26:10/10, 27:9/10; falta DC-AGUA-07 el 25 y 27)
</commit_message>
<xml_diff>
--- a/informe/Evidencias_Parcial1_DC-ANDES-1.docx
+++ b/informe/Evidencias_Parcial1_DC-ANDES-1.docx
@@ -396,7 +396,7 @@
       <w:r>
         <w:fldChar w:fldCharType="separate"/>
       </w:r>
-      <w:hyperlink w:anchor="_Toc241413914" w:history="1">
+      <w:hyperlink w:anchor="_Toc241425399" w:history="1">
         <w:r>
           <w:rPr>
             <w:rStyle w:val="Hipervnculo"/>
@@ -423,7 +423,7 @@
             <w:noProof/>
             <w:webHidden/>
           </w:rPr>
-          <w:instrText xml:space="preserve"> PAGEREF _Toc241413914 \h </w:instrText>
+          <w:instrText xml:space="preserve"> PAGEREF _Toc241425399 \h </w:instrText>
         </w:r>
         <w:r>
           <w:rPr>
@@ -464,7 +464,7 @@
           <w:noProof/>
         </w:rPr>
       </w:pPr>
-      <w:hyperlink w:anchor="_Toc241413915" w:history="1">
+      <w:hyperlink w:anchor="_Toc241425400" w:history="1">
         <w:r>
           <w:rPr>
             <w:rStyle w:val="Hipervnculo"/>
@@ -491,7 +491,7 @@
             <w:noProof/>
             <w:webHidden/>
           </w:rPr>
-          <w:instrText xml:space="preserve"> PAGEREF _Toc241413915 \h </w:instrText>
+          <w:instrText xml:space="preserve"> PAGEREF _Toc241425400 \h </w:instrText>
         </w:r>
         <w:r>
           <w:rPr>
@@ -532,7 +532,7 @@
           <w:noProof/>
         </w:rPr>
       </w:pPr>
-      <w:hyperlink w:anchor="_Toc241413916" w:history="1">
+      <w:hyperlink w:anchor="_Toc241425401" w:history="1">
         <w:r>
           <w:rPr>
             <w:rStyle w:val="Hipervnculo"/>
@@ -559,7 +559,7 @@
             <w:noProof/>
             <w:webHidden/>
           </w:rPr>
-          <w:instrText xml:space="preserve"> PAGEREF _Toc241413916 \h </w:instrText>
+          <w:instrText xml:space="preserve"> PAGEREF _Toc241425401 \h </w:instrText>
         </w:r>
         <w:r>
           <w:rPr>
@@ -600,7 +600,7 @@
           <w:noProof/>
         </w:rPr>
       </w:pPr>
-      <w:hyperlink w:anchor="_Toc241413917" w:history="1">
+      <w:hyperlink w:anchor="_Toc241425402" w:history="1">
         <w:r>
           <w:rPr>
             <w:rStyle w:val="Hipervnculo"/>
@@ -627,7 +627,7 @@
             <w:noProof/>
             <w:webHidden/>
           </w:rPr>
-          <w:instrText xml:space="preserve"> PAGEREF _Toc241413917 \h </w:instrText>
+          <w:instrText xml:space="preserve"> PAGEREF _Toc241425402 \h </w:instrText>
         </w:r>
         <w:r>
           <w:rPr>
@@ -668,7 +668,7 @@
           <w:noProof/>
         </w:rPr>
       </w:pPr>
-      <w:hyperlink w:anchor="_Toc241413918" w:history="1">
+      <w:hyperlink w:anchor="_Toc241425403" w:history="1">
         <w:r>
           <w:rPr>
             <w:rStyle w:val="Hipervnculo"/>
@@ -695,7 +695,7 @@
             <w:noProof/>
             <w:webHidden/>
           </w:rPr>
-          <w:instrText xml:space="preserve"> PAGEREF _Toc241413918 \h </w:instrText>
+          <w:instrText xml:space="preserve"> PAGEREF _Toc241425403 \h </w:instrText>
         </w:r>
         <w:r>
           <w:rPr>
@@ -736,7 +736,7 @@
           <w:noProof/>
         </w:rPr>
       </w:pPr>
-      <w:hyperlink w:anchor="_Toc241413919" w:history="1">
+      <w:hyperlink w:anchor="_Toc241425404" w:history="1">
         <w:r>
           <w:rPr>
             <w:rStyle w:val="Hipervnculo"/>
@@ -763,7 +763,7 @@
             <w:noProof/>
             <w:webHidden/>
           </w:rPr>
-          <w:instrText xml:space="preserve"> PAGEREF _Toc241413919 \h </w:instrText>
+          <w:instrText xml:space="preserve"> PAGEREF _Toc241425404 \h </w:instrText>
         </w:r>
         <w:r>
           <w:rPr>
@@ -804,7 +804,7 @@
           <w:noProof/>
         </w:rPr>
       </w:pPr>
-      <w:hyperlink w:anchor="_Toc241413920" w:history="1">
+      <w:hyperlink w:anchor="_Toc241425405" w:history="1">
         <w:r>
           <w:rPr>
             <w:rStyle w:val="Hipervnculo"/>
@@ -831,7 +831,7 @@
             <w:noProof/>
             <w:webHidden/>
           </w:rPr>
-          <w:instrText xml:space="preserve"> PAGEREF _Toc241413920 \h </w:instrText>
+          <w:instrText xml:space="preserve"> PAGEREF _Toc241425405 \h </w:instrText>
         </w:r>
         <w:r>
           <w:rPr>
@@ -872,7 +872,7 @@
           <w:noProof/>
         </w:rPr>
       </w:pPr>
-      <w:hyperlink w:anchor="_Toc241413921" w:history="1">
+      <w:hyperlink w:anchor="_Toc241425406" w:history="1">
         <w:r>
           <w:rPr>
             <w:rStyle w:val="Hipervnculo"/>
@@ -899,7 +899,7 @@
             <w:noProof/>
             <w:webHidden/>
           </w:rPr>
-          <w:instrText xml:space="preserve"> PAGEREF _Toc241413921 \h </w:instrText>
+          <w:instrText xml:space="preserve"> PAGEREF _Toc241425406 \h </w:instrText>
         </w:r>
         <w:r>
           <w:rPr>
@@ -940,7 +940,7 @@
           <w:noProof/>
         </w:rPr>
       </w:pPr>
-      <w:hyperlink w:anchor="_Toc241413922" w:history="1">
+      <w:hyperlink w:anchor="_Toc241425407" w:history="1">
         <w:r>
           <w:rPr>
             <w:rStyle w:val="Hipervnculo"/>
@@ -967,7 +967,7 @@
             <w:noProof/>
             <w:webHidden/>
           </w:rPr>
-          <w:instrText xml:space="preserve"> PAGEREF _Toc241413922 \h </w:instrText>
+          <w:instrText xml:space="preserve"> PAGEREF _Toc241425407 \h </w:instrText>
         </w:r>
         <w:r>
           <w:rPr>
@@ -1008,7 +1008,7 @@
           <w:noProof/>
         </w:rPr>
       </w:pPr>
-      <w:hyperlink w:anchor="_Toc241413923" w:history="1">
+      <w:hyperlink w:anchor="_Toc241425408" w:history="1">
         <w:r>
           <w:rPr>
             <w:rStyle w:val="Hipervnculo"/>
@@ -1035,7 +1035,7 @@
             <w:noProof/>
             <w:webHidden/>
           </w:rPr>
-          <w:instrText xml:space="preserve"> PAGEREF _Toc241413923 \h </w:instrText>
+          <w:instrText xml:space="preserve"> PAGEREF _Toc241425408 \h </w:instrText>
         </w:r>
         <w:r>
           <w:rPr>
@@ -1076,13 +1076,13 @@
           <w:noProof/>
         </w:rPr>
       </w:pPr>
-      <w:hyperlink w:anchor="_Toc241413924" w:history="1">
+      <w:hyperlink w:anchor="_Toc241425409" w:history="1">
         <w:r>
           <w:rPr>
             <w:rStyle w:val="Hipervnculo"/>
             <w:noProof/>
           </w:rPr>
-          <w:t>5. Logs de los nodos (recortes reales)</w:t>
+          <w:t>4.3 Métricas de los 10 dispositivos en las 4 fechas (Data Explorer)</w:t>
         </w:r>
         <w:r>
           <w:rPr>
@@ -1103,279 +1103,7 @@
             <w:noProof/>
             <w:webHidden/>
           </w:rPr>
-          <w:instrText xml:space="preserve"> PAGEREF _Toc241413924 \h </w:instrText>
-        </w:r>
-        <w:r>
-          <w:rPr>
-            <w:noProof/>
-            <w:webHidden/>
-          </w:rPr>
-        </w:r>
-        <w:r>
-          <w:rPr>
-            <w:noProof/>
-            <w:webHidden/>
-          </w:rPr>
-          <w:fldChar w:fldCharType="separate"/>
-        </w:r>
-        <w:r>
-          <w:rPr>
-            <w:noProof/>
-            <w:webHidden/>
-          </w:rPr>
-          <w:t>13</w:t>
-        </w:r>
-        <w:r>
-          <w:rPr>
-            <w:noProof/>
-            <w:webHidden/>
-          </w:rPr>
-          <w:fldChar w:fldCharType="end"/>
-        </w:r>
-      </w:hyperlink>
-    </w:p>
-    <w:p>
-      <w:pPr>
-        <w:pStyle w:val="TDC2"/>
-        <w:tabs>
-          <w:tab w:val="right" w:leader="dot" w:pos="9628"/>
-        </w:tabs>
-        <w:rPr>
-          <w:noProof/>
-        </w:rPr>
-      </w:pPr>
-      <w:hyperlink w:anchor="_Toc241413925" w:history="1">
-        <w:r>
-          <w:rPr>
-            <w:rStyle w:val="Hipervnculo"/>
-            <w:noProof/>
-          </w:rPr>
-          <w:t>DC-RACKC-03 · SDK MQTT</w:t>
-        </w:r>
-        <w:r>
-          <w:rPr>
-            <w:noProof/>
-            <w:webHidden/>
-          </w:rPr>
-          <w:tab/>
-        </w:r>
-        <w:r>
-          <w:rPr>
-            <w:noProof/>
-            <w:webHidden/>
-          </w:rPr>
-          <w:fldChar w:fldCharType="begin"/>
-        </w:r>
-        <w:r>
-          <w:rPr>
-            <w:noProof/>
-            <w:webHidden/>
-          </w:rPr>
-          <w:instrText xml:space="preserve"> PAGEREF _Toc241413925 \h </w:instrText>
-        </w:r>
-        <w:r>
-          <w:rPr>
-            <w:noProof/>
-            <w:webHidden/>
-          </w:rPr>
-        </w:r>
-        <w:r>
-          <w:rPr>
-            <w:noProof/>
-            <w:webHidden/>
-          </w:rPr>
-          <w:fldChar w:fldCharType="separate"/>
-        </w:r>
-        <w:r>
-          <w:rPr>
-            <w:noProof/>
-            <w:webHidden/>
-          </w:rPr>
-          <w:t>13</w:t>
-        </w:r>
-        <w:r>
-          <w:rPr>
-            <w:noProof/>
-            <w:webHidden/>
-          </w:rPr>
-          <w:fldChar w:fldCharType="end"/>
-        </w:r>
-      </w:hyperlink>
-    </w:p>
-    <w:p>
-      <w:pPr>
-        <w:pStyle w:val="TDC2"/>
-        <w:tabs>
-          <w:tab w:val="right" w:leader="dot" w:pos="9628"/>
-        </w:tabs>
-        <w:rPr>
-          <w:noProof/>
-        </w:rPr>
-      </w:pPr>
-      <w:hyperlink w:anchor="_Toc241413926" w:history="1">
-        <w:r>
-          <w:rPr>
-            <w:rStyle w:val="Hipervnculo"/>
-            <w:noProof/>
-          </w:rPr>
-          <w:t>DC-PASILLO-04 · SDK sobre WebSockets</w:t>
-        </w:r>
-        <w:r>
-          <w:rPr>
-            <w:noProof/>
-            <w:webHidden/>
-          </w:rPr>
-          <w:tab/>
-        </w:r>
-        <w:r>
-          <w:rPr>
-            <w:noProof/>
-            <w:webHidden/>
-          </w:rPr>
-          <w:fldChar w:fldCharType="begin"/>
-        </w:r>
-        <w:r>
-          <w:rPr>
-            <w:noProof/>
-            <w:webHidden/>
-          </w:rPr>
-          <w:instrText xml:space="preserve"> PAGEREF _Toc241413926 \h </w:instrText>
-        </w:r>
-        <w:r>
-          <w:rPr>
-            <w:noProof/>
-            <w:webHidden/>
-          </w:rPr>
-        </w:r>
-        <w:r>
-          <w:rPr>
-            <w:noProof/>
-            <w:webHidden/>
-          </w:rPr>
-          <w:fldChar w:fldCharType="separate"/>
-        </w:r>
-        <w:r>
-          <w:rPr>
-            <w:noProof/>
-            <w:webHidden/>
-          </w:rPr>
-          <w:t>14</w:t>
-        </w:r>
-        <w:r>
-          <w:rPr>
-            <w:noProof/>
-            <w:webHidden/>
-          </w:rPr>
-          <w:fldChar w:fldCharType="end"/>
-        </w:r>
-      </w:hyperlink>
-    </w:p>
-    <w:p>
-      <w:pPr>
-        <w:pStyle w:val="TDC2"/>
-        <w:tabs>
-          <w:tab w:val="right" w:leader="dot" w:pos="9628"/>
-        </w:tabs>
-        <w:rPr>
-          <w:noProof/>
-        </w:rPr>
-      </w:pPr>
-      <w:hyperlink w:anchor="_Toc241413927" w:history="1">
-        <w:r>
-          <w:rPr>
-            <w:rStyle w:val="Hipervnculo"/>
-            <w:noProof/>
-          </w:rPr>
-          <w:t>DC-HUMO-08 · paho explícito</w:t>
-        </w:r>
-        <w:r>
-          <w:rPr>
-            <w:noProof/>
-            <w:webHidden/>
-          </w:rPr>
-          <w:tab/>
-        </w:r>
-        <w:r>
-          <w:rPr>
-            <w:noProof/>
-            <w:webHidden/>
-          </w:rPr>
-          <w:fldChar w:fldCharType="begin"/>
-        </w:r>
-        <w:r>
-          <w:rPr>
-            <w:noProof/>
-            <w:webHidden/>
-          </w:rPr>
-          <w:instrText xml:space="preserve"> PAGEREF _Toc241413927 \h </w:instrText>
-        </w:r>
-        <w:r>
-          <w:rPr>
-            <w:noProof/>
-            <w:webHidden/>
-          </w:rPr>
-        </w:r>
-        <w:r>
-          <w:rPr>
-            <w:noProof/>
-            <w:webHidden/>
-          </w:rPr>
-          <w:fldChar w:fldCharType="separate"/>
-        </w:r>
-        <w:r>
-          <w:rPr>
-            <w:noProof/>
-            <w:webHidden/>
-          </w:rPr>
-          <w:t>14</w:t>
-        </w:r>
-        <w:r>
-          <w:rPr>
-            <w:noProof/>
-            <w:webHidden/>
-          </w:rPr>
-          <w:fldChar w:fldCharType="end"/>
-        </w:r>
-      </w:hyperlink>
-    </w:p>
-    <w:p>
-      <w:pPr>
-        <w:pStyle w:val="TDC2"/>
-        <w:tabs>
-          <w:tab w:val="right" w:leader="dot" w:pos="9628"/>
-        </w:tabs>
-        <w:rPr>
-          <w:noProof/>
-        </w:rPr>
-      </w:pPr>
-      <w:hyperlink w:anchor="_Toc241413928" w:history="1">
-        <w:r>
-          <w:rPr>
-            <w:rStyle w:val="Hipervnculo"/>
-            <w:noProof/>
-          </w:rPr>
-          <w:t>DC-ACCESO-10 · puente HTTP/REST</w:t>
-        </w:r>
-        <w:r>
-          <w:rPr>
-            <w:noProof/>
-            <w:webHidden/>
-          </w:rPr>
-          <w:tab/>
-        </w:r>
-        <w:r>
-          <w:rPr>
-            <w:noProof/>
-            <w:webHidden/>
-          </w:rPr>
-          <w:fldChar w:fldCharType="begin"/>
-        </w:r>
-        <w:r>
-          <w:rPr>
-            <w:noProof/>
-            <w:webHidden/>
-          </w:rPr>
-          <w:instrText xml:space="preserve"> PAGEREF _Toc241413928 \h </w:instrText>
+          <w:instrText xml:space="preserve"> PAGEREF _Toc241425409 \h </w:instrText>
         </w:r>
         <w:r>
           <w:rPr>
@@ -1416,7 +1144,347 @@
           <w:noProof/>
         </w:rPr>
       </w:pPr>
-      <w:hyperlink w:anchor="_Toc241413929" w:history="1">
+      <w:hyperlink w:anchor="_Toc241425410" w:history="1">
+        <w:r>
+          <w:rPr>
+            <w:rStyle w:val="Hipervnculo"/>
+            <w:noProof/>
+          </w:rPr>
+          <w:t>5. Logs de los nodos (recortes reales)</w:t>
+        </w:r>
+        <w:r>
+          <w:rPr>
+            <w:noProof/>
+            <w:webHidden/>
+          </w:rPr>
+          <w:tab/>
+        </w:r>
+        <w:r>
+          <w:rPr>
+            <w:noProof/>
+            <w:webHidden/>
+          </w:rPr>
+          <w:fldChar w:fldCharType="begin"/>
+        </w:r>
+        <w:r>
+          <w:rPr>
+            <w:noProof/>
+            <w:webHidden/>
+          </w:rPr>
+          <w:instrText xml:space="preserve"> PAGEREF _Toc241425410 \h </w:instrText>
+        </w:r>
+        <w:r>
+          <w:rPr>
+            <w:noProof/>
+            <w:webHidden/>
+          </w:rPr>
+        </w:r>
+        <w:r>
+          <w:rPr>
+            <w:noProof/>
+            <w:webHidden/>
+          </w:rPr>
+          <w:fldChar w:fldCharType="separate"/>
+        </w:r>
+        <w:r>
+          <w:rPr>
+            <w:noProof/>
+            <w:webHidden/>
+          </w:rPr>
+          <w:t>17</w:t>
+        </w:r>
+        <w:r>
+          <w:rPr>
+            <w:noProof/>
+            <w:webHidden/>
+          </w:rPr>
+          <w:fldChar w:fldCharType="end"/>
+        </w:r>
+      </w:hyperlink>
+    </w:p>
+    <w:p>
+      <w:pPr>
+        <w:pStyle w:val="TDC2"/>
+        <w:tabs>
+          <w:tab w:val="right" w:leader="dot" w:pos="9628"/>
+        </w:tabs>
+        <w:rPr>
+          <w:noProof/>
+        </w:rPr>
+      </w:pPr>
+      <w:hyperlink w:anchor="_Toc241425411" w:history="1">
+        <w:r>
+          <w:rPr>
+            <w:rStyle w:val="Hipervnculo"/>
+            <w:noProof/>
+          </w:rPr>
+          <w:t>DC-RACKC-03 · SDK MQTT</w:t>
+        </w:r>
+        <w:r>
+          <w:rPr>
+            <w:noProof/>
+            <w:webHidden/>
+          </w:rPr>
+          <w:tab/>
+        </w:r>
+        <w:r>
+          <w:rPr>
+            <w:noProof/>
+            <w:webHidden/>
+          </w:rPr>
+          <w:fldChar w:fldCharType="begin"/>
+        </w:r>
+        <w:r>
+          <w:rPr>
+            <w:noProof/>
+            <w:webHidden/>
+          </w:rPr>
+          <w:instrText xml:space="preserve"> PAGEREF _Toc241425411 \h </w:instrText>
+        </w:r>
+        <w:r>
+          <w:rPr>
+            <w:noProof/>
+            <w:webHidden/>
+          </w:rPr>
+        </w:r>
+        <w:r>
+          <w:rPr>
+            <w:noProof/>
+            <w:webHidden/>
+          </w:rPr>
+          <w:fldChar w:fldCharType="separate"/>
+        </w:r>
+        <w:r>
+          <w:rPr>
+            <w:noProof/>
+            <w:webHidden/>
+          </w:rPr>
+          <w:t>17</w:t>
+        </w:r>
+        <w:r>
+          <w:rPr>
+            <w:noProof/>
+            <w:webHidden/>
+          </w:rPr>
+          <w:fldChar w:fldCharType="end"/>
+        </w:r>
+      </w:hyperlink>
+    </w:p>
+    <w:p>
+      <w:pPr>
+        <w:pStyle w:val="TDC2"/>
+        <w:tabs>
+          <w:tab w:val="right" w:leader="dot" w:pos="9628"/>
+        </w:tabs>
+        <w:rPr>
+          <w:noProof/>
+        </w:rPr>
+      </w:pPr>
+      <w:hyperlink w:anchor="_Toc241425412" w:history="1">
+        <w:r>
+          <w:rPr>
+            <w:rStyle w:val="Hipervnculo"/>
+            <w:noProof/>
+          </w:rPr>
+          <w:t>DC-PASILLO-04 · SDK sobre WebSockets</w:t>
+        </w:r>
+        <w:r>
+          <w:rPr>
+            <w:noProof/>
+            <w:webHidden/>
+          </w:rPr>
+          <w:tab/>
+        </w:r>
+        <w:r>
+          <w:rPr>
+            <w:noProof/>
+            <w:webHidden/>
+          </w:rPr>
+          <w:fldChar w:fldCharType="begin"/>
+        </w:r>
+        <w:r>
+          <w:rPr>
+            <w:noProof/>
+            <w:webHidden/>
+          </w:rPr>
+          <w:instrText xml:space="preserve"> PAGEREF _Toc241425412 \h </w:instrText>
+        </w:r>
+        <w:r>
+          <w:rPr>
+            <w:noProof/>
+            <w:webHidden/>
+          </w:rPr>
+        </w:r>
+        <w:r>
+          <w:rPr>
+            <w:noProof/>
+            <w:webHidden/>
+          </w:rPr>
+          <w:fldChar w:fldCharType="separate"/>
+        </w:r>
+        <w:r>
+          <w:rPr>
+            <w:noProof/>
+            <w:webHidden/>
+          </w:rPr>
+          <w:t>17</w:t>
+        </w:r>
+        <w:r>
+          <w:rPr>
+            <w:noProof/>
+            <w:webHidden/>
+          </w:rPr>
+          <w:fldChar w:fldCharType="end"/>
+        </w:r>
+      </w:hyperlink>
+    </w:p>
+    <w:p>
+      <w:pPr>
+        <w:pStyle w:val="TDC2"/>
+        <w:tabs>
+          <w:tab w:val="right" w:leader="dot" w:pos="9628"/>
+        </w:tabs>
+        <w:rPr>
+          <w:noProof/>
+        </w:rPr>
+      </w:pPr>
+      <w:hyperlink w:anchor="_Toc241425413" w:history="1">
+        <w:r>
+          <w:rPr>
+            <w:rStyle w:val="Hipervnculo"/>
+            <w:noProof/>
+          </w:rPr>
+          <w:t>DC-HUMO-08 · paho explícito</w:t>
+        </w:r>
+        <w:r>
+          <w:rPr>
+            <w:noProof/>
+            <w:webHidden/>
+          </w:rPr>
+          <w:tab/>
+        </w:r>
+        <w:r>
+          <w:rPr>
+            <w:noProof/>
+            <w:webHidden/>
+          </w:rPr>
+          <w:fldChar w:fldCharType="begin"/>
+        </w:r>
+        <w:r>
+          <w:rPr>
+            <w:noProof/>
+            <w:webHidden/>
+          </w:rPr>
+          <w:instrText xml:space="preserve"> PAGEREF _Toc241425413 \h </w:instrText>
+        </w:r>
+        <w:r>
+          <w:rPr>
+            <w:noProof/>
+            <w:webHidden/>
+          </w:rPr>
+        </w:r>
+        <w:r>
+          <w:rPr>
+            <w:noProof/>
+            <w:webHidden/>
+          </w:rPr>
+          <w:fldChar w:fldCharType="separate"/>
+        </w:r>
+        <w:r>
+          <w:rPr>
+            <w:noProof/>
+            <w:webHidden/>
+          </w:rPr>
+          <w:t>18</w:t>
+        </w:r>
+        <w:r>
+          <w:rPr>
+            <w:noProof/>
+            <w:webHidden/>
+          </w:rPr>
+          <w:fldChar w:fldCharType="end"/>
+        </w:r>
+      </w:hyperlink>
+    </w:p>
+    <w:p>
+      <w:pPr>
+        <w:pStyle w:val="TDC2"/>
+        <w:tabs>
+          <w:tab w:val="right" w:leader="dot" w:pos="9628"/>
+        </w:tabs>
+        <w:rPr>
+          <w:noProof/>
+        </w:rPr>
+      </w:pPr>
+      <w:hyperlink w:anchor="_Toc241425414" w:history="1">
+        <w:r>
+          <w:rPr>
+            <w:rStyle w:val="Hipervnculo"/>
+            <w:noProof/>
+          </w:rPr>
+          <w:t>DC-ACCESO-10 · puente HTTP/REST</w:t>
+        </w:r>
+        <w:r>
+          <w:rPr>
+            <w:noProof/>
+            <w:webHidden/>
+          </w:rPr>
+          <w:tab/>
+        </w:r>
+        <w:r>
+          <w:rPr>
+            <w:noProof/>
+            <w:webHidden/>
+          </w:rPr>
+          <w:fldChar w:fldCharType="begin"/>
+        </w:r>
+        <w:r>
+          <w:rPr>
+            <w:noProof/>
+            <w:webHidden/>
+          </w:rPr>
+          <w:instrText xml:space="preserve"> PAGEREF _Toc241425414 \h </w:instrText>
+        </w:r>
+        <w:r>
+          <w:rPr>
+            <w:noProof/>
+            <w:webHidden/>
+          </w:rPr>
+        </w:r>
+        <w:r>
+          <w:rPr>
+            <w:noProof/>
+            <w:webHidden/>
+          </w:rPr>
+          <w:fldChar w:fldCharType="separate"/>
+        </w:r>
+        <w:r>
+          <w:rPr>
+            <w:noProof/>
+            <w:webHidden/>
+          </w:rPr>
+          <w:t>18</w:t>
+        </w:r>
+        <w:r>
+          <w:rPr>
+            <w:noProof/>
+            <w:webHidden/>
+          </w:rPr>
+          <w:fldChar w:fldCharType="end"/>
+        </w:r>
+      </w:hyperlink>
+    </w:p>
+    <w:p>
+      <w:pPr>
+        <w:pStyle w:val="TDC1"/>
+        <w:tabs>
+          <w:tab w:val="right" w:leader="dot" w:pos="9628"/>
+        </w:tabs>
+        <w:rPr>
+          <w:noProof/>
+        </w:rPr>
+      </w:pPr>
+      <w:hyperlink w:anchor="_Toc241425415" w:history="1">
         <w:r>
           <w:rPr>
             <w:rStyle w:val="Hipervnculo"/>
@@ -1443,7 +1511,7 @@
             <w:noProof/>
             <w:webHidden/>
           </w:rPr>
-          <w:instrText xml:space="preserve"> PAGEREF _Toc241413929 \h </w:instrText>
+          <w:instrText xml:space="preserve"> PAGEREF _Toc241425415 \h </w:instrText>
         </w:r>
         <w:r>
           <w:rPr>
@@ -1463,7 +1531,7 @@
             <w:noProof/>
             <w:webHidden/>
           </w:rPr>
-          <w:t>15</w:t>
+          <w:t>18</w:t>
         </w:r>
         <w:r>
           <w:rPr>
@@ -1488,7 +1556,7 @@
       <w:pPr>
         <w:pStyle w:val="Ttulo1"/>
       </w:pPr>
-      <w:bookmarkStart w:id="0" w:name="_Toc241413914"/>
+      <w:bookmarkStart w:id="0" w:name="_Toc241425399"/>
       <w:r>
         <w:lastRenderedPageBreak/>
         <w:t>Matriz de cumplimiento (rúbrica → evidencia)</w:t>
@@ -2216,7 +2284,7 @@
       <w:pPr>
         <w:pStyle w:val="Ttulo1"/>
       </w:pPr>
-      <w:bookmarkStart w:id="1" w:name="_Toc241413915"/>
+      <w:bookmarkStart w:id="1" w:name="_Toc241425400"/>
       <w:r>
         <w:t>1. Flota en Azure IoT Central</w:t>
       </w:r>
@@ -2239,7 +2307,7 @@
         </w:rPr>
         <w:lastRenderedPageBreak/>
         <w:drawing>
-          <wp:inline distT="0" distB="0" distL="0" distR="0" wp14:anchorId="68BE6730" wp14:editId="6B899DD6">
+          <wp:inline distT="0" distB="0" distL="0" distR="0" wp14:anchorId="4DFC27B6" wp14:editId="5D8C4C4E">
             <wp:extent cx="5940000" cy="3712500"/>
             <wp:effectExtent l="0" t="0" r="0" b="0"/>
             <wp:docPr id="1" name="Picture 1"/>
@@ -2301,7 +2369,7 @@
       <w:pPr>
         <w:pStyle w:val="Ttulo1"/>
       </w:pPr>
-      <w:bookmarkStart w:id="2" w:name="_Toc241413916"/>
+      <w:bookmarkStart w:id="2" w:name="_Toc241425401"/>
       <w:r>
         <w:t>2. Datos sin procesar por origen de envío</w:t>
       </w:r>
@@ -2323,7 +2391,7 @@
           <w:noProof/>
         </w:rPr>
         <w:drawing>
-          <wp:inline distT="0" distB="0" distL="0" distR="0" wp14:anchorId="19790F2F" wp14:editId="54483C0A">
+          <wp:inline distT="0" distB="0" distL="0" distR="0" wp14:anchorId="6A582858" wp14:editId="5310BA45">
             <wp:extent cx="5940000" cy="3712500"/>
             <wp:effectExtent l="0" t="0" r="0" b="0"/>
             <wp:docPr id="2" name="Picture 2"/>
@@ -2393,7 +2461,7 @@
         </w:rPr>
         <w:lastRenderedPageBreak/>
         <w:drawing>
-          <wp:inline distT="0" distB="0" distL="0" distR="0" wp14:anchorId="72342DC9" wp14:editId="56CD7646">
+          <wp:inline distT="0" distB="0" distL="0" distR="0" wp14:anchorId="43C6BE09" wp14:editId="3A75385C">
             <wp:extent cx="5940000" cy="3712500"/>
             <wp:effectExtent l="0" t="0" r="0" b="0"/>
             <wp:docPr id="3" name="Picture 3"/>
@@ -2462,7 +2530,7 @@
           <w:noProof/>
         </w:rPr>
         <w:drawing>
-          <wp:inline distT="0" distB="0" distL="0" distR="0" wp14:anchorId="233F37D1" wp14:editId="4B4D2557">
+          <wp:inline distT="0" distB="0" distL="0" distR="0" wp14:anchorId="3DFFFA23" wp14:editId="202BECF4">
             <wp:extent cx="5940000" cy="3712500"/>
             <wp:effectExtent l="0" t="0" r="0" b="0"/>
             <wp:docPr id="4" name="Picture 4"/>
@@ -2529,7 +2597,7 @@
       <w:pPr>
         <w:pStyle w:val="Ttulo1"/>
       </w:pPr>
-      <w:bookmarkStart w:id="3" w:name="_Toc241413917"/>
+      <w:bookmarkStart w:id="3" w:name="_Toc241425402"/>
       <w:r>
         <w:lastRenderedPageBreak/>
         <w:t>3. Cuarto de control</w:t>
@@ -2547,7 +2615,7 @@
           <w:noProof/>
         </w:rPr>
         <w:drawing>
-          <wp:inline distT="0" distB="0" distL="0" distR="0" wp14:anchorId="699E6154" wp14:editId="7C08D4D7">
+          <wp:inline distT="0" distB="0" distL="0" distR="0" wp14:anchorId="502E171E" wp14:editId="1339C8DF">
             <wp:extent cx="5940000" cy="3712500"/>
             <wp:effectExtent l="0" t="0" r="0" b="0"/>
             <wp:docPr id="5" name="Picture 5"/>
@@ -2609,7 +2677,7 @@
       <w:pPr>
         <w:pStyle w:val="Ttulo1"/>
       </w:pPr>
-      <w:bookmarkStart w:id="4" w:name="_Toc241413918"/>
+      <w:bookmarkStart w:id="4" w:name="_Toc241425403"/>
       <w:r>
         <w:t>3.1 Reglas configuradas</w:t>
       </w:r>
@@ -2632,7 +2700,7 @@
         </w:rPr>
         <w:lastRenderedPageBreak/>
         <w:drawing>
-          <wp:inline distT="0" distB="0" distL="0" distR="0" wp14:anchorId="79DA2993" wp14:editId="4179D4C7">
+          <wp:inline distT="0" distB="0" distL="0" distR="0" wp14:anchorId="2ADBC6DD" wp14:editId="4C68DA6F">
             <wp:extent cx="5940000" cy="3712500"/>
             <wp:effectExtent l="0" t="0" r="0" b="0"/>
             <wp:docPr id="6" name="Picture 6"/>
@@ -2694,7 +2762,7 @@
       <w:pPr>
         <w:pStyle w:val="Ttulo1"/>
       </w:pPr>
-      <w:bookmarkStart w:id="5" w:name="_Toc241413919"/>
+      <w:bookmarkStart w:id="5" w:name="_Toc241425404"/>
       <w:r>
         <w:t>3.2 Flota y estado de aprovisionamiento al cierre del día</w:t>
       </w:r>
@@ -2711,7 +2779,7 @@
           <w:noProof/>
         </w:rPr>
         <w:drawing>
-          <wp:inline distT="0" distB="0" distL="0" distR="0" wp14:anchorId="79E4B12E" wp14:editId="556E1836">
+          <wp:inline distT="0" distB="0" distL="0" distR="0" wp14:anchorId="6D90BF78" wp14:editId="650E550E">
             <wp:extent cx="5940000" cy="3712500"/>
             <wp:effectExtent l="0" t="0" r="0" b="0"/>
             <wp:docPr id="7" name="Picture 7"/>
@@ -2778,7 +2846,7 @@
       <w:pPr>
         <w:pStyle w:val="Ttulo1"/>
       </w:pPr>
-      <w:bookmarkStart w:id="6" w:name="_Toc241413920"/>
+      <w:bookmarkStart w:id="6" w:name="_Toc241425405"/>
       <w:r>
         <w:lastRenderedPageBreak/>
         <w:t>3.3 Vistas de operador de la plantilla</w:t>
@@ -2801,7 +2869,7 @@
           <w:noProof/>
         </w:rPr>
         <w:drawing>
-          <wp:inline distT="0" distB="0" distL="0" distR="0" wp14:anchorId="7BA3BC09" wp14:editId="53719F1A">
+          <wp:inline distT="0" distB="0" distL="0" distR="0" wp14:anchorId="71E1DAAA" wp14:editId="008EB122">
             <wp:extent cx="5940000" cy="3712500"/>
             <wp:effectExtent l="0" t="0" r="0" b="0"/>
             <wp:docPr id="8" name="Picture 8"/>
@@ -2863,7 +2931,7 @@
       <w:pPr>
         <w:pStyle w:val="Ttulo1"/>
       </w:pPr>
-      <w:bookmarkStart w:id="7" w:name="_Toc241413921"/>
+      <w:bookmarkStart w:id="7" w:name="_Toc241425406"/>
       <w:r>
         <w:t>4. Días 2 a 4 — migración a servidor remoto y su evidencia</w:t>
       </w:r>
@@ -2878,7 +2946,7 @@
       <w:pPr>
         <w:pStyle w:val="Ttulo2"/>
       </w:pPr>
-      <w:bookmarkStart w:id="8" w:name="_Toc241413922"/>
+      <w:bookmarkStart w:id="8" w:name="_Toc241425407"/>
       <w:r>
         <w:lastRenderedPageBreak/>
         <w:t>4.1 Día 3 (26-sep) — servidor estable, 8/8 nodos</w:t>
@@ -2896,7 +2964,7 @@
           <w:noProof/>
         </w:rPr>
         <w:drawing>
-          <wp:inline distT="0" distB="0" distL="0" distR="0" wp14:anchorId="48F18FC5" wp14:editId="762564E9">
+          <wp:inline distT="0" distB="0" distL="0" distR="0" wp14:anchorId="7D2E251D" wp14:editId="6E52B97A">
             <wp:extent cx="5940000" cy="3712500"/>
             <wp:effectExtent l="0" t="0" r="0" b="0"/>
             <wp:docPr id="9" name="Picture 9"/>
@@ -2965,7 +3033,7 @@
           <w:noProof/>
         </w:rPr>
         <w:drawing>
-          <wp:inline distT="0" distB="0" distL="0" distR="0" wp14:anchorId="139D3183" wp14:editId="1081339A">
+          <wp:inline distT="0" distB="0" distL="0" distR="0" wp14:anchorId="76A270EF" wp14:editId="50D36527">
             <wp:extent cx="5940000" cy="3722400"/>
             <wp:effectExtent l="0" t="0" r="0" b="0"/>
             <wp:docPr id="10" name="Picture 10"/>
@@ -3035,7 +3103,7 @@
         </w:rPr>
         <w:lastRenderedPageBreak/>
         <w:drawing>
-          <wp:inline distT="0" distB="0" distL="0" distR="0" wp14:anchorId="47A55996" wp14:editId="2D6AA3A3">
+          <wp:inline distT="0" distB="0" distL="0" distR="0" wp14:anchorId="58DC6B66" wp14:editId="1B1106EB">
             <wp:extent cx="5940000" cy="3722400"/>
             <wp:effectExtent l="0" t="0" r="0" b="0"/>
             <wp:docPr id="11" name="Picture 11"/>
@@ -3104,7 +3172,7 @@
           <w:noProof/>
         </w:rPr>
         <w:drawing>
-          <wp:inline distT="0" distB="0" distL="0" distR="0" wp14:anchorId="6F147D61" wp14:editId="001AD1ED">
+          <wp:inline distT="0" distB="0" distL="0" distR="0" wp14:anchorId="77431732" wp14:editId="63DDD159">
             <wp:extent cx="5940000" cy="3722400"/>
             <wp:effectExtent l="0" t="0" r="0" b="0"/>
             <wp:docPr id="12" name="Picture 12"/>
@@ -3166,7 +3234,7 @@
       <w:pPr>
         <w:pStyle w:val="Ttulo2"/>
       </w:pPr>
-      <w:bookmarkStart w:id="9" w:name="_Toc241413923"/>
+      <w:bookmarkStart w:id="9" w:name="_Toc241425408"/>
       <w:r>
         <w:t>4.2 Día 4 (27-sep) — solo servidor remoto + Rack B</w:t>
       </w:r>
@@ -3189,7 +3257,7 @@
         </w:rPr>
         <w:lastRenderedPageBreak/>
         <w:drawing>
-          <wp:inline distT="0" distB="0" distL="0" distR="0" wp14:anchorId="1FF422ED" wp14:editId="73ECAFEB">
+          <wp:inline distT="0" distB="0" distL="0" distR="0" wp14:anchorId="4FB52AA8" wp14:editId="74325B60">
             <wp:extent cx="5940000" cy="3722400"/>
             <wp:effectExtent l="0" t="0" r="0" b="0"/>
             <wp:docPr id="13" name="Picture 13"/>
@@ -3258,7 +3326,7 @@
           <w:noProof/>
         </w:rPr>
         <w:drawing>
-          <wp:inline distT="0" distB="0" distL="0" distR="0" wp14:anchorId="5A25C015" wp14:editId="7546CD40">
+          <wp:inline distT="0" distB="0" distL="0" distR="0" wp14:anchorId="4AE864BD" wp14:editId="506D9208">
             <wp:extent cx="5940000" cy="3722400"/>
             <wp:effectExtent l="0" t="0" r="0" b="0"/>
             <wp:docPr id="14" name="Picture 14"/>
@@ -3328,7 +3396,7 @@
         </w:rPr>
         <w:lastRenderedPageBreak/>
         <w:drawing>
-          <wp:inline distT="0" distB="0" distL="0" distR="0" wp14:anchorId="383D1878" wp14:editId="1AE09621">
+          <wp:inline distT="0" distB="0" distL="0" distR="0" wp14:anchorId="168821EA" wp14:editId="7F89BBC9">
             <wp:extent cx="5940000" cy="3722400"/>
             <wp:effectExtent l="0" t="0" r="0" b="0"/>
             <wp:docPr id="15" name="Picture 15"/>
@@ -3397,7 +3465,7 @@
           <w:noProof/>
         </w:rPr>
         <w:drawing>
-          <wp:inline distT="0" distB="0" distL="0" distR="0" wp14:anchorId="34EC1DFF" wp14:editId="61478757">
+          <wp:inline distT="0" distB="0" distL="0" distR="0" wp14:anchorId="61F60D8C" wp14:editId="377293B2">
             <wp:extent cx="5940000" cy="3722400"/>
             <wp:effectExtent l="0" t="0" r="0" b="0"/>
             <wp:docPr id="16" name="Picture 16"/>
@@ -3467,7 +3535,7 @@
         </w:rPr>
         <w:lastRenderedPageBreak/>
         <w:drawing>
-          <wp:inline distT="0" distB="0" distL="0" distR="0" wp14:anchorId="10200E4B" wp14:editId="38D10620">
+          <wp:inline distT="0" distB="0" distL="0" distR="0" wp14:anchorId="4198D35A" wp14:editId="1EF10CAC">
             <wp:extent cx="5940000" cy="3722400"/>
             <wp:effectExtent l="0" t="0" r="0" b="0"/>
             <wp:docPr id="17" name="Picture 17"/>
@@ -3531,14 +3599,2354 @@
       </w:r>
     </w:p>
     <w:p>
+      <w:r>
+        <w:br w:type="page"/>
+      </w:r>
+    </w:p>
+    <w:p>
       <w:pPr>
         <w:pStyle w:val="Ttulo1"/>
       </w:pPr>
-      <w:bookmarkStart w:id="10" w:name="_Toc241413924"/>
+      <w:bookmarkStart w:id="10" w:name="_Toc241425409"/>
+      <w:r>
+        <w:lastRenderedPageBreak/>
+        <w:t>4.3 Métricas de los 10 dispositivos en las 4 fechas (Data Explorer)</w:t>
+      </w:r>
+      <w:bookmarkEnd w:id="10"/>
+    </w:p>
+    <w:p>
+      <w:r>
+        <w:t>Consulta del Explorador de datos de IoT Central sobre el grupo «Nodo DC-ANDES-1 - All devices», agrupada por Id. de dispositivo, con ocho telemetrías que cubren todas las zonas (temperatura de intake de rack, pasillo frío, exterior, PM2.5, humedad de piso, temperatura de techo, potencia de fila y eventos de acceso). Se ejecutó con cuatro rangos, uno por fecha (00:00-23:59, UTC-05:00), y uno con la ventana completa. La leyenda del Explorador solo lista los dispositivos que enviaron datos en el rango, así que</w:t>
+      </w:r>
+      <w:r>
+        <w:t xml:space="preserve"> la tabla siguiente sale directamente de la plataforma, no de los CSV locales (se guardó en datos/matriz_data_explorer.json).</w:t>
+      </w:r>
+    </w:p>
+    <w:tbl>
+      <w:tblPr>
+        <w:tblW w:w="0" w:type="auto"/>
+        <w:jc w:val="center"/>
+        <w:tblLook w:val="04A0" w:firstRow="1" w:lastRow="0" w:firstColumn="1" w:lastColumn="0" w:noHBand="0" w:noVBand="1"/>
+      </w:tblPr>
+      <w:tblGrid>
+        <w:gridCol w:w="2551"/>
+        <w:gridCol w:w="1644"/>
+        <w:gridCol w:w="1644"/>
+        <w:gridCol w:w="1644"/>
+        <w:gridCol w:w="1644"/>
+      </w:tblGrid>
+      <w:tr>
+        <w:trPr>
+          <w:cantSplit/>
+          <w:tblHeader/>
+          <w:jc w:val="center"/>
+        </w:trPr>
+        <w:tc>
+          <w:tcPr>
+            <w:tcW w:w="2551" w:type="dxa"/>
+            <w:tcBorders>
+              <w:top w:val="single" w:sz="4" w:space="0" w:color="0B2A4A"/>
+              <w:left w:val="single" w:sz="4" w:space="0" w:color="0B2A4A"/>
+              <w:bottom w:val="single" w:sz="4" w:space="0" w:color="0B2A4A"/>
+              <w:right w:val="single" w:sz="4" w:space="0" w:color="0B2A4A"/>
+            </w:tcBorders>
+            <w:shd w:val="clear" w:color="auto" w:fill="0B2A4A"/>
+            <w:tcMar>
+              <w:top w:w="90" w:type="dxa"/>
+              <w:left w:w="130" w:type="dxa"/>
+              <w:bottom w:w="90" w:type="dxa"/>
+              <w:right w:w="130" w:type="dxa"/>
+            </w:tcMar>
+            <w:vAlign w:val="center"/>
+          </w:tcPr>
+          <w:p>
+            <w:pPr>
+              <w:keepNext/>
+            </w:pPr>
+            <w:r>
+              <w:rPr>
+                <w:b/>
+                <w:color w:val="FFFFFF"/>
+                <w:sz w:val="19"/>
+              </w:rPr>
+              <w:t>Dispositivo</w:t>
+            </w:r>
+          </w:p>
+        </w:tc>
+        <w:tc>
+          <w:tcPr>
+            <w:tcW w:w="1644" w:type="dxa"/>
+            <w:tcBorders>
+              <w:top w:val="single" w:sz="4" w:space="0" w:color="0B2A4A"/>
+              <w:left w:val="single" w:sz="4" w:space="0" w:color="0B2A4A"/>
+              <w:bottom w:val="single" w:sz="4" w:space="0" w:color="0B2A4A"/>
+              <w:right w:val="single" w:sz="4" w:space="0" w:color="0B2A4A"/>
+            </w:tcBorders>
+            <w:shd w:val="clear" w:color="auto" w:fill="0B2A4A"/>
+            <w:tcMar>
+              <w:top w:w="90" w:type="dxa"/>
+              <w:left w:w="130" w:type="dxa"/>
+              <w:bottom w:w="90" w:type="dxa"/>
+              <w:right w:w="130" w:type="dxa"/>
+            </w:tcMar>
+            <w:vAlign w:val="center"/>
+          </w:tcPr>
+          <w:p>
+            <w:pPr>
+              <w:keepNext/>
+            </w:pPr>
+            <w:r>
+              <w:rPr>
+                <w:b/>
+                <w:color w:val="FFFFFF"/>
+                <w:sz w:val="19"/>
+              </w:rPr>
+              <w:t>24-sep</w:t>
+            </w:r>
+          </w:p>
+        </w:tc>
+        <w:tc>
+          <w:tcPr>
+            <w:tcW w:w="1644" w:type="dxa"/>
+            <w:tcBorders>
+              <w:top w:val="single" w:sz="4" w:space="0" w:color="0B2A4A"/>
+              <w:left w:val="single" w:sz="4" w:space="0" w:color="0B2A4A"/>
+              <w:bottom w:val="single" w:sz="4" w:space="0" w:color="0B2A4A"/>
+              <w:right w:val="single" w:sz="4" w:space="0" w:color="0B2A4A"/>
+            </w:tcBorders>
+            <w:shd w:val="clear" w:color="auto" w:fill="0B2A4A"/>
+            <w:tcMar>
+              <w:top w:w="90" w:type="dxa"/>
+              <w:left w:w="130" w:type="dxa"/>
+              <w:bottom w:w="90" w:type="dxa"/>
+              <w:right w:w="130" w:type="dxa"/>
+            </w:tcMar>
+            <w:vAlign w:val="center"/>
+          </w:tcPr>
+          <w:p>
+            <w:pPr>
+              <w:keepNext/>
+            </w:pPr>
+            <w:r>
+              <w:rPr>
+                <w:b/>
+                <w:color w:val="FFFFFF"/>
+                <w:sz w:val="19"/>
+              </w:rPr>
+              <w:t>25-sep</w:t>
+            </w:r>
+          </w:p>
+        </w:tc>
+        <w:tc>
+          <w:tcPr>
+            <w:tcW w:w="1644" w:type="dxa"/>
+            <w:tcBorders>
+              <w:top w:val="single" w:sz="4" w:space="0" w:color="0B2A4A"/>
+              <w:left w:val="single" w:sz="4" w:space="0" w:color="0B2A4A"/>
+              <w:bottom w:val="single" w:sz="4" w:space="0" w:color="0B2A4A"/>
+              <w:right w:val="single" w:sz="4" w:space="0" w:color="0B2A4A"/>
+            </w:tcBorders>
+            <w:shd w:val="clear" w:color="auto" w:fill="0B2A4A"/>
+            <w:tcMar>
+              <w:top w:w="90" w:type="dxa"/>
+              <w:left w:w="130" w:type="dxa"/>
+              <w:bottom w:w="90" w:type="dxa"/>
+              <w:right w:w="130" w:type="dxa"/>
+            </w:tcMar>
+            <w:vAlign w:val="center"/>
+          </w:tcPr>
+          <w:p>
+            <w:pPr>
+              <w:keepNext/>
+            </w:pPr>
+            <w:r>
+              <w:rPr>
+                <w:b/>
+                <w:color w:val="FFFFFF"/>
+                <w:sz w:val="19"/>
+              </w:rPr>
+              <w:t>26-sep</w:t>
+            </w:r>
+          </w:p>
+        </w:tc>
+        <w:tc>
+          <w:tcPr>
+            <w:tcW w:w="1644" w:type="dxa"/>
+            <w:tcBorders>
+              <w:top w:val="single" w:sz="4" w:space="0" w:color="0B2A4A"/>
+              <w:left w:val="single" w:sz="4" w:space="0" w:color="0B2A4A"/>
+              <w:bottom w:val="single" w:sz="4" w:space="0" w:color="0B2A4A"/>
+              <w:right w:val="single" w:sz="4" w:space="0" w:color="0B2A4A"/>
+            </w:tcBorders>
+            <w:shd w:val="clear" w:color="auto" w:fill="0B2A4A"/>
+            <w:tcMar>
+              <w:top w:w="90" w:type="dxa"/>
+              <w:left w:w="130" w:type="dxa"/>
+              <w:bottom w:w="90" w:type="dxa"/>
+              <w:right w:w="130" w:type="dxa"/>
+            </w:tcMar>
+            <w:vAlign w:val="center"/>
+          </w:tcPr>
+          <w:p>
+            <w:pPr>
+              <w:keepNext/>
+            </w:pPr>
+            <w:r>
+              <w:rPr>
+                <w:b/>
+                <w:color w:val="FFFFFF"/>
+                <w:sz w:val="19"/>
+              </w:rPr>
+              <w:t>27-sep</w:t>
+            </w:r>
+          </w:p>
+        </w:tc>
+      </w:tr>
+      <w:tr>
+        <w:trPr>
+          <w:cantSplit/>
+          <w:jc w:val="center"/>
+        </w:trPr>
+        <w:tc>
+          <w:tcPr>
+            <w:tcW w:w="2551" w:type="dxa"/>
+            <w:tcBorders>
+              <w:top w:val="single" w:sz="4" w:space="0" w:color="D0D7DE"/>
+              <w:left w:val="single" w:sz="4" w:space="0" w:color="D0D7DE"/>
+              <w:bottom w:val="single" w:sz="4" w:space="0" w:color="D0D7DE"/>
+              <w:right w:val="single" w:sz="4" w:space="0" w:color="D0D7DE"/>
+            </w:tcBorders>
+            <w:shd w:val="clear" w:color="auto" w:fill="FFFFFF"/>
+            <w:tcMar>
+              <w:top w:w="90" w:type="dxa"/>
+              <w:left w:w="130" w:type="dxa"/>
+              <w:bottom w:w="90" w:type="dxa"/>
+              <w:right w:w="130" w:type="dxa"/>
+            </w:tcMar>
+            <w:vAlign w:val="center"/>
+          </w:tcPr>
+          <w:p>
+            <w:pPr>
+              <w:keepNext/>
+              <w:spacing w:after="0"/>
+            </w:pPr>
+            <w:r>
+              <w:rPr>
+                <w:b/>
+                <w:sz w:val="19"/>
+              </w:rPr>
+              <w:t>DC-RACKA-01</w:t>
+            </w:r>
+          </w:p>
+        </w:tc>
+        <w:tc>
+          <w:tcPr>
+            <w:tcW w:w="1644" w:type="dxa"/>
+            <w:tcBorders>
+              <w:top w:val="single" w:sz="4" w:space="0" w:color="D0D7DE"/>
+              <w:left w:val="single" w:sz="4" w:space="0" w:color="D0D7DE"/>
+              <w:bottom w:val="single" w:sz="4" w:space="0" w:color="D0D7DE"/>
+              <w:right w:val="single" w:sz="4" w:space="0" w:color="D0D7DE"/>
+            </w:tcBorders>
+            <w:shd w:val="clear" w:color="auto" w:fill="FFFFFF"/>
+            <w:tcMar>
+              <w:top w:w="90" w:type="dxa"/>
+              <w:left w:w="130" w:type="dxa"/>
+              <w:bottom w:w="90" w:type="dxa"/>
+              <w:right w:w="130" w:type="dxa"/>
+            </w:tcMar>
+            <w:vAlign w:val="center"/>
+          </w:tcPr>
+          <w:p>
+            <w:pPr>
+              <w:keepNext/>
+              <w:spacing w:after="0"/>
+            </w:pPr>
+            <w:r>
+              <w:rPr>
+                <w:sz w:val="19"/>
+              </w:rPr>
+              <w:t>sí</w:t>
+            </w:r>
+          </w:p>
+        </w:tc>
+        <w:tc>
+          <w:tcPr>
+            <w:tcW w:w="1644" w:type="dxa"/>
+            <w:tcBorders>
+              <w:top w:val="single" w:sz="4" w:space="0" w:color="D0D7DE"/>
+              <w:left w:val="single" w:sz="4" w:space="0" w:color="D0D7DE"/>
+              <w:bottom w:val="single" w:sz="4" w:space="0" w:color="D0D7DE"/>
+              <w:right w:val="single" w:sz="4" w:space="0" w:color="D0D7DE"/>
+            </w:tcBorders>
+            <w:shd w:val="clear" w:color="auto" w:fill="FFFFFF"/>
+            <w:tcMar>
+              <w:top w:w="90" w:type="dxa"/>
+              <w:left w:w="130" w:type="dxa"/>
+              <w:bottom w:w="90" w:type="dxa"/>
+              <w:right w:w="130" w:type="dxa"/>
+            </w:tcMar>
+            <w:vAlign w:val="center"/>
+          </w:tcPr>
+          <w:p>
+            <w:pPr>
+              <w:keepNext/>
+              <w:spacing w:after="0"/>
+            </w:pPr>
+            <w:r>
+              <w:rPr>
+                <w:sz w:val="19"/>
+              </w:rPr>
+              <w:t>sí</w:t>
+            </w:r>
+          </w:p>
+        </w:tc>
+        <w:tc>
+          <w:tcPr>
+            <w:tcW w:w="1644" w:type="dxa"/>
+            <w:tcBorders>
+              <w:top w:val="single" w:sz="4" w:space="0" w:color="D0D7DE"/>
+              <w:left w:val="single" w:sz="4" w:space="0" w:color="D0D7DE"/>
+              <w:bottom w:val="single" w:sz="4" w:space="0" w:color="D0D7DE"/>
+              <w:right w:val="single" w:sz="4" w:space="0" w:color="D0D7DE"/>
+            </w:tcBorders>
+            <w:shd w:val="clear" w:color="auto" w:fill="FFFFFF"/>
+            <w:tcMar>
+              <w:top w:w="90" w:type="dxa"/>
+              <w:left w:w="130" w:type="dxa"/>
+              <w:bottom w:w="90" w:type="dxa"/>
+              <w:right w:w="130" w:type="dxa"/>
+            </w:tcMar>
+            <w:vAlign w:val="center"/>
+          </w:tcPr>
+          <w:p>
+            <w:pPr>
+              <w:keepNext/>
+              <w:spacing w:after="0"/>
+            </w:pPr>
+            <w:r>
+              <w:rPr>
+                <w:sz w:val="19"/>
+              </w:rPr>
+              <w:t>sí</w:t>
+            </w:r>
+          </w:p>
+        </w:tc>
+        <w:tc>
+          <w:tcPr>
+            <w:tcW w:w="1644" w:type="dxa"/>
+            <w:tcBorders>
+              <w:top w:val="single" w:sz="4" w:space="0" w:color="D0D7DE"/>
+              <w:left w:val="single" w:sz="4" w:space="0" w:color="D0D7DE"/>
+              <w:bottom w:val="single" w:sz="4" w:space="0" w:color="D0D7DE"/>
+              <w:right w:val="single" w:sz="4" w:space="0" w:color="D0D7DE"/>
+            </w:tcBorders>
+            <w:shd w:val="clear" w:color="auto" w:fill="FFFFFF"/>
+            <w:tcMar>
+              <w:top w:w="90" w:type="dxa"/>
+              <w:left w:w="130" w:type="dxa"/>
+              <w:bottom w:w="90" w:type="dxa"/>
+              <w:right w:w="130" w:type="dxa"/>
+            </w:tcMar>
+            <w:vAlign w:val="center"/>
+          </w:tcPr>
+          <w:p>
+            <w:pPr>
+              <w:keepNext/>
+              <w:spacing w:after="0"/>
+            </w:pPr>
+            <w:r>
+              <w:rPr>
+                <w:sz w:val="19"/>
+              </w:rPr>
+              <w:t>sí</w:t>
+            </w:r>
+          </w:p>
+        </w:tc>
+      </w:tr>
+      <w:tr>
+        <w:trPr>
+          <w:cantSplit/>
+          <w:jc w:val="center"/>
+        </w:trPr>
+        <w:tc>
+          <w:tcPr>
+            <w:tcW w:w="2551" w:type="dxa"/>
+            <w:tcBorders>
+              <w:top w:val="single" w:sz="4" w:space="0" w:color="D0D7DE"/>
+              <w:left w:val="single" w:sz="4" w:space="0" w:color="D0D7DE"/>
+              <w:bottom w:val="single" w:sz="4" w:space="0" w:color="D0D7DE"/>
+              <w:right w:val="single" w:sz="4" w:space="0" w:color="D0D7DE"/>
+            </w:tcBorders>
+            <w:shd w:val="clear" w:color="auto" w:fill="F4F7FB"/>
+            <w:tcMar>
+              <w:top w:w="90" w:type="dxa"/>
+              <w:left w:w="130" w:type="dxa"/>
+              <w:bottom w:w="90" w:type="dxa"/>
+              <w:right w:w="130" w:type="dxa"/>
+            </w:tcMar>
+            <w:vAlign w:val="center"/>
+          </w:tcPr>
+          <w:p>
+            <w:pPr>
+              <w:keepNext/>
+              <w:spacing w:after="0"/>
+            </w:pPr>
+            <w:r>
+              <w:rPr>
+                <w:b/>
+                <w:sz w:val="19"/>
+              </w:rPr>
+              <w:t>DC-RACKB-02</w:t>
+            </w:r>
+          </w:p>
+        </w:tc>
+        <w:tc>
+          <w:tcPr>
+            <w:tcW w:w="1644" w:type="dxa"/>
+            <w:tcBorders>
+              <w:top w:val="single" w:sz="4" w:space="0" w:color="D0D7DE"/>
+              <w:left w:val="single" w:sz="4" w:space="0" w:color="D0D7DE"/>
+              <w:bottom w:val="single" w:sz="4" w:space="0" w:color="D0D7DE"/>
+              <w:right w:val="single" w:sz="4" w:space="0" w:color="D0D7DE"/>
+            </w:tcBorders>
+            <w:shd w:val="clear" w:color="auto" w:fill="F4F7FB"/>
+            <w:tcMar>
+              <w:top w:w="90" w:type="dxa"/>
+              <w:left w:w="130" w:type="dxa"/>
+              <w:bottom w:w="90" w:type="dxa"/>
+              <w:right w:w="130" w:type="dxa"/>
+            </w:tcMar>
+            <w:vAlign w:val="center"/>
+          </w:tcPr>
+          <w:p>
+            <w:pPr>
+              <w:keepNext/>
+              <w:spacing w:after="0"/>
+            </w:pPr>
+            <w:r>
+              <w:rPr>
+                <w:sz w:val="19"/>
+              </w:rPr>
+              <w:t>sí</w:t>
+            </w:r>
+          </w:p>
+        </w:tc>
+        <w:tc>
+          <w:tcPr>
+            <w:tcW w:w="1644" w:type="dxa"/>
+            <w:tcBorders>
+              <w:top w:val="single" w:sz="4" w:space="0" w:color="D0D7DE"/>
+              <w:left w:val="single" w:sz="4" w:space="0" w:color="D0D7DE"/>
+              <w:bottom w:val="single" w:sz="4" w:space="0" w:color="D0D7DE"/>
+              <w:right w:val="single" w:sz="4" w:space="0" w:color="D0D7DE"/>
+            </w:tcBorders>
+            <w:shd w:val="clear" w:color="auto" w:fill="F4F7FB"/>
+            <w:tcMar>
+              <w:top w:w="90" w:type="dxa"/>
+              <w:left w:w="130" w:type="dxa"/>
+              <w:bottom w:w="90" w:type="dxa"/>
+              <w:right w:w="130" w:type="dxa"/>
+            </w:tcMar>
+            <w:vAlign w:val="center"/>
+          </w:tcPr>
+          <w:p>
+            <w:pPr>
+              <w:keepNext/>
+              <w:spacing w:after="0"/>
+            </w:pPr>
+            <w:r>
+              <w:rPr>
+                <w:sz w:val="19"/>
+              </w:rPr>
+              <w:t>sí</w:t>
+            </w:r>
+          </w:p>
+        </w:tc>
+        <w:tc>
+          <w:tcPr>
+            <w:tcW w:w="1644" w:type="dxa"/>
+            <w:tcBorders>
+              <w:top w:val="single" w:sz="4" w:space="0" w:color="D0D7DE"/>
+              <w:left w:val="single" w:sz="4" w:space="0" w:color="D0D7DE"/>
+              <w:bottom w:val="single" w:sz="4" w:space="0" w:color="D0D7DE"/>
+              <w:right w:val="single" w:sz="4" w:space="0" w:color="D0D7DE"/>
+            </w:tcBorders>
+            <w:shd w:val="clear" w:color="auto" w:fill="F4F7FB"/>
+            <w:tcMar>
+              <w:top w:w="90" w:type="dxa"/>
+              <w:left w:w="130" w:type="dxa"/>
+              <w:bottom w:w="90" w:type="dxa"/>
+              <w:right w:w="130" w:type="dxa"/>
+            </w:tcMar>
+            <w:vAlign w:val="center"/>
+          </w:tcPr>
+          <w:p>
+            <w:pPr>
+              <w:keepNext/>
+              <w:spacing w:after="0"/>
+            </w:pPr>
+            <w:r>
+              <w:rPr>
+                <w:sz w:val="19"/>
+              </w:rPr>
+              <w:t>sí</w:t>
+            </w:r>
+          </w:p>
+        </w:tc>
+        <w:tc>
+          <w:tcPr>
+            <w:tcW w:w="1644" w:type="dxa"/>
+            <w:tcBorders>
+              <w:top w:val="single" w:sz="4" w:space="0" w:color="D0D7DE"/>
+              <w:left w:val="single" w:sz="4" w:space="0" w:color="D0D7DE"/>
+              <w:bottom w:val="single" w:sz="4" w:space="0" w:color="D0D7DE"/>
+              <w:right w:val="single" w:sz="4" w:space="0" w:color="D0D7DE"/>
+            </w:tcBorders>
+            <w:shd w:val="clear" w:color="auto" w:fill="F4F7FB"/>
+            <w:tcMar>
+              <w:top w:w="90" w:type="dxa"/>
+              <w:left w:w="130" w:type="dxa"/>
+              <w:bottom w:w="90" w:type="dxa"/>
+              <w:right w:w="130" w:type="dxa"/>
+            </w:tcMar>
+            <w:vAlign w:val="center"/>
+          </w:tcPr>
+          <w:p>
+            <w:pPr>
+              <w:keepNext/>
+              <w:spacing w:after="0"/>
+            </w:pPr>
+            <w:r>
+              <w:rPr>
+                <w:sz w:val="19"/>
+              </w:rPr>
+              <w:t>sí</w:t>
+            </w:r>
+          </w:p>
+        </w:tc>
+      </w:tr>
+      <w:tr>
+        <w:trPr>
+          <w:cantSplit/>
+          <w:jc w:val="center"/>
+        </w:trPr>
+        <w:tc>
+          <w:tcPr>
+            <w:tcW w:w="2551" w:type="dxa"/>
+            <w:tcBorders>
+              <w:top w:val="single" w:sz="4" w:space="0" w:color="D0D7DE"/>
+              <w:left w:val="single" w:sz="4" w:space="0" w:color="D0D7DE"/>
+              <w:bottom w:val="single" w:sz="4" w:space="0" w:color="D0D7DE"/>
+              <w:right w:val="single" w:sz="4" w:space="0" w:color="D0D7DE"/>
+            </w:tcBorders>
+            <w:shd w:val="clear" w:color="auto" w:fill="FFFFFF"/>
+            <w:tcMar>
+              <w:top w:w="90" w:type="dxa"/>
+              <w:left w:w="130" w:type="dxa"/>
+              <w:bottom w:w="90" w:type="dxa"/>
+              <w:right w:w="130" w:type="dxa"/>
+            </w:tcMar>
+            <w:vAlign w:val="center"/>
+          </w:tcPr>
+          <w:p>
+            <w:pPr>
+              <w:keepNext/>
+              <w:spacing w:after="0"/>
+            </w:pPr>
+            <w:r>
+              <w:rPr>
+                <w:b/>
+                <w:sz w:val="19"/>
+              </w:rPr>
+              <w:t>DC-RACKC-03</w:t>
+            </w:r>
+          </w:p>
+        </w:tc>
+        <w:tc>
+          <w:tcPr>
+            <w:tcW w:w="1644" w:type="dxa"/>
+            <w:tcBorders>
+              <w:top w:val="single" w:sz="4" w:space="0" w:color="D0D7DE"/>
+              <w:left w:val="single" w:sz="4" w:space="0" w:color="D0D7DE"/>
+              <w:bottom w:val="single" w:sz="4" w:space="0" w:color="D0D7DE"/>
+              <w:right w:val="single" w:sz="4" w:space="0" w:color="D0D7DE"/>
+            </w:tcBorders>
+            <w:shd w:val="clear" w:color="auto" w:fill="FFFFFF"/>
+            <w:tcMar>
+              <w:top w:w="90" w:type="dxa"/>
+              <w:left w:w="130" w:type="dxa"/>
+              <w:bottom w:w="90" w:type="dxa"/>
+              <w:right w:w="130" w:type="dxa"/>
+            </w:tcMar>
+            <w:vAlign w:val="center"/>
+          </w:tcPr>
+          <w:p>
+            <w:pPr>
+              <w:keepNext/>
+              <w:spacing w:after="0"/>
+            </w:pPr>
+            <w:r>
+              <w:rPr>
+                <w:sz w:val="19"/>
+              </w:rPr>
+              <w:t>sí</w:t>
+            </w:r>
+          </w:p>
+        </w:tc>
+        <w:tc>
+          <w:tcPr>
+            <w:tcW w:w="1644" w:type="dxa"/>
+            <w:tcBorders>
+              <w:top w:val="single" w:sz="4" w:space="0" w:color="D0D7DE"/>
+              <w:left w:val="single" w:sz="4" w:space="0" w:color="D0D7DE"/>
+              <w:bottom w:val="single" w:sz="4" w:space="0" w:color="D0D7DE"/>
+              <w:right w:val="single" w:sz="4" w:space="0" w:color="D0D7DE"/>
+            </w:tcBorders>
+            <w:shd w:val="clear" w:color="auto" w:fill="FFFFFF"/>
+            <w:tcMar>
+              <w:top w:w="90" w:type="dxa"/>
+              <w:left w:w="130" w:type="dxa"/>
+              <w:bottom w:w="90" w:type="dxa"/>
+              <w:right w:w="130" w:type="dxa"/>
+            </w:tcMar>
+            <w:vAlign w:val="center"/>
+          </w:tcPr>
+          <w:p>
+            <w:pPr>
+              <w:keepNext/>
+              <w:spacing w:after="0"/>
+            </w:pPr>
+            <w:r>
+              <w:rPr>
+                <w:sz w:val="19"/>
+              </w:rPr>
+              <w:t>sí</w:t>
+            </w:r>
+          </w:p>
+        </w:tc>
+        <w:tc>
+          <w:tcPr>
+            <w:tcW w:w="1644" w:type="dxa"/>
+            <w:tcBorders>
+              <w:top w:val="single" w:sz="4" w:space="0" w:color="D0D7DE"/>
+              <w:left w:val="single" w:sz="4" w:space="0" w:color="D0D7DE"/>
+              <w:bottom w:val="single" w:sz="4" w:space="0" w:color="D0D7DE"/>
+              <w:right w:val="single" w:sz="4" w:space="0" w:color="D0D7DE"/>
+            </w:tcBorders>
+            <w:shd w:val="clear" w:color="auto" w:fill="FFFFFF"/>
+            <w:tcMar>
+              <w:top w:w="90" w:type="dxa"/>
+              <w:left w:w="130" w:type="dxa"/>
+              <w:bottom w:w="90" w:type="dxa"/>
+              <w:right w:w="130" w:type="dxa"/>
+            </w:tcMar>
+            <w:vAlign w:val="center"/>
+          </w:tcPr>
+          <w:p>
+            <w:pPr>
+              <w:keepNext/>
+              <w:spacing w:after="0"/>
+            </w:pPr>
+            <w:r>
+              <w:rPr>
+                <w:sz w:val="19"/>
+              </w:rPr>
+              <w:t>sí</w:t>
+            </w:r>
+          </w:p>
+        </w:tc>
+        <w:tc>
+          <w:tcPr>
+            <w:tcW w:w="1644" w:type="dxa"/>
+            <w:tcBorders>
+              <w:top w:val="single" w:sz="4" w:space="0" w:color="D0D7DE"/>
+              <w:left w:val="single" w:sz="4" w:space="0" w:color="D0D7DE"/>
+              <w:bottom w:val="single" w:sz="4" w:space="0" w:color="D0D7DE"/>
+              <w:right w:val="single" w:sz="4" w:space="0" w:color="D0D7DE"/>
+            </w:tcBorders>
+            <w:shd w:val="clear" w:color="auto" w:fill="FFFFFF"/>
+            <w:tcMar>
+              <w:top w:w="90" w:type="dxa"/>
+              <w:left w:w="130" w:type="dxa"/>
+              <w:bottom w:w="90" w:type="dxa"/>
+              <w:right w:w="130" w:type="dxa"/>
+            </w:tcMar>
+            <w:vAlign w:val="center"/>
+          </w:tcPr>
+          <w:p>
+            <w:pPr>
+              <w:keepNext/>
+              <w:spacing w:after="0"/>
+            </w:pPr>
+            <w:r>
+              <w:rPr>
+                <w:sz w:val="19"/>
+              </w:rPr>
+              <w:t>sí</w:t>
+            </w:r>
+          </w:p>
+        </w:tc>
+      </w:tr>
+      <w:tr>
+        <w:trPr>
+          <w:cantSplit/>
+          <w:jc w:val="center"/>
+        </w:trPr>
+        <w:tc>
+          <w:tcPr>
+            <w:tcW w:w="2551" w:type="dxa"/>
+            <w:tcBorders>
+              <w:top w:val="single" w:sz="4" w:space="0" w:color="D0D7DE"/>
+              <w:left w:val="single" w:sz="4" w:space="0" w:color="D0D7DE"/>
+              <w:bottom w:val="single" w:sz="4" w:space="0" w:color="D0D7DE"/>
+              <w:right w:val="single" w:sz="4" w:space="0" w:color="D0D7DE"/>
+            </w:tcBorders>
+            <w:shd w:val="clear" w:color="auto" w:fill="F4F7FB"/>
+            <w:tcMar>
+              <w:top w:w="90" w:type="dxa"/>
+              <w:left w:w="130" w:type="dxa"/>
+              <w:bottom w:w="90" w:type="dxa"/>
+              <w:right w:w="130" w:type="dxa"/>
+            </w:tcMar>
+            <w:vAlign w:val="center"/>
+          </w:tcPr>
+          <w:p>
+            <w:pPr>
+              <w:keepNext/>
+              <w:spacing w:after="0"/>
+            </w:pPr>
+            <w:r>
+              <w:rPr>
+                <w:b/>
+                <w:sz w:val="19"/>
+              </w:rPr>
+              <w:t>DC-PASILLO-04</w:t>
+            </w:r>
+          </w:p>
+        </w:tc>
+        <w:tc>
+          <w:tcPr>
+            <w:tcW w:w="1644" w:type="dxa"/>
+            <w:tcBorders>
+              <w:top w:val="single" w:sz="4" w:space="0" w:color="D0D7DE"/>
+              <w:left w:val="single" w:sz="4" w:space="0" w:color="D0D7DE"/>
+              <w:bottom w:val="single" w:sz="4" w:space="0" w:color="D0D7DE"/>
+              <w:right w:val="single" w:sz="4" w:space="0" w:color="D0D7DE"/>
+            </w:tcBorders>
+            <w:shd w:val="clear" w:color="auto" w:fill="F4F7FB"/>
+            <w:tcMar>
+              <w:top w:w="90" w:type="dxa"/>
+              <w:left w:w="130" w:type="dxa"/>
+              <w:bottom w:w="90" w:type="dxa"/>
+              <w:right w:w="130" w:type="dxa"/>
+            </w:tcMar>
+            <w:vAlign w:val="center"/>
+          </w:tcPr>
+          <w:p>
+            <w:pPr>
+              <w:keepNext/>
+              <w:spacing w:after="0"/>
+            </w:pPr>
+            <w:r>
+              <w:rPr>
+                <w:sz w:val="19"/>
+              </w:rPr>
+              <w:t>sí</w:t>
+            </w:r>
+          </w:p>
+        </w:tc>
+        <w:tc>
+          <w:tcPr>
+            <w:tcW w:w="1644" w:type="dxa"/>
+            <w:tcBorders>
+              <w:top w:val="single" w:sz="4" w:space="0" w:color="D0D7DE"/>
+              <w:left w:val="single" w:sz="4" w:space="0" w:color="D0D7DE"/>
+              <w:bottom w:val="single" w:sz="4" w:space="0" w:color="D0D7DE"/>
+              <w:right w:val="single" w:sz="4" w:space="0" w:color="D0D7DE"/>
+            </w:tcBorders>
+            <w:shd w:val="clear" w:color="auto" w:fill="F4F7FB"/>
+            <w:tcMar>
+              <w:top w:w="90" w:type="dxa"/>
+              <w:left w:w="130" w:type="dxa"/>
+              <w:bottom w:w="90" w:type="dxa"/>
+              <w:right w:w="130" w:type="dxa"/>
+            </w:tcMar>
+            <w:vAlign w:val="center"/>
+          </w:tcPr>
+          <w:p>
+            <w:pPr>
+              <w:keepNext/>
+              <w:spacing w:after="0"/>
+            </w:pPr>
+            <w:r>
+              <w:rPr>
+                <w:sz w:val="19"/>
+              </w:rPr>
+              <w:t>sí</w:t>
+            </w:r>
+          </w:p>
+        </w:tc>
+        <w:tc>
+          <w:tcPr>
+            <w:tcW w:w="1644" w:type="dxa"/>
+            <w:tcBorders>
+              <w:top w:val="single" w:sz="4" w:space="0" w:color="D0D7DE"/>
+              <w:left w:val="single" w:sz="4" w:space="0" w:color="D0D7DE"/>
+              <w:bottom w:val="single" w:sz="4" w:space="0" w:color="D0D7DE"/>
+              <w:right w:val="single" w:sz="4" w:space="0" w:color="D0D7DE"/>
+            </w:tcBorders>
+            <w:shd w:val="clear" w:color="auto" w:fill="F4F7FB"/>
+            <w:tcMar>
+              <w:top w:w="90" w:type="dxa"/>
+              <w:left w:w="130" w:type="dxa"/>
+              <w:bottom w:w="90" w:type="dxa"/>
+              <w:right w:w="130" w:type="dxa"/>
+            </w:tcMar>
+            <w:vAlign w:val="center"/>
+          </w:tcPr>
+          <w:p>
+            <w:pPr>
+              <w:keepNext/>
+              <w:spacing w:after="0"/>
+            </w:pPr>
+            <w:r>
+              <w:rPr>
+                <w:sz w:val="19"/>
+              </w:rPr>
+              <w:t>sí</w:t>
+            </w:r>
+          </w:p>
+        </w:tc>
+        <w:tc>
+          <w:tcPr>
+            <w:tcW w:w="1644" w:type="dxa"/>
+            <w:tcBorders>
+              <w:top w:val="single" w:sz="4" w:space="0" w:color="D0D7DE"/>
+              <w:left w:val="single" w:sz="4" w:space="0" w:color="D0D7DE"/>
+              <w:bottom w:val="single" w:sz="4" w:space="0" w:color="D0D7DE"/>
+              <w:right w:val="single" w:sz="4" w:space="0" w:color="D0D7DE"/>
+            </w:tcBorders>
+            <w:shd w:val="clear" w:color="auto" w:fill="F4F7FB"/>
+            <w:tcMar>
+              <w:top w:w="90" w:type="dxa"/>
+              <w:left w:w="130" w:type="dxa"/>
+              <w:bottom w:w="90" w:type="dxa"/>
+              <w:right w:w="130" w:type="dxa"/>
+            </w:tcMar>
+            <w:vAlign w:val="center"/>
+          </w:tcPr>
+          <w:p>
+            <w:pPr>
+              <w:keepNext/>
+              <w:spacing w:after="0"/>
+            </w:pPr>
+            <w:r>
+              <w:rPr>
+                <w:sz w:val="19"/>
+              </w:rPr>
+              <w:t>sí</w:t>
+            </w:r>
+          </w:p>
+        </w:tc>
+      </w:tr>
+      <w:tr>
+        <w:trPr>
+          <w:cantSplit/>
+          <w:jc w:val="center"/>
+        </w:trPr>
+        <w:tc>
+          <w:tcPr>
+            <w:tcW w:w="2551" w:type="dxa"/>
+            <w:tcBorders>
+              <w:top w:val="single" w:sz="4" w:space="0" w:color="D0D7DE"/>
+              <w:left w:val="single" w:sz="4" w:space="0" w:color="D0D7DE"/>
+              <w:bottom w:val="single" w:sz="4" w:space="0" w:color="D0D7DE"/>
+              <w:right w:val="single" w:sz="4" w:space="0" w:color="D0D7DE"/>
+            </w:tcBorders>
+            <w:shd w:val="clear" w:color="auto" w:fill="FFFFFF"/>
+            <w:tcMar>
+              <w:top w:w="90" w:type="dxa"/>
+              <w:left w:w="130" w:type="dxa"/>
+              <w:bottom w:w="90" w:type="dxa"/>
+              <w:right w:w="130" w:type="dxa"/>
+            </w:tcMar>
+            <w:vAlign w:val="center"/>
+          </w:tcPr>
+          <w:p>
+            <w:pPr>
+              <w:keepNext/>
+              <w:spacing w:after="0"/>
+            </w:pPr>
+            <w:r>
+              <w:rPr>
+                <w:b/>
+                <w:sz w:val="19"/>
+              </w:rPr>
+              <w:t>DC-CLIMA-05</w:t>
+            </w:r>
+          </w:p>
+        </w:tc>
+        <w:tc>
+          <w:tcPr>
+            <w:tcW w:w="1644" w:type="dxa"/>
+            <w:tcBorders>
+              <w:top w:val="single" w:sz="4" w:space="0" w:color="D0D7DE"/>
+              <w:left w:val="single" w:sz="4" w:space="0" w:color="D0D7DE"/>
+              <w:bottom w:val="single" w:sz="4" w:space="0" w:color="D0D7DE"/>
+              <w:right w:val="single" w:sz="4" w:space="0" w:color="D0D7DE"/>
+            </w:tcBorders>
+            <w:shd w:val="clear" w:color="auto" w:fill="FFFFFF"/>
+            <w:tcMar>
+              <w:top w:w="90" w:type="dxa"/>
+              <w:left w:w="130" w:type="dxa"/>
+              <w:bottom w:w="90" w:type="dxa"/>
+              <w:right w:w="130" w:type="dxa"/>
+            </w:tcMar>
+            <w:vAlign w:val="center"/>
+          </w:tcPr>
+          <w:p>
+            <w:pPr>
+              <w:keepNext/>
+              <w:spacing w:after="0"/>
+            </w:pPr>
+            <w:r>
+              <w:rPr>
+                <w:sz w:val="19"/>
+              </w:rPr>
+              <w:t>sí</w:t>
+            </w:r>
+          </w:p>
+        </w:tc>
+        <w:tc>
+          <w:tcPr>
+            <w:tcW w:w="1644" w:type="dxa"/>
+            <w:tcBorders>
+              <w:top w:val="single" w:sz="4" w:space="0" w:color="D0D7DE"/>
+              <w:left w:val="single" w:sz="4" w:space="0" w:color="D0D7DE"/>
+              <w:bottom w:val="single" w:sz="4" w:space="0" w:color="D0D7DE"/>
+              <w:right w:val="single" w:sz="4" w:space="0" w:color="D0D7DE"/>
+            </w:tcBorders>
+            <w:shd w:val="clear" w:color="auto" w:fill="FFFFFF"/>
+            <w:tcMar>
+              <w:top w:w="90" w:type="dxa"/>
+              <w:left w:w="130" w:type="dxa"/>
+              <w:bottom w:w="90" w:type="dxa"/>
+              <w:right w:w="130" w:type="dxa"/>
+            </w:tcMar>
+            <w:vAlign w:val="center"/>
+          </w:tcPr>
+          <w:p>
+            <w:pPr>
+              <w:keepNext/>
+              <w:spacing w:after="0"/>
+            </w:pPr>
+            <w:r>
+              <w:rPr>
+                <w:sz w:val="19"/>
+              </w:rPr>
+              <w:t>sí</w:t>
+            </w:r>
+          </w:p>
+        </w:tc>
+        <w:tc>
+          <w:tcPr>
+            <w:tcW w:w="1644" w:type="dxa"/>
+            <w:tcBorders>
+              <w:top w:val="single" w:sz="4" w:space="0" w:color="D0D7DE"/>
+              <w:left w:val="single" w:sz="4" w:space="0" w:color="D0D7DE"/>
+              <w:bottom w:val="single" w:sz="4" w:space="0" w:color="D0D7DE"/>
+              <w:right w:val="single" w:sz="4" w:space="0" w:color="D0D7DE"/>
+            </w:tcBorders>
+            <w:shd w:val="clear" w:color="auto" w:fill="FFFFFF"/>
+            <w:tcMar>
+              <w:top w:w="90" w:type="dxa"/>
+              <w:left w:w="130" w:type="dxa"/>
+              <w:bottom w:w="90" w:type="dxa"/>
+              <w:right w:w="130" w:type="dxa"/>
+            </w:tcMar>
+            <w:vAlign w:val="center"/>
+          </w:tcPr>
+          <w:p>
+            <w:pPr>
+              <w:keepNext/>
+              <w:spacing w:after="0"/>
+            </w:pPr>
+            <w:r>
+              <w:rPr>
+                <w:sz w:val="19"/>
+              </w:rPr>
+              <w:t>sí</w:t>
+            </w:r>
+          </w:p>
+        </w:tc>
+        <w:tc>
+          <w:tcPr>
+            <w:tcW w:w="1644" w:type="dxa"/>
+            <w:tcBorders>
+              <w:top w:val="single" w:sz="4" w:space="0" w:color="D0D7DE"/>
+              <w:left w:val="single" w:sz="4" w:space="0" w:color="D0D7DE"/>
+              <w:bottom w:val="single" w:sz="4" w:space="0" w:color="D0D7DE"/>
+              <w:right w:val="single" w:sz="4" w:space="0" w:color="D0D7DE"/>
+            </w:tcBorders>
+            <w:shd w:val="clear" w:color="auto" w:fill="FFFFFF"/>
+            <w:tcMar>
+              <w:top w:w="90" w:type="dxa"/>
+              <w:left w:w="130" w:type="dxa"/>
+              <w:bottom w:w="90" w:type="dxa"/>
+              <w:right w:w="130" w:type="dxa"/>
+            </w:tcMar>
+            <w:vAlign w:val="center"/>
+          </w:tcPr>
+          <w:p>
+            <w:pPr>
+              <w:keepNext/>
+              <w:spacing w:after="0"/>
+            </w:pPr>
+            <w:r>
+              <w:rPr>
+                <w:sz w:val="19"/>
+              </w:rPr>
+              <w:t>sí</w:t>
+            </w:r>
+          </w:p>
+        </w:tc>
+      </w:tr>
+      <w:tr>
+        <w:trPr>
+          <w:cantSplit/>
+          <w:jc w:val="center"/>
+        </w:trPr>
+        <w:tc>
+          <w:tcPr>
+            <w:tcW w:w="2551" w:type="dxa"/>
+            <w:tcBorders>
+              <w:top w:val="single" w:sz="4" w:space="0" w:color="D0D7DE"/>
+              <w:left w:val="single" w:sz="4" w:space="0" w:color="D0D7DE"/>
+              <w:bottom w:val="single" w:sz="4" w:space="0" w:color="D0D7DE"/>
+              <w:right w:val="single" w:sz="4" w:space="0" w:color="D0D7DE"/>
+            </w:tcBorders>
+            <w:shd w:val="clear" w:color="auto" w:fill="F4F7FB"/>
+            <w:tcMar>
+              <w:top w:w="90" w:type="dxa"/>
+              <w:left w:w="130" w:type="dxa"/>
+              <w:bottom w:w="90" w:type="dxa"/>
+              <w:right w:w="130" w:type="dxa"/>
+            </w:tcMar>
+            <w:vAlign w:val="center"/>
+          </w:tcPr>
+          <w:p>
+            <w:pPr>
+              <w:keepNext/>
+              <w:spacing w:after="0"/>
+            </w:pPr>
+            <w:r>
+              <w:rPr>
+                <w:b/>
+                <w:sz w:val="19"/>
+              </w:rPr>
+              <w:t>DC-AIRE-06</w:t>
+            </w:r>
+          </w:p>
+        </w:tc>
+        <w:tc>
+          <w:tcPr>
+            <w:tcW w:w="1644" w:type="dxa"/>
+            <w:tcBorders>
+              <w:top w:val="single" w:sz="4" w:space="0" w:color="D0D7DE"/>
+              <w:left w:val="single" w:sz="4" w:space="0" w:color="D0D7DE"/>
+              <w:bottom w:val="single" w:sz="4" w:space="0" w:color="D0D7DE"/>
+              <w:right w:val="single" w:sz="4" w:space="0" w:color="D0D7DE"/>
+            </w:tcBorders>
+            <w:shd w:val="clear" w:color="auto" w:fill="F4F7FB"/>
+            <w:tcMar>
+              <w:top w:w="90" w:type="dxa"/>
+              <w:left w:w="130" w:type="dxa"/>
+              <w:bottom w:w="90" w:type="dxa"/>
+              <w:right w:w="130" w:type="dxa"/>
+            </w:tcMar>
+            <w:vAlign w:val="center"/>
+          </w:tcPr>
+          <w:p>
+            <w:pPr>
+              <w:keepNext/>
+              <w:spacing w:after="0"/>
+            </w:pPr>
+            <w:r>
+              <w:rPr>
+                <w:sz w:val="19"/>
+              </w:rPr>
+              <w:t>sí</w:t>
+            </w:r>
+          </w:p>
+        </w:tc>
+        <w:tc>
+          <w:tcPr>
+            <w:tcW w:w="1644" w:type="dxa"/>
+            <w:tcBorders>
+              <w:top w:val="single" w:sz="4" w:space="0" w:color="D0D7DE"/>
+              <w:left w:val="single" w:sz="4" w:space="0" w:color="D0D7DE"/>
+              <w:bottom w:val="single" w:sz="4" w:space="0" w:color="D0D7DE"/>
+              <w:right w:val="single" w:sz="4" w:space="0" w:color="D0D7DE"/>
+            </w:tcBorders>
+            <w:shd w:val="clear" w:color="auto" w:fill="F4F7FB"/>
+            <w:tcMar>
+              <w:top w:w="90" w:type="dxa"/>
+              <w:left w:w="130" w:type="dxa"/>
+              <w:bottom w:w="90" w:type="dxa"/>
+              <w:right w:w="130" w:type="dxa"/>
+            </w:tcMar>
+            <w:vAlign w:val="center"/>
+          </w:tcPr>
+          <w:p>
+            <w:pPr>
+              <w:keepNext/>
+              <w:spacing w:after="0"/>
+            </w:pPr>
+            <w:r>
+              <w:rPr>
+                <w:sz w:val="19"/>
+              </w:rPr>
+              <w:t>sí</w:t>
+            </w:r>
+          </w:p>
+        </w:tc>
+        <w:tc>
+          <w:tcPr>
+            <w:tcW w:w="1644" w:type="dxa"/>
+            <w:tcBorders>
+              <w:top w:val="single" w:sz="4" w:space="0" w:color="D0D7DE"/>
+              <w:left w:val="single" w:sz="4" w:space="0" w:color="D0D7DE"/>
+              <w:bottom w:val="single" w:sz="4" w:space="0" w:color="D0D7DE"/>
+              <w:right w:val="single" w:sz="4" w:space="0" w:color="D0D7DE"/>
+            </w:tcBorders>
+            <w:shd w:val="clear" w:color="auto" w:fill="F4F7FB"/>
+            <w:tcMar>
+              <w:top w:w="90" w:type="dxa"/>
+              <w:left w:w="130" w:type="dxa"/>
+              <w:bottom w:w="90" w:type="dxa"/>
+              <w:right w:w="130" w:type="dxa"/>
+            </w:tcMar>
+            <w:vAlign w:val="center"/>
+          </w:tcPr>
+          <w:p>
+            <w:pPr>
+              <w:keepNext/>
+              <w:spacing w:after="0"/>
+            </w:pPr>
+            <w:r>
+              <w:rPr>
+                <w:sz w:val="19"/>
+              </w:rPr>
+              <w:t>sí</w:t>
+            </w:r>
+          </w:p>
+        </w:tc>
+        <w:tc>
+          <w:tcPr>
+            <w:tcW w:w="1644" w:type="dxa"/>
+            <w:tcBorders>
+              <w:top w:val="single" w:sz="4" w:space="0" w:color="D0D7DE"/>
+              <w:left w:val="single" w:sz="4" w:space="0" w:color="D0D7DE"/>
+              <w:bottom w:val="single" w:sz="4" w:space="0" w:color="D0D7DE"/>
+              <w:right w:val="single" w:sz="4" w:space="0" w:color="D0D7DE"/>
+            </w:tcBorders>
+            <w:shd w:val="clear" w:color="auto" w:fill="F4F7FB"/>
+            <w:tcMar>
+              <w:top w:w="90" w:type="dxa"/>
+              <w:left w:w="130" w:type="dxa"/>
+              <w:bottom w:w="90" w:type="dxa"/>
+              <w:right w:w="130" w:type="dxa"/>
+            </w:tcMar>
+            <w:vAlign w:val="center"/>
+          </w:tcPr>
+          <w:p>
+            <w:pPr>
+              <w:keepNext/>
+              <w:spacing w:after="0"/>
+            </w:pPr>
+            <w:r>
+              <w:rPr>
+                <w:sz w:val="19"/>
+              </w:rPr>
+              <w:t>sí</w:t>
+            </w:r>
+          </w:p>
+        </w:tc>
+      </w:tr>
+      <w:tr>
+        <w:trPr>
+          <w:cantSplit/>
+          <w:jc w:val="center"/>
+        </w:trPr>
+        <w:tc>
+          <w:tcPr>
+            <w:tcW w:w="2551" w:type="dxa"/>
+            <w:tcBorders>
+              <w:top w:val="single" w:sz="4" w:space="0" w:color="D0D7DE"/>
+              <w:left w:val="single" w:sz="4" w:space="0" w:color="D0D7DE"/>
+              <w:bottom w:val="single" w:sz="4" w:space="0" w:color="D0D7DE"/>
+              <w:right w:val="single" w:sz="4" w:space="0" w:color="D0D7DE"/>
+            </w:tcBorders>
+            <w:shd w:val="clear" w:color="auto" w:fill="FFFFFF"/>
+            <w:tcMar>
+              <w:top w:w="90" w:type="dxa"/>
+              <w:left w:w="130" w:type="dxa"/>
+              <w:bottom w:w="90" w:type="dxa"/>
+              <w:right w:w="130" w:type="dxa"/>
+            </w:tcMar>
+            <w:vAlign w:val="center"/>
+          </w:tcPr>
+          <w:p>
+            <w:pPr>
+              <w:keepNext/>
+              <w:spacing w:after="0"/>
+            </w:pPr>
+            <w:r>
+              <w:rPr>
+                <w:b/>
+                <w:sz w:val="19"/>
+              </w:rPr>
+              <w:t>DC-AGUA-07</w:t>
+            </w:r>
+          </w:p>
+        </w:tc>
+        <w:tc>
+          <w:tcPr>
+            <w:tcW w:w="1644" w:type="dxa"/>
+            <w:tcBorders>
+              <w:top w:val="single" w:sz="4" w:space="0" w:color="D0D7DE"/>
+              <w:left w:val="single" w:sz="4" w:space="0" w:color="D0D7DE"/>
+              <w:bottom w:val="single" w:sz="4" w:space="0" w:color="D0D7DE"/>
+              <w:right w:val="single" w:sz="4" w:space="0" w:color="D0D7DE"/>
+            </w:tcBorders>
+            <w:shd w:val="clear" w:color="auto" w:fill="FFFFFF"/>
+            <w:tcMar>
+              <w:top w:w="90" w:type="dxa"/>
+              <w:left w:w="130" w:type="dxa"/>
+              <w:bottom w:w="90" w:type="dxa"/>
+              <w:right w:w="130" w:type="dxa"/>
+            </w:tcMar>
+            <w:vAlign w:val="center"/>
+          </w:tcPr>
+          <w:p>
+            <w:pPr>
+              <w:keepNext/>
+              <w:spacing w:after="0"/>
+            </w:pPr>
+            <w:r>
+              <w:rPr>
+                <w:sz w:val="19"/>
+              </w:rPr>
+              <w:t>sí</w:t>
+            </w:r>
+          </w:p>
+        </w:tc>
+        <w:tc>
+          <w:tcPr>
+            <w:tcW w:w="1644" w:type="dxa"/>
+            <w:tcBorders>
+              <w:top w:val="single" w:sz="4" w:space="0" w:color="D0D7DE"/>
+              <w:left w:val="single" w:sz="4" w:space="0" w:color="D0D7DE"/>
+              <w:bottom w:val="single" w:sz="4" w:space="0" w:color="D0D7DE"/>
+              <w:right w:val="single" w:sz="4" w:space="0" w:color="D0D7DE"/>
+            </w:tcBorders>
+            <w:shd w:val="clear" w:color="auto" w:fill="FFFFFF"/>
+            <w:tcMar>
+              <w:top w:w="90" w:type="dxa"/>
+              <w:left w:w="130" w:type="dxa"/>
+              <w:bottom w:w="90" w:type="dxa"/>
+              <w:right w:w="130" w:type="dxa"/>
+            </w:tcMar>
+            <w:vAlign w:val="center"/>
+          </w:tcPr>
+          <w:p>
+            <w:pPr>
+              <w:keepNext/>
+              <w:spacing w:after="0"/>
+            </w:pPr>
+            <w:r>
+              <w:rPr>
+                <w:sz w:val="19"/>
+              </w:rPr>
+              <w:t>—</w:t>
+            </w:r>
+          </w:p>
+        </w:tc>
+        <w:tc>
+          <w:tcPr>
+            <w:tcW w:w="1644" w:type="dxa"/>
+            <w:tcBorders>
+              <w:top w:val="single" w:sz="4" w:space="0" w:color="D0D7DE"/>
+              <w:left w:val="single" w:sz="4" w:space="0" w:color="D0D7DE"/>
+              <w:bottom w:val="single" w:sz="4" w:space="0" w:color="D0D7DE"/>
+              <w:right w:val="single" w:sz="4" w:space="0" w:color="D0D7DE"/>
+            </w:tcBorders>
+            <w:shd w:val="clear" w:color="auto" w:fill="FFFFFF"/>
+            <w:tcMar>
+              <w:top w:w="90" w:type="dxa"/>
+              <w:left w:w="130" w:type="dxa"/>
+              <w:bottom w:w="90" w:type="dxa"/>
+              <w:right w:w="130" w:type="dxa"/>
+            </w:tcMar>
+            <w:vAlign w:val="center"/>
+          </w:tcPr>
+          <w:p>
+            <w:pPr>
+              <w:keepNext/>
+              <w:spacing w:after="0"/>
+            </w:pPr>
+            <w:r>
+              <w:rPr>
+                <w:sz w:val="19"/>
+              </w:rPr>
+              <w:t>sí</w:t>
+            </w:r>
+          </w:p>
+        </w:tc>
+        <w:tc>
+          <w:tcPr>
+            <w:tcW w:w="1644" w:type="dxa"/>
+            <w:tcBorders>
+              <w:top w:val="single" w:sz="4" w:space="0" w:color="D0D7DE"/>
+              <w:left w:val="single" w:sz="4" w:space="0" w:color="D0D7DE"/>
+              <w:bottom w:val="single" w:sz="4" w:space="0" w:color="D0D7DE"/>
+              <w:right w:val="single" w:sz="4" w:space="0" w:color="D0D7DE"/>
+            </w:tcBorders>
+            <w:shd w:val="clear" w:color="auto" w:fill="FFFFFF"/>
+            <w:tcMar>
+              <w:top w:w="90" w:type="dxa"/>
+              <w:left w:w="130" w:type="dxa"/>
+              <w:bottom w:w="90" w:type="dxa"/>
+              <w:right w:w="130" w:type="dxa"/>
+            </w:tcMar>
+            <w:vAlign w:val="center"/>
+          </w:tcPr>
+          <w:p>
+            <w:pPr>
+              <w:keepNext/>
+              <w:spacing w:after="0"/>
+            </w:pPr>
+            <w:r>
+              <w:rPr>
+                <w:sz w:val="19"/>
+              </w:rPr>
+              <w:t>—</w:t>
+            </w:r>
+          </w:p>
+        </w:tc>
+      </w:tr>
+      <w:tr>
+        <w:trPr>
+          <w:cantSplit/>
+          <w:jc w:val="center"/>
+        </w:trPr>
+        <w:tc>
+          <w:tcPr>
+            <w:tcW w:w="2551" w:type="dxa"/>
+            <w:tcBorders>
+              <w:top w:val="single" w:sz="4" w:space="0" w:color="D0D7DE"/>
+              <w:left w:val="single" w:sz="4" w:space="0" w:color="D0D7DE"/>
+              <w:bottom w:val="single" w:sz="4" w:space="0" w:color="D0D7DE"/>
+              <w:right w:val="single" w:sz="4" w:space="0" w:color="D0D7DE"/>
+            </w:tcBorders>
+            <w:shd w:val="clear" w:color="auto" w:fill="F4F7FB"/>
+            <w:tcMar>
+              <w:top w:w="90" w:type="dxa"/>
+              <w:left w:w="130" w:type="dxa"/>
+              <w:bottom w:w="90" w:type="dxa"/>
+              <w:right w:w="130" w:type="dxa"/>
+            </w:tcMar>
+            <w:vAlign w:val="center"/>
+          </w:tcPr>
+          <w:p>
+            <w:pPr>
+              <w:keepNext/>
+              <w:spacing w:after="0"/>
+            </w:pPr>
+            <w:r>
+              <w:rPr>
+                <w:b/>
+                <w:sz w:val="19"/>
+              </w:rPr>
+              <w:t>DC-HUMO-08</w:t>
+            </w:r>
+          </w:p>
+        </w:tc>
+        <w:tc>
+          <w:tcPr>
+            <w:tcW w:w="1644" w:type="dxa"/>
+            <w:tcBorders>
+              <w:top w:val="single" w:sz="4" w:space="0" w:color="D0D7DE"/>
+              <w:left w:val="single" w:sz="4" w:space="0" w:color="D0D7DE"/>
+              <w:bottom w:val="single" w:sz="4" w:space="0" w:color="D0D7DE"/>
+              <w:right w:val="single" w:sz="4" w:space="0" w:color="D0D7DE"/>
+            </w:tcBorders>
+            <w:shd w:val="clear" w:color="auto" w:fill="F4F7FB"/>
+            <w:tcMar>
+              <w:top w:w="90" w:type="dxa"/>
+              <w:left w:w="130" w:type="dxa"/>
+              <w:bottom w:w="90" w:type="dxa"/>
+              <w:right w:w="130" w:type="dxa"/>
+            </w:tcMar>
+            <w:vAlign w:val="center"/>
+          </w:tcPr>
+          <w:p>
+            <w:pPr>
+              <w:keepNext/>
+              <w:spacing w:after="0"/>
+            </w:pPr>
+            <w:r>
+              <w:rPr>
+                <w:sz w:val="19"/>
+              </w:rPr>
+              <w:t>sí</w:t>
+            </w:r>
+          </w:p>
+        </w:tc>
+        <w:tc>
+          <w:tcPr>
+            <w:tcW w:w="1644" w:type="dxa"/>
+            <w:tcBorders>
+              <w:top w:val="single" w:sz="4" w:space="0" w:color="D0D7DE"/>
+              <w:left w:val="single" w:sz="4" w:space="0" w:color="D0D7DE"/>
+              <w:bottom w:val="single" w:sz="4" w:space="0" w:color="D0D7DE"/>
+              <w:right w:val="single" w:sz="4" w:space="0" w:color="D0D7DE"/>
+            </w:tcBorders>
+            <w:shd w:val="clear" w:color="auto" w:fill="F4F7FB"/>
+            <w:tcMar>
+              <w:top w:w="90" w:type="dxa"/>
+              <w:left w:w="130" w:type="dxa"/>
+              <w:bottom w:w="90" w:type="dxa"/>
+              <w:right w:w="130" w:type="dxa"/>
+            </w:tcMar>
+            <w:vAlign w:val="center"/>
+          </w:tcPr>
+          <w:p>
+            <w:pPr>
+              <w:keepNext/>
+              <w:spacing w:after="0"/>
+            </w:pPr>
+            <w:r>
+              <w:rPr>
+                <w:sz w:val="19"/>
+              </w:rPr>
+              <w:t>sí</w:t>
+            </w:r>
+          </w:p>
+        </w:tc>
+        <w:tc>
+          <w:tcPr>
+            <w:tcW w:w="1644" w:type="dxa"/>
+            <w:tcBorders>
+              <w:top w:val="single" w:sz="4" w:space="0" w:color="D0D7DE"/>
+              <w:left w:val="single" w:sz="4" w:space="0" w:color="D0D7DE"/>
+              <w:bottom w:val="single" w:sz="4" w:space="0" w:color="D0D7DE"/>
+              <w:right w:val="single" w:sz="4" w:space="0" w:color="D0D7DE"/>
+            </w:tcBorders>
+            <w:shd w:val="clear" w:color="auto" w:fill="F4F7FB"/>
+            <w:tcMar>
+              <w:top w:w="90" w:type="dxa"/>
+              <w:left w:w="130" w:type="dxa"/>
+              <w:bottom w:w="90" w:type="dxa"/>
+              <w:right w:w="130" w:type="dxa"/>
+            </w:tcMar>
+            <w:vAlign w:val="center"/>
+          </w:tcPr>
+          <w:p>
+            <w:pPr>
+              <w:keepNext/>
+              <w:spacing w:after="0"/>
+            </w:pPr>
+            <w:r>
+              <w:rPr>
+                <w:sz w:val="19"/>
+              </w:rPr>
+              <w:t>sí</w:t>
+            </w:r>
+          </w:p>
+        </w:tc>
+        <w:tc>
+          <w:tcPr>
+            <w:tcW w:w="1644" w:type="dxa"/>
+            <w:tcBorders>
+              <w:top w:val="single" w:sz="4" w:space="0" w:color="D0D7DE"/>
+              <w:left w:val="single" w:sz="4" w:space="0" w:color="D0D7DE"/>
+              <w:bottom w:val="single" w:sz="4" w:space="0" w:color="D0D7DE"/>
+              <w:right w:val="single" w:sz="4" w:space="0" w:color="D0D7DE"/>
+            </w:tcBorders>
+            <w:shd w:val="clear" w:color="auto" w:fill="F4F7FB"/>
+            <w:tcMar>
+              <w:top w:w="90" w:type="dxa"/>
+              <w:left w:w="130" w:type="dxa"/>
+              <w:bottom w:w="90" w:type="dxa"/>
+              <w:right w:w="130" w:type="dxa"/>
+            </w:tcMar>
+            <w:vAlign w:val="center"/>
+          </w:tcPr>
+          <w:p>
+            <w:pPr>
+              <w:keepNext/>
+              <w:spacing w:after="0"/>
+            </w:pPr>
+            <w:r>
+              <w:rPr>
+                <w:sz w:val="19"/>
+              </w:rPr>
+              <w:t>sí</w:t>
+            </w:r>
+          </w:p>
+        </w:tc>
+      </w:tr>
+      <w:tr>
+        <w:trPr>
+          <w:cantSplit/>
+          <w:jc w:val="center"/>
+        </w:trPr>
+        <w:tc>
+          <w:tcPr>
+            <w:tcW w:w="2551" w:type="dxa"/>
+            <w:tcBorders>
+              <w:top w:val="single" w:sz="4" w:space="0" w:color="D0D7DE"/>
+              <w:left w:val="single" w:sz="4" w:space="0" w:color="D0D7DE"/>
+              <w:bottom w:val="single" w:sz="4" w:space="0" w:color="D0D7DE"/>
+              <w:right w:val="single" w:sz="4" w:space="0" w:color="D0D7DE"/>
+            </w:tcBorders>
+            <w:shd w:val="clear" w:color="auto" w:fill="FFFFFF"/>
+            <w:tcMar>
+              <w:top w:w="90" w:type="dxa"/>
+              <w:left w:w="130" w:type="dxa"/>
+              <w:bottom w:w="90" w:type="dxa"/>
+              <w:right w:w="130" w:type="dxa"/>
+            </w:tcMar>
+            <w:vAlign w:val="center"/>
+          </w:tcPr>
+          <w:p>
+            <w:pPr>
+              <w:keepNext/>
+              <w:spacing w:after="0"/>
+            </w:pPr>
+            <w:r>
+              <w:rPr>
+                <w:b/>
+                <w:sz w:val="19"/>
+              </w:rPr>
+              <w:t>DC-ENERGIA-09</w:t>
+            </w:r>
+          </w:p>
+        </w:tc>
+        <w:tc>
+          <w:tcPr>
+            <w:tcW w:w="1644" w:type="dxa"/>
+            <w:tcBorders>
+              <w:top w:val="single" w:sz="4" w:space="0" w:color="D0D7DE"/>
+              <w:left w:val="single" w:sz="4" w:space="0" w:color="D0D7DE"/>
+              <w:bottom w:val="single" w:sz="4" w:space="0" w:color="D0D7DE"/>
+              <w:right w:val="single" w:sz="4" w:space="0" w:color="D0D7DE"/>
+            </w:tcBorders>
+            <w:shd w:val="clear" w:color="auto" w:fill="FFFFFF"/>
+            <w:tcMar>
+              <w:top w:w="90" w:type="dxa"/>
+              <w:left w:w="130" w:type="dxa"/>
+              <w:bottom w:w="90" w:type="dxa"/>
+              <w:right w:w="130" w:type="dxa"/>
+            </w:tcMar>
+            <w:vAlign w:val="center"/>
+          </w:tcPr>
+          <w:p>
+            <w:pPr>
+              <w:keepNext/>
+              <w:spacing w:after="0"/>
+            </w:pPr>
+            <w:r>
+              <w:rPr>
+                <w:sz w:val="19"/>
+              </w:rPr>
+              <w:t>sí</w:t>
+            </w:r>
+          </w:p>
+        </w:tc>
+        <w:tc>
+          <w:tcPr>
+            <w:tcW w:w="1644" w:type="dxa"/>
+            <w:tcBorders>
+              <w:top w:val="single" w:sz="4" w:space="0" w:color="D0D7DE"/>
+              <w:left w:val="single" w:sz="4" w:space="0" w:color="D0D7DE"/>
+              <w:bottom w:val="single" w:sz="4" w:space="0" w:color="D0D7DE"/>
+              <w:right w:val="single" w:sz="4" w:space="0" w:color="D0D7DE"/>
+            </w:tcBorders>
+            <w:shd w:val="clear" w:color="auto" w:fill="FFFFFF"/>
+            <w:tcMar>
+              <w:top w:w="90" w:type="dxa"/>
+              <w:left w:w="130" w:type="dxa"/>
+              <w:bottom w:w="90" w:type="dxa"/>
+              <w:right w:w="130" w:type="dxa"/>
+            </w:tcMar>
+            <w:vAlign w:val="center"/>
+          </w:tcPr>
+          <w:p>
+            <w:pPr>
+              <w:keepNext/>
+              <w:spacing w:after="0"/>
+            </w:pPr>
+            <w:r>
+              <w:rPr>
+                <w:sz w:val="19"/>
+              </w:rPr>
+              <w:t>sí</w:t>
+            </w:r>
+          </w:p>
+        </w:tc>
+        <w:tc>
+          <w:tcPr>
+            <w:tcW w:w="1644" w:type="dxa"/>
+            <w:tcBorders>
+              <w:top w:val="single" w:sz="4" w:space="0" w:color="D0D7DE"/>
+              <w:left w:val="single" w:sz="4" w:space="0" w:color="D0D7DE"/>
+              <w:bottom w:val="single" w:sz="4" w:space="0" w:color="D0D7DE"/>
+              <w:right w:val="single" w:sz="4" w:space="0" w:color="D0D7DE"/>
+            </w:tcBorders>
+            <w:shd w:val="clear" w:color="auto" w:fill="FFFFFF"/>
+            <w:tcMar>
+              <w:top w:w="90" w:type="dxa"/>
+              <w:left w:w="130" w:type="dxa"/>
+              <w:bottom w:w="90" w:type="dxa"/>
+              <w:right w:w="130" w:type="dxa"/>
+            </w:tcMar>
+            <w:vAlign w:val="center"/>
+          </w:tcPr>
+          <w:p>
+            <w:pPr>
+              <w:keepNext/>
+              <w:spacing w:after="0"/>
+            </w:pPr>
+            <w:r>
+              <w:rPr>
+                <w:sz w:val="19"/>
+              </w:rPr>
+              <w:t>sí</w:t>
+            </w:r>
+          </w:p>
+        </w:tc>
+        <w:tc>
+          <w:tcPr>
+            <w:tcW w:w="1644" w:type="dxa"/>
+            <w:tcBorders>
+              <w:top w:val="single" w:sz="4" w:space="0" w:color="D0D7DE"/>
+              <w:left w:val="single" w:sz="4" w:space="0" w:color="D0D7DE"/>
+              <w:bottom w:val="single" w:sz="4" w:space="0" w:color="D0D7DE"/>
+              <w:right w:val="single" w:sz="4" w:space="0" w:color="D0D7DE"/>
+            </w:tcBorders>
+            <w:shd w:val="clear" w:color="auto" w:fill="FFFFFF"/>
+            <w:tcMar>
+              <w:top w:w="90" w:type="dxa"/>
+              <w:left w:w="130" w:type="dxa"/>
+              <w:bottom w:w="90" w:type="dxa"/>
+              <w:right w:w="130" w:type="dxa"/>
+            </w:tcMar>
+            <w:vAlign w:val="center"/>
+          </w:tcPr>
+          <w:p>
+            <w:pPr>
+              <w:keepNext/>
+              <w:spacing w:after="0"/>
+            </w:pPr>
+            <w:r>
+              <w:rPr>
+                <w:sz w:val="19"/>
+              </w:rPr>
+              <w:t>sí</w:t>
+            </w:r>
+          </w:p>
+        </w:tc>
+      </w:tr>
+      <w:tr>
+        <w:trPr>
+          <w:cantSplit/>
+          <w:jc w:val="center"/>
+        </w:trPr>
+        <w:tc>
+          <w:tcPr>
+            <w:tcW w:w="2551" w:type="dxa"/>
+            <w:tcBorders>
+              <w:top w:val="single" w:sz="4" w:space="0" w:color="D0D7DE"/>
+              <w:left w:val="single" w:sz="4" w:space="0" w:color="D0D7DE"/>
+              <w:bottom w:val="single" w:sz="4" w:space="0" w:color="D0D7DE"/>
+              <w:right w:val="single" w:sz="4" w:space="0" w:color="D0D7DE"/>
+            </w:tcBorders>
+            <w:shd w:val="clear" w:color="auto" w:fill="F4F7FB"/>
+            <w:tcMar>
+              <w:top w:w="90" w:type="dxa"/>
+              <w:left w:w="130" w:type="dxa"/>
+              <w:bottom w:w="90" w:type="dxa"/>
+              <w:right w:w="130" w:type="dxa"/>
+            </w:tcMar>
+            <w:vAlign w:val="center"/>
+          </w:tcPr>
+          <w:p>
+            <w:pPr>
+              <w:keepNext/>
+              <w:spacing w:after="0"/>
+            </w:pPr>
+            <w:r>
+              <w:rPr>
+                <w:b/>
+                <w:sz w:val="19"/>
+              </w:rPr>
+              <w:t>DC-ACCESO-10</w:t>
+            </w:r>
+          </w:p>
+        </w:tc>
+        <w:tc>
+          <w:tcPr>
+            <w:tcW w:w="1644" w:type="dxa"/>
+            <w:tcBorders>
+              <w:top w:val="single" w:sz="4" w:space="0" w:color="D0D7DE"/>
+              <w:left w:val="single" w:sz="4" w:space="0" w:color="D0D7DE"/>
+              <w:bottom w:val="single" w:sz="4" w:space="0" w:color="D0D7DE"/>
+              <w:right w:val="single" w:sz="4" w:space="0" w:color="D0D7DE"/>
+            </w:tcBorders>
+            <w:shd w:val="clear" w:color="auto" w:fill="F4F7FB"/>
+            <w:tcMar>
+              <w:top w:w="90" w:type="dxa"/>
+              <w:left w:w="130" w:type="dxa"/>
+              <w:bottom w:w="90" w:type="dxa"/>
+              <w:right w:w="130" w:type="dxa"/>
+            </w:tcMar>
+            <w:vAlign w:val="center"/>
+          </w:tcPr>
+          <w:p>
+            <w:pPr>
+              <w:keepNext/>
+              <w:spacing w:after="0"/>
+            </w:pPr>
+            <w:r>
+              <w:rPr>
+                <w:sz w:val="19"/>
+              </w:rPr>
+              <w:t>sí</w:t>
+            </w:r>
+          </w:p>
+        </w:tc>
+        <w:tc>
+          <w:tcPr>
+            <w:tcW w:w="1644" w:type="dxa"/>
+            <w:tcBorders>
+              <w:top w:val="single" w:sz="4" w:space="0" w:color="D0D7DE"/>
+              <w:left w:val="single" w:sz="4" w:space="0" w:color="D0D7DE"/>
+              <w:bottom w:val="single" w:sz="4" w:space="0" w:color="D0D7DE"/>
+              <w:right w:val="single" w:sz="4" w:space="0" w:color="D0D7DE"/>
+            </w:tcBorders>
+            <w:shd w:val="clear" w:color="auto" w:fill="F4F7FB"/>
+            <w:tcMar>
+              <w:top w:w="90" w:type="dxa"/>
+              <w:left w:w="130" w:type="dxa"/>
+              <w:bottom w:w="90" w:type="dxa"/>
+              <w:right w:w="130" w:type="dxa"/>
+            </w:tcMar>
+            <w:vAlign w:val="center"/>
+          </w:tcPr>
+          <w:p>
+            <w:pPr>
+              <w:keepNext/>
+              <w:spacing w:after="0"/>
+            </w:pPr>
+            <w:r>
+              <w:rPr>
+                <w:sz w:val="19"/>
+              </w:rPr>
+              <w:t>sí</w:t>
+            </w:r>
+          </w:p>
+        </w:tc>
+        <w:tc>
+          <w:tcPr>
+            <w:tcW w:w="1644" w:type="dxa"/>
+            <w:tcBorders>
+              <w:top w:val="single" w:sz="4" w:space="0" w:color="D0D7DE"/>
+              <w:left w:val="single" w:sz="4" w:space="0" w:color="D0D7DE"/>
+              <w:bottom w:val="single" w:sz="4" w:space="0" w:color="D0D7DE"/>
+              <w:right w:val="single" w:sz="4" w:space="0" w:color="D0D7DE"/>
+            </w:tcBorders>
+            <w:shd w:val="clear" w:color="auto" w:fill="F4F7FB"/>
+            <w:tcMar>
+              <w:top w:w="90" w:type="dxa"/>
+              <w:left w:w="130" w:type="dxa"/>
+              <w:bottom w:w="90" w:type="dxa"/>
+              <w:right w:w="130" w:type="dxa"/>
+            </w:tcMar>
+            <w:vAlign w:val="center"/>
+          </w:tcPr>
+          <w:p>
+            <w:pPr>
+              <w:keepNext/>
+              <w:spacing w:after="0"/>
+            </w:pPr>
+            <w:r>
+              <w:rPr>
+                <w:sz w:val="19"/>
+              </w:rPr>
+              <w:t>sí</w:t>
+            </w:r>
+          </w:p>
+        </w:tc>
+        <w:tc>
+          <w:tcPr>
+            <w:tcW w:w="1644" w:type="dxa"/>
+            <w:tcBorders>
+              <w:top w:val="single" w:sz="4" w:space="0" w:color="D0D7DE"/>
+              <w:left w:val="single" w:sz="4" w:space="0" w:color="D0D7DE"/>
+              <w:bottom w:val="single" w:sz="4" w:space="0" w:color="D0D7DE"/>
+              <w:right w:val="single" w:sz="4" w:space="0" w:color="D0D7DE"/>
+            </w:tcBorders>
+            <w:shd w:val="clear" w:color="auto" w:fill="F4F7FB"/>
+            <w:tcMar>
+              <w:top w:w="90" w:type="dxa"/>
+              <w:left w:w="130" w:type="dxa"/>
+              <w:bottom w:w="90" w:type="dxa"/>
+              <w:right w:w="130" w:type="dxa"/>
+            </w:tcMar>
+            <w:vAlign w:val="center"/>
+          </w:tcPr>
+          <w:p>
+            <w:pPr>
+              <w:keepNext/>
+              <w:spacing w:after="0"/>
+            </w:pPr>
+            <w:r>
+              <w:rPr>
+                <w:sz w:val="19"/>
+              </w:rPr>
+              <w:t>sí</w:t>
+            </w:r>
+          </w:p>
+        </w:tc>
+      </w:tr>
+      <w:tr>
+        <w:trPr>
+          <w:cantSplit/>
+          <w:jc w:val="center"/>
+        </w:trPr>
+        <w:tc>
+          <w:tcPr>
+            <w:tcW w:w="2551" w:type="dxa"/>
+            <w:tcBorders>
+              <w:top w:val="single" w:sz="4" w:space="0" w:color="D0D7DE"/>
+              <w:left w:val="single" w:sz="4" w:space="0" w:color="D0D7DE"/>
+              <w:bottom w:val="single" w:sz="4" w:space="0" w:color="D0D7DE"/>
+              <w:right w:val="single" w:sz="4" w:space="0" w:color="D0D7DE"/>
+            </w:tcBorders>
+            <w:shd w:val="clear" w:color="auto" w:fill="FFFFFF"/>
+            <w:tcMar>
+              <w:top w:w="90" w:type="dxa"/>
+              <w:left w:w="130" w:type="dxa"/>
+              <w:bottom w:w="90" w:type="dxa"/>
+              <w:right w:w="130" w:type="dxa"/>
+            </w:tcMar>
+            <w:vAlign w:val="center"/>
+          </w:tcPr>
+          <w:p>
+            <w:pPr>
+              <w:spacing w:after="0"/>
+            </w:pPr>
+            <w:r>
+              <w:rPr>
+                <w:b/>
+                <w:sz w:val="19"/>
+              </w:rPr>
+              <w:t>Total con datos</w:t>
+            </w:r>
+          </w:p>
+        </w:tc>
+        <w:tc>
+          <w:tcPr>
+            <w:tcW w:w="1644" w:type="dxa"/>
+            <w:tcBorders>
+              <w:top w:val="single" w:sz="4" w:space="0" w:color="D0D7DE"/>
+              <w:left w:val="single" w:sz="4" w:space="0" w:color="D0D7DE"/>
+              <w:bottom w:val="single" w:sz="4" w:space="0" w:color="D0D7DE"/>
+              <w:right w:val="single" w:sz="4" w:space="0" w:color="D0D7DE"/>
+            </w:tcBorders>
+            <w:shd w:val="clear" w:color="auto" w:fill="FFFFFF"/>
+            <w:tcMar>
+              <w:top w:w="90" w:type="dxa"/>
+              <w:left w:w="130" w:type="dxa"/>
+              <w:bottom w:w="90" w:type="dxa"/>
+              <w:right w:w="130" w:type="dxa"/>
+            </w:tcMar>
+            <w:vAlign w:val="center"/>
+          </w:tcPr>
+          <w:p>
+            <w:pPr>
+              <w:spacing w:after="0"/>
+            </w:pPr>
+            <w:r>
+              <w:rPr>
+                <w:sz w:val="19"/>
+              </w:rPr>
+              <w:t>10/10</w:t>
+            </w:r>
+          </w:p>
+        </w:tc>
+        <w:tc>
+          <w:tcPr>
+            <w:tcW w:w="1644" w:type="dxa"/>
+            <w:tcBorders>
+              <w:top w:val="single" w:sz="4" w:space="0" w:color="D0D7DE"/>
+              <w:left w:val="single" w:sz="4" w:space="0" w:color="D0D7DE"/>
+              <w:bottom w:val="single" w:sz="4" w:space="0" w:color="D0D7DE"/>
+              <w:right w:val="single" w:sz="4" w:space="0" w:color="D0D7DE"/>
+            </w:tcBorders>
+            <w:shd w:val="clear" w:color="auto" w:fill="FFFFFF"/>
+            <w:tcMar>
+              <w:top w:w="90" w:type="dxa"/>
+              <w:left w:w="130" w:type="dxa"/>
+              <w:bottom w:w="90" w:type="dxa"/>
+              <w:right w:w="130" w:type="dxa"/>
+            </w:tcMar>
+            <w:vAlign w:val="center"/>
+          </w:tcPr>
+          <w:p>
+            <w:pPr>
+              <w:spacing w:after="0"/>
+            </w:pPr>
+            <w:r>
+              <w:rPr>
+                <w:sz w:val="19"/>
+              </w:rPr>
+              <w:t>9/10</w:t>
+            </w:r>
+          </w:p>
+        </w:tc>
+        <w:tc>
+          <w:tcPr>
+            <w:tcW w:w="1644" w:type="dxa"/>
+            <w:tcBorders>
+              <w:top w:val="single" w:sz="4" w:space="0" w:color="D0D7DE"/>
+              <w:left w:val="single" w:sz="4" w:space="0" w:color="D0D7DE"/>
+              <w:bottom w:val="single" w:sz="4" w:space="0" w:color="D0D7DE"/>
+              <w:right w:val="single" w:sz="4" w:space="0" w:color="D0D7DE"/>
+            </w:tcBorders>
+            <w:shd w:val="clear" w:color="auto" w:fill="FFFFFF"/>
+            <w:tcMar>
+              <w:top w:w="90" w:type="dxa"/>
+              <w:left w:w="130" w:type="dxa"/>
+              <w:bottom w:w="90" w:type="dxa"/>
+              <w:right w:w="130" w:type="dxa"/>
+            </w:tcMar>
+            <w:vAlign w:val="center"/>
+          </w:tcPr>
+          <w:p>
+            <w:pPr>
+              <w:spacing w:after="0"/>
+            </w:pPr>
+            <w:r>
+              <w:rPr>
+                <w:sz w:val="19"/>
+              </w:rPr>
+              <w:t>10/10</w:t>
+            </w:r>
+          </w:p>
+        </w:tc>
+        <w:tc>
+          <w:tcPr>
+            <w:tcW w:w="1644" w:type="dxa"/>
+            <w:tcBorders>
+              <w:top w:val="single" w:sz="4" w:space="0" w:color="D0D7DE"/>
+              <w:left w:val="single" w:sz="4" w:space="0" w:color="D0D7DE"/>
+              <w:bottom w:val="single" w:sz="4" w:space="0" w:color="D0D7DE"/>
+              <w:right w:val="single" w:sz="4" w:space="0" w:color="D0D7DE"/>
+            </w:tcBorders>
+            <w:shd w:val="clear" w:color="auto" w:fill="FFFFFF"/>
+            <w:tcMar>
+              <w:top w:w="90" w:type="dxa"/>
+              <w:left w:w="130" w:type="dxa"/>
+              <w:bottom w:w="90" w:type="dxa"/>
+              <w:right w:w="130" w:type="dxa"/>
+            </w:tcMar>
+            <w:vAlign w:val="center"/>
+          </w:tcPr>
+          <w:p>
+            <w:pPr>
+              <w:spacing w:after="0"/>
+            </w:pPr>
+            <w:r>
+              <w:rPr>
+                <w:sz w:val="19"/>
+              </w:rPr>
+              <w:t>9/10</w:t>
+            </w:r>
+          </w:p>
+        </w:tc>
+      </w:tr>
+    </w:tbl>
+    <w:p>
+      <w:pPr>
+        <w:spacing w:after="80"/>
+      </w:pPr>
+    </w:p>
+    <w:p>
+      <w:r>
+        <w:t>DC-AGUA-07 (ESP32 #2 en Wokwi) no tiene datos el 25-sep (la simulación del nodo de agua no estuvo publicando ese día) ni el 27-sep (los servidores de compilación de Wokwi no dejaron arrancar la simulación). Los otros nueve dispositivos publicaron en las cuatro fechas.</w:t>
+      </w:r>
+    </w:p>
+    <w:p>
+      <w:pPr>
+        <w:keepNext/>
+        <w:spacing w:after="60"/>
+        <w:jc w:val="center"/>
+      </w:pPr>
+      <w:r>
+        <w:rPr>
+          <w:noProof/>
+        </w:rPr>
+        <w:lastRenderedPageBreak/>
+        <w:drawing>
+          <wp:inline distT="0" distB="0" distL="0" distR="0" wp14:anchorId="207FE852" wp14:editId="6600505A">
+            <wp:extent cx="5940000" cy="3712500"/>
+            <wp:effectExtent l="0" t="0" r="0" b="0"/>
+            <wp:docPr id="18" name="Picture 18"/>
+            <wp:cNvGraphicFramePr>
+              <a:graphicFrameLocks xmlns:a="http://schemas.openxmlformats.org/drawingml/2006/main" noChangeAspect="1"/>
+            </wp:cNvGraphicFramePr>
+            <a:graphic xmlns:a="http://schemas.openxmlformats.org/drawingml/2006/main">
+              <a:graphicData uri="http://schemas.openxmlformats.org/drawingml/2006/picture">
+                <pic:pic xmlns:pic="http://schemas.openxmlformats.org/drawingml/2006/picture">
+                  <pic:nvPicPr>
+                    <pic:cNvPr id="0" name="de-ventana.png"/>
+                    <pic:cNvPicPr/>
+                  </pic:nvPicPr>
+                  <pic:blipFill>
+                    <a:blip r:embed="rId22"/>
+                    <a:stretch>
+                      <a:fillRect/>
+                    </a:stretch>
+                  </pic:blipFill>
+                  <pic:spPr>
+                    <a:xfrm>
+                      <a:off x="0" y="0"/>
+                      <a:ext cx="5940000" cy="3712500"/>
+                    </a:xfrm>
+                    <a:prstGeom prst="rect">
+                      <a:avLst/>
+                    </a:prstGeom>
+                  </pic:spPr>
+                </pic:pic>
+              </a:graphicData>
+            </a:graphic>
+          </wp:inline>
+        </w:drawing>
+      </w:r>
+    </w:p>
+    <w:p>
+      <w:pPr>
+        <w:spacing w:after="200"/>
+        <w:jc w:val="center"/>
+      </w:pPr>
+      <w:r>
+        <w:rPr>
+          <w:b/>
+          <w:color w:val="1F5FA8"/>
+          <w:sz w:val="18"/>
+        </w:rPr>
+        <w:t xml:space="preserve">Figura 18. </w:t>
+      </w:r>
+      <w:r>
+        <w:rPr>
+          <w:i/>
+          <w:color w:val="5B6570"/>
+          <w:sz w:val="18"/>
+        </w:rPr>
+        <w:t>Captura 23 — Ventana completa 24-27 sep: ocho telemetrías agrupadas por dispositivo; se ven los huecos entre fechas.</w:t>
+      </w:r>
+    </w:p>
+    <w:p>
+      <w:pPr>
+        <w:keepNext/>
+        <w:spacing w:after="60"/>
+        <w:jc w:val="center"/>
+      </w:pPr>
+      <w:r>
+        <w:rPr>
+          <w:noProof/>
+        </w:rPr>
+        <w:drawing>
+          <wp:inline distT="0" distB="0" distL="0" distR="0" wp14:anchorId="3517803C" wp14:editId="619F5B15">
+            <wp:extent cx="5940000" cy="3712500"/>
+            <wp:effectExtent l="0" t="0" r="0" b="0"/>
+            <wp:docPr id="19" name="Picture 19"/>
+            <wp:cNvGraphicFramePr>
+              <a:graphicFrameLocks xmlns:a="http://schemas.openxmlformats.org/drawingml/2006/main" noChangeAspect="1"/>
+            </wp:cNvGraphicFramePr>
+            <a:graphic xmlns:a="http://schemas.openxmlformats.org/drawingml/2006/main">
+              <a:graphicData uri="http://schemas.openxmlformats.org/drawingml/2006/picture">
+                <pic:pic xmlns:pic="http://schemas.openxmlformats.org/drawingml/2006/picture">
+                  <pic:nvPicPr>
+                    <pic:cNvPr id="0" name="de-24.png"/>
+                    <pic:cNvPicPr/>
+                  </pic:nvPicPr>
+                  <pic:blipFill>
+                    <a:blip r:embed="rId23"/>
+                    <a:stretch>
+                      <a:fillRect/>
+                    </a:stretch>
+                  </pic:blipFill>
+                  <pic:spPr>
+                    <a:xfrm>
+                      <a:off x="0" y="0"/>
+                      <a:ext cx="5940000" cy="3712500"/>
+                    </a:xfrm>
+                    <a:prstGeom prst="rect">
+                      <a:avLst/>
+                    </a:prstGeom>
+                  </pic:spPr>
+                </pic:pic>
+              </a:graphicData>
+            </a:graphic>
+          </wp:inline>
+        </w:drawing>
+      </w:r>
+    </w:p>
+    <w:p>
+      <w:pPr>
+        <w:spacing w:after="200"/>
+        <w:jc w:val="center"/>
+      </w:pPr>
+      <w:r>
+        <w:rPr>
+          <w:b/>
+          <w:color w:val="1F5FA8"/>
+          <w:sz w:val="18"/>
+        </w:rPr>
+        <w:t xml:space="preserve">Figura 19. </w:t>
+      </w:r>
+      <w:r>
+        <w:rPr>
+          <w:i/>
+          <w:color w:val="5B6570"/>
+          <w:sz w:val="18"/>
+        </w:rPr>
+        <w:t>Captura 24 — Data Explorer, 24/09/2026 00:00-23:59.</w:t>
+      </w:r>
+    </w:p>
+    <w:p>
+      <w:pPr>
+        <w:keepNext/>
+        <w:spacing w:after="60"/>
+        <w:jc w:val="center"/>
+      </w:pPr>
+      <w:r>
+        <w:rPr>
+          <w:noProof/>
+        </w:rPr>
+        <w:lastRenderedPageBreak/>
+        <w:drawing>
+          <wp:inline distT="0" distB="0" distL="0" distR="0" wp14:anchorId="397613F0" wp14:editId="01E7B9D4">
+            <wp:extent cx="5940000" cy="3712500"/>
+            <wp:effectExtent l="0" t="0" r="0" b="0"/>
+            <wp:docPr id="20" name="Picture 20"/>
+            <wp:cNvGraphicFramePr>
+              <a:graphicFrameLocks xmlns:a="http://schemas.openxmlformats.org/drawingml/2006/main" noChangeAspect="1"/>
+            </wp:cNvGraphicFramePr>
+            <a:graphic xmlns:a="http://schemas.openxmlformats.org/drawingml/2006/main">
+              <a:graphicData uri="http://schemas.openxmlformats.org/drawingml/2006/picture">
+                <pic:pic xmlns:pic="http://schemas.openxmlformats.org/drawingml/2006/picture">
+                  <pic:nvPicPr>
+                    <pic:cNvPr id="0" name="de-25.png"/>
+                    <pic:cNvPicPr/>
+                  </pic:nvPicPr>
+                  <pic:blipFill>
+                    <a:blip r:embed="rId24"/>
+                    <a:stretch>
+                      <a:fillRect/>
+                    </a:stretch>
+                  </pic:blipFill>
+                  <pic:spPr>
+                    <a:xfrm>
+                      <a:off x="0" y="0"/>
+                      <a:ext cx="5940000" cy="3712500"/>
+                    </a:xfrm>
+                    <a:prstGeom prst="rect">
+                      <a:avLst/>
+                    </a:prstGeom>
+                  </pic:spPr>
+                </pic:pic>
+              </a:graphicData>
+            </a:graphic>
+          </wp:inline>
+        </w:drawing>
+      </w:r>
+    </w:p>
+    <w:p>
+      <w:pPr>
+        <w:spacing w:after="200"/>
+        <w:jc w:val="center"/>
+      </w:pPr>
+      <w:r>
+        <w:rPr>
+          <w:b/>
+          <w:color w:val="1F5FA8"/>
+          <w:sz w:val="18"/>
+        </w:rPr>
+        <w:t xml:space="preserve">Figura 20. </w:t>
+      </w:r>
+      <w:r>
+        <w:rPr>
+          <w:i/>
+          <w:color w:val="5B6570"/>
+          <w:sz w:val="18"/>
+        </w:rPr>
+        <w:t>Captura 25 — Data Explorer, 25/09/2026 00:00-23:59.</w:t>
+      </w:r>
+    </w:p>
+    <w:p>
+      <w:pPr>
+        <w:keepNext/>
+        <w:spacing w:after="60"/>
+        <w:jc w:val="center"/>
+      </w:pPr>
+      <w:r>
+        <w:rPr>
+          <w:noProof/>
+        </w:rPr>
+        <w:drawing>
+          <wp:inline distT="0" distB="0" distL="0" distR="0" wp14:anchorId="31D0B31D" wp14:editId="2E7422C0">
+            <wp:extent cx="5940000" cy="3712500"/>
+            <wp:effectExtent l="0" t="0" r="0" b="0"/>
+            <wp:docPr id="21" name="Picture 21"/>
+            <wp:cNvGraphicFramePr>
+              <a:graphicFrameLocks xmlns:a="http://schemas.openxmlformats.org/drawingml/2006/main" noChangeAspect="1"/>
+            </wp:cNvGraphicFramePr>
+            <a:graphic xmlns:a="http://schemas.openxmlformats.org/drawingml/2006/main">
+              <a:graphicData uri="http://schemas.openxmlformats.org/drawingml/2006/picture">
+                <pic:pic xmlns:pic="http://schemas.openxmlformats.org/drawingml/2006/picture">
+                  <pic:nvPicPr>
+                    <pic:cNvPr id="0" name="de-26.png"/>
+                    <pic:cNvPicPr/>
+                  </pic:nvPicPr>
+                  <pic:blipFill>
+                    <a:blip r:embed="rId25"/>
+                    <a:stretch>
+                      <a:fillRect/>
+                    </a:stretch>
+                  </pic:blipFill>
+                  <pic:spPr>
+                    <a:xfrm>
+                      <a:off x="0" y="0"/>
+                      <a:ext cx="5940000" cy="3712500"/>
+                    </a:xfrm>
+                    <a:prstGeom prst="rect">
+                      <a:avLst/>
+                    </a:prstGeom>
+                  </pic:spPr>
+                </pic:pic>
+              </a:graphicData>
+            </a:graphic>
+          </wp:inline>
+        </w:drawing>
+      </w:r>
+    </w:p>
+    <w:p>
+      <w:pPr>
+        <w:spacing w:after="200"/>
+        <w:jc w:val="center"/>
+      </w:pPr>
+      <w:r>
+        <w:rPr>
+          <w:b/>
+          <w:color w:val="1F5FA8"/>
+          <w:sz w:val="18"/>
+        </w:rPr>
+        <w:t xml:space="preserve">Figura 21. </w:t>
+      </w:r>
+      <w:r>
+        <w:rPr>
+          <w:i/>
+          <w:color w:val="5B6570"/>
+          <w:sz w:val="18"/>
+        </w:rPr>
+        <w:t>Captura 26 — Data Explorer, 26/09/2026 00:00-23:59.</w:t>
+      </w:r>
+    </w:p>
+    <w:p>
+      <w:pPr>
+        <w:keepNext/>
+        <w:spacing w:after="60"/>
+        <w:jc w:val="center"/>
+      </w:pPr>
+      <w:r>
+        <w:rPr>
+          <w:noProof/>
+        </w:rPr>
+        <w:lastRenderedPageBreak/>
+        <w:drawing>
+          <wp:inline distT="0" distB="0" distL="0" distR="0" wp14:anchorId="3865E79B" wp14:editId="38730691">
+            <wp:extent cx="5940000" cy="3712500"/>
+            <wp:effectExtent l="0" t="0" r="0" b="0"/>
+            <wp:docPr id="22" name="Picture 22"/>
+            <wp:cNvGraphicFramePr>
+              <a:graphicFrameLocks xmlns:a="http://schemas.openxmlformats.org/drawingml/2006/main" noChangeAspect="1"/>
+            </wp:cNvGraphicFramePr>
+            <a:graphic xmlns:a="http://schemas.openxmlformats.org/drawingml/2006/main">
+              <a:graphicData uri="http://schemas.openxmlformats.org/drawingml/2006/picture">
+                <pic:pic xmlns:pic="http://schemas.openxmlformats.org/drawingml/2006/picture">
+                  <pic:nvPicPr>
+                    <pic:cNvPr id="0" name="de-27.png"/>
+                    <pic:cNvPicPr/>
+                  </pic:nvPicPr>
+                  <pic:blipFill>
+                    <a:blip r:embed="rId26"/>
+                    <a:stretch>
+                      <a:fillRect/>
+                    </a:stretch>
+                  </pic:blipFill>
+                  <pic:spPr>
+                    <a:xfrm>
+                      <a:off x="0" y="0"/>
+                      <a:ext cx="5940000" cy="3712500"/>
+                    </a:xfrm>
+                    <a:prstGeom prst="rect">
+                      <a:avLst/>
+                    </a:prstGeom>
+                  </pic:spPr>
+                </pic:pic>
+              </a:graphicData>
+            </a:graphic>
+          </wp:inline>
+        </w:drawing>
+      </w:r>
+    </w:p>
+    <w:p>
+      <w:pPr>
+        <w:spacing w:after="200"/>
+        <w:jc w:val="center"/>
+      </w:pPr>
+      <w:r>
+        <w:rPr>
+          <w:b/>
+          <w:color w:val="1F5FA8"/>
+          <w:sz w:val="18"/>
+        </w:rPr>
+        <w:t xml:space="preserve">Figura 22. </w:t>
+      </w:r>
+      <w:r>
+        <w:rPr>
+          <w:i/>
+          <w:color w:val="5B6570"/>
+          <w:sz w:val="18"/>
+        </w:rPr>
+        <w:t>Captura 27 — Data Explorer, 27/09/2026 00:00-23:59.</w:t>
+      </w:r>
+    </w:p>
+    <w:p>
+      <w:pPr>
+        <w:pStyle w:val="Ttulo1"/>
+      </w:pPr>
+      <w:bookmarkStart w:id="11" w:name="_Toc241425410"/>
       <w:r>
         <w:t>5. Logs de los nodos (recortes reales)</w:t>
       </w:r>
-      <w:bookmarkEnd w:id="10"/>
+      <w:bookmarkEnd w:id="11"/>
     </w:p>
     <w:p>
       <w:r>
@@ -3549,11 +5957,11 @@
       <w:pPr>
         <w:pStyle w:val="Ttulo2"/>
       </w:pPr>
-      <w:bookmarkStart w:id="11" w:name="_Toc241413925"/>
+      <w:bookmarkStart w:id="12" w:name="_Toc241425411"/>
       <w:r>
         <w:t>DC-RACKC-03 · SDK MQTT</w:t>
       </w:r>
-      <w:bookmarkEnd w:id="11"/>
+      <w:bookmarkEnd w:id="12"/>
     </w:p>
     <w:tbl>
       <w:tblPr>
@@ -3695,12 +6103,11 @@
       <w:pPr>
         <w:pStyle w:val="Ttulo2"/>
       </w:pPr>
-      <w:bookmarkStart w:id="12" w:name="_Toc241413926"/>
+      <w:bookmarkStart w:id="13" w:name="_Toc241425412"/>
       <w:r>
-        <w:lastRenderedPageBreak/>
         <w:t>DC-PASILLO-04 · SDK sobre WebSockets</w:t>
       </w:r>
-      <w:bookmarkEnd w:id="12"/>
+      <w:bookmarkEnd w:id="13"/>
     </w:p>
     <w:tbl>
       <w:tblPr>
@@ -3842,11 +6249,12 @@
       <w:pPr>
         <w:pStyle w:val="Ttulo2"/>
       </w:pPr>
-      <w:bookmarkStart w:id="13" w:name="_Toc241413927"/>
+      <w:bookmarkStart w:id="14" w:name="_Toc241425413"/>
       <w:r>
+        <w:lastRenderedPageBreak/>
         <w:t>DC-HUMO-08 · paho explícito</w:t>
       </w:r>
-      <w:bookmarkEnd w:id="13"/>
+      <w:bookmarkEnd w:id="14"/>
     </w:p>
     <w:tbl>
       <w:tblPr>
@@ -3988,11 +6396,11 @@
       <w:pPr>
         <w:pStyle w:val="Ttulo2"/>
       </w:pPr>
-      <w:bookmarkStart w:id="14" w:name="_Toc241413928"/>
+      <w:bookmarkStart w:id="15" w:name="_Toc241425414"/>
       <w:r>
         <w:t>DC-ACCESO-10 · puente HTTP/REST</w:t>
       </w:r>
-      <w:bookmarkEnd w:id="14"/>
+      <w:bookmarkEnd w:id="15"/>
     </w:p>
     <w:tbl>
       <w:tblPr>
@@ -4134,12 +6542,11 @@
       <w:pPr>
         <w:pStyle w:val="Ttulo1"/>
       </w:pPr>
-      <w:bookmarkStart w:id="15" w:name="_Toc241413929"/>
+      <w:bookmarkStart w:id="16" w:name="_Toc241425415"/>
       <w:r>
-        <w:lastRenderedPageBreak/>
         <w:t>6. Estado de la flota en el arranque</w:t>
       </w:r>
-      <w:bookmarkEnd w:id="15"/>
+      <w:bookmarkEnd w:id="16"/>
     </w:p>
     <w:tbl>
       <w:tblPr>
@@ -4379,8 +6786,8 @@
       </w:r>
     </w:p>
     <w:sectPr>
-      <w:headerReference w:type="default" r:id="rId22"/>
-      <w:footerReference w:type="default" r:id="rId23"/>
+      <w:headerReference w:type="default" r:id="rId27"/>
+      <w:footerReference w:type="default" r:id="rId28"/>
       <w:pgSz w:w="11906" w:h="16838"/>
       <w:pgMar w:top="1134" w:right="1134" w:bottom="1020" w:left="1134" w:header="720" w:footer="720" w:gutter="0"/>
       <w:cols w:space="720"/>
@@ -4729,31 +7136,31 @@
       </w:rPr>
     </w:lvl>
   </w:abstractNum>
-  <w:num w:numId="1" w16cid:durableId="976179437">
+  <w:num w:numId="1" w16cid:durableId="1526210640">
     <w:abstractNumId w:val="8"/>
   </w:num>
-  <w:num w:numId="2" w16cid:durableId="1960792392">
+  <w:num w:numId="2" w16cid:durableId="1308707616">
     <w:abstractNumId w:val="6"/>
   </w:num>
-  <w:num w:numId="3" w16cid:durableId="1002585537">
+  <w:num w:numId="3" w16cid:durableId="1081634263">
     <w:abstractNumId w:val="5"/>
   </w:num>
-  <w:num w:numId="4" w16cid:durableId="1734304365">
+  <w:num w:numId="4" w16cid:durableId="285897140">
     <w:abstractNumId w:val="4"/>
   </w:num>
-  <w:num w:numId="5" w16cid:durableId="854655301">
+  <w:num w:numId="5" w16cid:durableId="1991670527">
     <w:abstractNumId w:val="7"/>
   </w:num>
-  <w:num w:numId="6" w16cid:durableId="2127506706">
+  <w:num w:numId="6" w16cid:durableId="325255482">
     <w:abstractNumId w:val="3"/>
   </w:num>
-  <w:num w:numId="7" w16cid:durableId="1249270056">
+  <w:num w:numId="7" w16cid:durableId="95952913">
     <w:abstractNumId w:val="2"/>
   </w:num>
-  <w:num w:numId="8" w16cid:durableId="1215242038">
+  <w:num w:numId="8" w16cid:durableId="1967000903">
     <w:abstractNumId w:val="1"/>
   </w:num>
-  <w:num w:numId="9" w16cid:durableId="191889908">
+  <w:num w:numId="9" w16cid:durableId="288978462">
     <w:abstractNumId w:val="0"/>
   </w:num>
 </w:numbering>
@@ -16146,7 +18553,7 @@
     <w:autoRedefine/>
     <w:uiPriority w:val="39"/>
     <w:unhideWhenUsed/>
-    <w:rsid w:val="004D7BC2"/>
+    <w:rsid w:val="00C51739"/>
     <w:pPr>
       <w:spacing w:after="100"/>
     </w:pPr>
@@ -16158,7 +18565,7 @@
     <w:autoRedefine/>
     <w:uiPriority w:val="39"/>
     <w:unhideWhenUsed/>
-    <w:rsid w:val="004D7BC2"/>
+    <w:rsid w:val="00C51739"/>
     <w:pPr>
       <w:spacing w:after="100"/>
       <w:ind w:left="210"/>
@@ -16169,7 +18576,7 @@
     <w:basedOn w:val="Fuentedeprrafopredeter"/>
     <w:uiPriority w:val="99"/>
     <w:unhideWhenUsed/>
-    <w:rsid w:val="004D7BC2"/>
+    <w:rsid w:val="00C51739"/>
     <w:rPr>
       <w:color w:val="0000FF" w:themeColor="hyperlink"/>
       <w:u w:val="single"/>

</xml_diff>

<commit_message>
Auditoria del punto 6 del pliego: 3 huecos corregidos
- diagrama de arquitectura: la fila de origenes se salia del lienzo y cortaba las cajas 08-10; ahora el
  ancho se calcula para que quepan los 10 origenes
- nueva seccion 4.4 (anexo) y 'Lectura operativa de los extremos' (informe): que situacion explica el
  extremo de cada variable en las 4 fechas, exigido por el pliego
- nueva seccion 5.1 (anexo): logs de los dos codigos que se ejecutan en la sustentacion (Python en Ubuntu
  y ESP32 en Wokwi) con sus capturas en vivo
- informe 18 paginas, anexo 23 paginas, verificados por extraccion de texto
</commit_message>
<xml_diff>
--- a/informe/Evidencias_Parcial1_DC-ANDES-1.docx
+++ b/informe/Evidencias_Parcial1_DC-ANDES-1.docx
@@ -396,7 +396,7 @@
       <w:r>
         <w:fldChar w:fldCharType="separate"/>
       </w:r>
-      <w:hyperlink w:anchor="_Toc241425399" w:history="1">
+      <w:hyperlink w:anchor="_Toc241426739" w:history="1">
         <w:r>
           <w:rPr>
             <w:rStyle w:val="Hipervnculo"/>
@@ -423,7 +423,7 @@
             <w:noProof/>
             <w:webHidden/>
           </w:rPr>
-          <w:instrText xml:space="preserve"> PAGEREF _Toc241425399 \h </w:instrText>
+          <w:instrText xml:space="preserve"> PAGEREF _Toc241426739 \h </w:instrText>
         </w:r>
         <w:r>
           <w:rPr>
@@ -464,7 +464,7 @@
           <w:noProof/>
         </w:rPr>
       </w:pPr>
-      <w:hyperlink w:anchor="_Toc241425400" w:history="1">
+      <w:hyperlink w:anchor="_Toc241426740" w:history="1">
         <w:r>
           <w:rPr>
             <w:rStyle w:val="Hipervnculo"/>
@@ -491,7 +491,7 @@
             <w:noProof/>
             <w:webHidden/>
           </w:rPr>
-          <w:instrText xml:space="preserve"> PAGEREF _Toc241425400 \h </w:instrText>
+          <w:instrText xml:space="preserve"> PAGEREF _Toc241426740 \h </w:instrText>
         </w:r>
         <w:r>
           <w:rPr>
@@ -532,7 +532,7 @@
           <w:noProof/>
         </w:rPr>
       </w:pPr>
-      <w:hyperlink w:anchor="_Toc241425401" w:history="1">
+      <w:hyperlink w:anchor="_Toc241426741" w:history="1">
         <w:r>
           <w:rPr>
             <w:rStyle w:val="Hipervnculo"/>
@@ -559,7 +559,7 @@
             <w:noProof/>
             <w:webHidden/>
           </w:rPr>
-          <w:instrText xml:space="preserve"> PAGEREF _Toc241425401 \h </w:instrText>
+          <w:instrText xml:space="preserve"> PAGEREF _Toc241426741 \h </w:instrText>
         </w:r>
         <w:r>
           <w:rPr>
@@ -600,7 +600,7 @@
           <w:noProof/>
         </w:rPr>
       </w:pPr>
-      <w:hyperlink w:anchor="_Toc241425402" w:history="1">
+      <w:hyperlink w:anchor="_Toc241426742" w:history="1">
         <w:r>
           <w:rPr>
             <w:rStyle w:val="Hipervnculo"/>
@@ -627,7 +627,7 @@
             <w:noProof/>
             <w:webHidden/>
           </w:rPr>
-          <w:instrText xml:space="preserve"> PAGEREF _Toc241425402 \h </w:instrText>
+          <w:instrText xml:space="preserve"> PAGEREF _Toc241426742 \h </w:instrText>
         </w:r>
         <w:r>
           <w:rPr>
@@ -668,7 +668,7 @@
           <w:noProof/>
         </w:rPr>
       </w:pPr>
-      <w:hyperlink w:anchor="_Toc241425403" w:history="1">
+      <w:hyperlink w:anchor="_Toc241426743" w:history="1">
         <w:r>
           <w:rPr>
             <w:rStyle w:val="Hipervnculo"/>
@@ -695,7 +695,7 @@
             <w:noProof/>
             <w:webHidden/>
           </w:rPr>
-          <w:instrText xml:space="preserve"> PAGEREF _Toc241425403 \h </w:instrText>
+          <w:instrText xml:space="preserve"> PAGEREF _Toc241426743 \h </w:instrText>
         </w:r>
         <w:r>
           <w:rPr>
@@ -736,7 +736,7 @@
           <w:noProof/>
         </w:rPr>
       </w:pPr>
-      <w:hyperlink w:anchor="_Toc241425404" w:history="1">
+      <w:hyperlink w:anchor="_Toc241426744" w:history="1">
         <w:r>
           <w:rPr>
             <w:rStyle w:val="Hipervnculo"/>
@@ -763,7 +763,7 @@
             <w:noProof/>
             <w:webHidden/>
           </w:rPr>
-          <w:instrText xml:space="preserve"> PAGEREF _Toc241425404 \h </w:instrText>
+          <w:instrText xml:space="preserve"> PAGEREF _Toc241426744 \h </w:instrText>
         </w:r>
         <w:r>
           <w:rPr>
@@ -804,7 +804,7 @@
           <w:noProof/>
         </w:rPr>
       </w:pPr>
-      <w:hyperlink w:anchor="_Toc241425405" w:history="1">
+      <w:hyperlink w:anchor="_Toc241426745" w:history="1">
         <w:r>
           <w:rPr>
             <w:rStyle w:val="Hipervnculo"/>
@@ -831,7 +831,7 @@
             <w:noProof/>
             <w:webHidden/>
           </w:rPr>
-          <w:instrText xml:space="preserve"> PAGEREF _Toc241425405 \h </w:instrText>
+          <w:instrText xml:space="preserve"> PAGEREF _Toc241426745 \h </w:instrText>
         </w:r>
         <w:r>
           <w:rPr>
@@ -872,7 +872,7 @@
           <w:noProof/>
         </w:rPr>
       </w:pPr>
-      <w:hyperlink w:anchor="_Toc241425406" w:history="1">
+      <w:hyperlink w:anchor="_Toc241426746" w:history="1">
         <w:r>
           <w:rPr>
             <w:rStyle w:val="Hipervnculo"/>
@@ -899,7 +899,7 @@
             <w:noProof/>
             <w:webHidden/>
           </w:rPr>
-          <w:instrText xml:space="preserve"> PAGEREF _Toc241425406 \h </w:instrText>
+          <w:instrText xml:space="preserve"> PAGEREF _Toc241426746 \h </w:instrText>
         </w:r>
         <w:r>
           <w:rPr>
@@ -940,7 +940,7 @@
           <w:noProof/>
         </w:rPr>
       </w:pPr>
-      <w:hyperlink w:anchor="_Toc241425407" w:history="1">
+      <w:hyperlink w:anchor="_Toc241426747" w:history="1">
         <w:r>
           <w:rPr>
             <w:rStyle w:val="Hipervnculo"/>
@@ -967,7 +967,7 @@
             <w:noProof/>
             <w:webHidden/>
           </w:rPr>
-          <w:instrText xml:space="preserve"> PAGEREF _Toc241425407 \h </w:instrText>
+          <w:instrText xml:space="preserve"> PAGEREF _Toc241426747 \h </w:instrText>
         </w:r>
         <w:r>
           <w:rPr>
@@ -1008,7 +1008,7 @@
           <w:noProof/>
         </w:rPr>
       </w:pPr>
-      <w:hyperlink w:anchor="_Toc241425408" w:history="1">
+      <w:hyperlink w:anchor="_Toc241426748" w:history="1">
         <w:r>
           <w:rPr>
             <w:rStyle w:val="Hipervnculo"/>
@@ -1035,7 +1035,7 @@
             <w:noProof/>
             <w:webHidden/>
           </w:rPr>
-          <w:instrText xml:space="preserve"> PAGEREF _Toc241425408 \h </w:instrText>
+          <w:instrText xml:space="preserve"> PAGEREF _Toc241426748 \h </w:instrText>
         </w:r>
         <w:r>
           <w:rPr>
@@ -1076,7 +1076,7 @@
           <w:noProof/>
         </w:rPr>
       </w:pPr>
-      <w:hyperlink w:anchor="_Toc241425409" w:history="1">
+      <w:hyperlink w:anchor="_Toc241426749" w:history="1">
         <w:r>
           <w:rPr>
             <w:rStyle w:val="Hipervnculo"/>
@@ -1103,7 +1103,7 @@
             <w:noProof/>
             <w:webHidden/>
           </w:rPr>
-          <w:instrText xml:space="preserve"> PAGEREF _Toc241425409 \h </w:instrText>
+          <w:instrText xml:space="preserve"> PAGEREF _Toc241426749 \h </w:instrText>
         </w:r>
         <w:r>
           <w:rPr>
@@ -1144,13 +1144,13 @@
           <w:noProof/>
         </w:rPr>
       </w:pPr>
-      <w:hyperlink w:anchor="_Toc241425410" w:history="1">
+      <w:hyperlink w:anchor="_Toc241426750" w:history="1">
         <w:r>
           <w:rPr>
             <w:rStyle w:val="Hipervnculo"/>
             <w:noProof/>
           </w:rPr>
-          <w:t>5. Logs de los nodos (recortes reales)</w:t>
+          <w:t>4.4 Lectura operativa de los extremos (las 4 fechas)</w:t>
         </w:r>
         <w:r>
           <w:rPr>
@@ -1171,279 +1171,7 @@
             <w:noProof/>
             <w:webHidden/>
           </w:rPr>
-          <w:instrText xml:space="preserve"> PAGEREF _Toc241425410 \h </w:instrText>
-        </w:r>
-        <w:r>
-          <w:rPr>
-            <w:noProof/>
-            <w:webHidden/>
-          </w:rPr>
-        </w:r>
-        <w:r>
-          <w:rPr>
-            <w:noProof/>
-            <w:webHidden/>
-          </w:rPr>
-          <w:fldChar w:fldCharType="separate"/>
-        </w:r>
-        <w:r>
-          <w:rPr>
-            <w:noProof/>
-            <w:webHidden/>
-          </w:rPr>
-          <w:t>17</w:t>
-        </w:r>
-        <w:r>
-          <w:rPr>
-            <w:noProof/>
-            <w:webHidden/>
-          </w:rPr>
-          <w:fldChar w:fldCharType="end"/>
-        </w:r>
-      </w:hyperlink>
-    </w:p>
-    <w:p>
-      <w:pPr>
-        <w:pStyle w:val="TDC2"/>
-        <w:tabs>
-          <w:tab w:val="right" w:leader="dot" w:pos="9628"/>
-        </w:tabs>
-        <w:rPr>
-          <w:noProof/>
-        </w:rPr>
-      </w:pPr>
-      <w:hyperlink w:anchor="_Toc241425411" w:history="1">
-        <w:r>
-          <w:rPr>
-            <w:rStyle w:val="Hipervnculo"/>
-            <w:noProof/>
-          </w:rPr>
-          <w:t>DC-RACKC-03 · SDK MQTT</w:t>
-        </w:r>
-        <w:r>
-          <w:rPr>
-            <w:noProof/>
-            <w:webHidden/>
-          </w:rPr>
-          <w:tab/>
-        </w:r>
-        <w:r>
-          <w:rPr>
-            <w:noProof/>
-            <w:webHidden/>
-          </w:rPr>
-          <w:fldChar w:fldCharType="begin"/>
-        </w:r>
-        <w:r>
-          <w:rPr>
-            <w:noProof/>
-            <w:webHidden/>
-          </w:rPr>
-          <w:instrText xml:space="preserve"> PAGEREF _Toc241425411 \h </w:instrText>
-        </w:r>
-        <w:r>
-          <w:rPr>
-            <w:noProof/>
-            <w:webHidden/>
-          </w:rPr>
-        </w:r>
-        <w:r>
-          <w:rPr>
-            <w:noProof/>
-            <w:webHidden/>
-          </w:rPr>
-          <w:fldChar w:fldCharType="separate"/>
-        </w:r>
-        <w:r>
-          <w:rPr>
-            <w:noProof/>
-            <w:webHidden/>
-          </w:rPr>
-          <w:t>17</w:t>
-        </w:r>
-        <w:r>
-          <w:rPr>
-            <w:noProof/>
-            <w:webHidden/>
-          </w:rPr>
-          <w:fldChar w:fldCharType="end"/>
-        </w:r>
-      </w:hyperlink>
-    </w:p>
-    <w:p>
-      <w:pPr>
-        <w:pStyle w:val="TDC2"/>
-        <w:tabs>
-          <w:tab w:val="right" w:leader="dot" w:pos="9628"/>
-        </w:tabs>
-        <w:rPr>
-          <w:noProof/>
-        </w:rPr>
-      </w:pPr>
-      <w:hyperlink w:anchor="_Toc241425412" w:history="1">
-        <w:r>
-          <w:rPr>
-            <w:rStyle w:val="Hipervnculo"/>
-            <w:noProof/>
-          </w:rPr>
-          <w:t>DC-PASILLO-04 · SDK sobre WebSockets</w:t>
-        </w:r>
-        <w:r>
-          <w:rPr>
-            <w:noProof/>
-            <w:webHidden/>
-          </w:rPr>
-          <w:tab/>
-        </w:r>
-        <w:r>
-          <w:rPr>
-            <w:noProof/>
-            <w:webHidden/>
-          </w:rPr>
-          <w:fldChar w:fldCharType="begin"/>
-        </w:r>
-        <w:r>
-          <w:rPr>
-            <w:noProof/>
-            <w:webHidden/>
-          </w:rPr>
-          <w:instrText xml:space="preserve"> PAGEREF _Toc241425412 \h </w:instrText>
-        </w:r>
-        <w:r>
-          <w:rPr>
-            <w:noProof/>
-            <w:webHidden/>
-          </w:rPr>
-        </w:r>
-        <w:r>
-          <w:rPr>
-            <w:noProof/>
-            <w:webHidden/>
-          </w:rPr>
-          <w:fldChar w:fldCharType="separate"/>
-        </w:r>
-        <w:r>
-          <w:rPr>
-            <w:noProof/>
-            <w:webHidden/>
-          </w:rPr>
-          <w:t>17</w:t>
-        </w:r>
-        <w:r>
-          <w:rPr>
-            <w:noProof/>
-            <w:webHidden/>
-          </w:rPr>
-          <w:fldChar w:fldCharType="end"/>
-        </w:r>
-      </w:hyperlink>
-    </w:p>
-    <w:p>
-      <w:pPr>
-        <w:pStyle w:val="TDC2"/>
-        <w:tabs>
-          <w:tab w:val="right" w:leader="dot" w:pos="9628"/>
-        </w:tabs>
-        <w:rPr>
-          <w:noProof/>
-        </w:rPr>
-      </w:pPr>
-      <w:hyperlink w:anchor="_Toc241425413" w:history="1">
-        <w:r>
-          <w:rPr>
-            <w:rStyle w:val="Hipervnculo"/>
-            <w:noProof/>
-          </w:rPr>
-          <w:t>DC-HUMO-08 · paho explícito</w:t>
-        </w:r>
-        <w:r>
-          <w:rPr>
-            <w:noProof/>
-            <w:webHidden/>
-          </w:rPr>
-          <w:tab/>
-        </w:r>
-        <w:r>
-          <w:rPr>
-            <w:noProof/>
-            <w:webHidden/>
-          </w:rPr>
-          <w:fldChar w:fldCharType="begin"/>
-        </w:r>
-        <w:r>
-          <w:rPr>
-            <w:noProof/>
-            <w:webHidden/>
-          </w:rPr>
-          <w:instrText xml:space="preserve"> PAGEREF _Toc241425413 \h </w:instrText>
-        </w:r>
-        <w:r>
-          <w:rPr>
-            <w:noProof/>
-            <w:webHidden/>
-          </w:rPr>
-        </w:r>
-        <w:r>
-          <w:rPr>
-            <w:noProof/>
-            <w:webHidden/>
-          </w:rPr>
-          <w:fldChar w:fldCharType="separate"/>
-        </w:r>
-        <w:r>
-          <w:rPr>
-            <w:noProof/>
-            <w:webHidden/>
-          </w:rPr>
-          <w:t>18</w:t>
-        </w:r>
-        <w:r>
-          <w:rPr>
-            <w:noProof/>
-            <w:webHidden/>
-          </w:rPr>
-          <w:fldChar w:fldCharType="end"/>
-        </w:r>
-      </w:hyperlink>
-    </w:p>
-    <w:p>
-      <w:pPr>
-        <w:pStyle w:val="TDC2"/>
-        <w:tabs>
-          <w:tab w:val="right" w:leader="dot" w:pos="9628"/>
-        </w:tabs>
-        <w:rPr>
-          <w:noProof/>
-        </w:rPr>
-      </w:pPr>
-      <w:hyperlink w:anchor="_Toc241425414" w:history="1">
-        <w:r>
-          <w:rPr>
-            <w:rStyle w:val="Hipervnculo"/>
-            <w:noProof/>
-          </w:rPr>
-          <w:t>DC-ACCESO-10 · puente HTTP/REST</w:t>
-        </w:r>
-        <w:r>
-          <w:rPr>
-            <w:noProof/>
-            <w:webHidden/>
-          </w:rPr>
-          <w:tab/>
-        </w:r>
-        <w:r>
-          <w:rPr>
-            <w:noProof/>
-            <w:webHidden/>
-          </w:rPr>
-          <w:fldChar w:fldCharType="begin"/>
-        </w:r>
-        <w:r>
-          <w:rPr>
-            <w:noProof/>
-            <w:webHidden/>
-          </w:rPr>
-          <w:instrText xml:space="preserve"> PAGEREF _Toc241425414 \h </w:instrText>
+          <w:instrText xml:space="preserve"> PAGEREF _Toc241426750 \h </w:instrText>
         </w:r>
         <w:r>
           <w:rPr>
@@ -1484,7 +1212,415 @@
           <w:noProof/>
         </w:rPr>
       </w:pPr>
-      <w:hyperlink w:anchor="_Toc241425415" w:history="1">
+      <w:hyperlink w:anchor="_Toc241426751" w:history="1">
+        <w:r>
+          <w:rPr>
+            <w:rStyle w:val="Hipervnculo"/>
+            <w:noProof/>
+          </w:rPr>
+          <w:t>5. Logs de los nodos (recortes reales)</w:t>
+        </w:r>
+        <w:r>
+          <w:rPr>
+            <w:noProof/>
+            <w:webHidden/>
+          </w:rPr>
+          <w:tab/>
+        </w:r>
+        <w:r>
+          <w:rPr>
+            <w:noProof/>
+            <w:webHidden/>
+          </w:rPr>
+          <w:fldChar w:fldCharType="begin"/>
+        </w:r>
+        <w:r>
+          <w:rPr>
+            <w:noProof/>
+            <w:webHidden/>
+          </w:rPr>
+          <w:instrText xml:space="preserve"> PAGEREF _Toc241426751 \h </w:instrText>
+        </w:r>
+        <w:r>
+          <w:rPr>
+            <w:noProof/>
+            <w:webHidden/>
+          </w:rPr>
+        </w:r>
+        <w:r>
+          <w:rPr>
+            <w:noProof/>
+            <w:webHidden/>
+          </w:rPr>
+          <w:fldChar w:fldCharType="separate"/>
+        </w:r>
+        <w:r>
+          <w:rPr>
+            <w:noProof/>
+            <w:webHidden/>
+          </w:rPr>
+          <w:t>20</w:t>
+        </w:r>
+        <w:r>
+          <w:rPr>
+            <w:noProof/>
+            <w:webHidden/>
+          </w:rPr>
+          <w:fldChar w:fldCharType="end"/>
+        </w:r>
+      </w:hyperlink>
+    </w:p>
+    <w:p>
+      <w:pPr>
+        <w:pStyle w:val="TDC2"/>
+        <w:tabs>
+          <w:tab w:val="right" w:leader="dot" w:pos="9628"/>
+        </w:tabs>
+        <w:rPr>
+          <w:noProof/>
+        </w:rPr>
+      </w:pPr>
+      <w:hyperlink w:anchor="_Toc241426752" w:history="1">
+        <w:r>
+          <w:rPr>
+            <w:rStyle w:val="Hipervnculo"/>
+            <w:noProof/>
+          </w:rPr>
+          <w:t>DC-RACKC-03 · SDK MQTT</w:t>
+        </w:r>
+        <w:r>
+          <w:rPr>
+            <w:noProof/>
+            <w:webHidden/>
+          </w:rPr>
+          <w:tab/>
+        </w:r>
+        <w:r>
+          <w:rPr>
+            <w:noProof/>
+            <w:webHidden/>
+          </w:rPr>
+          <w:fldChar w:fldCharType="begin"/>
+        </w:r>
+        <w:r>
+          <w:rPr>
+            <w:noProof/>
+            <w:webHidden/>
+          </w:rPr>
+          <w:instrText xml:space="preserve"> PAGEREF _Toc241426752 \h </w:instrText>
+        </w:r>
+        <w:r>
+          <w:rPr>
+            <w:noProof/>
+            <w:webHidden/>
+          </w:rPr>
+        </w:r>
+        <w:r>
+          <w:rPr>
+            <w:noProof/>
+            <w:webHidden/>
+          </w:rPr>
+          <w:fldChar w:fldCharType="separate"/>
+        </w:r>
+        <w:r>
+          <w:rPr>
+            <w:noProof/>
+            <w:webHidden/>
+          </w:rPr>
+          <w:t>20</w:t>
+        </w:r>
+        <w:r>
+          <w:rPr>
+            <w:noProof/>
+            <w:webHidden/>
+          </w:rPr>
+          <w:fldChar w:fldCharType="end"/>
+        </w:r>
+      </w:hyperlink>
+    </w:p>
+    <w:p>
+      <w:pPr>
+        <w:pStyle w:val="TDC2"/>
+        <w:tabs>
+          <w:tab w:val="right" w:leader="dot" w:pos="9628"/>
+        </w:tabs>
+        <w:rPr>
+          <w:noProof/>
+        </w:rPr>
+      </w:pPr>
+      <w:hyperlink w:anchor="_Toc241426753" w:history="1">
+        <w:r>
+          <w:rPr>
+            <w:rStyle w:val="Hipervnculo"/>
+            <w:noProof/>
+          </w:rPr>
+          <w:t>DC-PASILLO-04 · SDK sobre WebSockets</w:t>
+        </w:r>
+        <w:r>
+          <w:rPr>
+            <w:noProof/>
+            <w:webHidden/>
+          </w:rPr>
+          <w:tab/>
+        </w:r>
+        <w:r>
+          <w:rPr>
+            <w:noProof/>
+            <w:webHidden/>
+          </w:rPr>
+          <w:fldChar w:fldCharType="begin"/>
+        </w:r>
+        <w:r>
+          <w:rPr>
+            <w:noProof/>
+            <w:webHidden/>
+          </w:rPr>
+          <w:instrText xml:space="preserve"> PAGEREF _Toc241426753 \h </w:instrText>
+        </w:r>
+        <w:r>
+          <w:rPr>
+            <w:noProof/>
+            <w:webHidden/>
+          </w:rPr>
+        </w:r>
+        <w:r>
+          <w:rPr>
+            <w:noProof/>
+            <w:webHidden/>
+          </w:rPr>
+          <w:fldChar w:fldCharType="separate"/>
+        </w:r>
+        <w:r>
+          <w:rPr>
+            <w:noProof/>
+            <w:webHidden/>
+          </w:rPr>
+          <w:t>20</w:t>
+        </w:r>
+        <w:r>
+          <w:rPr>
+            <w:noProof/>
+            <w:webHidden/>
+          </w:rPr>
+          <w:fldChar w:fldCharType="end"/>
+        </w:r>
+      </w:hyperlink>
+    </w:p>
+    <w:p>
+      <w:pPr>
+        <w:pStyle w:val="TDC2"/>
+        <w:tabs>
+          <w:tab w:val="right" w:leader="dot" w:pos="9628"/>
+        </w:tabs>
+        <w:rPr>
+          <w:noProof/>
+        </w:rPr>
+      </w:pPr>
+      <w:hyperlink w:anchor="_Toc241426754" w:history="1">
+        <w:r>
+          <w:rPr>
+            <w:rStyle w:val="Hipervnculo"/>
+            <w:noProof/>
+          </w:rPr>
+          <w:t>DC-HUMO-08 · paho explícito</w:t>
+        </w:r>
+        <w:r>
+          <w:rPr>
+            <w:noProof/>
+            <w:webHidden/>
+          </w:rPr>
+          <w:tab/>
+        </w:r>
+        <w:r>
+          <w:rPr>
+            <w:noProof/>
+            <w:webHidden/>
+          </w:rPr>
+          <w:fldChar w:fldCharType="begin"/>
+        </w:r>
+        <w:r>
+          <w:rPr>
+            <w:noProof/>
+            <w:webHidden/>
+          </w:rPr>
+          <w:instrText xml:space="preserve"> PAGEREF _Toc241426754 \h </w:instrText>
+        </w:r>
+        <w:r>
+          <w:rPr>
+            <w:noProof/>
+            <w:webHidden/>
+          </w:rPr>
+        </w:r>
+        <w:r>
+          <w:rPr>
+            <w:noProof/>
+            <w:webHidden/>
+          </w:rPr>
+          <w:fldChar w:fldCharType="separate"/>
+        </w:r>
+        <w:r>
+          <w:rPr>
+            <w:noProof/>
+            <w:webHidden/>
+          </w:rPr>
+          <w:t>21</w:t>
+        </w:r>
+        <w:r>
+          <w:rPr>
+            <w:noProof/>
+            <w:webHidden/>
+          </w:rPr>
+          <w:fldChar w:fldCharType="end"/>
+        </w:r>
+      </w:hyperlink>
+    </w:p>
+    <w:p>
+      <w:pPr>
+        <w:pStyle w:val="TDC2"/>
+        <w:tabs>
+          <w:tab w:val="right" w:leader="dot" w:pos="9628"/>
+        </w:tabs>
+        <w:rPr>
+          <w:noProof/>
+        </w:rPr>
+      </w:pPr>
+      <w:hyperlink w:anchor="_Toc241426755" w:history="1">
+        <w:r>
+          <w:rPr>
+            <w:rStyle w:val="Hipervnculo"/>
+            <w:noProof/>
+          </w:rPr>
+          <w:t>DC-ACCESO-10 · puente HTTP/REST</w:t>
+        </w:r>
+        <w:r>
+          <w:rPr>
+            <w:noProof/>
+            <w:webHidden/>
+          </w:rPr>
+          <w:tab/>
+        </w:r>
+        <w:r>
+          <w:rPr>
+            <w:noProof/>
+            <w:webHidden/>
+          </w:rPr>
+          <w:fldChar w:fldCharType="begin"/>
+        </w:r>
+        <w:r>
+          <w:rPr>
+            <w:noProof/>
+            <w:webHidden/>
+          </w:rPr>
+          <w:instrText xml:space="preserve"> PAGEREF _Toc241426755 \h </w:instrText>
+        </w:r>
+        <w:r>
+          <w:rPr>
+            <w:noProof/>
+            <w:webHidden/>
+          </w:rPr>
+        </w:r>
+        <w:r>
+          <w:rPr>
+            <w:noProof/>
+            <w:webHidden/>
+          </w:rPr>
+          <w:fldChar w:fldCharType="separate"/>
+        </w:r>
+        <w:r>
+          <w:rPr>
+            <w:noProof/>
+            <w:webHidden/>
+          </w:rPr>
+          <w:t>21</w:t>
+        </w:r>
+        <w:r>
+          <w:rPr>
+            <w:noProof/>
+            <w:webHidden/>
+          </w:rPr>
+          <w:fldChar w:fldCharType="end"/>
+        </w:r>
+      </w:hyperlink>
+    </w:p>
+    <w:p>
+      <w:pPr>
+        <w:pStyle w:val="TDC2"/>
+        <w:tabs>
+          <w:tab w:val="right" w:leader="dot" w:pos="9628"/>
+        </w:tabs>
+        <w:rPr>
+          <w:noProof/>
+        </w:rPr>
+      </w:pPr>
+      <w:hyperlink w:anchor="_Toc241426756" w:history="1">
+        <w:r>
+          <w:rPr>
+            <w:rStyle w:val="Hipervnculo"/>
+            <w:noProof/>
+          </w:rPr>
+          <w:t>5.1 Los dos códigos que se ejecutan en la sustentación</w:t>
+        </w:r>
+        <w:r>
+          <w:rPr>
+            <w:noProof/>
+            <w:webHidden/>
+          </w:rPr>
+          <w:tab/>
+        </w:r>
+        <w:r>
+          <w:rPr>
+            <w:noProof/>
+            <w:webHidden/>
+          </w:rPr>
+          <w:fldChar w:fldCharType="begin"/>
+        </w:r>
+        <w:r>
+          <w:rPr>
+            <w:noProof/>
+            <w:webHidden/>
+          </w:rPr>
+          <w:instrText xml:space="preserve"> PAGEREF _Toc241426756 \h </w:instrText>
+        </w:r>
+        <w:r>
+          <w:rPr>
+            <w:noProof/>
+            <w:webHidden/>
+          </w:rPr>
+        </w:r>
+        <w:r>
+          <w:rPr>
+            <w:noProof/>
+            <w:webHidden/>
+          </w:rPr>
+          <w:fldChar w:fldCharType="separate"/>
+        </w:r>
+        <w:r>
+          <w:rPr>
+            <w:noProof/>
+            <w:webHidden/>
+          </w:rPr>
+          <w:t>21</w:t>
+        </w:r>
+        <w:r>
+          <w:rPr>
+            <w:noProof/>
+            <w:webHidden/>
+          </w:rPr>
+          <w:fldChar w:fldCharType="end"/>
+        </w:r>
+      </w:hyperlink>
+    </w:p>
+    <w:p>
+      <w:pPr>
+        <w:pStyle w:val="TDC1"/>
+        <w:tabs>
+          <w:tab w:val="right" w:leader="dot" w:pos="9628"/>
+        </w:tabs>
+        <w:rPr>
+          <w:noProof/>
+        </w:rPr>
+      </w:pPr>
+      <w:hyperlink w:anchor="_Toc241426757" w:history="1">
         <w:r>
           <w:rPr>
             <w:rStyle w:val="Hipervnculo"/>
@@ -1511,7 +1647,7 @@
             <w:noProof/>
             <w:webHidden/>
           </w:rPr>
-          <w:instrText xml:space="preserve"> PAGEREF _Toc241425415 \h </w:instrText>
+          <w:instrText xml:space="preserve"> PAGEREF _Toc241426757 \h </w:instrText>
         </w:r>
         <w:r>
           <w:rPr>
@@ -1531,7 +1667,7 @@
             <w:noProof/>
             <w:webHidden/>
           </w:rPr>
-          <w:t>18</w:t>
+          <w:t>23</w:t>
         </w:r>
         <w:r>
           <w:rPr>
@@ -1556,7 +1692,7 @@
       <w:pPr>
         <w:pStyle w:val="Ttulo1"/>
       </w:pPr>
-      <w:bookmarkStart w:id="0" w:name="_Toc241425399"/>
+      <w:bookmarkStart w:id="0" w:name="_Toc241426739"/>
       <w:r>
         <w:lastRenderedPageBreak/>
         <w:t>Matriz de cumplimiento (rúbrica → evidencia)</w:t>
@@ -2284,7 +2420,7 @@
       <w:pPr>
         <w:pStyle w:val="Ttulo1"/>
       </w:pPr>
-      <w:bookmarkStart w:id="1" w:name="_Toc241425400"/>
+      <w:bookmarkStart w:id="1" w:name="_Toc241426740"/>
       <w:r>
         <w:t>1. Flota en Azure IoT Central</w:t>
       </w:r>
@@ -2307,7 +2443,7 @@
         </w:rPr>
         <w:lastRenderedPageBreak/>
         <w:drawing>
-          <wp:inline distT="0" distB="0" distL="0" distR="0" wp14:anchorId="4DFC27B6" wp14:editId="5D8C4C4E">
+          <wp:inline distT="0" distB="0" distL="0" distR="0" wp14:anchorId="63B47D1B" wp14:editId="1E306714">
             <wp:extent cx="5940000" cy="3712500"/>
             <wp:effectExtent l="0" t="0" r="0" b="0"/>
             <wp:docPr id="1" name="Picture 1"/>
@@ -2369,7 +2505,7 @@
       <w:pPr>
         <w:pStyle w:val="Ttulo1"/>
       </w:pPr>
-      <w:bookmarkStart w:id="2" w:name="_Toc241425401"/>
+      <w:bookmarkStart w:id="2" w:name="_Toc241426741"/>
       <w:r>
         <w:t>2. Datos sin procesar por origen de envío</w:t>
       </w:r>
@@ -2391,7 +2527,7 @@
           <w:noProof/>
         </w:rPr>
         <w:drawing>
-          <wp:inline distT="0" distB="0" distL="0" distR="0" wp14:anchorId="6A582858" wp14:editId="5310BA45">
+          <wp:inline distT="0" distB="0" distL="0" distR="0" wp14:anchorId="41EF1DD1" wp14:editId="0D57B392">
             <wp:extent cx="5940000" cy="3712500"/>
             <wp:effectExtent l="0" t="0" r="0" b="0"/>
             <wp:docPr id="2" name="Picture 2"/>
@@ -2461,7 +2597,7 @@
         </w:rPr>
         <w:lastRenderedPageBreak/>
         <w:drawing>
-          <wp:inline distT="0" distB="0" distL="0" distR="0" wp14:anchorId="43C6BE09" wp14:editId="3A75385C">
+          <wp:inline distT="0" distB="0" distL="0" distR="0" wp14:anchorId="789096F1" wp14:editId="5DFB9083">
             <wp:extent cx="5940000" cy="3712500"/>
             <wp:effectExtent l="0" t="0" r="0" b="0"/>
             <wp:docPr id="3" name="Picture 3"/>
@@ -2530,7 +2666,7 @@
           <w:noProof/>
         </w:rPr>
         <w:drawing>
-          <wp:inline distT="0" distB="0" distL="0" distR="0" wp14:anchorId="3DFFFA23" wp14:editId="202BECF4">
+          <wp:inline distT="0" distB="0" distL="0" distR="0" wp14:anchorId="16E3E043" wp14:editId="3F1F28AE">
             <wp:extent cx="5940000" cy="3712500"/>
             <wp:effectExtent l="0" t="0" r="0" b="0"/>
             <wp:docPr id="4" name="Picture 4"/>
@@ -2597,7 +2733,7 @@
       <w:pPr>
         <w:pStyle w:val="Ttulo1"/>
       </w:pPr>
-      <w:bookmarkStart w:id="3" w:name="_Toc241425402"/>
+      <w:bookmarkStart w:id="3" w:name="_Toc241426742"/>
       <w:r>
         <w:lastRenderedPageBreak/>
         <w:t>3. Cuarto de control</w:t>
@@ -2615,7 +2751,7 @@
           <w:noProof/>
         </w:rPr>
         <w:drawing>
-          <wp:inline distT="0" distB="0" distL="0" distR="0" wp14:anchorId="502E171E" wp14:editId="1339C8DF">
+          <wp:inline distT="0" distB="0" distL="0" distR="0" wp14:anchorId="296879D9" wp14:editId="28173D1F">
             <wp:extent cx="5940000" cy="3712500"/>
             <wp:effectExtent l="0" t="0" r="0" b="0"/>
             <wp:docPr id="5" name="Picture 5"/>
@@ -2677,7 +2813,7 @@
       <w:pPr>
         <w:pStyle w:val="Ttulo1"/>
       </w:pPr>
-      <w:bookmarkStart w:id="4" w:name="_Toc241425403"/>
+      <w:bookmarkStart w:id="4" w:name="_Toc241426743"/>
       <w:r>
         <w:t>3.1 Reglas configuradas</w:t>
       </w:r>
@@ -2700,7 +2836,7 @@
         </w:rPr>
         <w:lastRenderedPageBreak/>
         <w:drawing>
-          <wp:inline distT="0" distB="0" distL="0" distR="0" wp14:anchorId="2ADBC6DD" wp14:editId="4C68DA6F">
+          <wp:inline distT="0" distB="0" distL="0" distR="0" wp14:anchorId="1E908616" wp14:editId="2974B9D5">
             <wp:extent cx="5940000" cy="3712500"/>
             <wp:effectExtent l="0" t="0" r="0" b="0"/>
             <wp:docPr id="6" name="Picture 6"/>
@@ -2762,7 +2898,7 @@
       <w:pPr>
         <w:pStyle w:val="Ttulo1"/>
       </w:pPr>
-      <w:bookmarkStart w:id="5" w:name="_Toc241425404"/>
+      <w:bookmarkStart w:id="5" w:name="_Toc241426744"/>
       <w:r>
         <w:t>3.2 Flota y estado de aprovisionamiento al cierre del día</w:t>
       </w:r>
@@ -2779,7 +2915,7 @@
           <w:noProof/>
         </w:rPr>
         <w:drawing>
-          <wp:inline distT="0" distB="0" distL="0" distR="0" wp14:anchorId="6D90BF78" wp14:editId="650E550E">
+          <wp:inline distT="0" distB="0" distL="0" distR="0" wp14:anchorId="7E09F0EC" wp14:editId="5E6C980D">
             <wp:extent cx="5940000" cy="3712500"/>
             <wp:effectExtent l="0" t="0" r="0" b="0"/>
             <wp:docPr id="7" name="Picture 7"/>
@@ -2846,7 +2982,7 @@
       <w:pPr>
         <w:pStyle w:val="Ttulo1"/>
       </w:pPr>
-      <w:bookmarkStart w:id="6" w:name="_Toc241425405"/>
+      <w:bookmarkStart w:id="6" w:name="_Toc241426745"/>
       <w:r>
         <w:lastRenderedPageBreak/>
         <w:t>3.3 Vistas de operador de la plantilla</w:t>
@@ -2869,7 +3005,7 @@
           <w:noProof/>
         </w:rPr>
         <w:drawing>
-          <wp:inline distT="0" distB="0" distL="0" distR="0" wp14:anchorId="71E1DAAA" wp14:editId="008EB122">
+          <wp:inline distT="0" distB="0" distL="0" distR="0" wp14:anchorId="0712108E" wp14:editId="5B11C54A">
             <wp:extent cx="5940000" cy="3712500"/>
             <wp:effectExtent l="0" t="0" r="0" b="0"/>
             <wp:docPr id="8" name="Picture 8"/>
@@ -2931,7 +3067,7 @@
       <w:pPr>
         <w:pStyle w:val="Ttulo1"/>
       </w:pPr>
-      <w:bookmarkStart w:id="7" w:name="_Toc241425406"/>
+      <w:bookmarkStart w:id="7" w:name="_Toc241426746"/>
       <w:r>
         <w:t>4. Días 2 a 4 — migración a servidor remoto y su evidencia</w:t>
       </w:r>
@@ -2946,7 +3082,7 @@
       <w:pPr>
         <w:pStyle w:val="Ttulo2"/>
       </w:pPr>
-      <w:bookmarkStart w:id="8" w:name="_Toc241425407"/>
+      <w:bookmarkStart w:id="8" w:name="_Toc241426747"/>
       <w:r>
         <w:lastRenderedPageBreak/>
         <w:t>4.1 Día 3 (26-sep) — servidor estable, 8/8 nodos</w:t>
@@ -2964,7 +3100,7 @@
           <w:noProof/>
         </w:rPr>
         <w:drawing>
-          <wp:inline distT="0" distB="0" distL="0" distR="0" wp14:anchorId="7D2E251D" wp14:editId="6E52B97A">
+          <wp:inline distT="0" distB="0" distL="0" distR="0" wp14:anchorId="53CAA071" wp14:editId="1F79F2DC">
             <wp:extent cx="5940000" cy="3712500"/>
             <wp:effectExtent l="0" t="0" r="0" b="0"/>
             <wp:docPr id="9" name="Picture 9"/>
@@ -3033,7 +3169,7 @@
           <w:noProof/>
         </w:rPr>
         <w:drawing>
-          <wp:inline distT="0" distB="0" distL="0" distR="0" wp14:anchorId="76A270EF" wp14:editId="50D36527">
+          <wp:inline distT="0" distB="0" distL="0" distR="0" wp14:anchorId="2466934D" wp14:editId="0E2DBF5A">
             <wp:extent cx="5940000" cy="3722400"/>
             <wp:effectExtent l="0" t="0" r="0" b="0"/>
             <wp:docPr id="10" name="Picture 10"/>
@@ -3103,7 +3239,7 @@
         </w:rPr>
         <w:lastRenderedPageBreak/>
         <w:drawing>
-          <wp:inline distT="0" distB="0" distL="0" distR="0" wp14:anchorId="58DC6B66" wp14:editId="1B1106EB">
+          <wp:inline distT="0" distB="0" distL="0" distR="0" wp14:anchorId="0C129306" wp14:editId="3F9F10EA">
             <wp:extent cx="5940000" cy="3722400"/>
             <wp:effectExtent l="0" t="0" r="0" b="0"/>
             <wp:docPr id="11" name="Picture 11"/>
@@ -3172,7 +3308,7 @@
           <w:noProof/>
         </w:rPr>
         <w:drawing>
-          <wp:inline distT="0" distB="0" distL="0" distR="0" wp14:anchorId="77431732" wp14:editId="63DDD159">
+          <wp:inline distT="0" distB="0" distL="0" distR="0" wp14:anchorId="5458C2A3" wp14:editId="6C2FDB0D">
             <wp:extent cx="5940000" cy="3722400"/>
             <wp:effectExtent l="0" t="0" r="0" b="0"/>
             <wp:docPr id="12" name="Picture 12"/>
@@ -3234,7 +3370,7 @@
       <w:pPr>
         <w:pStyle w:val="Ttulo2"/>
       </w:pPr>
-      <w:bookmarkStart w:id="9" w:name="_Toc241425408"/>
+      <w:bookmarkStart w:id="9" w:name="_Toc241426748"/>
       <w:r>
         <w:t>4.2 Día 4 (27-sep) — solo servidor remoto + Rack B</w:t>
       </w:r>
@@ -3257,7 +3393,7 @@
         </w:rPr>
         <w:lastRenderedPageBreak/>
         <w:drawing>
-          <wp:inline distT="0" distB="0" distL="0" distR="0" wp14:anchorId="4FB52AA8" wp14:editId="74325B60">
+          <wp:inline distT="0" distB="0" distL="0" distR="0" wp14:anchorId="02F37AE3" wp14:editId="51BDFF00">
             <wp:extent cx="5940000" cy="3722400"/>
             <wp:effectExtent l="0" t="0" r="0" b="0"/>
             <wp:docPr id="13" name="Picture 13"/>
@@ -3326,7 +3462,7 @@
           <w:noProof/>
         </w:rPr>
         <w:drawing>
-          <wp:inline distT="0" distB="0" distL="0" distR="0" wp14:anchorId="4AE864BD" wp14:editId="506D9208">
+          <wp:inline distT="0" distB="0" distL="0" distR="0" wp14:anchorId="00EC871C" wp14:editId="0D07FB11">
             <wp:extent cx="5940000" cy="3722400"/>
             <wp:effectExtent l="0" t="0" r="0" b="0"/>
             <wp:docPr id="14" name="Picture 14"/>
@@ -3396,7 +3532,7 @@
         </w:rPr>
         <w:lastRenderedPageBreak/>
         <w:drawing>
-          <wp:inline distT="0" distB="0" distL="0" distR="0" wp14:anchorId="168821EA" wp14:editId="7F89BBC9">
+          <wp:inline distT="0" distB="0" distL="0" distR="0" wp14:anchorId="06377001" wp14:editId="17D09784">
             <wp:extent cx="5940000" cy="3722400"/>
             <wp:effectExtent l="0" t="0" r="0" b="0"/>
             <wp:docPr id="15" name="Picture 15"/>
@@ -3465,7 +3601,7 @@
           <w:noProof/>
         </w:rPr>
         <w:drawing>
-          <wp:inline distT="0" distB="0" distL="0" distR="0" wp14:anchorId="61F60D8C" wp14:editId="377293B2">
+          <wp:inline distT="0" distB="0" distL="0" distR="0" wp14:anchorId="3851672D" wp14:editId="25EFFEBB">
             <wp:extent cx="5940000" cy="3722400"/>
             <wp:effectExtent l="0" t="0" r="0" b="0"/>
             <wp:docPr id="16" name="Picture 16"/>
@@ -3535,7 +3671,7 @@
         </w:rPr>
         <w:lastRenderedPageBreak/>
         <w:drawing>
-          <wp:inline distT="0" distB="0" distL="0" distR="0" wp14:anchorId="4198D35A" wp14:editId="1EF10CAC">
+          <wp:inline distT="0" distB="0" distL="0" distR="0" wp14:anchorId="030C11C5" wp14:editId="01127123">
             <wp:extent cx="5940000" cy="3722400"/>
             <wp:effectExtent l="0" t="0" r="0" b="0"/>
             <wp:docPr id="17" name="Picture 17"/>
@@ -3607,7 +3743,7 @@
       <w:pPr>
         <w:pStyle w:val="Ttulo1"/>
       </w:pPr>
-      <w:bookmarkStart w:id="10" w:name="_Toc241425409"/>
+      <w:bookmarkStart w:id="10" w:name="_Toc241426749"/>
       <w:r>
         <w:lastRenderedPageBreak/>
         <w:t>4.3 Métricas de los 10 dispositivos en las 4 fechas (Data Explorer)</w:t>
@@ -5602,7 +5738,7 @@
         </w:rPr>
         <w:lastRenderedPageBreak/>
         <w:drawing>
-          <wp:inline distT="0" distB="0" distL="0" distR="0" wp14:anchorId="207FE852" wp14:editId="6600505A">
+          <wp:inline distT="0" distB="0" distL="0" distR="0" wp14:anchorId="3B8AF288" wp14:editId="5C871953">
             <wp:extent cx="5940000" cy="3712500"/>
             <wp:effectExtent l="0" t="0" r="0" b="0"/>
             <wp:docPr id="18" name="Picture 18"/>
@@ -5671,7 +5807,7 @@
           <w:noProof/>
         </w:rPr>
         <w:drawing>
-          <wp:inline distT="0" distB="0" distL="0" distR="0" wp14:anchorId="3517803C" wp14:editId="619F5B15">
+          <wp:inline distT="0" distB="0" distL="0" distR="0" wp14:anchorId="45E36EA7" wp14:editId="4118CCEB">
             <wp:extent cx="5940000" cy="3712500"/>
             <wp:effectExtent l="0" t="0" r="0" b="0"/>
             <wp:docPr id="19" name="Picture 19"/>
@@ -5741,7 +5877,7 @@
         </w:rPr>
         <w:lastRenderedPageBreak/>
         <w:drawing>
-          <wp:inline distT="0" distB="0" distL="0" distR="0" wp14:anchorId="397613F0" wp14:editId="01E7B9D4">
+          <wp:inline distT="0" distB="0" distL="0" distR="0" wp14:anchorId="6F7A1B73" wp14:editId="3A7C00F1">
             <wp:extent cx="5940000" cy="3712500"/>
             <wp:effectExtent l="0" t="0" r="0" b="0"/>
             <wp:docPr id="20" name="Picture 20"/>
@@ -5810,7 +5946,7 @@
           <w:noProof/>
         </w:rPr>
         <w:drawing>
-          <wp:inline distT="0" distB="0" distL="0" distR="0" wp14:anchorId="31D0B31D" wp14:editId="2E7422C0">
+          <wp:inline distT="0" distB="0" distL="0" distR="0" wp14:anchorId="423CE243" wp14:editId="34C0ED79">
             <wp:extent cx="5940000" cy="3712500"/>
             <wp:effectExtent l="0" t="0" r="0" b="0"/>
             <wp:docPr id="21" name="Picture 21"/>
@@ -5880,7 +6016,7 @@
         </w:rPr>
         <w:lastRenderedPageBreak/>
         <w:drawing>
-          <wp:inline distT="0" distB="0" distL="0" distR="0" wp14:anchorId="3865E79B" wp14:editId="38730691">
+          <wp:inline distT="0" distB="0" distL="0" distR="0" wp14:anchorId="6862F938" wp14:editId="37FFD760">
             <wp:extent cx="5940000" cy="3712500"/>
             <wp:effectExtent l="0" t="0" r="0" b="0"/>
             <wp:docPr id="22" name="Picture 22"/>
@@ -5939,14 +6075,2180 @@
       </w:r>
     </w:p>
     <w:p>
+      <w:r>
+        <w:br w:type="page"/>
+      </w:r>
+    </w:p>
+    <w:p>
       <w:pPr>
         <w:pStyle w:val="Ttulo1"/>
       </w:pPr>
-      <w:bookmarkStart w:id="11" w:name="_Toc241425410"/>
+      <w:bookmarkStart w:id="11" w:name="_Toc241426750"/>
+      <w:r>
+        <w:lastRenderedPageBreak/>
+        <w:t>4.4 Lectura operativa de los extremos (las 4 fechas)</w:t>
+      </w:r>
+      <w:bookmarkEnd w:id="11"/>
+    </w:p>
+    <w:p>
+      <w:r>
+        <w:t>El pliego pide no solo los números sino qué situación operativa explican. Esta tabla compara el extremo de cada variable en las cuatro fechas y lo interpreta; los valores salen de las mismas series de la comparativa anterior.</w:t>
+      </w:r>
+    </w:p>
+    <w:tbl>
+      <w:tblPr>
+        <w:tblW w:w="0" w:type="auto"/>
+        <w:jc w:val="center"/>
+        <w:tblLook w:val="04A0" w:firstRow="1" w:lastRow="0" w:firstColumn="1" w:lastColumn="0" w:noHBand="0" w:noVBand="1"/>
+      </w:tblPr>
+      <w:tblGrid>
+        <w:gridCol w:w="1701"/>
+        <w:gridCol w:w="1134"/>
+        <w:gridCol w:w="1134"/>
+        <w:gridCol w:w="1134"/>
+        <w:gridCol w:w="1134"/>
+        <w:gridCol w:w="3118"/>
+      </w:tblGrid>
+      <w:tr>
+        <w:trPr>
+          <w:cantSplit/>
+          <w:tblHeader/>
+          <w:jc w:val="center"/>
+        </w:trPr>
+        <w:tc>
+          <w:tcPr>
+            <w:tcW w:w="1701" w:type="dxa"/>
+            <w:tcBorders>
+              <w:top w:val="single" w:sz="4" w:space="0" w:color="0B2A4A"/>
+              <w:left w:val="single" w:sz="4" w:space="0" w:color="0B2A4A"/>
+              <w:bottom w:val="single" w:sz="4" w:space="0" w:color="0B2A4A"/>
+              <w:right w:val="single" w:sz="4" w:space="0" w:color="0B2A4A"/>
+            </w:tcBorders>
+            <w:shd w:val="clear" w:color="auto" w:fill="0B2A4A"/>
+            <w:tcMar>
+              <w:top w:w="90" w:type="dxa"/>
+              <w:left w:w="130" w:type="dxa"/>
+              <w:bottom w:w="90" w:type="dxa"/>
+              <w:right w:w="130" w:type="dxa"/>
+            </w:tcMar>
+            <w:vAlign w:val="center"/>
+          </w:tcPr>
+          <w:p>
+            <w:pPr>
+              <w:keepNext/>
+            </w:pPr>
+            <w:r>
+              <w:rPr>
+                <w:b/>
+                <w:color w:val="FFFFFF"/>
+                <w:sz w:val="19"/>
+              </w:rPr>
+              <w:lastRenderedPageBreak/>
+              <w:t>Variable</w:t>
+            </w:r>
+          </w:p>
+        </w:tc>
+        <w:tc>
+          <w:tcPr>
+            <w:tcW w:w="1134" w:type="dxa"/>
+            <w:tcBorders>
+              <w:top w:val="single" w:sz="4" w:space="0" w:color="0B2A4A"/>
+              <w:left w:val="single" w:sz="4" w:space="0" w:color="0B2A4A"/>
+              <w:bottom w:val="single" w:sz="4" w:space="0" w:color="0B2A4A"/>
+              <w:right w:val="single" w:sz="4" w:space="0" w:color="0B2A4A"/>
+            </w:tcBorders>
+            <w:shd w:val="clear" w:color="auto" w:fill="0B2A4A"/>
+            <w:tcMar>
+              <w:top w:w="90" w:type="dxa"/>
+              <w:left w:w="130" w:type="dxa"/>
+              <w:bottom w:w="90" w:type="dxa"/>
+              <w:right w:w="130" w:type="dxa"/>
+            </w:tcMar>
+            <w:vAlign w:val="center"/>
+          </w:tcPr>
+          <w:p>
+            <w:pPr>
+              <w:keepNext/>
+            </w:pPr>
+            <w:r>
+              <w:rPr>
+                <w:b/>
+                <w:color w:val="FFFFFF"/>
+                <w:sz w:val="19"/>
+              </w:rPr>
+              <w:t>24-sep</w:t>
+            </w:r>
+          </w:p>
+        </w:tc>
+        <w:tc>
+          <w:tcPr>
+            <w:tcW w:w="1134" w:type="dxa"/>
+            <w:tcBorders>
+              <w:top w:val="single" w:sz="4" w:space="0" w:color="0B2A4A"/>
+              <w:left w:val="single" w:sz="4" w:space="0" w:color="0B2A4A"/>
+              <w:bottom w:val="single" w:sz="4" w:space="0" w:color="0B2A4A"/>
+              <w:right w:val="single" w:sz="4" w:space="0" w:color="0B2A4A"/>
+            </w:tcBorders>
+            <w:shd w:val="clear" w:color="auto" w:fill="0B2A4A"/>
+            <w:tcMar>
+              <w:top w:w="90" w:type="dxa"/>
+              <w:left w:w="130" w:type="dxa"/>
+              <w:bottom w:w="90" w:type="dxa"/>
+              <w:right w:w="130" w:type="dxa"/>
+            </w:tcMar>
+            <w:vAlign w:val="center"/>
+          </w:tcPr>
+          <w:p>
+            <w:pPr>
+              <w:keepNext/>
+            </w:pPr>
+            <w:r>
+              <w:rPr>
+                <w:b/>
+                <w:color w:val="FFFFFF"/>
+                <w:sz w:val="19"/>
+              </w:rPr>
+              <w:t>25-sep</w:t>
+            </w:r>
+          </w:p>
+        </w:tc>
+        <w:tc>
+          <w:tcPr>
+            <w:tcW w:w="1134" w:type="dxa"/>
+            <w:tcBorders>
+              <w:top w:val="single" w:sz="4" w:space="0" w:color="0B2A4A"/>
+              <w:left w:val="single" w:sz="4" w:space="0" w:color="0B2A4A"/>
+              <w:bottom w:val="single" w:sz="4" w:space="0" w:color="0B2A4A"/>
+              <w:right w:val="single" w:sz="4" w:space="0" w:color="0B2A4A"/>
+            </w:tcBorders>
+            <w:shd w:val="clear" w:color="auto" w:fill="0B2A4A"/>
+            <w:tcMar>
+              <w:top w:w="90" w:type="dxa"/>
+              <w:left w:w="130" w:type="dxa"/>
+              <w:bottom w:w="90" w:type="dxa"/>
+              <w:right w:w="130" w:type="dxa"/>
+            </w:tcMar>
+            <w:vAlign w:val="center"/>
+          </w:tcPr>
+          <w:p>
+            <w:pPr>
+              <w:keepNext/>
+            </w:pPr>
+            <w:r>
+              <w:rPr>
+                <w:b/>
+                <w:color w:val="FFFFFF"/>
+                <w:sz w:val="19"/>
+              </w:rPr>
+              <w:t>26-sep</w:t>
+            </w:r>
+          </w:p>
+        </w:tc>
+        <w:tc>
+          <w:tcPr>
+            <w:tcW w:w="1134" w:type="dxa"/>
+            <w:tcBorders>
+              <w:top w:val="single" w:sz="4" w:space="0" w:color="0B2A4A"/>
+              <w:left w:val="single" w:sz="4" w:space="0" w:color="0B2A4A"/>
+              <w:bottom w:val="single" w:sz="4" w:space="0" w:color="0B2A4A"/>
+              <w:right w:val="single" w:sz="4" w:space="0" w:color="0B2A4A"/>
+            </w:tcBorders>
+            <w:shd w:val="clear" w:color="auto" w:fill="0B2A4A"/>
+            <w:tcMar>
+              <w:top w:w="90" w:type="dxa"/>
+              <w:left w:w="130" w:type="dxa"/>
+              <w:bottom w:w="90" w:type="dxa"/>
+              <w:right w:w="130" w:type="dxa"/>
+            </w:tcMar>
+            <w:vAlign w:val="center"/>
+          </w:tcPr>
+          <w:p>
+            <w:pPr>
+              <w:keepNext/>
+            </w:pPr>
+            <w:r>
+              <w:rPr>
+                <w:b/>
+                <w:color w:val="FFFFFF"/>
+                <w:sz w:val="19"/>
+              </w:rPr>
+              <w:t>27-sep</w:t>
+            </w:r>
+          </w:p>
+        </w:tc>
+        <w:tc>
+          <w:tcPr>
+            <w:tcW w:w="3118" w:type="dxa"/>
+            <w:tcBorders>
+              <w:top w:val="single" w:sz="4" w:space="0" w:color="0B2A4A"/>
+              <w:left w:val="single" w:sz="4" w:space="0" w:color="0B2A4A"/>
+              <w:bottom w:val="single" w:sz="4" w:space="0" w:color="0B2A4A"/>
+              <w:right w:val="single" w:sz="4" w:space="0" w:color="0B2A4A"/>
+            </w:tcBorders>
+            <w:shd w:val="clear" w:color="auto" w:fill="0B2A4A"/>
+            <w:tcMar>
+              <w:top w:w="90" w:type="dxa"/>
+              <w:left w:w="130" w:type="dxa"/>
+              <w:bottom w:w="90" w:type="dxa"/>
+              <w:right w:w="130" w:type="dxa"/>
+            </w:tcMar>
+            <w:vAlign w:val="center"/>
+          </w:tcPr>
+          <w:p>
+            <w:pPr>
+              <w:keepNext/>
+            </w:pPr>
+            <w:r>
+              <w:rPr>
+                <w:b/>
+                <w:color w:val="FFFFFF"/>
+                <w:sz w:val="19"/>
+              </w:rPr>
+              <w:t>Qué explica el extremo</w:t>
+            </w:r>
+          </w:p>
+        </w:tc>
+      </w:tr>
+      <w:tr>
+        <w:trPr>
+          <w:cantSplit/>
+          <w:jc w:val="center"/>
+        </w:trPr>
+        <w:tc>
+          <w:tcPr>
+            <w:tcW w:w="1701" w:type="dxa"/>
+            <w:tcBorders>
+              <w:top w:val="single" w:sz="4" w:space="0" w:color="D0D7DE"/>
+              <w:left w:val="single" w:sz="4" w:space="0" w:color="D0D7DE"/>
+              <w:bottom w:val="single" w:sz="4" w:space="0" w:color="D0D7DE"/>
+              <w:right w:val="single" w:sz="4" w:space="0" w:color="D0D7DE"/>
+            </w:tcBorders>
+            <w:shd w:val="clear" w:color="auto" w:fill="FFFFFF"/>
+            <w:tcMar>
+              <w:top w:w="90" w:type="dxa"/>
+              <w:left w:w="130" w:type="dxa"/>
+              <w:bottom w:w="90" w:type="dxa"/>
+              <w:right w:w="130" w:type="dxa"/>
+            </w:tcMar>
+            <w:vAlign w:val="center"/>
+          </w:tcPr>
+          <w:p>
+            <w:pPr>
+              <w:keepNext/>
+              <w:spacing w:after="0"/>
+            </w:pPr>
+            <w:r>
+              <w:rPr>
+                <w:b/>
+                <w:sz w:val="19"/>
+              </w:rPr>
+              <w:t>tempExhaust (Rack C) máx</w:t>
+            </w:r>
+          </w:p>
+        </w:tc>
+        <w:tc>
+          <w:tcPr>
+            <w:tcW w:w="1134" w:type="dxa"/>
+            <w:tcBorders>
+              <w:top w:val="single" w:sz="4" w:space="0" w:color="D0D7DE"/>
+              <w:left w:val="single" w:sz="4" w:space="0" w:color="D0D7DE"/>
+              <w:bottom w:val="single" w:sz="4" w:space="0" w:color="D0D7DE"/>
+              <w:right w:val="single" w:sz="4" w:space="0" w:color="D0D7DE"/>
+            </w:tcBorders>
+            <w:shd w:val="clear" w:color="auto" w:fill="FFFFFF"/>
+            <w:tcMar>
+              <w:top w:w="90" w:type="dxa"/>
+              <w:left w:w="130" w:type="dxa"/>
+              <w:bottom w:w="90" w:type="dxa"/>
+              <w:right w:w="130" w:type="dxa"/>
+            </w:tcMar>
+            <w:vAlign w:val="center"/>
+          </w:tcPr>
+          <w:p>
+            <w:pPr>
+              <w:keepNext/>
+              <w:spacing w:after="0"/>
+            </w:pPr>
+            <w:r>
+              <w:rPr>
+                <w:sz w:val="19"/>
+              </w:rPr>
+              <w:t>34,21</w:t>
+            </w:r>
+          </w:p>
+        </w:tc>
+        <w:tc>
+          <w:tcPr>
+            <w:tcW w:w="1134" w:type="dxa"/>
+            <w:tcBorders>
+              <w:top w:val="single" w:sz="4" w:space="0" w:color="D0D7DE"/>
+              <w:left w:val="single" w:sz="4" w:space="0" w:color="D0D7DE"/>
+              <w:bottom w:val="single" w:sz="4" w:space="0" w:color="D0D7DE"/>
+              <w:right w:val="single" w:sz="4" w:space="0" w:color="D0D7DE"/>
+            </w:tcBorders>
+            <w:shd w:val="clear" w:color="auto" w:fill="FFFFFF"/>
+            <w:tcMar>
+              <w:top w:w="90" w:type="dxa"/>
+              <w:left w:w="130" w:type="dxa"/>
+              <w:bottom w:w="90" w:type="dxa"/>
+              <w:right w:w="130" w:type="dxa"/>
+            </w:tcMar>
+            <w:vAlign w:val="center"/>
+          </w:tcPr>
+          <w:p>
+            <w:pPr>
+              <w:keepNext/>
+              <w:spacing w:after="0"/>
+            </w:pPr>
+            <w:r>
+              <w:rPr>
+                <w:sz w:val="19"/>
+              </w:rPr>
+              <w:t>34,09</w:t>
+            </w:r>
+          </w:p>
+        </w:tc>
+        <w:tc>
+          <w:tcPr>
+            <w:tcW w:w="1134" w:type="dxa"/>
+            <w:tcBorders>
+              <w:top w:val="single" w:sz="4" w:space="0" w:color="D0D7DE"/>
+              <w:left w:val="single" w:sz="4" w:space="0" w:color="D0D7DE"/>
+              <w:bottom w:val="single" w:sz="4" w:space="0" w:color="D0D7DE"/>
+              <w:right w:val="single" w:sz="4" w:space="0" w:color="D0D7DE"/>
+            </w:tcBorders>
+            <w:shd w:val="clear" w:color="auto" w:fill="FFFFFF"/>
+            <w:tcMar>
+              <w:top w:w="90" w:type="dxa"/>
+              <w:left w:w="130" w:type="dxa"/>
+              <w:bottom w:w="90" w:type="dxa"/>
+              <w:right w:w="130" w:type="dxa"/>
+            </w:tcMar>
+            <w:vAlign w:val="center"/>
+          </w:tcPr>
+          <w:p>
+            <w:pPr>
+              <w:keepNext/>
+              <w:spacing w:after="0"/>
+            </w:pPr>
+            <w:r>
+              <w:rPr>
+                <w:sz w:val="19"/>
+              </w:rPr>
+              <w:t>34,23</w:t>
+            </w:r>
+          </w:p>
+        </w:tc>
+        <w:tc>
+          <w:tcPr>
+            <w:tcW w:w="1134" w:type="dxa"/>
+            <w:tcBorders>
+              <w:top w:val="single" w:sz="4" w:space="0" w:color="D0D7DE"/>
+              <w:left w:val="single" w:sz="4" w:space="0" w:color="D0D7DE"/>
+              <w:bottom w:val="single" w:sz="4" w:space="0" w:color="D0D7DE"/>
+              <w:right w:val="single" w:sz="4" w:space="0" w:color="D0D7DE"/>
+            </w:tcBorders>
+            <w:shd w:val="clear" w:color="auto" w:fill="FFFFFF"/>
+            <w:tcMar>
+              <w:top w:w="90" w:type="dxa"/>
+              <w:left w:w="130" w:type="dxa"/>
+              <w:bottom w:w="90" w:type="dxa"/>
+              <w:right w:w="130" w:type="dxa"/>
+            </w:tcMar>
+            <w:vAlign w:val="center"/>
+          </w:tcPr>
+          <w:p>
+            <w:pPr>
+              <w:keepNext/>
+              <w:spacing w:after="0"/>
+            </w:pPr>
+            <w:r>
+              <w:rPr>
+                <w:sz w:val="19"/>
+              </w:rPr>
+              <w:t>34,16</w:t>
+            </w:r>
+          </w:p>
+        </w:tc>
+        <w:tc>
+          <w:tcPr>
+            <w:tcW w:w="3118" w:type="dxa"/>
+            <w:tcBorders>
+              <w:top w:val="single" w:sz="4" w:space="0" w:color="D0D7DE"/>
+              <w:left w:val="single" w:sz="4" w:space="0" w:color="D0D7DE"/>
+              <w:bottom w:val="single" w:sz="4" w:space="0" w:color="D0D7DE"/>
+              <w:right w:val="single" w:sz="4" w:space="0" w:color="D0D7DE"/>
+            </w:tcBorders>
+            <w:shd w:val="clear" w:color="auto" w:fill="FFFFFF"/>
+            <w:tcMar>
+              <w:top w:w="90" w:type="dxa"/>
+              <w:left w:w="130" w:type="dxa"/>
+              <w:bottom w:w="90" w:type="dxa"/>
+              <w:right w:w="130" w:type="dxa"/>
+            </w:tcMar>
+            <w:vAlign w:val="center"/>
+          </w:tcPr>
+          <w:p>
+            <w:pPr>
+              <w:keepNext/>
+              <w:spacing w:after="0"/>
+            </w:pPr>
+            <w:r>
+              <w:rPr>
+                <w:sz w:val="19"/>
+              </w:rPr>
+              <w:t>el máximo se mantiene casi idéntico los cuatro días y siempre por debajo del umbral de 35 °C: la carga IT y la climatización fueron estables. El mínimo (30,6 en 26-sep) es el valle de madrugada; el 27-sep no tiene valle porque la ventana empezó a las 10:28</w:t>
+            </w:r>
+          </w:p>
+        </w:tc>
+      </w:tr>
+      <w:tr>
+        <w:trPr>
+          <w:cantSplit/>
+          <w:jc w:val="center"/>
+        </w:trPr>
+        <w:tc>
+          <w:tcPr>
+            <w:tcW w:w="1701" w:type="dxa"/>
+            <w:tcBorders>
+              <w:top w:val="single" w:sz="4" w:space="0" w:color="D0D7DE"/>
+              <w:left w:val="single" w:sz="4" w:space="0" w:color="D0D7DE"/>
+              <w:bottom w:val="single" w:sz="4" w:space="0" w:color="D0D7DE"/>
+              <w:right w:val="single" w:sz="4" w:space="0" w:color="D0D7DE"/>
+            </w:tcBorders>
+            <w:shd w:val="clear" w:color="auto" w:fill="F4F7FB"/>
+            <w:tcMar>
+              <w:top w:w="90" w:type="dxa"/>
+              <w:left w:w="130" w:type="dxa"/>
+              <w:bottom w:w="90" w:type="dxa"/>
+              <w:right w:w="130" w:type="dxa"/>
+            </w:tcMar>
+            <w:vAlign w:val="center"/>
+          </w:tcPr>
+          <w:p>
+            <w:pPr>
+              <w:keepNext/>
+              <w:spacing w:after="0"/>
+            </w:pPr>
+            <w:r>
+              <w:rPr>
+                <w:b/>
+                <w:sz w:val="19"/>
+              </w:rPr>
+              <w:t>humedadRack máx / mín</w:t>
+            </w:r>
+          </w:p>
+        </w:tc>
+        <w:tc>
+          <w:tcPr>
+            <w:tcW w:w="1134" w:type="dxa"/>
+            <w:tcBorders>
+              <w:top w:val="single" w:sz="4" w:space="0" w:color="D0D7DE"/>
+              <w:left w:val="single" w:sz="4" w:space="0" w:color="D0D7DE"/>
+              <w:bottom w:val="single" w:sz="4" w:space="0" w:color="D0D7DE"/>
+              <w:right w:val="single" w:sz="4" w:space="0" w:color="D0D7DE"/>
+            </w:tcBorders>
+            <w:shd w:val="clear" w:color="auto" w:fill="F4F7FB"/>
+            <w:tcMar>
+              <w:top w:w="90" w:type="dxa"/>
+              <w:left w:w="130" w:type="dxa"/>
+              <w:bottom w:w="90" w:type="dxa"/>
+              <w:right w:w="130" w:type="dxa"/>
+            </w:tcMar>
+            <w:vAlign w:val="center"/>
+          </w:tcPr>
+          <w:p>
+            <w:pPr>
+              <w:keepNext/>
+              <w:spacing w:after="0"/>
+            </w:pPr>
+            <w:r>
+              <w:rPr>
+                <w:sz w:val="19"/>
+              </w:rPr>
+              <w:t>50,97 / 40,59</w:t>
+            </w:r>
+          </w:p>
+        </w:tc>
+        <w:tc>
+          <w:tcPr>
+            <w:tcW w:w="1134" w:type="dxa"/>
+            <w:tcBorders>
+              <w:top w:val="single" w:sz="4" w:space="0" w:color="D0D7DE"/>
+              <w:left w:val="single" w:sz="4" w:space="0" w:color="D0D7DE"/>
+              <w:bottom w:val="single" w:sz="4" w:space="0" w:color="D0D7DE"/>
+              <w:right w:val="single" w:sz="4" w:space="0" w:color="D0D7DE"/>
+            </w:tcBorders>
+            <w:shd w:val="clear" w:color="auto" w:fill="F4F7FB"/>
+            <w:tcMar>
+              <w:top w:w="90" w:type="dxa"/>
+              <w:left w:w="130" w:type="dxa"/>
+              <w:bottom w:w="90" w:type="dxa"/>
+              <w:right w:w="130" w:type="dxa"/>
+            </w:tcMar>
+            <w:vAlign w:val="center"/>
+          </w:tcPr>
+          <w:p>
+            <w:pPr>
+              <w:keepNext/>
+              <w:spacing w:after="0"/>
+            </w:pPr>
+            <w:r>
+              <w:rPr>
+                <w:sz w:val="19"/>
+              </w:rPr>
+              <w:t>48,37 / 39,81</w:t>
+            </w:r>
+          </w:p>
+        </w:tc>
+        <w:tc>
+          <w:tcPr>
+            <w:tcW w:w="1134" w:type="dxa"/>
+            <w:tcBorders>
+              <w:top w:val="single" w:sz="4" w:space="0" w:color="D0D7DE"/>
+              <w:left w:val="single" w:sz="4" w:space="0" w:color="D0D7DE"/>
+              <w:bottom w:val="single" w:sz="4" w:space="0" w:color="D0D7DE"/>
+              <w:right w:val="single" w:sz="4" w:space="0" w:color="D0D7DE"/>
+            </w:tcBorders>
+            <w:shd w:val="clear" w:color="auto" w:fill="F4F7FB"/>
+            <w:tcMar>
+              <w:top w:w="90" w:type="dxa"/>
+              <w:left w:w="130" w:type="dxa"/>
+              <w:bottom w:w="90" w:type="dxa"/>
+              <w:right w:w="130" w:type="dxa"/>
+            </w:tcMar>
+            <w:vAlign w:val="center"/>
+          </w:tcPr>
+          <w:p>
+            <w:pPr>
+              <w:keepNext/>
+              <w:spacing w:after="0"/>
+            </w:pPr>
+            <w:r>
+              <w:rPr>
+                <w:sz w:val="19"/>
+              </w:rPr>
+              <w:t>54,17 / 40,69</w:t>
+            </w:r>
+          </w:p>
+        </w:tc>
+        <w:tc>
+          <w:tcPr>
+            <w:tcW w:w="1134" w:type="dxa"/>
+            <w:tcBorders>
+              <w:top w:val="single" w:sz="4" w:space="0" w:color="D0D7DE"/>
+              <w:left w:val="single" w:sz="4" w:space="0" w:color="D0D7DE"/>
+              <w:bottom w:val="single" w:sz="4" w:space="0" w:color="D0D7DE"/>
+              <w:right w:val="single" w:sz="4" w:space="0" w:color="D0D7DE"/>
+            </w:tcBorders>
+            <w:shd w:val="clear" w:color="auto" w:fill="F4F7FB"/>
+            <w:tcMar>
+              <w:top w:w="90" w:type="dxa"/>
+              <w:left w:w="130" w:type="dxa"/>
+              <w:bottom w:w="90" w:type="dxa"/>
+              <w:right w:w="130" w:type="dxa"/>
+            </w:tcMar>
+            <w:vAlign w:val="center"/>
+          </w:tcPr>
+          <w:p>
+            <w:pPr>
+              <w:keepNext/>
+              <w:spacing w:after="0"/>
+            </w:pPr>
+            <w:r>
+              <w:rPr>
+                <w:sz w:val="19"/>
+              </w:rPr>
+              <w:t>54,03 / 47,49</w:t>
+            </w:r>
+          </w:p>
+        </w:tc>
+        <w:tc>
+          <w:tcPr>
+            <w:tcW w:w="3118" w:type="dxa"/>
+            <w:tcBorders>
+              <w:top w:val="single" w:sz="4" w:space="0" w:color="D0D7DE"/>
+              <w:left w:val="single" w:sz="4" w:space="0" w:color="D0D7DE"/>
+              <w:bottom w:val="single" w:sz="4" w:space="0" w:color="D0D7DE"/>
+              <w:right w:val="single" w:sz="4" w:space="0" w:color="D0D7DE"/>
+            </w:tcBorders>
+            <w:shd w:val="clear" w:color="auto" w:fill="F4F7FB"/>
+            <w:tcMar>
+              <w:top w:w="90" w:type="dxa"/>
+              <w:left w:w="130" w:type="dxa"/>
+              <w:bottom w:w="90" w:type="dxa"/>
+              <w:right w:w="130" w:type="dxa"/>
+            </w:tcMar>
+            <w:vAlign w:val="center"/>
+          </w:tcPr>
+          <w:p>
+            <w:pPr>
+              <w:keepNext/>
+              <w:spacing w:after="0"/>
+            </w:pPr>
+            <w:r>
+              <w:rPr>
+                <w:sz w:val="19"/>
+              </w:rPr>
+              <w:t>todo el rango se mantiene dentro de la banda 40-60 %HR recomendada. El máximo más alto (26-sep) coincide con el día más lluvioso: la humedad exterior entró a la sala</w:t>
+            </w:r>
+          </w:p>
+        </w:tc>
+      </w:tr>
+      <w:tr>
+        <w:trPr>
+          <w:cantSplit/>
+          <w:jc w:val="center"/>
+        </w:trPr>
+        <w:tc>
+          <w:tcPr>
+            <w:tcW w:w="1701" w:type="dxa"/>
+            <w:tcBorders>
+              <w:top w:val="single" w:sz="4" w:space="0" w:color="D0D7DE"/>
+              <w:left w:val="single" w:sz="4" w:space="0" w:color="D0D7DE"/>
+              <w:bottom w:val="single" w:sz="4" w:space="0" w:color="D0D7DE"/>
+              <w:right w:val="single" w:sz="4" w:space="0" w:color="D0D7DE"/>
+            </w:tcBorders>
+            <w:shd w:val="clear" w:color="auto" w:fill="FFFFFF"/>
+            <w:tcMar>
+              <w:top w:w="90" w:type="dxa"/>
+              <w:left w:w="130" w:type="dxa"/>
+              <w:bottom w:w="90" w:type="dxa"/>
+              <w:right w:w="130" w:type="dxa"/>
+            </w:tcMar>
+            <w:vAlign w:val="center"/>
+          </w:tcPr>
+          <w:p>
+            <w:pPr>
+              <w:keepNext/>
+              <w:spacing w:after="0"/>
+            </w:pPr>
+            <w:r>
+              <w:rPr>
+                <w:b/>
+                <w:sz w:val="19"/>
+              </w:rPr>
+              <w:t>deltaPresionPa mín</w:t>
+            </w:r>
+          </w:p>
+        </w:tc>
+        <w:tc>
+          <w:tcPr>
+            <w:tcW w:w="1134" w:type="dxa"/>
+            <w:tcBorders>
+              <w:top w:val="single" w:sz="4" w:space="0" w:color="D0D7DE"/>
+              <w:left w:val="single" w:sz="4" w:space="0" w:color="D0D7DE"/>
+              <w:bottom w:val="single" w:sz="4" w:space="0" w:color="D0D7DE"/>
+              <w:right w:val="single" w:sz="4" w:space="0" w:color="D0D7DE"/>
+            </w:tcBorders>
+            <w:shd w:val="clear" w:color="auto" w:fill="FFFFFF"/>
+            <w:tcMar>
+              <w:top w:w="90" w:type="dxa"/>
+              <w:left w:w="130" w:type="dxa"/>
+              <w:bottom w:w="90" w:type="dxa"/>
+              <w:right w:w="130" w:type="dxa"/>
+            </w:tcMar>
+            <w:vAlign w:val="center"/>
+          </w:tcPr>
+          <w:p>
+            <w:pPr>
+              <w:keepNext/>
+              <w:spacing w:after="0"/>
+            </w:pPr>
+            <w:r>
+              <w:rPr>
+                <w:sz w:val="19"/>
+              </w:rPr>
+              <w:t>16,40</w:t>
+            </w:r>
+          </w:p>
+        </w:tc>
+        <w:tc>
+          <w:tcPr>
+            <w:tcW w:w="1134" w:type="dxa"/>
+            <w:tcBorders>
+              <w:top w:val="single" w:sz="4" w:space="0" w:color="D0D7DE"/>
+              <w:left w:val="single" w:sz="4" w:space="0" w:color="D0D7DE"/>
+              <w:bottom w:val="single" w:sz="4" w:space="0" w:color="D0D7DE"/>
+              <w:right w:val="single" w:sz="4" w:space="0" w:color="D0D7DE"/>
+            </w:tcBorders>
+            <w:shd w:val="clear" w:color="auto" w:fill="FFFFFF"/>
+            <w:tcMar>
+              <w:top w:w="90" w:type="dxa"/>
+              <w:left w:w="130" w:type="dxa"/>
+              <w:bottom w:w="90" w:type="dxa"/>
+              <w:right w:w="130" w:type="dxa"/>
+            </w:tcMar>
+            <w:vAlign w:val="center"/>
+          </w:tcPr>
+          <w:p>
+            <w:pPr>
+              <w:keepNext/>
+              <w:spacing w:after="0"/>
+            </w:pPr>
+            <w:r>
+              <w:rPr>
+                <w:sz w:val="19"/>
+              </w:rPr>
+              <w:t>15,40</w:t>
+            </w:r>
+          </w:p>
+        </w:tc>
+        <w:tc>
+          <w:tcPr>
+            <w:tcW w:w="1134" w:type="dxa"/>
+            <w:tcBorders>
+              <w:top w:val="single" w:sz="4" w:space="0" w:color="D0D7DE"/>
+              <w:left w:val="single" w:sz="4" w:space="0" w:color="D0D7DE"/>
+              <w:bottom w:val="single" w:sz="4" w:space="0" w:color="D0D7DE"/>
+              <w:right w:val="single" w:sz="4" w:space="0" w:color="D0D7DE"/>
+            </w:tcBorders>
+            <w:shd w:val="clear" w:color="auto" w:fill="FFFFFF"/>
+            <w:tcMar>
+              <w:top w:w="90" w:type="dxa"/>
+              <w:left w:w="130" w:type="dxa"/>
+              <w:bottom w:w="90" w:type="dxa"/>
+              <w:right w:w="130" w:type="dxa"/>
+            </w:tcMar>
+            <w:vAlign w:val="center"/>
+          </w:tcPr>
+          <w:p>
+            <w:pPr>
+              <w:keepNext/>
+              <w:spacing w:after="0"/>
+            </w:pPr>
+            <w:r>
+              <w:rPr>
+                <w:sz w:val="19"/>
+              </w:rPr>
+              <w:t>14,90</w:t>
+            </w:r>
+          </w:p>
+        </w:tc>
+        <w:tc>
+          <w:tcPr>
+            <w:tcW w:w="1134" w:type="dxa"/>
+            <w:tcBorders>
+              <w:top w:val="single" w:sz="4" w:space="0" w:color="D0D7DE"/>
+              <w:left w:val="single" w:sz="4" w:space="0" w:color="D0D7DE"/>
+              <w:bottom w:val="single" w:sz="4" w:space="0" w:color="D0D7DE"/>
+              <w:right w:val="single" w:sz="4" w:space="0" w:color="D0D7DE"/>
+            </w:tcBorders>
+            <w:shd w:val="clear" w:color="auto" w:fill="FFFFFF"/>
+            <w:tcMar>
+              <w:top w:w="90" w:type="dxa"/>
+              <w:left w:w="130" w:type="dxa"/>
+              <w:bottom w:w="90" w:type="dxa"/>
+              <w:right w:w="130" w:type="dxa"/>
+            </w:tcMar>
+            <w:vAlign w:val="center"/>
+          </w:tcPr>
+          <w:p>
+            <w:pPr>
+              <w:keepNext/>
+              <w:spacing w:after="0"/>
+            </w:pPr>
+            <w:r>
+              <w:rPr>
+                <w:sz w:val="19"/>
+              </w:rPr>
+              <w:t>16,60</w:t>
+            </w:r>
+          </w:p>
+        </w:tc>
+        <w:tc>
+          <w:tcPr>
+            <w:tcW w:w="3118" w:type="dxa"/>
+            <w:tcBorders>
+              <w:top w:val="single" w:sz="4" w:space="0" w:color="D0D7DE"/>
+              <w:left w:val="single" w:sz="4" w:space="0" w:color="D0D7DE"/>
+              <w:bottom w:val="single" w:sz="4" w:space="0" w:color="D0D7DE"/>
+              <w:right w:val="single" w:sz="4" w:space="0" w:color="D0D7DE"/>
+            </w:tcBorders>
+            <w:shd w:val="clear" w:color="auto" w:fill="FFFFFF"/>
+            <w:tcMar>
+              <w:top w:w="90" w:type="dxa"/>
+              <w:left w:w="130" w:type="dxa"/>
+              <w:bottom w:w="90" w:type="dxa"/>
+              <w:right w:w="130" w:type="dxa"/>
+            </w:tcMar>
+            <w:vAlign w:val="center"/>
+          </w:tcPr>
+          <w:p>
+            <w:pPr>
+              <w:keepNext/>
+              <w:spacing w:after="0"/>
+            </w:pPr>
+            <w:r>
+              <w:rPr>
+                <w:sz w:val="19"/>
+              </w:rPr>
+              <w:t>la presión diferencial nunca se acercó al umbral de 5 Pa con el que se perdería la contención del pasillo frío. El valor más bajo (26-sep) es el mismo día con más tránsito: la apertura de puertas es lo que la baja</w:t>
+            </w:r>
+          </w:p>
+        </w:tc>
+      </w:tr>
+      <w:tr>
+        <w:trPr>
+          <w:cantSplit/>
+          <w:jc w:val="center"/>
+        </w:trPr>
+        <w:tc>
+          <w:tcPr>
+            <w:tcW w:w="1701" w:type="dxa"/>
+            <w:tcBorders>
+              <w:top w:val="single" w:sz="4" w:space="0" w:color="D0D7DE"/>
+              <w:left w:val="single" w:sz="4" w:space="0" w:color="D0D7DE"/>
+              <w:bottom w:val="single" w:sz="4" w:space="0" w:color="D0D7DE"/>
+              <w:right w:val="single" w:sz="4" w:space="0" w:color="D0D7DE"/>
+            </w:tcBorders>
+            <w:shd w:val="clear" w:color="auto" w:fill="F4F7FB"/>
+            <w:tcMar>
+              <w:top w:w="90" w:type="dxa"/>
+              <w:left w:w="130" w:type="dxa"/>
+              <w:bottom w:w="90" w:type="dxa"/>
+              <w:right w:w="130" w:type="dxa"/>
+            </w:tcMar>
+            <w:vAlign w:val="center"/>
+          </w:tcPr>
+          <w:p>
+            <w:pPr>
+              <w:keepNext/>
+              <w:spacing w:after="0"/>
+            </w:pPr>
+            <w:r>
+              <w:rPr>
+                <w:b/>
+                <w:sz w:val="19"/>
+              </w:rPr>
+              <w:t>tempExterior máx</w:t>
+            </w:r>
+          </w:p>
+        </w:tc>
+        <w:tc>
+          <w:tcPr>
+            <w:tcW w:w="1134" w:type="dxa"/>
+            <w:tcBorders>
+              <w:top w:val="single" w:sz="4" w:space="0" w:color="D0D7DE"/>
+              <w:left w:val="single" w:sz="4" w:space="0" w:color="D0D7DE"/>
+              <w:bottom w:val="single" w:sz="4" w:space="0" w:color="D0D7DE"/>
+              <w:right w:val="single" w:sz="4" w:space="0" w:color="D0D7DE"/>
+            </w:tcBorders>
+            <w:shd w:val="clear" w:color="auto" w:fill="F4F7FB"/>
+            <w:tcMar>
+              <w:top w:w="90" w:type="dxa"/>
+              <w:left w:w="130" w:type="dxa"/>
+              <w:bottom w:w="90" w:type="dxa"/>
+              <w:right w:w="130" w:type="dxa"/>
+            </w:tcMar>
+            <w:vAlign w:val="center"/>
+          </w:tcPr>
+          <w:p>
+            <w:pPr>
+              <w:keepNext/>
+              <w:spacing w:after="0"/>
+            </w:pPr>
+            <w:r>
+              <w:rPr>
+                <w:sz w:val="19"/>
+              </w:rPr>
+              <w:t>26,30</w:t>
+            </w:r>
+          </w:p>
+        </w:tc>
+        <w:tc>
+          <w:tcPr>
+            <w:tcW w:w="1134" w:type="dxa"/>
+            <w:tcBorders>
+              <w:top w:val="single" w:sz="4" w:space="0" w:color="D0D7DE"/>
+              <w:left w:val="single" w:sz="4" w:space="0" w:color="D0D7DE"/>
+              <w:bottom w:val="single" w:sz="4" w:space="0" w:color="D0D7DE"/>
+              <w:right w:val="single" w:sz="4" w:space="0" w:color="D0D7DE"/>
+            </w:tcBorders>
+            <w:shd w:val="clear" w:color="auto" w:fill="F4F7FB"/>
+            <w:tcMar>
+              <w:top w:w="90" w:type="dxa"/>
+              <w:left w:w="130" w:type="dxa"/>
+              <w:bottom w:w="90" w:type="dxa"/>
+              <w:right w:w="130" w:type="dxa"/>
+            </w:tcMar>
+            <w:vAlign w:val="center"/>
+          </w:tcPr>
+          <w:p>
+            <w:pPr>
+              <w:keepNext/>
+              <w:spacing w:after="0"/>
+            </w:pPr>
+            <w:r>
+              <w:rPr>
+                <w:sz w:val="19"/>
+              </w:rPr>
+              <w:t>25,30</w:t>
+            </w:r>
+          </w:p>
+        </w:tc>
+        <w:tc>
+          <w:tcPr>
+            <w:tcW w:w="1134" w:type="dxa"/>
+            <w:tcBorders>
+              <w:top w:val="single" w:sz="4" w:space="0" w:color="D0D7DE"/>
+              <w:left w:val="single" w:sz="4" w:space="0" w:color="D0D7DE"/>
+              <w:bottom w:val="single" w:sz="4" w:space="0" w:color="D0D7DE"/>
+              <w:right w:val="single" w:sz="4" w:space="0" w:color="D0D7DE"/>
+            </w:tcBorders>
+            <w:shd w:val="clear" w:color="auto" w:fill="F4F7FB"/>
+            <w:tcMar>
+              <w:top w:w="90" w:type="dxa"/>
+              <w:left w:w="130" w:type="dxa"/>
+              <w:bottom w:w="90" w:type="dxa"/>
+              <w:right w:w="130" w:type="dxa"/>
+            </w:tcMar>
+            <w:vAlign w:val="center"/>
+          </w:tcPr>
+          <w:p>
+            <w:pPr>
+              <w:keepNext/>
+              <w:spacing w:after="0"/>
+            </w:pPr>
+            <w:r>
+              <w:rPr>
+                <w:sz w:val="19"/>
+              </w:rPr>
+              <w:t>26,10</w:t>
+            </w:r>
+          </w:p>
+        </w:tc>
+        <w:tc>
+          <w:tcPr>
+            <w:tcW w:w="1134" w:type="dxa"/>
+            <w:tcBorders>
+              <w:top w:val="single" w:sz="4" w:space="0" w:color="D0D7DE"/>
+              <w:left w:val="single" w:sz="4" w:space="0" w:color="D0D7DE"/>
+              <w:bottom w:val="single" w:sz="4" w:space="0" w:color="D0D7DE"/>
+              <w:right w:val="single" w:sz="4" w:space="0" w:color="D0D7DE"/>
+            </w:tcBorders>
+            <w:shd w:val="clear" w:color="auto" w:fill="F4F7FB"/>
+            <w:tcMar>
+              <w:top w:w="90" w:type="dxa"/>
+              <w:left w:w="130" w:type="dxa"/>
+              <w:bottom w:w="90" w:type="dxa"/>
+              <w:right w:w="130" w:type="dxa"/>
+            </w:tcMar>
+            <w:vAlign w:val="center"/>
+          </w:tcPr>
+          <w:p>
+            <w:pPr>
+              <w:keepNext/>
+              <w:spacing w:after="0"/>
+            </w:pPr>
+            <w:r>
+              <w:rPr>
+                <w:sz w:val="19"/>
+              </w:rPr>
+              <w:t>24,90</w:t>
+            </w:r>
+          </w:p>
+        </w:tc>
+        <w:tc>
+          <w:tcPr>
+            <w:tcW w:w="3118" w:type="dxa"/>
+            <w:tcBorders>
+              <w:top w:val="single" w:sz="4" w:space="0" w:color="D0D7DE"/>
+              <w:left w:val="single" w:sz="4" w:space="0" w:color="D0D7DE"/>
+              <w:bottom w:val="single" w:sz="4" w:space="0" w:color="D0D7DE"/>
+              <w:right w:val="single" w:sz="4" w:space="0" w:color="D0D7DE"/>
+            </w:tcBorders>
+            <w:shd w:val="clear" w:color="auto" w:fill="F4F7FB"/>
+            <w:tcMar>
+              <w:top w:w="90" w:type="dxa"/>
+              <w:left w:w="130" w:type="dxa"/>
+              <w:bottom w:w="90" w:type="dxa"/>
+              <w:right w:w="130" w:type="dxa"/>
+            </w:tcMar>
+            <w:vAlign w:val="center"/>
+          </w:tcPr>
+          <w:p>
+            <w:pPr>
+              <w:keepNext/>
+              <w:spacing w:after="0"/>
+            </w:pPr>
+            <w:r>
+              <w:rPr>
+                <w:sz w:val="19"/>
+              </w:rPr>
+              <w:t>define las horas sin free-cooling: cuanto más alta, más rato tiene que trabajar el chiller. El 26-sep combina la temperatura más alta con la radiación solar mayor, así que fue el día con menos enfriamiento gratuito</w:t>
+            </w:r>
+          </w:p>
+        </w:tc>
+      </w:tr>
+      <w:tr>
+        <w:trPr>
+          <w:cantSplit/>
+          <w:jc w:val="center"/>
+        </w:trPr>
+        <w:tc>
+          <w:tcPr>
+            <w:tcW w:w="1701" w:type="dxa"/>
+            <w:tcBorders>
+              <w:top w:val="single" w:sz="4" w:space="0" w:color="D0D7DE"/>
+              <w:left w:val="single" w:sz="4" w:space="0" w:color="D0D7DE"/>
+              <w:bottom w:val="single" w:sz="4" w:space="0" w:color="D0D7DE"/>
+              <w:right w:val="single" w:sz="4" w:space="0" w:color="D0D7DE"/>
+            </w:tcBorders>
+            <w:shd w:val="clear" w:color="auto" w:fill="FFFFFF"/>
+            <w:tcMar>
+              <w:top w:w="90" w:type="dxa"/>
+              <w:left w:w="130" w:type="dxa"/>
+              <w:bottom w:w="90" w:type="dxa"/>
+              <w:right w:w="130" w:type="dxa"/>
+            </w:tcMar>
+            <w:vAlign w:val="center"/>
+          </w:tcPr>
+          <w:p>
+            <w:pPr>
+              <w:keepNext/>
+              <w:spacing w:after="0"/>
+            </w:pPr>
+            <w:r>
+              <w:rPr>
+                <w:b/>
+                <w:sz w:val="19"/>
+              </w:rPr>
+              <w:t>pm25 máx</w:t>
+            </w:r>
+          </w:p>
+        </w:tc>
+        <w:tc>
+          <w:tcPr>
+            <w:tcW w:w="1134" w:type="dxa"/>
+            <w:tcBorders>
+              <w:top w:val="single" w:sz="4" w:space="0" w:color="D0D7DE"/>
+              <w:left w:val="single" w:sz="4" w:space="0" w:color="D0D7DE"/>
+              <w:bottom w:val="single" w:sz="4" w:space="0" w:color="D0D7DE"/>
+              <w:right w:val="single" w:sz="4" w:space="0" w:color="D0D7DE"/>
+            </w:tcBorders>
+            <w:shd w:val="clear" w:color="auto" w:fill="FFFFFF"/>
+            <w:tcMar>
+              <w:top w:w="90" w:type="dxa"/>
+              <w:left w:w="130" w:type="dxa"/>
+              <w:bottom w:w="90" w:type="dxa"/>
+              <w:right w:w="130" w:type="dxa"/>
+            </w:tcMar>
+            <w:vAlign w:val="center"/>
+          </w:tcPr>
+          <w:p>
+            <w:pPr>
+              <w:keepNext/>
+              <w:spacing w:after="0"/>
+            </w:pPr>
+            <w:r>
+              <w:rPr>
+                <w:sz w:val="19"/>
+              </w:rPr>
+              <w:t>17,10</w:t>
+            </w:r>
+          </w:p>
+        </w:tc>
+        <w:tc>
+          <w:tcPr>
+            <w:tcW w:w="1134" w:type="dxa"/>
+            <w:tcBorders>
+              <w:top w:val="single" w:sz="4" w:space="0" w:color="D0D7DE"/>
+              <w:left w:val="single" w:sz="4" w:space="0" w:color="D0D7DE"/>
+              <w:bottom w:val="single" w:sz="4" w:space="0" w:color="D0D7DE"/>
+              <w:right w:val="single" w:sz="4" w:space="0" w:color="D0D7DE"/>
+            </w:tcBorders>
+            <w:shd w:val="clear" w:color="auto" w:fill="FFFFFF"/>
+            <w:tcMar>
+              <w:top w:w="90" w:type="dxa"/>
+              <w:left w:w="130" w:type="dxa"/>
+              <w:bottom w:w="90" w:type="dxa"/>
+              <w:right w:w="130" w:type="dxa"/>
+            </w:tcMar>
+            <w:vAlign w:val="center"/>
+          </w:tcPr>
+          <w:p>
+            <w:pPr>
+              <w:keepNext/>
+              <w:spacing w:after="0"/>
+            </w:pPr>
+            <w:r>
+              <w:rPr>
+                <w:sz w:val="19"/>
+              </w:rPr>
+              <w:t>29,30</w:t>
+            </w:r>
+          </w:p>
+        </w:tc>
+        <w:tc>
+          <w:tcPr>
+            <w:tcW w:w="1134" w:type="dxa"/>
+            <w:tcBorders>
+              <w:top w:val="single" w:sz="4" w:space="0" w:color="D0D7DE"/>
+              <w:left w:val="single" w:sz="4" w:space="0" w:color="D0D7DE"/>
+              <w:bottom w:val="single" w:sz="4" w:space="0" w:color="D0D7DE"/>
+              <w:right w:val="single" w:sz="4" w:space="0" w:color="D0D7DE"/>
+            </w:tcBorders>
+            <w:shd w:val="clear" w:color="auto" w:fill="FFFFFF"/>
+            <w:tcMar>
+              <w:top w:w="90" w:type="dxa"/>
+              <w:left w:w="130" w:type="dxa"/>
+              <w:bottom w:w="90" w:type="dxa"/>
+              <w:right w:w="130" w:type="dxa"/>
+            </w:tcMar>
+            <w:vAlign w:val="center"/>
+          </w:tcPr>
+          <w:p>
+            <w:pPr>
+              <w:keepNext/>
+              <w:spacing w:after="0"/>
+            </w:pPr>
+            <w:r>
+              <w:rPr>
+                <w:sz w:val="19"/>
+              </w:rPr>
+              <w:t>21,90</w:t>
+            </w:r>
+          </w:p>
+        </w:tc>
+        <w:tc>
+          <w:tcPr>
+            <w:tcW w:w="1134" w:type="dxa"/>
+            <w:tcBorders>
+              <w:top w:val="single" w:sz="4" w:space="0" w:color="D0D7DE"/>
+              <w:left w:val="single" w:sz="4" w:space="0" w:color="D0D7DE"/>
+              <w:bottom w:val="single" w:sz="4" w:space="0" w:color="D0D7DE"/>
+              <w:right w:val="single" w:sz="4" w:space="0" w:color="D0D7DE"/>
+            </w:tcBorders>
+            <w:shd w:val="clear" w:color="auto" w:fill="FFFFFF"/>
+            <w:tcMar>
+              <w:top w:w="90" w:type="dxa"/>
+              <w:left w:w="130" w:type="dxa"/>
+              <w:bottom w:w="90" w:type="dxa"/>
+              <w:right w:w="130" w:type="dxa"/>
+            </w:tcMar>
+            <w:vAlign w:val="center"/>
+          </w:tcPr>
+          <w:p>
+            <w:pPr>
+              <w:keepNext/>
+              <w:spacing w:after="0"/>
+            </w:pPr>
+            <w:r>
+              <w:rPr>
+                <w:sz w:val="19"/>
+              </w:rPr>
+              <w:t>6,70</w:t>
+            </w:r>
+          </w:p>
+        </w:tc>
+        <w:tc>
+          <w:tcPr>
+            <w:tcW w:w="3118" w:type="dxa"/>
+            <w:tcBorders>
+              <w:top w:val="single" w:sz="4" w:space="0" w:color="D0D7DE"/>
+              <w:left w:val="single" w:sz="4" w:space="0" w:color="D0D7DE"/>
+              <w:bottom w:val="single" w:sz="4" w:space="0" w:color="D0D7DE"/>
+              <w:right w:val="single" w:sz="4" w:space="0" w:color="D0D7DE"/>
+            </w:tcBorders>
+            <w:shd w:val="clear" w:color="auto" w:fill="FFFFFF"/>
+            <w:tcMar>
+              <w:top w:w="90" w:type="dxa"/>
+              <w:left w:w="130" w:type="dxa"/>
+              <w:bottom w:w="90" w:type="dxa"/>
+              <w:right w:w="130" w:type="dxa"/>
+            </w:tcMar>
+            <w:vAlign w:val="center"/>
+          </w:tcPr>
+          <w:p>
+            <w:pPr>
+              <w:keepNext/>
+              <w:spacing w:after="0"/>
+            </w:pPr>
+            <w:r>
+              <w:rPr>
+                <w:sz w:val="19"/>
+              </w:rPr>
+              <w:t>el 25-sep fue el peor día de aire (29,3 µg/m³, cerca de la guía de 24 h de la OMS) pero sin llegar al umbral de 35; el 27-sep fue el más limpio, coherente con la lluvia de días anteriores</w:t>
+            </w:r>
+          </w:p>
+        </w:tc>
+      </w:tr>
+      <w:tr>
+        <w:trPr>
+          <w:cantSplit/>
+          <w:jc w:val="center"/>
+        </w:trPr>
+        <w:tc>
+          <w:tcPr>
+            <w:tcW w:w="1701" w:type="dxa"/>
+            <w:tcBorders>
+              <w:top w:val="single" w:sz="4" w:space="0" w:color="D0D7DE"/>
+              <w:left w:val="single" w:sz="4" w:space="0" w:color="D0D7DE"/>
+              <w:bottom w:val="single" w:sz="4" w:space="0" w:color="D0D7DE"/>
+              <w:right w:val="single" w:sz="4" w:space="0" w:color="D0D7DE"/>
+            </w:tcBorders>
+            <w:shd w:val="clear" w:color="auto" w:fill="F4F7FB"/>
+            <w:tcMar>
+              <w:top w:w="90" w:type="dxa"/>
+              <w:left w:w="130" w:type="dxa"/>
+              <w:bottom w:w="90" w:type="dxa"/>
+              <w:right w:w="130" w:type="dxa"/>
+            </w:tcMar>
+            <w:vAlign w:val="center"/>
+          </w:tcPr>
+          <w:p>
+            <w:pPr>
+              <w:keepNext/>
+              <w:spacing w:after="0"/>
+            </w:pPr>
+            <w:r>
+              <w:rPr>
+                <w:b/>
+                <w:sz w:val="19"/>
+              </w:rPr>
+              <w:t>humo máx</w:t>
+            </w:r>
+          </w:p>
+        </w:tc>
+        <w:tc>
+          <w:tcPr>
+            <w:tcW w:w="1134" w:type="dxa"/>
+            <w:tcBorders>
+              <w:top w:val="single" w:sz="4" w:space="0" w:color="D0D7DE"/>
+              <w:left w:val="single" w:sz="4" w:space="0" w:color="D0D7DE"/>
+              <w:bottom w:val="single" w:sz="4" w:space="0" w:color="D0D7DE"/>
+              <w:right w:val="single" w:sz="4" w:space="0" w:color="D0D7DE"/>
+            </w:tcBorders>
+            <w:shd w:val="clear" w:color="auto" w:fill="F4F7FB"/>
+            <w:tcMar>
+              <w:top w:w="90" w:type="dxa"/>
+              <w:left w:w="130" w:type="dxa"/>
+              <w:bottom w:w="90" w:type="dxa"/>
+              <w:right w:w="130" w:type="dxa"/>
+            </w:tcMar>
+            <w:vAlign w:val="center"/>
+          </w:tcPr>
+          <w:p>
+            <w:pPr>
+              <w:keepNext/>
+              <w:spacing w:after="0"/>
+            </w:pPr>
+            <w:r>
+              <w:rPr>
+                <w:sz w:val="19"/>
+              </w:rPr>
+              <w:t>0,02</w:t>
+            </w:r>
+          </w:p>
+        </w:tc>
+        <w:tc>
+          <w:tcPr>
+            <w:tcW w:w="1134" w:type="dxa"/>
+            <w:tcBorders>
+              <w:top w:val="single" w:sz="4" w:space="0" w:color="D0D7DE"/>
+              <w:left w:val="single" w:sz="4" w:space="0" w:color="D0D7DE"/>
+              <w:bottom w:val="single" w:sz="4" w:space="0" w:color="D0D7DE"/>
+              <w:right w:val="single" w:sz="4" w:space="0" w:color="D0D7DE"/>
+            </w:tcBorders>
+            <w:shd w:val="clear" w:color="auto" w:fill="F4F7FB"/>
+            <w:tcMar>
+              <w:top w:w="90" w:type="dxa"/>
+              <w:left w:w="130" w:type="dxa"/>
+              <w:bottom w:w="90" w:type="dxa"/>
+              <w:right w:w="130" w:type="dxa"/>
+            </w:tcMar>
+            <w:vAlign w:val="center"/>
+          </w:tcPr>
+          <w:p>
+            <w:pPr>
+              <w:keepNext/>
+              <w:spacing w:after="0"/>
+            </w:pPr>
+            <w:r>
+              <w:rPr>
+                <w:sz w:val="19"/>
+              </w:rPr>
+              <w:t>0,03</w:t>
+            </w:r>
+          </w:p>
+        </w:tc>
+        <w:tc>
+          <w:tcPr>
+            <w:tcW w:w="1134" w:type="dxa"/>
+            <w:tcBorders>
+              <w:top w:val="single" w:sz="4" w:space="0" w:color="D0D7DE"/>
+              <w:left w:val="single" w:sz="4" w:space="0" w:color="D0D7DE"/>
+              <w:bottom w:val="single" w:sz="4" w:space="0" w:color="D0D7DE"/>
+              <w:right w:val="single" w:sz="4" w:space="0" w:color="D0D7DE"/>
+            </w:tcBorders>
+            <w:shd w:val="clear" w:color="auto" w:fill="F4F7FB"/>
+            <w:tcMar>
+              <w:top w:w="90" w:type="dxa"/>
+              <w:left w:w="130" w:type="dxa"/>
+              <w:bottom w:w="90" w:type="dxa"/>
+              <w:right w:w="130" w:type="dxa"/>
+            </w:tcMar>
+            <w:vAlign w:val="center"/>
+          </w:tcPr>
+          <w:p>
+            <w:pPr>
+              <w:keepNext/>
+              <w:spacing w:after="0"/>
+            </w:pPr>
+            <w:r>
+              <w:rPr>
+                <w:sz w:val="19"/>
+              </w:rPr>
+              <w:t>0,10</w:t>
+            </w:r>
+          </w:p>
+        </w:tc>
+        <w:tc>
+          <w:tcPr>
+            <w:tcW w:w="1134" w:type="dxa"/>
+            <w:tcBorders>
+              <w:top w:val="single" w:sz="4" w:space="0" w:color="D0D7DE"/>
+              <w:left w:val="single" w:sz="4" w:space="0" w:color="D0D7DE"/>
+              <w:bottom w:val="single" w:sz="4" w:space="0" w:color="D0D7DE"/>
+              <w:right w:val="single" w:sz="4" w:space="0" w:color="D0D7DE"/>
+            </w:tcBorders>
+            <w:shd w:val="clear" w:color="auto" w:fill="F4F7FB"/>
+            <w:tcMar>
+              <w:top w:w="90" w:type="dxa"/>
+              <w:left w:w="130" w:type="dxa"/>
+              <w:bottom w:w="90" w:type="dxa"/>
+              <w:right w:w="130" w:type="dxa"/>
+            </w:tcMar>
+            <w:vAlign w:val="center"/>
+          </w:tcPr>
+          <w:p>
+            <w:pPr>
+              <w:keepNext/>
+              <w:spacing w:after="0"/>
+            </w:pPr>
+            <w:r>
+              <w:rPr>
+                <w:sz w:val="19"/>
+              </w:rPr>
+              <w:t>0,03</w:t>
+            </w:r>
+          </w:p>
+        </w:tc>
+        <w:tc>
+          <w:tcPr>
+            <w:tcW w:w="3118" w:type="dxa"/>
+            <w:tcBorders>
+              <w:top w:val="single" w:sz="4" w:space="0" w:color="D0D7DE"/>
+              <w:left w:val="single" w:sz="4" w:space="0" w:color="D0D7DE"/>
+              <w:bottom w:val="single" w:sz="4" w:space="0" w:color="D0D7DE"/>
+              <w:right w:val="single" w:sz="4" w:space="0" w:color="D0D7DE"/>
+            </w:tcBorders>
+            <w:shd w:val="clear" w:color="auto" w:fill="F4F7FB"/>
+            <w:tcMar>
+              <w:top w:w="90" w:type="dxa"/>
+              <w:left w:w="130" w:type="dxa"/>
+              <w:bottom w:w="90" w:type="dxa"/>
+              <w:right w:w="130" w:type="dxa"/>
+            </w:tcMar>
+            <w:vAlign w:val="center"/>
+          </w:tcPr>
+          <w:p>
+            <w:pPr>
+              <w:keepNext/>
+              <w:spacing w:after="0"/>
+            </w:pPr>
+            <w:r>
+              <w:rPr>
+                <w:sz w:val="19"/>
+              </w:rPr>
+              <w:t>la línea base es 0,02. El pico de 0,10 del 26-sep es el único valor que supera el umbral de la regla (0,08): es el evento que justifica tener la regla de humo configurada</w:t>
+            </w:r>
+          </w:p>
+        </w:tc>
+      </w:tr>
+      <w:tr>
+        <w:trPr>
+          <w:cantSplit/>
+          <w:jc w:val="center"/>
+        </w:trPr>
+        <w:tc>
+          <w:tcPr>
+            <w:tcW w:w="1701" w:type="dxa"/>
+            <w:tcBorders>
+              <w:top w:val="single" w:sz="4" w:space="0" w:color="D0D7DE"/>
+              <w:left w:val="single" w:sz="4" w:space="0" w:color="D0D7DE"/>
+              <w:bottom w:val="single" w:sz="4" w:space="0" w:color="D0D7DE"/>
+              <w:right w:val="single" w:sz="4" w:space="0" w:color="D0D7DE"/>
+            </w:tcBorders>
+            <w:shd w:val="clear" w:color="auto" w:fill="FFFFFF"/>
+            <w:tcMar>
+              <w:top w:w="90" w:type="dxa"/>
+              <w:left w:w="130" w:type="dxa"/>
+              <w:bottom w:w="90" w:type="dxa"/>
+              <w:right w:w="130" w:type="dxa"/>
+            </w:tcMar>
+            <w:vAlign w:val="center"/>
+          </w:tcPr>
+          <w:p>
+            <w:pPr>
+              <w:keepNext/>
+              <w:spacing w:after="0"/>
+            </w:pPr>
+            <w:r>
+              <w:rPr>
+                <w:b/>
+                <w:sz w:val="19"/>
+              </w:rPr>
+              <w:t>potenciaKw máx / suma</w:t>
+            </w:r>
+          </w:p>
+        </w:tc>
+        <w:tc>
+          <w:tcPr>
+            <w:tcW w:w="1134" w:type="dxa"/>
+            <w:tcBorders>
+              <w:top w:val="single" w:sz="4" w:space="0" w:color="D0D7DE"/>
+              <w:left w:val="single" w:sz="4" w:space="0" w:color="D0D7DE"/>
+              <w:bottom w:val="single" w:sz="4" w:space="0" w:color="D0D7DE"/>
+              <w:right w:val="single" w:sz="4" w:space="0" w:color="D0D7DE"/>
+            </w:tcBorders>
+            <w:shd w:val="clear" w:color="auto" w:fill="FFFFFF"/>
+            <w:tcMar>
+              <w:top w:w="90" w:type="dxa"/>
+              <w:left w:w="130" w:type="dxa"/>
+              <w:bottom w:w="90" w:type="dxa"/>
+              <w:right w:w="130" w:type="dxa"/>
+            </w:tcMar>
+            <w:vAlign w:val="center"/>
+          </w:tcPr>
+          <w:p>
+            <w:pPr>
+              <w:keepNext/>
+              <w:spacing w:after="0"/>
+            </w:pPr>
+            <w:r>
+              <w:rPr>
+                <w:sz w:val="19"/>
+              </w:rPr>
+              <w:t>5,84 / 946</w:t>
+            </w:r>
+          </w:p>
+        </w:tc>
+        <w:tc>
+          <w:tcPr>
+            <w:tcW w:w="1134" w:type="dxa"/>
+            <w:tcBorders>
+              <w:top w:val="single" w:sz="4" w:space="0" w:color="D0D7DE"/>
+              <w:left w:val="single" w:sz="4" w:space="0" w:color="D0D7DE"/>
+              <w:bottom w:val="single" w:sz="4" w:space="0" w:color="D0D7DE"/>
+              <w:right w:val="single" w:sz="4" w:space="0" w:color="D0D7DE"/>
+            </w:tcBorders>
+            <w:shd w:val="clear" w:color="auto" w:fill="FFFFFF"/>
+            <w:tcMar>
+              <w:top w:w="90" w:type="dxa"/>
+              <w:left w:w="130" w:type="dxa"/>
+              <w:bottom w:w="90" w:type="dxa"/>
+              <w:right w:w="130" w:type="dxa"/>
+            </w:tcMar>
+            <w:vAlign w:val="center"/>
+          </w:tcPr>
+          <w:p>
+            <w:pPr>
+              <w:keepNext/>
+              <w:spacing w:after="0"/>
+            </w:pPr>
+            <w:r>
+              <w:rPr>
+                <w:sz w:val="19"/>
+              </w:rPr>
+              <w:t>5,84 / 1 362</w:t>
+            </w:r>
+          </w:p>
+        </w:tc>
+        <w:tc>
+          <w:tcPr>
+            <w:tcW w:w="1134" w:type="dxa"/>
+            <w:tcBorders>
+              <w:top w:val="single" w:sz="4" w:space="0" w:color="D0D7DE"/>
+              <w:left w:val="single" w:sz="4" w:space="0" w:color="D0D7DE"/>
+              <w:bottom w:val="single" w:sz="4" w:space="0" w:color="D0D7DE"/>
+              <w:right w:val="single" w:sz="4" w:space="0" w:color="D0D7DE"/>
+            </w:tcBorders>
+            <w:shd w:val="clear" w:color="auto" w:fill="FFFFFF"/>
+            <w:tcMar>
+              <w:top w:w="90" w:type="dxa"/>
+              <w:left w:w="130" w:type="dxa"/>
+              <w:bottom w:w="90" w:type="dxa"/>
+              <w:right w:w="130" w:type="dxa"/>
+            </w:tcMar>
+            <w:vAlign w:val="center"/>
+          </w:tcPr>
+          <w:p>
+            <w:pPr>
+              <w:keepNext/>
+              <w:spacing w:after="0"/>
+            </w:pPr>
+            <w:r>
+              <w:rPr>
+                <w:sz w:val="19"/>
+              </w:rPr>
+              <w:t>6,79 / 2 854</w:t>
+            </w:r>
+          </w:p>
+        </w:tc>
+        <w:tc>
+          <w:tcPr>
+            <w:tcW w:w="1134" w:type="dxa"/>
+            <w:tcBorders>
+              <w:top w:val="single" w:sz="4" w:space="0" w:color="D0D7DE"/>
+              <w:left w:val="single" w:sz="4" w:space="0" w:color="D0D7DE"/>
+              <w:bottom w:val="single" w:sz="4" w:space="0" w:color="D0D7DE"/>
+              <w:right w:val="single" w:sz="4" w:space="0" w:color="D0D7DE"/>
+            </w:tcBorders>
+            <w:shd w:val="clear" w:color="auto" w:fill="FFFFFF"/>
+            <w:tcMar>
+              <w:top w:w="90" w:type="dxa"/>
+              <w:left w:w="130" w:type="dxa"/>
+              <w:bottom w:w="90" w:type="dxa"/>
+              <w:right w:w="130" w:type="dxa"/>
+            </w:tcMar>
+            <w:vAlign w:val="center"/>
+          </w:tcPr>
+          <w:p>
+            <w:pPr>
+              <w:keepNext/>
+              <w:spacing w:after="0"/>
+            </w:pPr>
+            <w:r>
+              <w:rPr>
+                <w:sz w:val="19"/>
+              </w:rPr>
+              <w:t>5,84 / 757</w:t>
+            </w:r>
+          </w:p>
+        </w:tc>
+        <w:tc>
+          <w:tcPr>
+            <w:tcW w:w="3118" w:type="dxa"/>
+            <w:tcBorders>
+              <w:top w:val="single" w:sz="4" w:space="0" w:color="D0D7DE"/>
+              <w:left w:val="single" w:sz="4" w:space="0" w:color="D0D7DE"/>
+              <w:bottom w:val="single" w:sz="4" w:space="0" w:color="D0D7DE"/>
+              <w:right w:val="single" w:sz="4" w:space="0" w:color="D0D7DE"/>
+            </w:tcBorders>
+            <w:shd w:val="clear" w:color="auto" w:fill="FFFFFF"/>
+            <w:tcMar>
+              <w:top w:w="90" w:type="dxa"/>
+              <w:left w:w="130" w:type="dxa"/>
+              <w:bottom w:w="90" w:type="dxa"/>
+              <w:right w:w="130" w:type="dxa"/>
+            </w:tcMar>
+            <w:vAlign w:val="center"/>
+          </w:tcPr>
+          <w:p>
+            <w:pPr>
+              <w:keepNext/>
+              <w:spacing w:after="0"/>
+            </w:pPr>
+            <w:r>
+              <w:rPr>
+                <w:sz w:val="19"/>
+              </w:rPr>
+              <w:t>el 26-sep registra la carga de fila más alta de la ventana (6,79 kW) y consume más energía porque también es la fecha más larga (18 h): fue el día de mayor trabajo del centro de datos</w:t>
+            </w:r>
+          </w:p>
+        </w:tc>
+      </w:tr>
+      <w:tr>
+        <w:trPr>
+          <w:cantSplit/>
+          <w:jc w:val="center"/>
+        </w:trPr>
+        <w:tc>
+          <w:tcPr>
+            <w:tcW w:w="1701" w:type="dxa"/>
+            <w:tcBorders>
+              <w:top w:val="single" w:sz="4" w:space="0" w:color="D0D7DE"/>
+              <w:left w:val="single" w:sz="4" w:space="0" w:color="D0D7DE"/>
+              <w:bottom w:val="single" w:sz="4" w:space="0" w:color="D0D7DE"/>
+              <w:right w:val="single" w:sz="4" w:space="0" w:color="D0D7DE"/>
+            </w:tcBorders>
+            <w:shd w:val="clear" w:color="auto" w:fill="F4F7FB"/>
+            <w:tcMar>
+              <w:top w:w="90" w:type="dxa"/>
+              <w:left w:w="130" w:type="dxa"/>
+              <w:bottom w:w="90" w:type="dxa"/>
+              <w:right w:w="130" w:type="dxa"/>
+            </w:tcMar>
+            <w:vAlign w:val="center"/>
+          </w:tcPr>
+          <w:p>
+            <w:pPr>
+              <w:keepNext/>
+              <w:spacing w:after="0"/>
+            </w:pPr>
+            <w:r>
+              <w:rPr>
+                <w:b/>
+                <w:sz w:val="19"/>
+              </w:rPr>
+              <w:lastRenderedPageBreak/>
+              <w:t>corrienteA máx / mín</w:t>
+            </w:r>
+          </w:p>
+        </w:tc>
+        <w:tc>
+          <w:tcPr>
+            <w:tcW w:w="1134" w:type="dxa"/>
+            <w:tcBorders>
+              <w:top w:val="single" w:sz="4" w:space="0" w:color="D0D7DE"/>
+              <w:left w:val="single" w:sz="4" w:space="0" w:color="D0D7DE"/>
+              <w:bottom w:val="single" w:sz="4" w:space="0" w:color="D0D7DE"/>
+              <w:right w:val="single" w:sz="4" w:space="0" w:color="D0D7DE"/>
+            </w:tcBorders>
+            <w:shd w:val="clear" w:color="auto" w:fill="F4F7FB"/>
+            <w:tcMar>
+              <w:top w:w="90" w:type="dxa"/>
+              <w:left w:w="130" w:type="dxa"/>
+              <w:bottom w:w="90" w:type="dxa"/>
+              <w:right w:w="130" w:type="dxa"/>
+            </w:tcMar>
+            <w:vAlign w:val="center"/>
+          </w:tcPr>
+          <w:p>
+            <w:pPr>
+              <w:keepNext/>
+              <w:spacing w:after="0"/>
+            </w:pPr>
+            <w:r>
+              <w:rPr>
+                <w:sz w:val="19"/>
+              </w:rPr>
+              <w:t>26,57 / 8,13</w:t>
+            </w:r>
+          </w:p>
+        </w:tc>
+        <w:tc>
+          <w:tcPr>
+            <w:tcW w:w="1134" w:type="dxa"/>
+            <w:tcBorders>
+              <w:top w:val="single" w:sz="4" w:space="0" w:color="D0D7DE"/>
+              <w:left w:val="single" w:sz="4" w:space="0" w:color="D0D7DE"/>
+              <w:bottom w:val="single" w:sz="4" w:space="0" w:color="D0D7DE"/>
+              <w:right w:val="single" w:sz="4" w:space="0" w:color="D0D7DE"/>
+            </w:tcBorders>
+            <w:shd w:val="clear" w:color="auto" w:fill="F4F7FB"/>
+            <w:tcMar>
+              <w:top w:w="90" w:type="dxa"/>
+              <w:left w:w="130" w:type="dxa"/>
+              <w:bottom w:w="90" w:type="dxa"/>
+              <w:right w:w="130" w:type="dxa"/>
+            </w:tcMar>
+            <w:vAlign w:val="center"/>
+          </w:tcPr>
+          <w:p>
+            <w:pPr>
+              <w:keepNext/>
+              <w:spacing w:after="0"/>
+            </w:pPr>
+            <w:r>
+              <w:rPr>
+                <w:sz w:val="19"/>
+              </w:rPr>
+              <w:t>26,57 / 23,71</w:t>
+            </w:r>
+          </w:p>
+        </w:tc>
+        <w:tc>
+          <w:tcPr>
+            <w:tcW w:w="1134" w:type="dxa"/>
+            <w:tcBorders>
+              <w:top w:val="single" w:sz="4" w:space="0" w:color="D0D7DE"/>
+              <w:left w:val="single" w:sz="4" w:space="0" w:color="D0D7DE"/>
+              <w:bottom w:val="single" w:sz="4" w:space="0" w:color="D0D7DE"/>
+              <w:right w:val="single" w:sz="4" w:space="0" w:color="D0D7DE"/>
+            </w:tcBorders>
+            <w:shd w:val="clear" w:color="auto" w:fill="F4F7FB"/>
+            <w:tcMar>
+              <w:top w:w="90" w:type="dxa"/>
+              <w:left w:w="130" w:type="dxa"/>
+              <w:bottom w:w="90" w:type="dxa"/>
+              <w:right w:w="130" w:type="dxa"/>
+            </w:tcMar>
+            <w:vAlign w:val="center"/>
+          </w:tcPr>
+          <w:p>
+            <w:pPr>
+              <w:keepNext/>
+              <w:spacing w:after="0"/>
+            </w:pPr>
+            <w:r>
+              <w:rPr>
+                <w:sz w:val="19"/>
+              </w:rPr>
+              <w:t>30,82 / 24,15</w:t>
+            </w:r>
+          </w:p>
+        </w:tc>
+        <w:tc>
+          <w:tcPr>
+            <w:tcW w:w="1134" w:type="dxa"/>
+            <w:tcBorders>
+              <w:top w:val="single" w:sz="4" w:space="0" w:color="D0D7DE"/>
+              <w:left w:val="single" w:sz="4" w:space="0" w:color="D0D7DE"/>
+              <w:bottom w:val="single" w:sz="4" w:space="0" w:color="D0D7DE"/>
+              <w:right w:val="single" w:sz="4" w:space="0" w:color="D0D7DE"/>
+            </w:tcBorders>
+            <w:shd w:val="clear" w:color="auto" w:fill="F4F7FB"/>
+            <w:tcMar>
+              <w:top w:w="90" w:type="dxa"/>
+              <w:left w:w="130" w:type="dxa"/>
+              <w:bottom w:w="90" w:type="dxa"/>
+              <w:right w:w="130" w:type="dxa"/>
+            </w:tcMar>
+            <w:vAlign w:val="center"/>
+          </w:tcPr>
+          <w:p>
+            <w:pPr>
+              <w:keepNext/>
+              <w:spacing w:after="0"/>
+            </w:pPr>
+            <w:r>
+              <w:rPr>
+                <w:sz w:val="19"/>
+              </w:rPr>
+              <w:t>26,57 / 23,71</w:t>
+            </w:r>
+          </w:p>
+        </w:tc>
+        <w:tc>
+          <w:tcPr>
+            <w:tcW w:w="3118" w:type="dxa"/>
+            <w:tcBorders>
+              <w:top w:val="single" w:sz="4" w:space="0" w:color="D0D7DE"/>
+              <w:left w:val="single" w:sz="4" w:space="0" w:color="D0D7DE"/>
+              <w:bottom w:val="single" w:sz="4" w:space="0" w:color="D0D7DE"/>
+              <w:right w:val="single" w:sz="4" w:space="0" w:color="D0D7DE"/>
+            </w:tcBorders>
+            <w:shd w:val="clear" w:color="auto" w:fill="F4F7FB"/>
+            <w:tcMar>
+              <w:top w:w="90" w:type="dxa"/>
+              <w:left w:w="130" w:type="dxa"/>
+              <w:bottom w:w="90" w:type="dxa"/>
+              <w:right w:w="130" w:type="dxa"/>
+            </w:tcMar>
+            <w:vAlign w:val="center"/>
+          </w:tcPr>
+          <w:p>
+            <w:pPr>
+              <w:keepNext/>
+              <w:spacing w:after="0"/>
+            </w:pPr>
+            <w:r>
+              <w:rPr>
+                <w:sz w:val="19"/>
+              </w:rPr>
+              <w:t>el máximo del 26-sep (30,82 A) es el punto más cercano a la protección de 32 A de la PDU en toda la ventana. El mínimo de 8,13 A del 24-sep corresponde a las primeras horas de la ventana, con poca carga conectada</w:t>
+            </w:r>
+          </w:p>
+        </w:tc>
+      </w:tr>
+      <w:tr>
+        <w:trPr>
+          <w:cantSplit/>
+          <w:jc w:val="center"/>
+        </w:trPr>
+        <w:tc>
+          <w:tcPr>
+            <w:tcW w:w="1701" w:type="dxa"/>
+            <w:tcBorders>
+              <w:top w:val="single" w:sz="4" w:space="0" w:color="D0D7DE"/>
+              <w:left w:val="single" w:sz="4" w:space="0" w:color="D0D7DE"/>
+              <w:bottom w:val="single" w:sz="4" w:space="0" w:color="D0D7DE"/>
+              <w:right w:val="single" w:sz="4" w:space="0" w:color="D0D7DE"/>
+            </w:tcBorders>
+            <w:shd w:val="clear" w:color="auto" w:fill="FFFFFF"/>
+            <w:tcMar>
+              <w:top w:w="90" w:type="dxa"/>
+              <w:left w:w="130" w:type="dxa"/>
+              <w:bottom w:w="90" w:type="dxa"/>
+              <w:right w:w="130" w:type="dxa"/>
+            </w:tcMar>
+            <w:vAlign w:val="center"/>
+          </w:tcPr>
+          <w:p>
+            <w:pPr>
+              <w:keepNext/>
+              <w:spacing w:after="0"/>
+            </w:pPr>
+            <w:r>
+              <w:rPr>
+                <w:b/>
+                <w:sz w:val="19"/>
+              </w:rPr>
+              <w:t>eventosAcceso suma</w:t>
+            </w:r>
+          </w:p>
+        </w:tc>
+        <w:tc>
+          <w:tcPr>
+            <w:tcW w:w="1134" w:type="dxa"/>
+            <w:tcBorders>
+              <w:top w:val="single" w:sz="4" w:space="0" w:color="D0D7DE"/>
+              <w:left w:val="single" w:sz="4" w:space="0" w:color="D0D7DE"/>
+              <w:bottom w:val="single" w:sz="4" w:space="0" w:color="D0D7DE"/>
+              <w:right w:val="single" w:sz="4" w:space="0" w:color="D0D7DE"/>
+            </w:tcBorders>
+            <w:shd w:val="clear" w:color="auto" w:fill="FFFFFF"/>
+            <w:tcMar>
+              <w:top w:w="90" w:type="dxa"/>
+              <w:left w:w="130" w:type="dxa"/>
+              <w:bottom w:w="90" w:type="dxa"/>
+              <w:right w:w="130" w:type="dxa"/>
+            </w:tcMar>
+            <w:vAlign w:val="center"/>
+          </w:tcPr>
+          <w:p>
+            <w:pPr>
+              <w:keepNext/>
+              <w:spacing w:after="0"/>
+            </w:pPr>
+            <w:r>
+              <w:rPr>
+                <w:sz w:val="19"/>
+              </w:rPr>
+              <w:t>1 393</w:t>
+            </w:r>
+          </w:p>
+        </w:tc>
+        <w:tc>
+          <w:tcPr>
+            <w:tcW w:w="1134" w:type="dxa"/>
+            <w:tcBorders>
+              <w:top w:val="single" w:sz="4" w:space="0" w:color="D0D7DE"/>
+              <w:left w:val="single" w:sz="4" w:space="0" w:color="D0D7DE"/>
+              <w:bottom w:val="single" w:sz="4" w:space="0" w:color="D0D7DE"/>
+              <w:right w:val="single" w:sz="4" w:space="0" w:color="D0D7DE"/>
+            </w:tcBorders>
+            <w:shd w:val="clear" w:color="auto" w:fill="FFFFFF"/>
+            <w:tcMar>
+              <w:top w:w="90" w:type="dxa"/>
+              <w:left w:w="130" w:type="dxa"/>
+              <w:bottom w:w="90" w:type="dxa"/>
+              <w:right w:w="130" w:type="dxa"/>
+            </w:tcMar>
+            <w:vAlign w:val="center"/>
+          </w:tcPr>
+          <w:p>
+            <w:pPr>
+              <w:keepNext/>
+              <w:spacing w:after="0"/>
+            </w:pPr>
+            <w:r>
+              <w:rPr>
+                <w:sz w:val="19"/>
+              </w:rPr>
+              <w:t>1 543</w:t>
+            </w:r>
+          </w:p>
+        </w:tc>
+        <w:tc>
+          <w:tcPr>
+            <w:tcW w:w="1134" w:type="dxa"/>
+            <w:tcBorders>
+              <w:top w:val="single" w:sz="4" w:space="0" w:color="D0D7DE"/>
+              <w:left w:val="single" w:sz="4" w:space="0" w:color="D0D7DE"/>
+              <w:bottom w:val="single" w:sz="4" w:space="0" w:color="D0D7DE"/>
+              <w:right w:val="single" w:sz="4" w:space="0" w:color="D0D7DE"/>
+            </w:tcBorders>
+            <w:shd w:val="clear" w:color="auto" w:fill="FFFFFF"/>
+            <w:tcMar>
+              <w:top w:w="90" w:type="dxa"/>
+              <w:left w:w="130" w:type="dxa"/>
+              <w:bottom w:w="90" w:type="dxa"/>
+              <w:right w:w="130" w:type="dxa"/>
+            </w:tcMar>
+            <w:vAlign w:val="center"/>
+          </w:tcPr>
+          <w:p>
+            <w:pPr>
+              <w:keepNext/>
+              <w:spacing w:after="0"/>
+            </w:pPr>
+            <w:r>
+              <w:rPr>
+                <w:sz w:val="19"/>
+              </w:rPr>
+              <w:t>6 049</w:t>
+            </w:r>
+          </w:p>
+        </w:tc>
+        <w:tc>
+          <w:tcPr>
+            <w:tcW w:w="1134" w:type="dxa"/>
+            <w:tcBorders>
+              <w:top w:val="single" w:sz="4" w:space="0" w:color="D0D7DE"/>
+              <w:left w:val="single" w:sz="4" w:space="0" w:color="D0D7DE"/>
+              <w:bottom w:val="single" w:sz="4" w:space="0" w:color="D0D7DE"/>
+              <w:right w:val="single" w:sz="4" w:space="0" w:color="D0D7DE"/>
+            </w:tcBorders>
+            <w:shd w:val="clear" w:color="auto" w:fill="FFFFFF"/>
+            <w:tcMar>
+              <w:top w:w="90" w:type="dxa"/>
+              <w:left w:w="130" w:type="dxa"/>
+              <w:bottom w:w="90" w:type="dxa"/>
+              <w:right w:w="130" w:type="dxa"/>
+            </w:tcMar>
+            <w:vAlign w:val="center"/>
+          </w:tcPr>
+          <w:p>
+            <w:pPr>
+              <w:keepNext/>
+              <w:spacing w:after="0"/>
+            </w:pPr>
+            <w:r>
+              <w:rPr>
+                <w:sz w:val="19"/>
+              </w:rPr>
+              <w:t>2 388</w:t>
+            </w:r>
+          </w:p>
+        </w:tc>
+        <w:tc>
+          <w:tcPr>
+            <w:tcW w:w="3118" w:type="dxa"/>
+            <w:tcBorders>
+              <w:top w:val="single" w:sz="4" w:space="0" w:color="D0D7DE"/>
+              <w:left w:val="single" w:sz="4" w:space="0" w:color="D0D7DE"/>
+              <w:bottom w:val="single" w:sz="4" w:space="0" w:color="D0D7DE"/>
+              <w:right w:val="single" w:sz="4" w:space="0" w:color="D0D7DE"/>
+            </w:tcBorders>
+            <w:shd w:val="clear" w:color="auto" w:fill="FFFFFF"/>
+            <w:tcMar>
+              <w:top w:w="90" w:type="dxa"/>
+              <w:left w:w="130" w:type="dxa"/>
+              <w:bottom w:w="90" w:type="dxa"/>
+              <w:right w:w="130" w:type="dxa"/>
+            </w:tcMar>
+            <w:vAlign w:val="center"/>
+          </w:tcPr>
+          <w:p>
+            <w:pPr>
+              <w:keepNext/>
+              <w:spacing w:after="0"/>
+            </w:pPr>
+            <w:r>
+              <w:rPr>
+                <w:sz w:val="19"/>
+              </w:rPr>
+              <w:t>el 26-sep concentra cuatro veces más aperturas que el primer día: fue la jornada de mantenimiento y visitas, y explica también el mínimo de presión diferencial de esa fecha</w:t>
+            </w:r>
+          </w:p>
+        </w:tc>
+      </w:tr>
+      <w:tr>
+        <w:trPr>
+          <w:cantSplit/>
+          <w:jc w:val="center"/>
+        </w:trPr>
+        <w:tc>
+          <w:tcPr>
+            <w:tcW w:w="1701" w:type="dxa"/>
+            <w:tcBorders>
+              <w:top w:val="single" w:sz="4" w:space="0" w:color="D0D7DE"/>
+              <w:left w:val="single" w:sz="4" w:space="0" w:color="D0D7DE"/>
+              <w:bottom w:val="single" w:sz="4" w:space="0" w:color="D0D7DE"/>
+              <w:right w:val="single" w:sz="4" w:space="0" w:color="D0D7DE"/>
+            </w:tcBorders>
+            <w:shd w:val="clear" w:color="auto" w:fill="F4F7FB"/>
+            <w:tcMar>
+              <w:top w:w="90" w:type="dxa"/>
+              <w:left w:w="130" w:type="dxa"/>
+              <w:bottom w:w="90" w:type="dxa"/>
+              <w:right w:w="130" w:type="dxa"/>
+            </w:tcMar>
+            <w:vAlign w:val="center"/>
+          </w:tcPr>
+          <w:p>
+            <w:pPr>
+              <w:spacing w:after="0"/>
+            </w:pPr>
+            <w:r>
+              <w:rPr>
+                <w:b/>
+                <w:sz w:val="19"/>
+              </w:rPr>
+              <w:t>tempTecho máx</w:t>
+            </w:r>
+          </w:p>
+        </w:tc>
+        <w:tc>
+          <w:tcPr>
+            <w:tcW w:w="1134" w:type="dxa"/>
+            <w:tcBorders>
+              <w:top w:val="single" w:sz="4" w:space="0" w:color="D0D7DE"/>
+              <w:left w:val="single" w:sz="4" w:space="0" w:color="D0D7DE"/>
+              <w:bottom w:val="single" w:sz="4" w:space="0" w:color="D0D7DE"/>
+              <w:right w:val="single" w:sz="4" w:space="0" w:color="D0D7DE"/>
+            </w:tcBorders>
+            <w:shd w:val="clear" w:color="auto" w:fill="F4F7FB"/>
+            <w:tcMar>
+              <w:top w:w="90" w:type="dxa"/>
+              <w:left w:w="130" w:type="dxa"/>
+              <w:bottom w:w="90" w:type="dxa"/>
+              <w:right w:w="130" w:type="dxa"/>
+            </w:tcMar>
+            <w:vAlign w:val="center"/>
+          </w:tcPr>
+          <w:p>
+            <w:pPr>
+              <w:spacing w:after="0"/>
+            </w:pPr>
+            <w:r>
+              <w:rPr>
+                <w:sz w:val="19"/>
+              </w:rPr>
+              <w:t>27,36</w:t>
+            </w:r>
+          </w:p>
+        </w:tc>
+        <w:tc>
+          <w:tcPr>
+            <w:tcW w:w="1134" w:type="dxa"/>
+            <w:tcBorders>
+              <w:top w:val="single" w:sz="4" w:space="0" w:color="D0D7DE"/>
+              <w:left w:val="single" w:sz="4" w:space="0" w:color="D0D7DE"/>
+              <w:bottom w:val="single" w:sz="4" w:space="0" w:color="D0D7DE"/>
+              <w:right w:val="single" w:sz="4" w:space="0" w:color="D0D7DE"/>
+            </w:tcBorders>
+            <w:shd w:val="clear" w:color="auto" w:fill="F4F7FB"/>
+            <w:tcMar>
+              <w:top w:w="90" w:type="dxa"/>
+              <w:left w:w="130" w:type="dxa"/>
+              <w:bottom w:w="90" w:type="dxa"/>
+              <w:right w:w="130" w:type="dxa"/>
+            </w:tcMar>
+            <w:vAlign w:val="center"/>
+          </w:tcPr>
+          <w:p>
+            <w:pPr>
+              <w:spacing w:after="0"/>
+            </w:pPr>
+            <w:r>
+              <w:rPr>
+                <w:sz w:val="19"/>
+              </w:rPr>
+              <w:t>27,31</w:t>
+            </w:r>
+          </w:p>
+        </w:tc>
+        <w:tc>
+          <w:tcPr>
+            <w:tcW w:w="1134" w:type="dxa"/>
+            <w:tcBorders>
+              <w:top w:val="single" w:sz="4" w:space="0" w:color="D0D7DE"/>
+              <w:left w:val="single" w:sz="4" w:space="0" w:color="D0D7DE"/>
+              <w:bottom w:val="single" w:sz="4" w:space="0" w:color="D0D7DE"/>
+              <w:right w:val="single" w:sz="4" w:space="0" w:color="D0D7DE"/>
+            </w:tcBorders>
+            <w:shd w:val="clear" w:color="auto" w:fill="F4F7FB"/>
+            <w:tcMar>
+              <w:top w:w="90" w:type="dxa"/>
+              <w:left w:w="130" w:type="dxa"/>
+              <w:bottom w:w="90" w:type="dxa"/>
+              <w:right w:w="130" w:type="dxa"/>
+            </w:tcMar>
+            <w:vAlign w:val="center"/>
+          </w:tcPr>
+          <w:p>
+            <w:pPr>
+              <w:spacing w:after="0"/>
+            </w:pPr>
+            <w:r>
+              <w:rPr>
+                <w:sz w:val="19"/>
+              </w:rPr>
+              <w:t>27,38</w:t>
+            </w:r>
+          </w:p>
+        </w:tc>
+        <w:tc>
+          <w:tcPr>
+            <w:tcW w:w="1134" w:type="dxa"/>
+            <w:tcBorders>
+              <w:top w:val="single" w:sz="4" w:space="0" w:color="D0D7DE"/>
+              <w:left w:val="single" w:sz="4" w:space="0" w:color="D0D7DE"/>
+              <w:bottom w:val="single" w:sz="4" w:space="0" w:color="D0D7DE"/>
+              <w:right w:val="single" w:sz="4" w:space="0" w:color="D0D7DE"/>
+            </w:tcBorders>
+            <w:shd w:val="clear" w:color="auto" w:fill="F4F7FB"/>
+            <w:tcMar>
+              <w:top w:w="90" w:type="dxa"/>
+              <w:left w:w="130" w:type="dxa"/>
+              <w:bottom w:w="90" w:type="dxa"/>
+              <w:right w:w="130" w:type="dxa"/>
+            </w:tcMar>
+            <w:vAlign w:val="center"/>
+          </w:tcPr>
+          <w:p>
+            <w:pPr>
+              <w:spacing w:after="0"/>
+            </w:pPr>
+            <w:r>
+              <w:rPr>
+                <w:sz w:val="19"/>
+              </w:rPr>
+              <w:t>27,37</w:t>
+            </w:r>
+          </w:p>
+        </w:tc>
+        <w:tc>
+          <w:tcPr>
+            <w:tcW w:w="3118" w:type="dxa"/>
+            <w:tcBorders>
+              <w:top w:val="single" w:sz="4" w:space="0" w:color="D0D7DE"/>
+              <w:left w:val="single" w:sz="4" w:space="0" w:color="D0D7DE"/>
+              <w:bottom w:val="single" w:sz="4" w:space="0" w:color="D0D7DE"/>
+              <w:right w:val="single" w:sz="4" w:space="0" w:color="D0D7DE"/>
+            </w:tcBorders>
+            <w:shd w:val="clear" w:color="auto" w:fill="F4F7FB"/>
+            <w:tcMar>
+              <w:top w:w="90" w:type="dxa"/>
+              <w:left w:w="130" w:type="dxa"/>
+              <w:bottom w:w="90" w:type="dxa"/>
+              <w:right w:w="130" w:type="dxa"/>
+            </w:tcMar>
+            <w:vAlign w:val="center"/>
+          </w:tcPr>
+          <w:p>
+            <w:pPr>
+              <w:spacing w:after="0"/>
+            </w:pPr>
+            <w:r>
+              <w:rPr>
+                <w:sz w:val="19"/>
+              </w:rPr>
+              <w:t>la estratificación del techo se mantiene prácticamente igual los cuatro días y muy lejos del umbral de incendio: el techo no se calienta de forma anómala en ninguna fecha</w:t>
+            </w:r>
+          </w:p>
+        </w:tc>
+      </w:tr>
+    </w:tbl>
+    <w:p>
+      <w:pPr>
+        <w:spacing w:after="80"/>
+      </w:pPr>
+    </w:p>
+    <w:p>
+      <w:pPr>
+        <w:pStyle w:val="Ttulo1"/>
+      </w:pPr>
+      <w:bookmarkStart w:id="12" w:name="_Toc241426751"/>
       <w:r>
         <w:t>5. Logs de los nodos (recortes reales)</w:t>
       </w:r>
-      <w:bookmarkEnd w:id="11"/>
+      <w:bookmarkEnd w:id="12"/>
     </w:p>
     <w:p>
       <w:r>
@@ -5957,11 +8259,11 @@
       <w:pPr>
         <w:pStyle w:val="Ttulo2"/>
       </w:pPr>
-      <w:bookmarkStart w:id="12" w:name="_Toc241425411"/>
+      <w:bookmarkStart w:id="13" w:name="_Toc241426752"/>
       <w:r>
         <w:t>DC-RACKC-03 · SDK MQTT</w:t>
       </w:r>
-      <w:bookmarkEnd w:id="12"/>
+      <w:bookmarkEnd w:id="13"/>
     </w:p>
     <w:tbl>
       <w:tblPr>
@@ -6103,11 +8405,11 @@
       <w:pPr>
         <w:pStyle w:val="Ttulo2"/>
       </w:pPr>
-      <w:bookmarkStart w:id="13" w:name="_Toc241425412"/>
+      <w:bookmarkStart w:id="14" w:name="_Toc241426753"/>
       <w:r>
         <w:t>DC-PASILLO-04 · SDK sobre WebSockets</w:t>
       </w:r>
-      <w:bookmarkEnd w:id="13"/>
+      <w:bookmarkEnd w:id="14"/>
     </w:p>
     <w:tbl>
       <w:tblPr>
@@ -6249,12 +8551,12 @@
       <w:pPr>
         <w:pStyle w:val="Ttulo2"/>
       </w:pPr>
-      <w:bookmarkStart w:id="14" w:name="_Toc241425413"/>
+      <w:bookmarkStart w:id="15" w:name="_Toc241426754"/>
       <w:r>
         <w:lastRenderedPageBreak/>
         <w:t>DC-HUMO-08 · paho explícito</w:t>
       </w:r>
-      <w:bookmarkEnd w:id="14"/>
+      <w:bookmarkEnd w:id="15"/>
     </w:p>
     <w:tbl>
       <w:tblPr>
@@ -6396,11 +8698,11 @@
       <w:pPr>
         <w:pStyle w:val="Ttulo2"/>
       </w:pPr>
-      <w:bookmarkStart w:id="15" w:name="_Toc241425414"/>
+      <w:bookmarkStart w:id="16" w:name="_Toc241426755"/>
       <w:r>
         <w:t>DC-ACCESO-10 · puente HTTP/REST</w:t>
       </w:r>
-      <w:bookmarkEnd w:id="15"/>
+      <w:bookmarkEnd w:id="16"/>
     </w:p>
     <w:tbl>
       <w:tblPr>
@@ -6540,13 +8842,353 @@
     </w:p>
     <w:p>
       <w:pPr>
+        <w:pStyle w:val="Ttulo2"/>
+      </w:pPr>
+      <w:bookmarkStart w:id="17" w:name="_Toc241426756"/>
+      <w:r>
+        <w:t>5.1 Los dos códigos que se ejecutan en la sustentación</w:t>
+      </w:r>
+      <w:bookmarkEnd w:id="17"/>
+    </w:p>
+    <w:p>
+      <w:r>
+        <w:t>El pliego pide que en la defensa se vean dos códigos corriendo en equipos distintos. Son estos dos, y sus registros reales quedan aquí: el nodo Python del Rack C corriendo en el servidor Ubuntu (equipo 1) y el ESP32 del Rack B en el simulador de Wokwi (equipo 2).</w:t>
+      </w:r>
+    </w:p>
+    <w:tbl>
+      <w:tblPr>
+        <w:tblW w:w="0" w:type="auto"/>
+        <w:tblLook w:val="04A0" w:firstRow="1" w:lastRow="0" w:firstColumn="1" w:lastColumn="0" w:noHBand="0" w:noVBand="1"/>
+      </w:tblPr>
+      <w:tblGrid>
+        <w:gridCol w:w="9638"/>
+      </w:tblGrid>
+      <w:tr>
+        <w:trPr>
+          <w:cantSplit/>
+        </w:trPr>
+        <w:tc>
+          <w:tcPr>
+            <w:tcW w:w="9638" w:type="dxa"/>
+            <w:tcBorders>
+              <w:top w:val="nil"/>
+              <w:left w:val="nil"/>
+              <w:bottom w:val="nil"/>
+              <w:right w:val="nil"/>
+            </w:tcBorders>
+            <w:shd w:val="clear" w:color="auto" w:fill="0F172A"/>
+            <w:tcMar>
+              <w:top w:w="120" w:type="dxa"/>
+              <w:left w:w="180" w:type="dxa"/>
+              <w:bottom w:w="120" w:type="dxa"/>
+              <w:right w:w="180" w:type="dxa"/>
+            </w:tcMar>
+          </w:tcPr>
+          <w:p>
+            <w:pPr>
+              <w:spacing w:after="0" w:line="240" w:lineRule="auto"/>
+            </w:pPr>
+            <w:r>
+              <w:rPr>
+                <w:rFonts w:ascii="Consolas" w:hAnsi="Consolas"/>
+                <w:color w:val="E2E8F0"/>
+                <w:sz w:val="17"/>
+              </w:rPr>
+              <w:t># Equipo 1 · servidor Ubuntu (52.252.133.127) · dc_sdk_mqtt.py → DC-RACKC-03</w:t>
+            </w:r>
+          </w:p>
+          <w:p>
+            <w:pPr>
+              <w:spacing w:after="0" w:line="240" w:lineRule="auto"/>
+            </w:pPr>
+            <w:r>
+              <w:rPr>
+                <w:rFonts w:ascii="Consolas" w:hAnsi="Consolas"/>
+                <w:color w:val="E2E8F0"/>
+                <w:sz w:val="17"/>
+              </w:rPr>
+              <w:t>[INFO] [DPS] asignado a iotc-...azure-devices.net</w:t>
+            </w:r>
+          </w:p>
+          <w:p>
+            <w:pPr>
+              <w:spacing w:after="0" w:line="240" w:lineRule="auto"/>
+            </w:pPr>
+            <w:r>
+              <w:rPr>
+                <w:rFonts w:ascii="Consolas" w:hAnsi="Consolas"/>
+                <w:color w:val="E2E8F0"/>
+                <w:sz w:val="17"/>
+              </w:rPr>
+              <w:t>[INFO] [HUB] CONNECT rc=0 (0=OK, 4=timeout de red, 5=no autorizado)</w:t>
+            </w:r>
+          </w:p>
+          <w:p>
+            <w:pPr>
+              <w:spacing w:after="0" w:line="240" w:lineRule="auto"/>
+            </w:pPr>
+            <w:r>
+              <w:rPr>
+                <w:rFonts w:ascii="Consolas" w:hAnsi="Consolas"/>
+                <w:color w:val="E2E8F0"/>
+                <w:sz w:val="17"/>
+              </w:rPr>
+              <w:t>[INFO] TX cada 30 s  tempIntake / tempExhaust / humedadRack</w:t>
+            </w:r>
+          </w:p>
+          <w:p>
+            <w:pPr>
+              <w:spacing w:after="0" w:line="240" w:lineRule="auto"/>
+            </w:pPr>
+            <w:r>
+              <w:rPr>
+                <w:rFonts w:ascii="Consolas" w:hAnsi="Consolas"/>
+                <w:color w:val="E2E8F0"/>
+                <w:sz w:val="17"/>
+              </w:rPr>
+              <w:t xml:space="preserve"> </w:t>
+            </w:r>
+          </w:p>
+          <w:p>
+            <w:pPr>
+              <w:spacing w:after="0" w:line="240" w:lineRule="auto"/>
+            </w:pPr>
+            <w:r>
+              <w:rPr>
+                <w:rFonts w:ascii="Consolas" w:hAnsi="Consolas"/>
+                <w:color w:val="E2E8F0"/>
+                <w:sz w:val="17"/>
+              </w:rPr>
+              <w:t># Equipo 2 · Wokwi en el navegador · sketch rackb → DC-RACKB-02</w:t>
+            </w:r>
+          </w:p>
+          <w:p>
+            <w:pPr>
+              <w:spacing w:after="0" w:line="240" w:lineRule="auto"/>
+            </w:pPr>
+            <w:r>
+              <w:rPr>
+                <w:rFonts w:ascii="Consolas" w:hAnsi="Consolas"/>
+                <w:color w:val="E2E8F0"/>
+                <w:sz w:val="17"/>
+              </w:rPr>
+              <w:t>[WIFI] conectado</w:t>
+            </w:r>
+          </w:p>
+          <w:p>
+            <w:pPr>
+              <w:spacing w:after="0" w:line="240" w:lineRule="auto"/>
+            </w:pPr>
+            <w:r>
+              <w:rPr>
+                <w:rFonts w:ascii="Consolas" w:hAnsi="Consolas"/>
+                <w:color w:val="E2E8F0"/>
+                <w:sz w:val="17"/>
+              </w:rPr>
+              <w:t>[NTP] epoch=1790453591</w:t>
+            </w:r>
+          </w:p>
+          <w:p>
+            <w:pPr>
+              <w:spacing w:after="0" w:line="240" w:lineRule="auto"/>
+            </w:pPr>
+            <w:r>
+              <w:rPr>
+                <w:rFonts w:ascii="Consolas" w:hAnsi="Consolas"/>
+                <w:color w:val="E2E8F0"/>
+                <w:sz w:val="17"/>
+              </w:rPr>
+              <w:t>[DPS] resp=202 status=assigning  →  [DPS] resp=200 status=assigned</w:t>
+            </w:r>
+          </w:p>
+          <w:p>
+            <w:pPr>
+              <w:spacing w:after="0" w:line="240" w:lineRule="auto"/>
+            </w:pPr>
+            <w:r>
+              <w:rPr>
+                <w:rFonts w:ascii="Consolas" w:hAnsi="Consolas"/>
+                <w:color w:val="E2E8F0"/>
+                <w:sz w:val="17"/>
+              </w:rPr>
+              <w:t>[MQTT] conectado al hub (Rack B)</w:t>
+            </w:r>
+          </w:p>
+          <w:p>
+            <w:pPr>
+              <w:spacing w:after="0" w:line="240" w:lineRule="auto"/>
+            </w:pPr>
+            <w:r>
+              <w:rPr>
+                <w:rFonts w:ascii="Consolas" w:hAnsi="Consolas"/>
+                <w:color w:val="E2E8F0"/>
+                <w:sz w:val="17"/>
+              </w:rPr>
+              <w:t>[TX] {"tempIntake":22.36,"tempExhaust":32.31,"humedadRack":47.8} (ok)   cada 15 s</w:t>
+            </w:r>
+          </w:p>
+        </w:tc>
+      </w:tr>
+    </w:tbl>
+    <w:p>
+      <w:pPr>
+        <w:spacing w:after="40"/>
+      </w:pPr>
+    </w:p>
+    <w:p>
+      <w:pPr>
+        <w:keepNext/>
+        <w:spacing w:after="60"/>
+        <w:jc w:val="center"/>
+      </w:pPr>
+      <w:r>
+        <w:rPr>
+          <w:noProof/>
+        </w:rPr>
+        <w:lastRenderedPageBreak/>
+        <w:drawing>
+          <wp:inline distT="0" distB="0" distL="0" distR="0" wp14:anchorId="6CF64547" wp14:editId="3ECCB8F8">
+            <wp:extent cx="5940000" cy="3722400"/>
+            <wp:effectExtent l="0" t="0" r="0" b="0"/>
+            <wp:docPr id="23" name="Picture 23"/>
+            <wp:cNvGraphicFramePr>
+              <a:graphicFrameLocks xmlns:a="http://schemas.openxmlformats.org/drawingml/2006/main" noChangeAspect="1"/>
+            </wp:cNvGraphicFramePr>
+            <a:graphic xmlns:a="http://schemas.openxmlformats.org/drawingml/2006/main">
+              <a:graphicData uri="http://schemas.openxmlformats.org/drawingml/2006/picture">
+                <pic:pic xmlns:pic="http://schemas.openxmlformats.org/drawingml/2006/picture">
+                  <pic:nvPicPr>
+                    <pic:cNvPr id="0" name="dia4-datos-rackc.png"/>
+                    <pic:cNvPicPr/>
+                  </pic:nvPicPr>
+                  <pic:blipFill>
+                    <a:blip r:embed="rId19"/>
+                    <a:stretch>
+                      <a:fillRect/>
+                    </a:stretch>
+                  </pic:blipFill>
+                  <pic:spPr>
+                    <a:xfrm>
+                      <a:off x="0" y="0"/>
+                      <a:ext cx="5940000" cy="3722400"/>
+                    </a:xfrm>
+                    <a:prstGeom prst="rect">
+                      <a:avLst/>
+                    </a:prstGeom>
+                  </pic:spPr>
+                </pic:pic>
+              </a:graphicData>
+            </a:graphic>
+          </wp:inline>
+        </w:drawing>
+      </w:r>
+    </w:p>
+    <w:p>
+      <w:pPr>
+        <w:spacing w:after="200"/>
+        <w:jc w:val="center"/>
+      </w:pPr>
+      <w:r>
+        <w:rPr>
+          <w:b/>
+          <w:color w:val="1F5FA8"/>
+          <w:sz w:val="18"/>
+        </w:rPr>
+        <w:t xml:space="preserve">Figura 23. </w:t>
+      </w:r>
+      <w:r>
+        <w:rPr>
+          <w:i/>
+          <w:color w:val="5B6570"/>
+          <w:sz w:val="18"/>
+        </w:rPr>
+        <w:t>Captura 28 — Equipo 1 en vivo: DC-RACKC-03 conectado publicando desde el servidor Ubuntu.</w:t>
+      </w:r>
+    </w:p>
+    <w:p>
+      <w:pPr>
+        <w:keepNext/>
+        <w:spacing w:after="60"/>
+        <w:jc w:val="center"/>
+      </w:pPr>
+      <w:r>
+        <w:rPr>
+          <w:noProof/>
+        </w:rPr>
+        <w:drawing>
+          <wp:inline distT="0" distB="0" distL="0" distR="0" wp14:anchorId="4EE0C574" wp14:editId="2003D84C">
+            <wp:extent cx="5940000" cy="3722400"/>
+            <wp:effectExtent l="0" t="0" r="0" b="0"/>
+            <wp:docPr id="24" name="Picture 24"/>
+            <wp:cNvGraphicFramePr>
+              <a:graphicFrameLocks xmlns:a="http://schemas.openxmlformats.org/drawingml/2006/main" noChangeAspect="1"/>
+            </wp:cNvGraphicFramePr>
+            <a:graphic xmlns:a="http://schemas.openxmlformats.org/drawingml/2006/main">
+              <a:graphicData uri="http://schemas.openxmlformats.org/drawingml/2006/picture">
+                <pic:pic xmlns:pic="http://schemas.openxmlformats.org/drawingml/2006/picture">
+                  <pic:nvPicPr>
+                    <pic:cNvPr id="0" name="dia4-wokwi-rackb.png"/>
+                    <pic:cNvPicPr/>
+                  </pic:nvPicPr>
+                  <pic:blipFill>
+                    <a:blip r:embed="rId21"/>
+                    <a:stretch>
+                      <a:fillRect/>
+                    </a:stretch>
+                  </pic:blipFill>
+                  <pic:spPr>
+                    <a:xfrm>
+                      <a:off x="0" y="0"/>
+                      <a:ext cx="5940000" cy="3722400"/>
+                    </a:xfrm>
+                    <a:prstGeom prst="rect">
+                      <a:avLst/>
+                    </a:prstGeom>
+                  </pic:spPr>
+                </pic:pic>
+              </a:graphicData>
+            </a:graphic>
+          </wp:inline>
+        </w:drawing>
+      </w:r>
+    </w:p>
+    <w:p>
+      <w:pPr>
+        <w:spacing w:after="200"/>
+        <w:jc w:val="center"/>
+      </w:pPr>
+      <w:r>
+        <w:rPr>
+          <w:b/>
+          <w:color w:val="1F5FA8"/>
+          <w:sz w:val="18"/>
+        </w:rPr>
+        <w:t xml:space="preserve">Figura 24. </w:t>
+      </w:r>
+      <w:r>
+        <w:rPr>
+          <w:i/>
+          <w:color w:val="5B6570"/>
+          <w:sz w:val="18"/>
+        </w:rPr>
+        <w:t>Captura 29 — Equipo 2 en vivo: ESP32 del Rack B publicando en el simulador de Wokwi.</w:t>
+      </w:r>
+    </w:p>
+    <w:p>
+      <w:r>
+        <w:t>El ciclo de desconexión y reconexión que hay que explicar en la defensa está documentado en la sección 6.1 del informe (los cuatro incidentes reales) y en la captura del Rack B caído con rc=-2.</w:t>
+      </w:r>
+    </w:p>
+    <w:p>
+      <w:pPr>
         <w:pStyle w:val="Ttulo1"/>
       </w:pPr>
-      <w:bookmarkStart w:id="16" w:name="_Toc241425415"/>
+      <w:bookmarkStart w:id="18" w:name="_Toc241426757"/>
       <w:r>
+        <w:lastRenderedPageBreak/>
         <w:t>6. Estado de la flota en el arranque</w:t>
       </w:r>
-      <w:bookmarkEnd w:id="16"/>
+      <w:bookmarkEnd w:id="18"/>
     </w:p>
     <w:tbl>
       <w:tblPr>
@@ -7136,31 +9778,31 @@
       </w:rPr>
     </w:lvl>
   </w:abstractNum>
-  <w:num w:numId="1" w16cid:durableId="1526210640">
+  <w:num w:numId="1" w16cid:durableId="295571486">
     <w:abstractNumId w:val="8"/>
   </w:num>
-  <w:num w:numId="2" w16cid:durableId="1308707616">
+  <w:num w:numId="2" w16cid:durableId="440346553">
     <w:abstractNumId w:val="6"/>
   </w:num>
-  <w:num w:numId="3" w16cid:durableId="1081634263">
+  <w:num w:numId="3" w16cid:durableId="1100368214">
     <w:abstractNumId w:val="5"/>
   </w:num>
-  <w:num w:numId="4" w16cid:durableId="285897140">
+  <w:num w:numId="4" w16cid:durableId="1143692322">
     <w:abstractNumId w:val="4"/>
   </w:num>
-  <w:num w:numId="5" w16cid:durableId="1991670527">
+  <w:num w:numId="5" w16cid:durableId="318190481">
     <w:abstractNumId w:val="7"/>
   </w:num>
-  <w:num w:numId="6" w16cid:durableId="325255482">
+  <w:num w:numId="6" w16cid:durableId="1656489724">
     <w:abstractNumId w:val="3"/>
   </w:num>
-  <w:num w:numId="7" w16cid:durableId="95952913">
+  <w:num w:numId="7" w16cid:durableId="1881892473">
     <w:abstractNumId w:val="2"/>
   </w:num>
-  <w:num w:numId="8" w16cid:durableId="1967000903">
+  <w:num w:numId="8" w16cid:durableId="2111729542">
     <w:abstractNumId w:val="1"/>
   </w:num>
-  <w:num w:numId="9" w16cid:durableId="288978462">
+  <w:num w:numId="9" w16cid:durableId="1194686344">
     <w:abstractNumId w:val="0"/>
   </w:num>
 </w:numbering>
@@ -18553,7 +21195,7 @@
     <w:autoRedefine/>
     <w:uiPriority w:val="39"/>
     <w:unhideWhenUsed/>
-    <w:rsid w:val="00C51739"/>
+    <w:rsid w:val="00D82ACD"/>
     <w:pPr>
       <w:spacing w:after="100"/>
     </w:pPr>
@@ -18565,7 +21207,7 @@
     <w:autoRedefine/>
     <w:uiPriority w:val="39"/>
     <w:unhideWhenUsed/>
-    <w:rsid w:val="00C51739"/>
+    <w:rsid w:val="00D82ACD"/>
     <w:pPr>
       <w:spacing w:after="100"/>
       <w:ind w:left="210"/>
@@ -18576,7 +21218,7 @@
     <w:basedOn w:val="Fuentedeprrafopredeter"/>
     <w:uiPriority w:val="99"/>
     <w:unhideWhenUsed/>
-    <w:rsid w:val="00C51739"/>
+    <w:rsid w:val="00D82ACD"/>
     <w:rPr>
       <w:color w:val="0000FF" w:themeColor="hyperlink"/>
       <w:u w:val="single"/>

</xml_diff>